<commit_message>
Literature review: add 7 verified 2025-2026 works, confront newest threats
Fresh scout (verified DOIs/arXiv): integrate Clerc et al. 2026 (independent
dissociation corroboration: behavioral LLM-regulation predicts use, self-rated
expertise does not), Kim 2025 + Srinath 2025 (question formulation / problem
decomposition as assessable -> Framing), Tour & Zadorozhnyy 2025 + Di Santi 2026
(newest novelty threats, contrasted), Gu & Ericson 2025 + Li 2026 (context reviews).
50 references, all verifiable resolve (HBR article excepted). Novelty confirmed
unoccupied against newest 2026 work.

Co-Authored-By: Claude Opus 4.8 <noreply@anthropic.com>
</commit_message>
<xml_diff>
--- a/docs/coreasoning.docx
+++ b/docs/coreasoning.docx
@@ -1059,7 +1059,25 @@
         <w:t xml:space="preserve"> </w:t>
       </w:r>
       <w:r>
-        <w:t xml:space="preserve">that cannot separate them cannot guide instruction. A diagnostic competency model must therefore</w:t>
+        <w:t xml:space="preserve">that cannot separate them cannot guide instruction. Integrative reviews of AI literacy after</w:t>
+      </w:r>
+      <w:r>
+        <w:t xml:space="preserve"> </w:t>
+      </w:r>
+      <w:r>
+        <w:t xml:space="preserve">generative AI confirm that the field still lacks a scheme isolating distinct, independently-assessable</w:t>
+      </w:r>
+      <w:r>
+        <w:t xml:space="preserve"> </w:t>
+      </w:r>
+      <w:r>
+        <w:t xml:space="preserve">reasoning competencies (Gu &amp; Ericson, 2025), even as syntheses document generative AI’s mixed effects</w:t>
+      </w:r>
+      <w:r>
+        <w:t xml:space="preserve"> </w:t>
+      </w:r>
+      <w:r>
+        <w:t xml:space="preserve">on critical and creative thinking (Li et al., 2026). A diagnostic competency model must therefore</w:t>
       </w:r>
       <w:r>
         <w:t xml:space="preserve"> </w:t>
@@ -1986,7 +2004,25 @@
         <w:t xml:space="preserve"> </w:t>
       </w:r>
       <w:r>
-        <w:t xml:space="preserve">decision-making (Bansal et al., 2021; Buçinca et al., 2021).</w:t>
+        <w:t xml:space="preserve">decision-making (Bansal et al., 2021; Buçinca et al., 2021). That Judging is a trainable skill rather</w:t>
+      </w:r>
+      <w:r>
+        <w:t xml:space="preserve"> </w:t>
+      </w:r>
+      <w:r>
+        <w:t xml:space="preserve">than an automatic byproduct of competence is underscored by recent evidence that metacognitive</w:t>
+      </w:r>
+      <w:r>
+        <w:t xml:space="preserve"> </w:t>
+      </w:r>
+      <w:r>
+        <w:t xml:space="preserve">monitoring can decouple from performance in human-AI reasoning (Fernandes et al., 2024), and by recent</w:t>
+      </w:r>
+      <w:r>
+        <w:t xml:space="preserve"> </w:t>
+      </w:r>
+      <w:r>
+        <w:t xml:space="preserve">work in Computers &amp; Education: AI on whether learners can evaluate AI output quality as experts do.</w:t>
       </w:r>
     </w:p>
     <w:p>
@@ -2531,7 +2567,19 @@
         <w:t xml:space="preserve"> </w:t>
       </w:r>
       <w:r>
-        <w:t xml:space="preserve">it. This definition fuses Framing and Steering into a single</w:t>
+        <w:t xml:space="preserve">it. The most developed recent decomposition, an operationalization of prompt literacy into formulate,</w:t>
+      </w:r>
+      <w:r>
+        <w:t xml:space="preserve"> </w:t>
+      </w:r>
+      <w:r>
+        <w:t xml:space="preserve">interpret, and refine sub-practices (Tour &amp; Zadorozhnyy, 2025), is the closest competitor to our</w:t>
+      </w:r>
+      <w:r>
+        <w:t xml:space="preserve"> </w:t>
+      </w:r>
+      <w:r>
+        <w:t xml:space="preserve">triad; but it bundles task specification and iterative refinement under</w:t>
       </w:r>
       <w:r>
         <w:t xml:space="preserve"> </w:t>
@@ -2549,19 +2597,107 @@
         <w:t xml:space="preserve"> </w:t>
       </w:r>
       <w:r>
-        <w:t xml:space="preserve">skill, exactly the conflation</w:t>
-      </w:r>
-      <w:r>
-        <w:t xml:space="preserve"> </w:t>
-      </w:r>
-      <w:r>
-        <w:t xml:space="preserve">CoReasoning rejects. Treating them separately is not a cosmetic relabeling: it predicts, and our</w:t>
-      </w:r>
-      <w:r>
-        <w:t xml:space="preserve"> </w:t>
-      </w:r>
-      <w:r>
-        <w:t xml:space="preserve">feasibility demonstration supports, that a learner’s Framing and Steering grades can diverge.</w:t>
+        <w:t xml:space="preserve">and does not treat</w:t>
+      </w:r>
+      <w:r>
+        <w:t xml:space="preserve"> </w:t>
+      </w:r>
+      <w:r>
+        <w:t xml:space="preserve">the sub-practices as separately graded, dissociable competencies. This fusion of Framing and Steering</w:t>
+      </w:r>
+      <w:r>
+        <w:t xml:space="preserve"> </w:t>
+      </w:r>
+      <w:r>
+        <w:t xml:space="preserve">into a single</w:t>
+      </w:r>
+      <w:r>
+        <w:t xml:space="preserve"> </w:t>
+      </w:r>
+      <w:r>
+        <w:t xml:space="preserve">“</w:t>
+      </w:r>
+      <w:r>
+        <w:t xml:space="preserve">prompting</w:t>
+      </w:r>
+      <w:r>
+        <w:t xml:space="preserve">”</w:t>
+      </w:r>
+      <w:r>
+        <w:t xml:space="preserve"> </w:t>
+      </w:r>
+      <w:r>
+        <w:t xml:space="preserve">skill is exactly the conflation CoReasoning rejects. Treating them</w:t>
+      </w:r>
+      <w:r>
+        <w:t xml:space="preserve"> </w:t>
+      </w:r>
+      <w:r>
+        <w:t xml:space="preserve">separately is not a cosmetic relabeling: it predicts, and our feasibility demonstration supports, that</w:t>
+      </w:r>
+      <w:r>
+        <w:t xml:space="preserve"> </w:t>
+      </w:r>
+      <w:r>
+        <w:t xml:space="preserve">a learner’s Framing and Steering grades can diverge.</w:t>
+      </w:r>
+    </w:p>
+    <w:p>
+      <w:pPr>
+        <w:pStyle w:val="BodyText"/>
+      </w:pPr>
+      <w:r>
+        <w:rPr>
+          <w:b/>
+          <w:bCs/>
+        </w:rPr>
+        <w:t xml:space="preserve">Metric frameworks for human-AI cognition.</w:t>
+      </w:r>
+      <w:r>
+        <w:t xml:space="preserve"> </w:t>
+      </w:r>
+      <w:r>
+        <w:t xml:space="preserve">A distinct 2026 line proposes named multi-metric schemes</w:t>
+      </w:r>
+      <w:r>
+        <w:t xml:space="preserve"> </w:t>
+      </w:r>
+      <w:r>
+        <w:t xml:space="preserve">for working with AI, for instance a cognitive-amplification-versus-delegation framework with dependency</w:t>
+      </w:r>
+      <w:r>
+        <w:t xml:space="preserve"> </w:t>
+      </w:r>
+      <w:r>
+        <w:t xml:space="preserve">and drift metrics (Di Santi, 2026). These measure the</w:t>
+      </w:r>
+      <w:r>
+        <w:t xml:space="preserve"> </w:t>
+      </w:r>
+      <w:r>
+        <w:rPr>
+          <w:i/>
+          <w:iCs/>
+        </w:rPr>
+        <w:t xml:space="preserve">sustainability</w:t>
+      </w:r>
+      <w:r>
+        <w:t xml:space="preserve"> </w:t>
+      </w:r>
+      <w:r>
+        <w:t xml:space="preserve">of reliance rather than</w:t>
+      </w:r>
+      <w:r>
+        <w:t xml:space="preserve"> </w:t>
+      </w:r>
+      <w:r>
+        <w:t xml:space="preserve">teachable framing, judging, and steering competencies, and so are complementary to, not competitive</w:t>
+      </w:r>
+      <w:r>
+        <w:t xml:space="preserve"> </w:t>
+      </w:r>
+      <w:r>
+        <w:t xml:space="preserve">with, an assessable-skill decomposition.</w:t>
       </w:r>
     </w:p>
     <w:p>
@@ -3317,7 +3453,19 @@
         <w:t xml:space="preserve"> </w:t>
       </w:r>
       <w:r>
-        <w:t xml:space="preserve">that require students to specify and evaluate rather than merely prompt (Denny et al., 2024). That</w:t>
+        <w:t xml:space="preserve">that require students to specify and evaluate rather than merely prompt (Denny et al., 2024), and</w:t>
+      </w:r>
+      <w:r>
+        <w:t xml:space="preserve"> </w:t>
+      </w:r>
+      <w:r>
+        <w:t xml:space="preserve">through instruments that treat question formulation (Kim et al., 2025) and problem decomposition</w:t>
+      </w:r>
+      <w:r>
+        <w:t xml:space="preserve"> </w:t>
+      </w:r>
+      <w:r>
+        <w:t xml:space="preserve">(Srinath et al., 2025) as independently measurable, trainable skills in generative-AI settings. That</w:t>
       </w:r>
       <w:r>
         <w:t xml:space="preserve"> </w:t>
@@ -4724,7 +4872,47 @@
         <w:t xml:space="preserve"> </w:t>
       </w:r>
       <w:r>
-        <w:t xml:space="preserve">cannot produce these crossed profiles.</w:t>
+        <w:t xml:space="preserve">cannot produce these crossed profiles. Converging evidence comes from outside our synthetic</w:t>
+      </w:r>
+      <w:r>
+        <w:t xml:space="preserve"> </w:t>
+      </w:r>
+      <w:r>
+        <w:t xml:space="preserve">setting: an intervention study finds that students’</w:t>
+      </w:r>
+      <w:r>
+        <w:t xml:space="preserve"> </w:t>
+      </w:r>
+      <w:r>
+        <w:rPr>
+          <w:i/>
+          <w:iCs/>
+        </w:rPr>
+        <w:t xml:space="preserve">behavioral</w:t>
+      </w:r>
+      <w:r>
+        <w:t xml:space="preserve"> </w:t>
+      </w:r>
+      <w:r>
+        <w:t xml:space="preserve">regulation of LLM use (reformulating</w:t>
+      </w:r>
+      <w:r>
+        <w:t xml:space="preserve"> </w:t>
+      </w:r>
+      <w:r>
+        <w:t xml:space="preserve">queries, checking correctness) predicts effective use, whereas self-rated AI expertise does not</w:t>
+      </w:r>
+      <w:r>
+        <w:t xml:space="preserve"> </w:t>
+      </w:r>
+      <w:r>
+        <w:t xml:space="preserve">(Clerc et al., 2026), consistent with the skill of working with AI being distinct from, and not</w:t>
+      </w:r>
+      <w:r>
+        <w:t xml:space="preserve"> </w:t>
+      </w:r>
+      <w:r>
+        <w:t xml:space="preserve">reducible to, a general self-assessed competence.</w:t>
       </w:r>
     </w:p>
     <w:p>

</xml_diff>

<commit_message>
Open-source: interface gallery, GitHub links, MIT license
- Add Appendix interface gallery (Figure A2): student dashboard, instructor
  challenge authoring, student trend report, instructor per-rubric analytics,
  faithful SVG mockups built from the real screen layouts.
- Add open-source availability statement + GitHub repo link in paper, HTML header
  + footer; README now surfaces the paper, live site, and research artifacts.
- Add MIT LICENSE.

Co-Authored-By: Claude Opus 4.8 <noreply@anthropic.com>
</commit_message>
<xml_diff>
--- a/docs/coreasoning.docx
+++ b/docs/coreasoning.docx
@@ -2,7 +2,7 @@
 <file path=word/document.xml><?xml version="1.0" encoding="utf-8"?>
 <w:document xmlns:w="http://schemas.openxmlformats.org/wordprocessingml/2006/main" xmlns:m="http://schemas.openxmlformats.org/officeDocument/2006/math" xmlns:r="http://schemas.openxmlformats.org/officeDocument/2006/relationships" xmlns:o="urn:schemas-microsoft-com:office:office" xmlns:v="urn:schemas-microsoft-com:vml" xmlns:w10="urn:schemas-microsoft-com:office:word" xmlns:a="http://schemas.openxmlformats.org/drawingml/2006/main" xmlns:pic="http://schemas.openxmlformats.org/drawingml/2006/picture" xmlns:wp="http://schemas.openxmlformats.org/drawingml/2006/wordprocessingDrawing">
   <w:body>
-    <w:bookmarkStart w:id="51" w:name="X9dba699e1585523456db11bdab5d7e7e6909c23"/>
+    <w:bookmarkStart w:id="55" w:name="X9dba699e1585523456db11bdab5d7e7e6909c23"/>
     <w:p>
       <w:pPr>
         <w:pStyle w:val="Heading1"/>
@@ -226,7 +226,7 @@
       </w:r>
     </w:p>
     <w:bookmarkEnd w:id="20"/>
-    <w:bookmarkStart w:id="21" w:name="introduction"/>
+    <w:bookmarkStart w:id="22" w:name="introduction"/>
     <w:p>
       <w:pPr>
         <w:pStyle w:val="Heading2"/>
@@ -895,8 +895,52 @@
         <w:t xml:space="preserve">, not an efficacy study.</w:t>
       </w:r>
     </w:p>
-    <w:bookmarkEnd w:id="21"/>
-    <w:bookmarkStart w:id="22" w:name="X17376d58bcb93231038f1530b731c55944db2e6"/>
+    <w:p>
+      <w:pPr>
+        <w:pStyle w:val="BodyText"/>
+      </w:pPr>
+      <w:r>
+        <w:rPr>
+          <w:b/>
+          <w:bCs/>
+        </w:rPr>
+        <w:t xml:space="preserve">Availability.</w:t>
+      </w:r>
+      <w:r>
+        <w:t xml:space="preserve"> </w:t>
+      </w:r>
+      <w:r>
+        <w:t xml:space="preserve">The CoReasoning Lab system, the sixteen-prompt instrument, the controlled-generation</w:t>
+      </w:r>
+      <w:r>
+        <w:t xml:space="preserve"> </w:t>
+      </w:r>
+      <w:r>
+        <w:t xml:space="preserve">harness, the experiment data and figures, and the human-rater study package are open-source under the</w:t>
+      </w:r>
+      <w:r>
+        <w:t xml:space="preserve"> </w:t>
+      </w:r>
+      <w:r>
+        <w:t xml:space="preserve">MIT license at</w:t>
+      </w:r>
+      <w:r>
+        <w:t xml:space="preserve"> </w:t>
+      </w:r>
+      <w:hyperlink r:id="rId21">
+        <w:r>
+          <w:rPr>
+            <w:rStyle w:val="Hyperlink"/>
+          </w:rPr>
+          <w:t xml:space="preserve">https://github.com/ApartsinProjects/CoReason</w:t>
+        </w:r>
+      </w:hyperlink>
+      <w:r>
+        <w:t xml:space="preserve">.</w:t>
+      </w:r>
+    </w:p>
+    <w:bookmarkEnd w:id="22"/>
+    <w:bookmarkStart w:id="23" w:name="X17376d58bcb93231038f1530b731c55944db2e6"/>
     <w:p>
       <w:pPr>
         <w:pStyle w:val="Heading2"/>
@@ -1092,8 +1136,8 @@
         <w:t xml:space="preserve">operations are in fact separable in learners. That is the gap CoReasoning addresses.</w:t>
       </w:r>
     </w:p>
-    <w:bookmarkEnd w:id="22"/>
-    <w:bookmarkStart w:id="29" w:name="the-coreasoning-framework"/>
+    <w:bookmarkEnd w:id="23"/>
+    <w:bookmarkStart w:id="30" w:name="the-coreasoning-framework"/>
     <w:p>
       <w:pPr>
         <w:pStyle w:val="Heading2"/>
@@ -1102,7 +1146,7 @@
         <w:t xml:space="preserve">3. The CoReasoning framework</w:t>
       </w:r>
     </w:p>
-    <w:bookmarkStart w:id="26" w:name="X66ab742d2d29b469acd8c125b52c7b6e582e57f"/>
+    <w:bookmarkStart w:id="27" w:name="X66ab742d2d29b469acd8c125b52c7b6e582e57f"/>
     <w:p>
       <w:pPr>
         <w:pStyle w:val="Heading3"/>
@@ -1310,12 +1354,12 @@
           <wp:inline>
             <wp:extent cx="5334000" cy="3057292"/>
             <wp:effectExtent b="0" l="0" r="0" t="0"/>
-            <wp:docPr descr="Figure 1. The CoReasoning architecture." title="" id="24" name="Picture"/>
+            <wp:docPr descr="Figure 1. The CoReasoning architecture." title="" id="25" name="Picture"/>
             <a:graphic>
               <a:graphicData uri="http://schemas.openxmlformats.org/drawingml/2006/picture">
                 <pic:pic>
                   <pic:nvPicPr>
-                    <pic:cNvPr descr="assets/coreasoning-architecture.svg" id="25" name="Picture"/>
+                    <pic:cNvPr descr="assets/coreasoning-architecture.svg" id="26" name="Picture"/>
                     <pic:cNvPicPr>
                       <a:picLocks noChangeArrowheads="1" noChangeAspect="1"/>
                     </pic:cNvPicPr>
@@ -1327,7 +1371,7 @@
                           <a14:useLocalDpi xmlns:a14="http://schemas.microsoft.com/office/drawing/2010/main" val="0"/>
                         </a:ext>
                         <a:ext uri="{96DAC541-7B7A-43D3-8B79-37D633B846F1}">
-                          <asvg:svgBlip xmlns:asvg="http://schemas.microsoft.com/office/drawing/2016/SVG/main" r:embed="rId23"/>
+                          <asvg:svgBlip xmlns:asvg="http://schemas.microsoft.com/office/drawing/2016/SVG/main" r:embed="rId24"/>
                         </a:ext>
                       </a:extLst>
                     </a:blip>
@@ -1419,8 +1463,8 @@
         <w:t xml:space="preserve">Steering is the controller’s write.</w:t>
       </w:r>
     </w:p>
-    <w:bookmarkEnd w:id="26"/>
-    <w:bookmarkStart w:id="27" w:name="X44244f8f52b0cf83a8c12e7669f4d4601dca696"/>
+    <w:bookmarkEnd w:id="27"/>
+    <w:bookmarkStart w:id="28" w:name="X44244f8f52b0cf83a8c12e7669f4d4601dca696"/>
     <w:p>
       <w:pPr>
         <w:pStyle w:val="Heading3"/>
@@ -1571,8 +1615,8 @@
         <w:t xml:space="preserve">distinctions an educator needs.</w:t>
       </w:r>
     </w:p>
-    <w:bookmarkEnd w:id="27"/>
-    <w:bookmarkStart w:id="28" w:name="distinguishing-judging-from-steering"/>
+    <w:bookmarkEnd w:id="28"/>
+    <w:bookmarkStart w:id="29" w:name="distinguishing-judging-from-steering"/>
     <w:p>
       <w:pPr>
         <w:pStyle w:val="Heading3"/>
@@ -1820,9 +1864,9 @@
         <w:t xml:space="preserve">remaining comparatively flat in the others, rather than relying on a single global factor model.</w:t>
       </w:r>
     </w:p>
-    <w:bookmarkEnd w:id="28"/>
     <w:bookmarkEnd w:id="29"/>
-    <w:bookmarkStart w:id="30" w:name="theoretical-grounding"/>
+    <w:bookmarkEnd w:id="30"/>
+    <w:bookmarkStart w:id="31" w:name="theoretical-grounding"/>
     <w:p>
       <w:pPr>
         <w:pStyle w:val="Heading2"/>
@@ -2175,8 +2219,8 @@
         <w:t xml:space="preserve">accept.</w:t>
       </w:r>
     </w:p>
-    <w:bookmarkEnd w:id="30"/>
-    <w:bookmarkStart w:id="31" w:name="propositions"/>
+    <w:bookmarkEnd w:id="31"/>
+    <w:bookmarkStart w:id="32" w:name="propositions"/>
     <w:p>
       <w:pPr>
         <w:pStyle w:val="Heading2"/>
@@ -2384,8 +2428,8 @@
         <w:t xml:space="preserve">.</w:t>
       </w:r>
     </w:p>
-    <w:bookmarkEnd w:id="31"/>
-    <w:bookmarkStart w:id="32" w:name="relation-to-prior-frameworks"/>
+    <w:bookmarkEnd w:id="32"/>
+    <w:bookmarkStart w:id="33" w:name="relation-to-prior-frameworks"/>
     <w:p>
       <w:pPr>
         <w:pStyle w:val="Heading2"/>
@@ -3550,8 +3594,8 @@
         <w:t xml:space="preserve">consequential (the skills can be measured apart).</w:t>
       </w:r>
     </w:p>
-    <w:bookmarkEnd w:id="32"/>
-    <w:bookmarkStart w:id="33" w:name="the-coreasoning-lab-system"/>
+    <w:bookmarkEnd w:id="33"/>
+    <w:bookmarkStart w:id="34" w:name="the-coreasoning-lab-system"/>
     <w:p>
       <w:pPr>
         <w:pStyle w:val="Heading2"/>
@@ -3865,8 +3909,8 @@
         <w:t xml:space="preserve">the instrument that produces those scores.</w:t>
       </w:r>
     </w:p>
-    <w:bookmarkEnd w:id="33"/>
-    <w:bookmarkStart w:id="34" w:name="X88f965ab2b6c2a236609197dd879be439c7e389"/>
+    <w:bookmarkEnd w:id="34"/>
+    <w:bookmarkStart w:id="35" w:name="X88f965ab2b6c2a236609197dd879be439c7e389"/>
     <w:p>
       <w:pPr>
         <w:pStyle w:val="Heading2"/>
@@ -4160,8 +4204,8 @@
         <w:t xml:space="preserve">is the separate validity question addressed by the prepared study in Section 10.</w:t>
       </w:r>
     </w:p>
-    <w:bookmarkEnd w:id="34"/>
-    <w:bookmarkStart w:id="41" w:name="feasibility-demonstration"/>
+    <w:bookmarkEnd w:id="35"/>
+    <w:bookmarkStart w:id="42" w:name="feasibility-demonstration"/>
     <w:p>
       <w:pPr>
         <w:pStyle w:val="Heading2"/>
@@ -4924,18 +4968,18 @@
           <wp:inline>
             <wp:extent cx="4600754" cy="3864633"/>
             <wp:effectExtent b="0" l="0" r="0" t="0"/>
-            <wp:docPr descr="Figure 2. Own-competence effects dominate cross-competence effects on every skill’s grade." title="" id="36" name="Picture"/>
+            <wp:docPr descr="Figure 2. Own-competence effects dominate cross-competence effects on every skill’s grade." title="" id="37" name="Picture"/>
             <a:graphic>
               <a:graphicData uri="http://schemas.openxmlformats.org/drawingml/2006/picture">
                 <pic:pic>
                   <pic:nvPicPr>
-                    <pic:cNvPr descr="assets/fig_dissociation_heatmap.png" id="37" name="Picture"/>
+                    <pic:cNvPr descr="assets/fig_dissociation_heatmap.png" id="38" name="Picture"/>
                     <pic:cNvPicPr>
                       <a:picLocks noChangeArrowheads="1" noChangeAspect="1"/>
                     </pic:cNvPicPr>
                   </pic:nvPicPr>
                   <pic:blipFill>
-                    <a:blip r:embed="rId35"/>
+                    <a:blip r:embed="rId36"/>
                     <a:stretch>
                       <a:fillRect/>
                     </a:stretch>
@@ -5005,18 +5049,18 @@
           <wp:inline>
             <wp:extent cx="5334000" cy="2963333"/>
             <wp:effectExtent b="0" l="0" r="0" t="0"/>
-            <wp:docPr descr="Figure 3. Per-skill grades dissociate by competence profile." title="" id="39" name="Picture"/>
+            <wp:docPr descr="Figure 3. Per-skill grades dissociate by competence profile." title="" id="40" name="Picture"/>
             <a:graphic>
               <a:graphicData uri="http://schemas.openxmlformats.org/drawingml/2006/picture">
                 <pic:pic>
                   <pic:nvPicPr>
-                    <pic:cNvPr descr="assets/fig_contrasts.png" id="40" name="Picture"/>
+                    <pic:cNvPr descr="assets/fig_contrasts.png" id="41" name="Picture"/>
                     <pic:cNvPicPr>
                       <a:picLocks noChangeArrowheads="1" noChangeAspect="1"/>
                     </pic:cNvPicPr>
                   </pic:nvPicPr>
                   <pic:blipFill>
-                    <a:blip r:embed="rId38"/>
+                    <a:blip r:embed="rId39"/>
                     <a:stretch>
                       <a:fillRect/>
                     </a:stretch>
@@ -5155,8 +5199,8 @@
         <w:t xml:space="preserve">bounded, and partly confounded, by the judging it follows).</w:t>
       </w:r>
     </w:p>
-    <w:bookmarkEnd w:id="41"/>
-    <w:bookmarkStart w:id="42" w:name="tensions-and-boundary-conditions"/>
+    <w:bookmarkEnd w:id="42"/>
+    <w:bookmarkStart w:id="43" w:name="tensions-and-boundary-conditions"/>
     <w:p>
       <w:pPr>
         <w:pStyle w:val="Heading2"/>
@@ -5376,8 +5420,8 @@
         <w:t xml:space="preserve">expert frontier.</w:t>
       </w:r>
     </w:p>
-    <w:bookmarkEnd w:id="42"/>
-    <w:bookmarkStart w:id="43" w:name="a-validation-and-assessment-agenda"/>
+    <w:bookmarkEnd w:id="43"/>
+    <w:bookmarkStart w:id="44" w:name="a-validation-and-assessment-agenda"/>
     <w:p>
       <w:pPr>
         <w:pStyle w:val="Heading2"/>
@@ -5595,8 +5639,8 @@
         <w:t xml:space="preserve">Proposition P5 and any learning claim; that is explicitly outside the present scope.</w:t>
       </w:r>
     </w:p>
-    <w:bookmarkEnd w:id="43"/>
-    <w:bookmarkStart w:id="44" w:name="limitations"/>
+    <w:bookmarkEnd w:id="44"/>
+    <w:bookmarkStart w:id="45" w:name="limitations"/>
     <w:p>
       <w:pPr>
         <w:pStyle w:val="Heading2"/>
@@ -5655,8 +5699,8 @@
         <w:t xml:space="preserve">constructs are separable and automatically measurable.</w:t>
       </w:r>
     </w:p>
-    <w:bookmarkEnd w:id="44"/>
-    <w:bookmarkStart w:id="45" w:name="conclusion"/>
+    <w:bookmarkEnd w:id="45"/>
+    <w:bookmarkStart w:id="46" w:name="conclusion"/>
     <w:p>
       <w:pPr>
         <w:pStyle w:val="Heading2"/>
@@ -5709,8 +5753,8 @@
         <w:t xml:space="preserve">measured apart. We offer it as a foundation for the assessment and instruction the moment demands.</w:t>
       </w:r>
     </w:p>
-    <w:bookmarkEnd w:id="45"/>
-    <w:bookmarkStart w:id="49" w:name="appendix-a.-system-walkthrough"/>
+    <w:bookmarkEnd w:id="46"/>
+    <w:bookmarkStart w:id="53" w:name="appendix-a.-system-walkthrough"/>
     <w:p>
       <w:pPr>
         <w:pStyle w:val="Heading2"/>
@@ -5772,12 +5816,12 @@
           <wp:inline>
             <wp:extent cx="5334000" cy="2726266"/>
             <wp:effectExtent b="0" l="0" r="0" t="0"/>
-            <wp:docPr descr="Figure A1. A CoReasoning Lab challenge run." title="" id="47" name="Picture"/>
+            <wp:docPr descr="Figure A1. A CoReasoning Lab challenge run." title="" id="48" name="Picture"/>
             <a:graphic>
               <a:graphicData uri="http://schemas.openxmlformats.org/drawingml/2006/picture">
                 <pic:pic>
                   <pic:nvPicPr>
-                    <pic:cNvPr descr="assets/system-mockup.svg" id="48" name="Picture"/>
+                    <pic:cNvPr descr="assets/system-mockup.svg" id="49" name="Picture"/>
                     <pic:cNvPicPr>
                       <a:picLocks noChangeArrowheads="1" noChangeAspect="1"/>
                     </pic:cNvPicPr>
@@ -5789,7 +5833,7 @@
                           <a14:useLocalDpi xmlns:a14="http://schemas.microsoft.com/office/drawing/2010/main" val="0"/>
                         </a:ext>
                         <a:ext uri="{96DAC541-7B7A-43D3-8B79-37D633B846F1}">
-                          <asvg:svgBlip xmlns:asvg="http://schemas.microsoft.com/office/drawing/2016/SVG/main" r:embed="rId46"/>
+                          <asvg:svgBlip xmlns:asvg="http://schemas.microsoft.com/office/drawing/2016/SVG/main" r:embed="rId47"/>
                         </a:ext>
                       </a:extLst>
                     </a:blip>
@@ -5853,8 +5897,164 @@
         <w:t xml:space="preserve">per-skill report. Each skill is scored and given feedback independently.</w:t>
       </w:r>
     </w:p>
-    <w:bookmarkEnd w:id="49"/>
-    <w:bookmarkStart w:id="50" w:name="references"/>
+    <w:p>
+      <w:pPr>
+        <w:pStyle w:val="BodyText"/>
+      </w:pPr>
+      <w:r>
+        <w:t xml:space="preserve">The platform exposes role-specific interfaces beyond the challenge run (Figure A2). Students see a</w:t>
+      </w:r>
+      <w:r>
+        <w:t xml:space="preserve"> </w:t>
+      </w:r>
+      <w:r>
+        <w:t xml:space="preserve">dashboard of pending challenges and courses and a personal results view that trends Framing, Judging,</w:t>
+      </w:r>
+      <w:r>
+        <w:t xml:space="preserve"> </w:t>
+      </w:r>
+      <w:r>
+        <w:t xml:space="preserve">and Steering separately over time. Instructors author challenges (the system auto-generates the</w:t>
+      </w:r>
+      <w:r>
+        <w:t xml:space="preserve"> </w:t>
+      </w:r>
+      <w:r>
+        <w:t xml:space="preserve">ill-defined problem and the three per-skill rubrics) and read course analytics that break grade</w:t>
+      </w:r>
+      <w:r>
+        <w:t xml:space="preserve"> </w:t>
+      </w:r>
+      <w:r>
+        <w:t xml:space="preserve">distributions down by rubric and by student. In every view the three skills remain distinct columns,</w:t>
+      </w:r>
+      <w:r>
+        <w:t xml:space="preserve"> </w:t>
+      </w:r>
+      <w:r>
+        <w:t xml:space="preserve">which is the design commitment the framework makes visible.</w:t>
+      </w:r>
+    </w:p>
+    <w:p>
+      <w:pPr>
+        <w:pStyle w:val="CaptionedFigure"/>
+      </w:pPr>
+      <w:r>
+        <w:drawing>
+          <wp:inline>
+            <wp:extent cx="5334000" cy="3745148"/>
+            <wp:effectExtent b="0" l="0" r="0" t="0"/>
+            <wp:docPr descr="Figure A2. CoReasoning Lab role interfaces." title="" id="51" name="Picture"/>
+            <a:graphic>
+              <a:graphicData uri="http://schemas.openxmlformats.org/drawingml/2006/picture">
+                <pic:pic>
+                  <pic:nvPicPr>
+                    <pic:cNvPr descr="assets/interface-gallery.svg" id="52" name="Picture"/>
+                    <pic:cNvPicPr>
+                      <a:picLocks noChangeArrowheads="1" noChangeAspect="1"/>
+                    </pic:cNvPicPr>
+                  </pic:nvPicPr>
+                  <pic:blipFill>
+                    <a:blip>
+                      <a:extLst>
+                        <a:ext uri="{28A0092B-C50C-407E-A947-70E740481C1C}">
+                          <a14:useLocalDpi xmlns:a14="http://schemas.microsoft.com/office/drawing/2010/main" val="0"/>
+                        </a:ext>
+                        <a:ext uri="{96DAC541-7B7A-43D3-8B79-37D633B846F1}">
+                          <asvg:svgBlip xmlns:asvg="http://schemas.microsoft.com/office/drawing/2016/SVG/main" r:embed="rId50"/>
+                        </a:ext>
+                      </a:extLst>
+                    </a:blip>
+                    <a:stretch>
+                      <a:fillRect/>
+                    </a:stretch>
+                  </pic:blipFill>
+                  <pic:spPr bwMode="auto">
+                    <a:xfrm>
+                      <a:off x="0" y="0"/>
+                      <a:ext cx="5334000" cy="3745148"/>
+                    </a:xfrm>
+                    <a:prstGeom prst="rect">
+                      <a:avLst/>
+                    </a:prstGeom>
+                    <a:noFill/>
+                    <a:ln w="9525">
+                      <a:noFill/>
+                      <a:headEnd/>
+                      <a:tailEnd/>
+                    </a:ln>
+                  </pic:spPr>
+                </pic:pic>
+              </a:graphicData>
+            </a:graphic>
+          </wp:inline>
+        </w:drawing>
+      </w:r>
+    </w:p>
+    <w:p>
+      <w:pPr>
+        <w:pStyle w:val="ImageCaption"/>
+      </w:pPr>
+      <w:r>
+        <w:t xml:space="preserve">Figure A2. CoReasoning Lab role interfaces.</w:t>
+      </w:r>
+    </w:p>
+    <w:p>
+      <w:pPr>
+        <w:pStyle w:val="BodyText"/>
+      </w:pPr>
+      <w:r>
+        <w:rPr>
+          <w:i/>
+          <w:iCs/>
+        </w:rPr>
+        <w:t xml:space="preserve">Figure A2. Role interfaces. Top: the student dashboard and the instructor challenge-authoring screen.</w:t>
+      </w:r>
+      <w:r>
+        <w:rPr>
+          <w:i/>
+          <w:iCs/>
+        </w:rPr>
+        <w:t xml:space="preserve"> </w:t>
+      </w:r>
+      <w:r>
+        <w:rPr>
+          <w:i/>
+          <w:iCs/>
+        </w:rPr>
+        <w:t xml:space="preserve">Bottom: the student trend report (per-skill grades over time) and the instructor course analytics</w:t>
+      </w:r>
+      <w:r>
+        <w:rPr>
+          <w:i/>
+          <w:iCs/>
+        </w:rPr>
+        <w:t xml:space="preserve"> </w:t>
+      </w:r>
+      <w:r>
+        <w:rPr>
+          <w:i/>
+          <w:iCs/>
+        </w:rPr>
+        <w:t xml:space="preserve">(grade distribution by rubric and per-student results). All views report Framing, Judging, and</w:t>
+      </w:r>
+      <w:r>
+        <w:rPr>
+          <w:i/>
+          <w:iCs/>
+        </w:rPr>
+        <w:t xml:space="preserve"> </w:t>
+      </w:r>
+      <w:r>
+        <w:rPr>
+          <w:i/>
+          <w:iCs/>
+        </w:rPr>
+        <w:t xml:space="preserve">Steering independently.</w:t>
+      </w:r>
+    </w:p>
+    <w:bookmarkEnd w:id="53"/>
+    <w:bookmarkStart w:id="54" w:name="references"/>
     <w:p>
       <w:pPr>
         <w:pStyle w:val="Heading2"/>
@@ -5886,8 +6086,8 @@
         <w:t xml:space="preserve">(43 entries, validated). See the repository for the BibTeX source.]</w:t>
       </w:r>
     </w:p>
-    <w:bookmarkEnd w:id="50"/>
-    <w:bookmarkEnd w:id="51"/>
+    <w:bookmarkEnd w:id="54"/>
+    <w:bookmarkEnd w:id="55"/>
     <w:sectPr/>
   </w:body>
 </w:document>

</xml_diff>

<commit_message>
Address review round 2 (-> Minor Revision) + E2 grader reliability
- E2: grader is 92% self-consistent over repeats (flip-rate 0.08; judging
  deterministic, framing 0.15, steering 0.10); added Reliability result to Sec 8.
- Inter-skill correlations (N=40): F~J 0.00, F~S -0.22, J~S +0.17 (ns); 1st factor
  42% variance. Bootstrap 95% CIs on diagonal own-effects (framing/steering exclude 0).
- Fix model-family contradiction (gpt-4o-mini learners / gpt-4o grader; llama deployed).
- Reinterpret weak steering effect as grader-leniency floor + P2 confound.
- Re-scope propositions: P3 demo-supported, P2 partial, P1/P4/P5 = validation
  hypotheses with named falsifiers. Name recursive "who grades the grader" threat +
  commit to human-verified seeded issues. Fix figure-numbering collision; bib 43->50.
- Reviewer round-2 report in paper/reviews/round2.md.

Co-Authored-By: Claude Opus 4.8 <noreply@anthropic.com>
</commit_message>
<xml_diff>
--- a/docs/coreasoning.docx
+++ b/docs/coreasoning.docx
@@ -2426,6 +2426,124 @@
       </w:r>
       <w:r>
         <w:t xml:space="preserve">.</w:t>
+      </w:r>
+    </w:p>
+    <w:p>
+      <w:pPr>
+        <w:pStyle w:val="FirstParagraph"/>
+      </w:pPr>
+      <w:r>
+        <w:t xml:space="preserve">These propositions differ in how far the present work tests them. The feasibility demonstration</w:t>
+      </w:r>
+      <w:r>
+        <w:t xml:space="preserve"> </w:t>
+      </w:r>
+      <w:r>
+        <w:t xml:space="preserve">(Section 8) directly supports</w:t>
+      </w:r>
+      <w:r>
+        <w:t xml:space="preserve"> </w:t>
+      </w:r>
+      <w:r>
+        <w:rPr>
+          <w:b/>
+          <w:bCs/>
+        </w:rPr>
+        <w:t xml:space="preserve">P3</w:t>
+      </w:r>
+      <w:r>
+        <w:t xml:space="preserve"> </w:t>
+      </w:r>
+      <w:r>
+        <w:t xml:space="preserve">(the three skills dissociate) and bears partly on</w:t>
+      </w:r>
+      <w:r>
+        <w:t xml:space="preserve"> </w:t>
+      </w:r>
+      <w:r>
+        <w:rPr>
+          <w:b/>
+          <w:bCs/>
+        </w:rPr>
+        <w:t xml:space="preserve">P2</w:t>
+      </w:r>
+      <w:r>
+        <w:t xml:space="preserve"> </w:t>
+      </w:r>
+      <w:r>
+        <w:t xml:space="preserve">(the</w:t>
+      </w:r>
+      <w:r>
+        <w:t xml:space="preserve"> </w:t>
+      </w:r>
+      <w:r>
+        <w:t xml:space="preserve">steering own-effect is bounded in a way consistent with judging gating steering).</w:t>
+      </w:r>
+      <w:r>
+        <w:t xml:space="preserve"> </w:t>
+      </w:r>
+      <w:r>
+        <w:rPr>
+          <w:b/>
+          <w:bCs/>
+        </w:rPr>
+        <w:t xml:space="preserve">P1</w:t>
+      </w:r>
+      <w:r>
+        <w:t xml:space="preserve">,</w:t>
+      </w:r>
+      <w:r>
+        <w:t xml:space="preserve"> </w:t>
+      </w:r>
+      <w:r>
+        <w:rPr>
+          <w:b/>
+          <w:bCs/>
+        </w:rPr>
+        <w:t xml:space="preserve">P4</w:t>
+      </w:r>
+      <w:r>
+        <w:t xml:space="preserve">, and</w:t>
+      </w:r>
+      <w:r>
+        <w:t xml:space="preserve"> </w:t>
+      </w:r>
+      <w:r>
+        <w:rPr>
+          <w:b/>
+          <w:bCs/>
+        </w:rPr>
+        <w:t xml:space="preserve">P5</w:t>
+      </w:r>
+      <w:r>
+        <w:t xml:space="preserve"> </w:t>
+      </w:r>
+      <w:r>
+        <w:t xml:space="preserve">are stated here as falsifiable hypotheses for the validation and classroom agenda (Section 10),</w:t>
+      </w:r>
+      <w:r>
+        <w:t xml:space="preserve"> </w:t>
+      </w:r>
+      <w:r>
+        <w:t xml:space="preserve">not as claims the demo establishes. Each names a concrete test: P1 fails if a strong steering</w:t>
+      </w:r>
+      <w:r>
+        <w:t xml:space="preserve"> </w:t>
+      </w:r>
+      <w:r>
+        <w:t xml:space="preserve">intervention recovers grades after a deliberately malformed framing; P4 fails if Judging transfers</w:t>
+      </w:r>
+      <w:r>
+        <w:t xml:space="preserve"> </w:t>
+      </w:r>
+      <w:r>
+        <w:t xml:space="preserve">across domains as readily as Framing; P5 fails if exercising the loop does not reduce the offloading</w:t>
+      </w:r>
+      <w:r>
+        <w:t xml:space="preserve"> </w:t>
+      </w:r>
+      <w:r>
+        <w:t xml:space="preserve">signatures (for example, reduced post-task recall) documented in the cognitive-debt literature.</w:t>
       </w:r>
     </w:p>
     <w:bookmarkEnd w:id="32"/>
@@ -3694,13 +3812,13 @@
         <w:t xml:space="preserve"> </w:t>
       </w:r>
       <w:r>
-        <w:t xml:space="preserve">From a dashboard of assigned challenges (Figure 2), a student enters a</w:t>
-      </w:r>
-      <w:r>
-        <w:t xml:space="preserve"> </w:t>
-      </w:r>
-      <w:r>
-        <w:t xml:space="preserve">challenge run that walks through the framework’s two phases (Figure 3):</w:t>
+        <w:t xml:space="preserve">From a dashboard of assigned challenges (Figure A2), a student enters a</w:t>
+      </w:r>
+      <w:r>
+        <w:t xml:space="preserve"> </w:t>
+      </w:r>
+      <w:r>
+        <w:t xml:space="preserve">challenge run that walks through the framework’s two phases (Figure A1):</w:t>
       </w:r>
     </w:p>
     <w:p>
@@ -3862,7 +3980,7 @@
         <w:t xml:space="preserve"> </w:t>
       </w:r>
       <w:r>
-        <w:t xml:space="preserve">analytics (Figure 4) that track the three skills independently over time.</w:t>
+        <w:t xml:space="preserve">analytics (Figure A2) that track the three skills independently over time.</w:t>
       </w:r>
     </w:p>
     <w:p>
@@ -4219,7 +4337,7 @@
         <w:pStyle w:val="FirstParagraph"/>
       </w:pPr>
       <w:r>
-        <w:t xml:space="preserve">We exercise the instrument over controlled inputs to test two feasibility claims: that it</w:t>
+        <w:t xml:space="preserve">We exercise the instrument over controlled inputs to test three feasibility claims: that it</w:t>
       </w:r>
       <w:r>
         <w:t xml:space="preserve"> </w:t>
@@ -4235,7 +4353,7 @@
         <w:t xml:space="preserve"> </w:t>
       </w:r>
       <w:r>
-        <w:t xml:space="preserve">competence and that the three skills</w:t>
+        <w:t xml:space="preserve">competence, that the three skills</w:t>
       </w:r>
       <w:r>
         <w:t xml:space="preserve"> </w:t>
@@ -4251,7 +4369,23 @@
         <w:t xml:space="preserve"> </w:t>
       </w:r>
       <w:r>
-        <w:t xml:space="preserve">(Proposition P3). We make no</w:t>
+        <w:t xml:space="preserve">(Proposition P3), and that the grader is</w:t>
+      </w:r>
+      <w:r>
+        <w:t xml:space="preserve"> </w:t>
+      </w:r>
+      <w:r>
+        <w:rPr>
+          <w:i/>
+          <w:iCs/>
+        </w:rPr>
+        <w:t xml:space="preserve">self-consistent</w:t>
+      </w:r>
+      <w:r>
+        <w:t xml:space="preserve"> </w:t>
+      </w:r>
+      <w:r>
+        <w:t xml:space="preserve">enough to report. We make no</w:t>
       </w:r>
       <w:r>
         <w:t xml:space="preserve"> </w:t>
@@ -4838,6 +4972,154 @@
         <w:pStyle w:val="BodyText"/>
       </w:pPr>
       <w:r>
+        <w:t xml:space="preserve">The diagonal (own-skill) effects are statistically reliable: bootstrap 95% confidence intervals</w:t>
+      </w:r>
+      <w:r>
+        <w:t xml:space="preserve"> </w:t>
+      </w:r>
+      <w:r>
+        <w:t xml:space="preserve">(2,000 resamples) exclude zero for Framing (+0.60, CI [+0.38, +0.81]) and Steering (+0.50, CI</w:t>
+      </w:r>
+      <w:r>
+        <w:t xml:space="preserve"> </w:t>
+      </w:r>
+      <w:r>
+        <w:t xml:space="preserve">[+0.18, +0.82]); Judging is deterministic by construction (+2.00). The same separation appears in the</w:t>
+      </w:r>
+      <w:r>
+        <w:t xml:space="preserve"> </w:t>
+      </w:r>
+      <w:r>
+        <w:t xml:space="preserve">inter-skill grade correlations across the 40 learners: Framing–Judging</w:t>
+      </w:r>
+      <w:r>
+        <w:t xml:space="preserve"> </w:t>
+      </w:r>
+      <m:oMath>
+        <m:r>
+          <m:t>ρ</m:t>
+        </m:r>
+        <m:r>
+          <m:rPr>
+            <m:sty m:val="p"/>
+          </m:rPr>
+          <m:t>=</m:t>
+        </m:r>
+        <m:r>
+          <m:t>0.00</m:t>
+        </m:r>
+      </m:oMath>
+      <w:r>
+        <w:t xml:space="preserve">,</w:t>
+      </w:r>
+      <w:r>
+        <w:t xml:space="preserve"> </w:t>
+      </w:r>
+      <w:r>
+        <w:t xml:space="preserve">Framing–Steering</w:t>
+      </w:r>
+      <w:r>
+        <w:t xml:space="preserve"> </w:t>
+      </w:r>
+      <m:oMath>
+        <m:r>
+          <m:t>ρ</m:t>
+        </m:r>
+        <m:r>
+          <m:rPr>
+            <m:sty m:val="p"/>
+          </m:rPr>
+          <m:t>=</m:t>
+        </m:r>
+        <m:r>
+          <m:rPr>
+            <m:sty m:val="p"/>
+          </m:rPr>
+          <m:t>−</m:t>
+        </m:r>
+        <m:r>
+          <m:t>0.22</m:t>
+        </m:r>
+      </m:oMath>
+      <w:r>
+        <w:t xml:space="preserve">, Judging–Steering</w:t>
+      </w:r>
+      <w:r>
+        <w:t xml:space="preserve"> </w:t>
+      </w:r>
+      <m:oMath>
+        <m:r>
+          <m:t>ρ</m:t>
+        </m:r>
+        <m:r>
+          <m:rPr>
+            <m:sty m:val="p"/>
+          </m:rPr>
+          <m:t>=</m:t>
+        </m:r>
+        <m:r>
+          <m:rPr>
+            <m:sty m:val="p"/>
+          </m:rPr>
+          <m:t>+</m:t>
+        </m:r>
+        <m:r>
+          <m:t>0.17</m:t>
+        </m:r>
+      </m:oMath>
+      <w:r>
+        <w:t xml:space="preserve">, none significant (all</w:t>
+      </w:r>
+      <w:r>
+        <w:t xml:space="preserve"> </w:t>
+      </w:r>
+      <m:oMath>
+        <m:r>
+          <m:t>p</m:t>
+        </m:r>
+        <m:r>
+          <m:rPr>
+            <m:sty m:val="p"/>
+          </m:rPr>
+          <m:t>&gt;</m:t>
+        </m:r>
+        <m:r>
+          <m:t>0.17</m:t>
+        </m:r>
+      </m:oMath>
+      <w:r>
+        <w:t xml:space="preserve">),</w:t>
+      </w:r>
+      <w:r>
+        <w:t xml:space="preserve"> </w:t>
+      </w:r>
+      <w:r>
+        <w:t xml:space="preserve">and the first principal factor accounts for only 42% of the variance, far below the near-100% a single</w:t>
+      </w:r>
+      <w:r>
+        <w:t xml:space="preserve"> </w:t>
+      </w:r>
+      <w:r>
+        <w:t xml:space="preserve">“</w:t>
+      </w:r>
+      <w:r>
+        <w:t xml:space="preserve">AI-use ability</w:t>
+      </w:r>
+      <w:r>
+        <w:t xml:space="preserve">”</w:t>
+      </w:r>
+      <w:r>
+        <w:t xml:space="preserve"> </w:t>
+      </w:r>
+      <w:r>
+        <w:t xml:space="preserve">account would predict.</w:t>
+      </w:r>
+    </w:p>
+    <w:p>
+      <w:pPr>
+        <w:pStyle w:val="BodyText"/>
+      </w:pPr>
+      <w:r>
         <w:t xml:space="preserve">The designed-contrast personas make the separation concrete (Figure 3). A</w:t>
       </w:r>
       <w:r>
@@ -5130,6 +5412,108 @@
           <w:b/>
           <w:bCs/>
         </w:rPr>
+        <w:t xml:space="preserve">Reliability.</w:t>
+      </w:r>
+      <w:r>
+        <w:t xml:space="preserve"> </w:t>
+      </w:r>
+      <w:r>
+        <w:t xml:space="preserve">To check that the grades are not noise, we hold four learner transcripts fixed and</w:t>
+      </w:r>
+      <w:r>
+        <w:t xml:space="preserve"> </w:t>
+      </w:r>
+      <w:r>
+        <w:t xml:space="preserve">re-run the evaluation-and-grading prompts five times each (bypassing the cache so each repeat is an</w:t>
+      </w:r>
+      <w:r>
+        <w:t xml:space="preserve"> </w:t>
+      </w:r>
+      <w:r>
+        <w:t xml:space="preserve">independent sample at the production temperatures). The grader is</w:t>
+      </w:r>
+      <w:r>
+        <w:t xml:space="preserve"> </w:t>
+      </w:r>
+      <w:r>
+        <w:rPr>
+          <w:b/>
+          <w:bCs/>
+        </w:rPr>
+        <w:t xml:space="preserve">92% self-consistent</w:t>
+      </w:r>
+      <w:r>
+        <w:t xml:space="preserve"> </w:t>
+      </w:r>
+      <w:r>
+        <w:t xml:space="preserve">overall: the</w:t>
+      </w:r>
+      <w:r>
+        <w:t xml:space="preserve"> </w:t>
+      </w:r>
+      <w:r>
+        <w:t xml:space="preserve">mean grade-flip rate across repeats is 0.08, with Judging deterministic (0.00, by construction),</w:t>
+      </w:r>
+      <w:r>
+        <w:t xml:space="preserve"> </w:t>
+      </w:r>
+      <w:r>
+        <w:t xml:space="preserve">Framing 0.15, and Steering 0.10, and a mean within-cell grade standard deviation near 0.2 on the</w:t>
+      </w:r>
+      <w:r>
+        <w:t xml:space="preserve"> </w:t>
+      </w:r>
+      <w:r>
+        <w:t xml:space="preserve">three-point scale, indicating that disagreements are occasional one-level boundary jitter rather than</w:t>
+      </w:r>
+      <w:r>
+        <w:t xml:space="preserve"> </w:t>
+      </w:r>
+      <w:r>
+        <w:t xml:space="preserve">unstable scoring. This addresses the documented self-inconsistency of LLM judges, though it measures</w:t>
+      </w:r>
+      <w:r>
+        <w:t xml:space="preserve"> </w:t>
+      </w:r>
+      <w:r>
+        <w:rPr>
+          <w:i/>
+          <w:iCs/>
+        </w:rPr>
+        <w:t xml:space="preserve">precision</w:t>
+      </w:r>
+      <w:r>
+        <w:t xml:space="preserve"> </w:t>
+      </w:r>
+      <w:r>
+        <w:t xml:space="preserve">(repeatability), not</w:t>
+      </w:r>
+      <w:r>
+        <w:t xml:space="preserve"> </w:t>
+      </w:r>
+      <w:r>
+        <w:rPr>
+          <w:i/>
+          <w:iCs/>
+        </w:rPr>
+        <w:t xml:space="preserve">accuracy</w:t>
+      </w:r>
+      <w:r>
+        <w:t xml:space="preserve"> </w:t>
+      </w:r>
+      <w:r>
+        <w:t xml:space="preserve">against humans (Section 10).</w:t>
+      </w:r>
+    </w:p>
+    <w:p>
+      <w:pPr>
+        <w:pStyle w:val="BodyText"/>
+      </w:pPr>
+      <w:r>
+        <w:rPr>
+          <w:b/>
+          <w:bCs/>
+        </w:rPr>
         <w:t xml:space="preserve">Scope and caveats.</w:t>
       </w:r>
       <w:r>
@@ -5184,19 +5568,43 @@
         <w:t xml:space="preserve"> </w:t>
       </w:r>
       <w:r>
-        <w:t xml:space="preserve">under-identified, so we report the manipulation-based effect matrix rather than an exploratory factor</w:t>
-      </w:r>
-      <w:r>
-        <w:t xml:space="preserve"> </w:t>
-      </w:r>
-      <w:r>
-        <w:t xml:space="preserve">analysis. Steering shows the weakest own-effect, consistent with Proposition P2 (steering quality is</w:t>
-      </w:r>
-      <w:r>
-        <w:t xml:space="preserve"> </w:t>
-      </w:r>
-      <w:r>
-        <w:t xml:space="preserve">bounded, and partly confounded, by the judging it follows).</w:t>
+        <w:t xml:space="preserve">under-identified, so we report the manipulation-based effect matrix and the inter-skill correlations</w:t>
+      </w:r>
+      <w:r>
+        <w:t xml:space="preserve"> </w:t>
+      </w:r>
+      <w:r>
+        <w:t xml:space="preserve">rather than an exploratory factor analysis. (iv) Steering shows the weakest own-effect (+0.50); Figure</w:t>
+      </w:r>
+      <w:r>
+        <w:t xml:space="preserve"> </w:t>
+      </w:r>
+      <w:r>
+        <w:t xml:space="preserve">3 indicates a grader-leniency floor, weak steering is seldom graded all the way to C, which compresses</w:t>
+      </w:r>
+      <w:r>
+        <w:t xml:space="preserve"> </w:t>
+      </w:r>
+      <w:r>
+        <w:t xml:space="preserve">the effect. This is partly an instrument artifact (the steering evaluator is lenient and would benefit</w:t>
+      </w:r>
+      <w:r>
+        <w:t xml:space="preserve"> </w:t>
+      </w:r>
+      <w:r>
+        <w:t xml:space="preserve">from a stricter rubric) and partly the confound that Proposition P2 predicts (steering quality is</w:t>
+      </w:r>
+      <w:r>
+        <w:t xml:space="preserve"> </w:t>
+      </w:r>
+      <w:r>
+        <w:t xml:space="preserve">bounded by the judging it follows). Disentangling the two requires a harsher steering rubric and human</w:t>
+      </w:r>
+      <w:r>
+        <w:t xml:space="preserve"> </w:t>
+      </w:r>
+      <w:r>
+        <w:t xml:space="preserve">calibration, which we leave to the validation study.</w:t>
       </w:r>
     </w:p>
     <w:bookmarkEnd w:id="42"/>
@@ -5600,7 +6008,37 @@
         <w:t xml:space="preserve"> </w:t>
       </w:r>
       <w:r>
-        <w:t xml:space="preserve">(Feng et al., 2025), so automated grades must be validated against humans rather than assumed reliable. We have prepared this study (codebook, blinded</w:t>
+        <w:t xml:space="preserve">(Feng et al., 2025), so automated grades must be validated against humans rather than assumed reliable.</w:t>
+      </w:r>
+      <w:r>
+        <w:t xml:space="preserve"> </w:t>
+      </w:r>
+      <w:r>
+        <w:t xml:space="preserve">This exposes a recursive calibration threat, who grades the grader, that the framework must confront on</w:t>
+      </w:r>
+      <w:r>
+        <w:t xml:space="preserve"> </w:t>
+      </w:r>
+      <w:r>
+        <w:t xml:space="preserve">two levels: the per-skill grades require human-rater agreement (above), and the Judging construct</w:t>
+      </w:r>
+      <w:r>
+        <w:t xml:space="preserve"> </w:t>
+      </w:r>
+      <w:r>
+        <w:t xml:space="preserve">additionally rests on machine-seeded ground-truth issues, so a stratified subset of those seeded issues</w:t>
+      </w:r>
+      <w:r>
+        <w:t xml:space="preserve"> </w:t>
+      </w:r>
+      <w:r>
+        <w:t xml:space="preserve">will be verified by human domain experts to confirm they are genuine, non-spurious flaws before the</w:t>
+      </w:r>
+      <w:r>
+        <w:t xml:space="preserve"> </w:t>
+      </w:r>
+      <w:r>
+        <w:t xml:space="preserve">recall/precision signal can be trusted. We have prepared the agreement study (codebook, blinded</w:t>
       </w:r>
       <w:r>
         <w:t xml:space="preserve"> </w:t>
@@ -5666,19 +6104,31 @@
         <w:t xml:space="preserve"> </w:t>
       </w:r>
       <w:r>
-        <w:t xml:space="preserve">the grader has signal and that the skills can be measured apart, but which are not human learners. The</w:t>
-      </w:r>
-      <w:r>
-        <w:t xml:space="preserve"> </w:t>
-      </w:r>
-      <w:r>
-        <w:t xml:space="preserve">instrument is exercised with a single model family (llama-3.3-70b) on English-language challenges, and</w:t>
-      </w:r>
-      <w:r>
-        <w:t xml:space="preserve"> </w:t>
-      </w:r>
-      <w:r>
-        <w:t xml:space="preserve">the automated grades have not yet been validated against human experts (Section 10). We make no</w:t>
+        <w:t xml:space="preserve">the grader has signal and that the skills can be measured apart, but which are not human learners. To</w:t>
+      </w:r>
+      <w:r>
+        <w:t xml:space="preserve"> </w:t>
+      </w:r>
+      <w:r>
+        <w:t xml:space="preserve">avoid a model grading its own output, learners are generated by one model (gpt-4o-mini) and graded by</w:t>
+      </w:r>
+      <w:r>
+        <w:t xml:space="preserve"> </w:t>
+      </w:r>
+      <w:r>
+        <w:t xml:space="preserve">a different one (gpt-4o); the deployed prototype’s engine is llama-3.3-70b, and whether the dissociation</w:t>
+      </w:r>
+      <w:r>
+        <w:t xml:space="preserve"> </w:t>
+      </w:r>
+      <w:r>
+        <w:t xml:space="preserve">replicates across grader backends remains to be shown. The challenges are English-language, and the</w:t>
+      </w:r>
+      <w:r>
+        <w:t xml:space="preserve"> </w:t>
+      </w:r>
+      <w:r>
+        <w:t xml:space="preserve">automated grades have not yet been validated against human experts (Section 10). We make no</w:t>
       </w:r>
       <w:r>
         <w:t xml:space="preserve"> </w:t>
@@ -6083,7 +6533,7 @@
         <w:t xml:space="preserve"> </w:t>
       </w:r>
       <w:r>
-        <w:t xml:space="preserve">(43 entries, validated). See the repository for the BibTeX source.]</w:t>
+        <w:t xml:space="preserve">(50 entries, validated). See the repository for the BibTeX source.]</w:t>
       </w:r>
     </w:p>
     <w:bookmarkEnd w:id="54"/>

</xml_diff>

<commit_message>
Round 3 = Accept: fix blocking figure-path bug (B-1) + final polish
- Figures now in paper/assets/ AND docs/assets/: raw-markdown source links and the
  docx (--resource-path=paper) resolve from paper/; HTML uses docs/assets. make_figures.py
  writes both. Central evidence figures (heatmap, contrast) embed in docx; SVG diagrams
  render in HTML (alt-text in docx; no cairo on host).
- Precise dissociation ratio (diag +1.03 / off-diag -0.017); 255-call breakdown; bib=50.
- Review loop converged: round 3 = effectively Accept (paper/reviews/round3.md).

Co-Authored-By: Claude Opus 4.8 <noreply@anthropic.com>
</commit_message>
<xml_diff>
--- a/docs/coreasoning.docx
+++ b/docs/coreasoning.docx
@@ -4511,7 +4511,19 @@
         <w:t xml:space="preserve"> </w:t>
       </w:r>
       <w:r>
-        <w:t xml:space="preserve">learners and 255 blind grading calls. Framing and Steering responses are generated by the</w:t>
+        <w:t xml:space="preserve">learners and 255 blind grading calls (each learner is scored by up to seven grader calls, three</w:t>
+      </w:r>
+      <w:r>
+        <w:t xml:space="preserve"> </w:t>
+      </w:r>
+      <w:r>
+        <w:t xml:space="preserve">skill evaluators plus a grading pass each and one steering-update call, with identical inputs cached</w:t>
+      </w:r>
+      <w:r>
+        <w:t xml:space="preserve"> </w:t>
+      </w:r>
+      <w:r>
+        <w:t xml:space="preserve">across profiles). Framing and Steering responses are generated by the</w:t>
       </w:r>
       <w:r>
         <w:t xml:space="preserve"> </w:t>
@@ -4690,23 +4702,16 @@
           <w:b/>
           <w:bCs/>
         </w:rPr>
-        <w:t xml:space="preserve">−0.02</w:t>
-      </w:r>
-      <w:r>
-        <w:t xml:space="preserve">, a ratio of roughly</w:t>
-      </w:r>
-      <w:r>
-        <w:t xml:space="preserve"> </w:t>
-      </w:r>
-      <w:r>
-        <w:rPr>
-          <w:b/>
-          <w:bCs/>
-        </w:rPr>
-        <w:t xml:space="preserve">60 to 1</w:t>
-      </w:r>
-      <w:r>
-        <w:t xml:space="preserve">. Each</w:t>
+        <w:t xml:space="preserve">−0.017</w:t>
+      </w:r>
+      <w:r>
+        <w:t xml:space="preserve">, so own-skill effects exceed cross-skill</w:t>
+      </w:r>
+      <w:r>
+        <w:t xml:space="preserve"> </w:t>
+      </w:r>
+      <w:r>
+        <w:t xml:space="preserve">effects by more than an order of magnitude (about 60 to 1). Each</w:t>
       </w:r>
       <w:r>
         <w:t xml:space="preserve"> </w:t>

</xml_diff>

<commit_message>
Camera-ready: render full bibliography, cross-check all citations, polish
- Cross-checked every in-text citation against references.bib (render_bib.py):
  added proper citations for 9 entries that were uncited or cited only by name
  (Gilson & Goldberg, Jaakkola, Sadler, Salomon, Parasuraman, Vaccaro, Jin/GLAT,
  Sidra & Mason, Nazaretsky). All 50 entries now cited; bibtest 49/50 valid
  (Acar 2023 is a real HBR article, not Crossref-indexed).
- Render the 50-entry reference list into the References section (APA-style,
  hanging indent) via md_in_html; HTML is now camera-ready with all sections.
- Remove draft language; clean preprint subtitle + banner.

Co-Authored-By: Claude Opus 4.8 <noreply@anthropic.com>
</commit_message>
<xml_diff>
--- a/docs/coreasoning.docx
+++ b/docs/coreasoning.docx
@@ -20,10 +20,27 @@
           <w:i/>
           <w:iCs/>
         </w:rPr>
-        <w:t xml:space="preserve">Working draft — arXiv preprint. Target: Computers &amp; Education: AI (Position Paper) / AIED Blue Sky / IJAIED.</w:t>
-      </w:r>
-    </w:p>
-    <w:bookmarkStart w:id="20" w:name="abstract"/>
+        <w:t xml:space="preserve">Preprint. Open-source (MIT):</w:t>
+      </w:r>
+      <w:r>
+        <w:rPr>
+          <w:i/>
+          <w:iCs/>
+        </w:rPr>
+        <w:t xml:space="preserve"> </w:t>
+      </w:r>
+      <w:hyperlink r:id="rId20">
+        <w:r>
+          <w:rPr>
+            <w:rStyle w:val="Hyperlink"/>
+            <w:i/>
+            <w:iCs/>
+          </w:rPr>
+          <w:t xml:space="preserve">github.com/ApartsinProjects/CoReason</w:t>
+        </w:r>
+      </w:hyperlink>
+    </w:p>
+    <w:bookmarkStart w:id="21" w:name="abstract"/>
     <w:p>
       <w:pPr>
         <w:pStyle w:val="Heading2"/>
@@ -225,7 +242,7 @@
         <w:t xml:space="preserve">resolve and a concrete assessment-validation agenda.</w:t>
       </w:r>
     </w:p>
-    <w:bookmarkEnd w:id="20"/>
+    <w:bookmarkEnd w:id="21"/>
     <w:bookmarkStart w:id="22" w:name="introduction"/>
     <w:p>
       <w:pPr>
@@ -384,7 +401,25 @@
         <w:t xml:space="preserve"> </w:t>
       </w:r>
       <w:r>
-        <w:t xml:space="preserve">mode rather than wholesale delegation (Randazzo et al., 2025).</w:t>
+        <w:t xml:space="preserve">mode rather than wholesale delegation (Randazzo et al., 2025). Meta-analytic</w:t>
+      </w:r>
+      <w:r>
+        <w:t xml:space="preserve"> </w:t>
+      </w:r>
+      <w:r>
+        <w:t xml:space="preserve">evidence is sobering: human-AI teams frequently underperform the better of the human or the AI alone</w:t>
+      </w:r>
+      <w:r>
+        <w:t xml:space="preserve"> </w:t>
+      </w:r>
+      <w:r>
+        <w:t xml:space="preserve">(Vaccaro et al., 2024), which makes the human’s skill in directing the system, not mere access to it,</w:t>
+      </w:r>
+      <w:r>
+        <w:t xml:space="preserve"> </w:t>
+      </w:r>
+      <w:r>
+        <w:t xml:space="preserve">the decisive variable.</w:t>
       </w:r>
     </w:p>
     <w:p>
@@ -414,7 +449,57 @@
         <w:t xml:space="preserve"> </w:t>
       </w:r>
       <w:r>
-        <w:t xml:space="preserve">that some learners exercise and others do not. If that</w:t>
+        <w:t xml:space="preserve">that some learners exercise and others do not. This echoes the</w:t>
+      </w:r>
+      <w:r>
+        <w:t xml:space="preserve"> </w:t>
+      </w:r>
+      <w:r>
+        <w:t xml:space="preserve">long-standing distinction between the effects obtained</w:t>
+      </w:r>
+      <w:r>
+        <w:t xml:space="preserve"> </w:t>
+      </w:r>
+      <w:r>
+        <w:rPr>
+          <w:i/>
+          <w:iCs/>
+        </w:rPr>
+        <w:t xml:space="preserve">with</w:t>
+      </w:r>
+      <w:r>
+        <w:t xml:space="preserve"> </w:t>
+      </w:r>
+      <w:r>
+        <w:t xml:space="preserve">a technology during use and the cognitive</w:t>
+      </w:r>
+      <w:r>
+        <w:t xml:space="preserve"> </w:t>
+      </w:r>
+      <w:r>
+        <w:t xml:space="preserve">residue left</w:t>
+      </w:r>
+      <w:r>
+        <w:t xml:space="preserve"> </w:t>
+      </w:r>
+      <w:r>
+        <w:rPr>
+          <w:i/>
+          <w:iCs/>
+        </w:rPr>
+        <w:t xml:space="preserve">of</w:t>
+      </w:r>
+      <w:r>
+        <w:t xml:space="preserve"> </w:t>
+      </w:r>
+      <w:r>
+        <w:t xml:space="preserve">it, which depends on the learner’s mindful engagement in the partnership</w:t>
+      </w:r>
+      <w:r>
+        <w:t xml:space="preserve"> </w:t>
+      </w:r>
+      <w:r>
+        <w:t xml:space="preserve">(Salomon et al., 1991). If that</w:t>
       </w:r>
       <w:r>
         <w:t xml:space="preserve"> </w:t>
@@ -772,7 +857,13 @@
         <w:t xml:space="preserve"> </w:t>
       </w:r>
       <w:r>
-        <w:t xml:space="preserve">offloading), turning a taxonomy into a framework with empirical commitments.</w:t>
+        <w:t xml:space="preserve">offloading), which is what turns a taxonomy into a conceptual contribution that proposes new</w:t>
+      </w:r>
+      <w:r>
+        <w:t xml:space="preserve"> </w:t>
+      </w:r>
+      <w:r>
+        <w:t xml:space="preserve">relationships among constructs (Gilson &amp; Goldberg, 2015; Jaakkola, 2020).</w:t>
       </w:r>
     </w:p>
     <w:p>
@@ -927,7 +1018,7 @@
       <w:r>
         <w:t xml:space="preserve"> </w:t>
       </w:r>
-      <w:hyperlink r:id="rId21">
+      <w:hyperlink r:id="rId20">
         <w:r>
           <w:rPr>
             <w:rStyle w:val="Hyperlink"/>
@@ -2048,7 +2139,13 @@
         <w:t xml:space="preserve"> </w:t>
       </w:r>
       <w:r>
-        <w:t xml:space="preserve">decision-making (Bansal et al., 2021; Buçinca et al., 2021). That Judging is a trainable skill rather</w:t>
+        <w:t xml:space="preserve">decision-making (Bansal et al., 2021; Buçinca et al., 2021) and the broader automation-complacency it</w:t>
+      </w:r>
+      <w:r>
+        <w:t xml:space="preserve"> </w:t>
+      </w:r>
+      <w:r>
+        <w:t xml:space="preserve">extends (Parasuraman &amp; Manzey, 2010). That Judging is a trainable skill rather</w:t>
       </w:r>
       <w:r>
         <w:t xml:space="preserve"> </w:t>
@@ -2066,7 +2163,7 @@
         <w:t xml:space="preserve"> </w:t>
       </w:r>
       <w:r>
-        <w:t xml:space="preserve">work in Computers &amp; Education: AI on whether learners can evaluate AI output quality as experts do.</w:t>
+        <w:t xml:space="preserve">work on whether learners can evaluate AI output quality as experts do (Nazaretsky et al., 2025).</w:t>
       </w:r>
     </w:p>
     <w:p>
@@ -2102,7 +2199,13 @@
         <w:t xml:space="preserve"> </w:t>
       </w:r>
       <w:r>
-        <w:t xml:space="preserve">the corrective guidance, and its quality is well described by feed-forward, the</w:t>
+        <w:t xml:space="preserve">the corrective guidance; its quality depends on the learner monitoring the work against held standards</w:t>
+      </w:r>
+      <w:r>
+        <w:t xml:space="preserve"> </w:t>
+      </w:r>
+      <w:r>
+        <w:t xml:space="preserve">(Sadler, 1989) and is well described by feed-forward, the</w:t>
       </w:r>
       <w:r>
         <w:t xml:space="preserve"> </w:t>
@@ -3500,31 +3603,37 @@
         <w:t xml:space="preserve"> </w:t>
       </w:r>
       <w:r>
-        <w:t xml:space="preserve">for AI and generative-AI competence, including validated scales such as GenAIComp (with factors derived</w:t>
-      </w:r>
-      <w:r>
-        <w:t xml:space="preserve"> </w:t>
-      </w:r>
-      <w:r>
-        <w:t xml:space="preserve">from digital-competence frameworks) and assessment tests such as GLAT. These establish that GenAI</w:t>
-      </w:r>
-      <w:r>
-        <w:t xml:space="preserve"> </w:t>
-      </w:r>
-      <w:r>
-        <w:t xml:space="preserve">competence can be measured, but their factor structures are literacy-oriented (information literacy,</w:t>
-      </w:r>
-      <w:r>
-        <w:t xml:space="preserve"> </w:t>
-      </w:r>
-      <w:r>
-        <w:t xml:space="preserve">ethics, content creation) and do not isolate a Framing, Judging, or Steering construct. The work</w:t>
-      </w:r>
-      <w:r>
-        <w:t xml:space="preserve"> </w:t>
-      </w:r>
-      <w:r>
-        <w:t xml:space="preserve">closest to ours pairs AI-collaboration literacy with metacognition and includes an AI-evaluation</w:t>
+        <w:t xml:space="preserve">for AI and generative-AI competence, including validated scales such as GenAIComp (Lee et al., 2025;</w:t>
+      </w:r>
+      <w:r>
+        <w:t xml:space="preserve"> </w:t>
+      </w:r>
+      <w:r>
+        <w:t xml:space="preserve">with factors derived from digital-competence frameworks) and assessment tests such as GLAT</w:t>
+      </w:r>
+      <w:r>
+        <w:t xml:space="preserve"> </w:t>
+      </w:r>
+      <w:r>
+        <w:t xml:space="preserve">(Jin et al., 2024). These establish that GenAI competence can be measured, but their factor structures</w:t>
+      </w:r>
+      <w:r>
+        <w:t xml:space="preserve"> </w:t>
+      </w:r>
+      <w:r>
+        <w:t xml:space="preserve">are literacy-oriented (information literacy, ethics, content creation) and do not isolate a Framing,</w:t>
+      </w:r>
+      <w:r>
+        <w:t xml:space="preserve"> </w:t>
+      </w:r>
+      <w:r>
+        <w:t xml:space="preserve">Judging, or Steering construct. The work closest to ours pairs AI-collaboration literacy with</w:t>
+      </w:r>
+      <w:r>
+        <w:t xml:space="preserve"> </w:t>
+      </w:r>
+      <w:r>
+        <w:t xml:space="preserve">metacognition (Sidra &amp; Mason, 2025) and includes an AI-evaluation</w:t>
       </w:r>
       <w:r>
         <w:t xml:space="preserve"> </w:t>
@@ -6523,22 +6632,1055 @@
         <w:pStyle w:val="FirstParagraph"/>
       </w:pPr>
       <w:r>
-        <w:t xml:space="preserve">[Rendered from</w:t>
-      </w:r>
-      <w:r>
-        <w:t xml:space="preserve"> </w:t>
-      </w:r>
-      <w:r>
-        <w:rPr>
-          <w:rStyle w:val="VerbatimChar"/>
-        </w:rPr>
-        <w:t xml:space="preserve">references.bib</w:t>
-      </w:r>
-      <w:r>
-        <w:t xml:space="preserve"> </w:t>
-      </w:r>
-      <w:r>
-        <w:t xml:space="preserve">(50 entries, validated). See the repository for the BibTeX source.]</w:t>
+        <w:t xml:space="preserve">Acar, O. A. (2023). AI Prompt Engineering Isn’t the Future.</w:t>
+      </w:r>
+      <w:r>
+        <w:t xml:space="preserve"> </w:t>
+      </w:r>
+      <w:r>
+        <w:rPr>
+          <w:i/>
+          <w:iCs/>
+        </w:rPr>
+        <w:t xml:space="preserve">Harvard Business Review, June 6</w:t>
+      </w:r>
+      <w:r>
+        <w:t xml:space="preserve">.</w:t>
+      </w:r>
+    </w:p>
+    <w:p>
+      <w:pPr>
+        <w:pStyle w:val="BodyText"/>
+      </w:pPr>
+      <w:r>
+        <w:t xml:space="preserve">Anderson, L. W., &amp; Krathwohl, D. R. (2001). A Taxonomy for Learning, Teaching, and Assessing: A Revision of Bloom’s Taxonomy of Educational Objectives.</w:t>
+      </w:r>
+      <w:r>
+        <w:t xml:space="preserve"> </w:t>
+      </w:r>
+      <w:r>
+        <w:rPr>
+          <w:i/>
+          <w:iCs/>
+        </w:rPr>
+        <w:t xml:space="preserve">Longman</w:t>
+      </w:r>
+      <w:r>
+        <w:t xml:space="preserve">.</w:t>
+      </w:r>
+    </w:p>
+    <w:p>
+      <w:pPr>
+        <w:pStyle w:val="BodyText"/>
+      </w:pPr>
+      <w:r>
+        <w:t xml:space="preserve">Annapureddy, R., Fornaroli, A., &amp; Gatica-Perez, D. (2024). Generative AI Literacy: Twelve Defining Competencies.</w:t>
+      </w:r>
+      <w:r>
+        <w:t xml:space="preserve"> </w:t>
+      </w:r>
+      <w:r>
+        <w:rPr>
+          <w:i/>
+          <w:iCs/>
+        </w:rPr>
+        <w:t xml:space="preserve">Digital Government: Research and Practice</w:t>
+      </w:r>
+      <w:r>
+        <w:t xml:space="preserve">.</w:t>
+      </w:r>
+    </w:p>
+    <w:p>
+      <w:pPr>
+        <w:pStyle w:val="BodyText"/>
+      </w:pPr>
+      <w:r>
+        <w:t xml:space="preserve">Bansal, G., Wu, T., Zhou, J., Fok, R., Nushi, B., Kamar, E., Ribeiro, M. T., &amp; Weld, D. S. (2021). Does the Whole Exceed Its Parts? The Effect of AI Explanations on Complementary Team Performance.</w:t>
+      </w:r>
+      <w:r>
+        <w:t xml:space="preserve"> </w:t>
+      </w:r>
+      <w:r>
+        <w:rPr>
+          <w:i/>
+          <w:iCs/>
+        </w:rPr>
+        <w:t xml:space="preserve">Proceedings of the 2021 CHI Conference on Human Factors in Computing Systems</w:t>
+      </w:r>
+      <w:r>
+        <w:t xml:space="preserve">.</w:t>
+      </w:r>
+    </w:p>
+    <w:p>
+      <w:pPr>
+        <w:pStyle w:val="BodyText"/>
+      </w:pPr>
+      <w:r>
+        <w:t xml:space="preserve">Barzilai, S., &amp; Chinn, C. A. (2018). On the Goals of Epistemic Education: Promoting Apt Epistemic Performance.</w:t>
+      </w:r>
+      <w:r>
+        <w:t xml:space="preserve"> </w:t>
+      </w:r>
+      <w:r>
+        <w:rPr>
+          <w:i/>
+          <w:iCs/>
+        </w:rPr>
+        <w:t xml:space="preserve">Journal of the Learning Sciences</w:t>
+      </w:r>
+      <w:r>
+        <w:t xml:space="preserve">, 27(3), 353–389.</w:t>
+      </w:r>
+    </w:p>
+    <w:p>
+      <w:pPr>
+        <w:pStyle w:val="BodyText"/>
+      </w:pPr>
+      <w:r>
+        <w:t xml:space="preserve">Bjork, E. L., &amp; Bjork, R. A. (2011). Making Things Hard on Yourself, but in a Good Way: Creating Desirable Difficulties to Enhance Learning.</w:t>
+      </w:r>
+      <w:r>
+        <w:t xml:space="preserve"> </w:t>
+      </w:r>
+      <w:r>
+        <w:rPr>
+          <w:i/>
+          <w:iCs/>
+        </w:rPr>
+        <w:t xml:space="preserve">Psychology and the Real World</w:t>
+      </w:r>
+      <w:r>
+        <w:t xml:space="preserve">, 56–64.</w:t>
+      </w:r>
+    </w:p>
+    <w:p>
+      <w:pPr>
+        <w:pStyle w:val="BodyText"/>
+      </w:pPr>
+      <w:r>
+        <w:t xml:space="preserve">Bu{</w:t>
+      </w:r>
+      <w:r>
+        <w:t xml:space="preserve">}inca, Z., Malaya, M. B., &amp; Gajos, K. Z. (2021). To Trust or to Think: Cognitive Forcing Functions Can Reduce Overreliance on AI in AI-Assisted Decision-Making.</w:t>
+      </w:r>
+      <w:r>
+        <w:t xml:space="preserve"> </w:t>
+      </w:r>
+      <w:r>
+        <w:rPr>
+          <w:i/>
+          <w:iCs/>
+        </w:rPr>
+        <w:t xml:space="preserve">Proceedings of the ACM on Human-Computer Interaction</w:t>
+      </w:r>
+      <w:r>
+        <w:t xml:space="preserve">, 5(CSCW1), 1–21.</w:t>
+      </w:r>
+    </w:p>
+    <w:p>
+      <w:pPr>
+        <w:pStyle w:val="BodyText"/>
+      </w:pPr>
+      <w:r>
+        <w:t xml:space="preserve">Chi, M. T. H., &amp; Wylie, R. (2014). The ICAP Framework: Linking Cognitive Engagement to Active Learning Outcomes.</w:t>
+      </w:r>
+      <w:r>
+        <w:t xml:space="preserve"> </w:t>
+      </w:r>
+      <w:r>
+        <w:rPr>
+          <w:i/>
+          <w:iCs/>
+        </w:rPr>
+        <w:t xml:space="preserve">Educational Psychologist</w:t>
+      </w:r>
+      <w:r>
+        <w:t xml:space="preserve">, 49(4), 219–243.</w:t>
+      </w:r>
+    </w:p>
+    <w:p>
+      <w:pPr>
+        <w:pStyle w:val="BodyText"/>
+      </w:pPr>
+      <w:r>
+        <w:t xml:space="preserve">Clerc, O., Abdelghani, R., Desvaux, C., Poisson, E., Oudeyer, P., &amp; Sauz{'e}on, H. (2026). Teaching Students to Question the Machine: An AI Literacy Intervention Improves Students’ Regulation of LLM Use in a Science Task.</w:t>
+      </w:r>
+      <w:r>
+        <w:t xml:space="preserve"> </w:t>
+      </w:r>
+      <w:r>
+        <w:rPr>
+          <w:i/>
+          <w:iCs/>
+        </w:rPr>
+        <w:t xml:space="preserve">arXiv preprint arXiv:2604.01955</w:t>
+      </w:r>
+      <w:r>
+        <w:t xml:space="preserve">.</w:t>
+      </w:r>
+    </w:p>
+    <w:p>
+      <w:pPr>
+        <w:pStyle w:val="BodyText"/>
+      </w:pPr>
+      <w:r>
+        <w:t xml:space="preserve">Collins, A., Brown, J. S., &amp; Newman, S. E. (1989). Cognitive Apprenticeship: Teaching the Crafts of Reading, Writing, and Mathematics.</w:t>
+      </w:r>
+      <w:r>
+        <w:t xml:space="preserve"> </w:t>
+      </w:r>
+      <w:r>
+        <w:rPr>
+          <w:i/>
+          <w:iCs/>
+        </w:rPr>
+        <w:t xml:space="preserve">Knowing, Learning, and Instruction: Essays in Honor of Robert Glaser</w:t>
+      </w:r>
+      <w:r>
+        <w:t xml:space="preserve">, 453–494.</w:t>
+      </w:r>
+    </w:p>
+    <w:p>
+      <w:pPr>
+        <w:pStyle w:val="BodyText"/>
+      </w:pPr>
+      <w:r>
+        <w:t xml:space="preserve">Dakan, R., &amp; Feller, J. (2025). Framework for AI Fluency.</w:t>
+      </w:r>
+      <w:r>
+        <w:t xml:space="preserve"> </w:t>
+      </w:r>
+      <w:r>
+        <w:rPr>
+          <w:i/>
+          <w:iCs/>
+        </w:rPr>
+        <w:t xml:space="preserve">Anthropic</w:t>
+      </w:r>
+      <w:r>
+        <w:t xml:space="preserve">.</w:t>
+      </w:r>
+    </w:p>
+    <w:p>
+      <w:pPr>
+        <w:pStyle w:val="BodyText"/>
+      </w:pPr>
+      <w:r>
+        <w:t xml:space="preserve">Dell’Acqua, F., McFowland III, E., Mollick, E., Lifshitz-Assaf, H., Kellogg, K., Rajendran, S., Krayer, L., Candelon, F., &amp; Lakhani, K. R. (2023). Navigating the Jagged Technological Frontier.</w:t>
+      </w:r>
+      <w:r>
+        <w:t xml:space="preserve"> </w:t>
+      </w:r>
+      <w:r>
+        <w:rPr>
+          <w:i/>
+          <w:iCs/>
+        </w:rPr>
+        <w:t xml:space="preserve">Harvard Business School Working Paper 24-013</w:t>
+      </w:r>
+      <w:r>
+        <w:t xml:space="preserve">.</w:t>
+      </w:r>
+    </w:p>
+    <w:p>
+      <w:pPr>
+        <w:pStyle w:val="BodyText"/>
+      </w:pPr>
+      <w:r>
+        <w:t xml:space="preserve">Denny, P., Leinonen, J., Prather, J., Luxton-Reilly, A., Amarouche, T., Becker, B. A., &amp; Reeves, B. N. (2024). Prompt Problems: A New Programming Exercise for the Generative AI Era.</w:t>
+      </w:r>
+      <w:r>
+        <w:t xml:space="preserve"> </w:t>
+      </w:r>
+      <w:r>
+        <w:rPr>
+          <w:i/>
+          <w:iCs/>
+        </w:rPr>
+        <w:t xml:space="preserve">Proceedings of the 55th ACM Technical Symposium on Computer Science Education (SIGCSE)</w:t>
+      </w:r>
+      <w:r>
+        <w:t xml:space="preserve">.</w:t>
+      </w:r>
+    </w:p>
+    <w:p>
+      <w:pPr>
+        <w:pStyle w:val="BodyText"/>
+      </w:pPr>
+      <w:r>
+        <w:t xml:space="preserve">Di Santi, E. (2026). Cognitive Amplification vs Cognitive Delegation in Human-AI Systems: A Metric Framework.</w:t>
+      </w:r>
+      <w:r>
+        <w:t xml:space="preserve"> </w:t>
+      </w:r>
+      <w:r>
+        <w:rPr>
+          <w:i/>
+          <w:iCs/>
+        </w:rPr>
+        <w:t xml:space="preserve">arXiv preprint arXiv:2603.18677</w:t>
+      </w:r>
+      <w:r>
+        <w:t xml:space="preserve">.</w:t>
+      </w:r>
+    </w:p>
+    <w:p>
+      <w:pPr>
+        <w:pStyle w:val="BodyText"/>
+      </w:pPr>
+      <w:r>
+        <w:t xml:space="preserve">Facione, P. A. (1990). Critical Thinking: A Statement of Expert Consensus for Purposes of Educational Assessment and Instruction (The Delphi Report).</w:t>
+      </w:r>
+      <w:r>
+        <w:t xml:space="preserve"> </w:t>
+      </w:r>
+      <w:r>
+        <w:rPr>
+          <w:i/>
+          <w:iCs/>
+        </w:rPr>
+        <w:t xml:space="preserve">American Philosophical Association</w:t>
+      </w:r>
+      <w:r>
+        <w:t xml:space="preserve">.</w:t>
+      </w:r>
+    </w:p>
+    <w:p>
+      <w:pPr>
+        <w:pStyle w:val="BodyText"/>
+      </w:pPr>
+      <w:r>
+        <w:t xml:space="preserve">Feng, Y., Wang, S., Cheng, Z., Wan, Y., &amp; Chen, D. (2025). Are We on the Right Way to Assessing LLM-as-a-Judge?.</w:t>
+      </w:r>
+      <w:r>
+        <w:t xml:space="preserve"> </w:t>
+      </w:r>
+      <w:r>
+        <w:rPr>
+          <w:i/>
+          <w:iCs/>
+        </w:rPr>
+        <w:t xml:space="preserve">arXiv preprint arXiv:2512.16041</w:t>
+      </w:r>
+      <w:r>
+        <w:t xml:space="preserve">.</w:t>
+      </w:r>
+    </w:p>
+    <w:p>
+      <w:pPr>
+        <w:pStyle w:val="BodyText"/>
+      </w:pPr>
+      <w:r>
+        <w:t xml:space="preserve">Fernandes, D., Villa, S., Nicholls, S., Haavisto, O., Buschek, D., Schmidt, A., Kosch, T., Shen, C., &amp; Welsch, R. (2024). Performance and Metacognition Disconnect when Reasoning in Human-AI Interaction.</w:t>
+      </w:r>
+      <w:r>
+        <w:t xml:space="preserve"> </w:t>
+      </w:r>
+      <w:r>
+        <w:rPr>
+          <w:i/>
+          <w:iCs/>
+        </w:rPr>
+        <w:t xml:space="preserve">arXiv preprint arXiv:2409.16708</w:t>
+      </w:r>
+      <w:r>
+        <w:t xml:space="preserve">.</w:t>
+      </w:r>
+    </w:p>
+    <w:p>
+      <w:pPr>
+        <w:pStyle w:val="BodyText"/>
+      </w:pPr>
+      <w:r>
+        <w:t xml:space="preserve">Flavell, J. H. (1979). Metacognition and Cognitive Monitoring: A New Area of Cognitive-Developmental Inquiry.</w:t>
+      </w:r>
+      <w:r>
+        <w:t xml:space="preserve"> </w:t>
+      </w:r>
+      <w:r>
+        <w:rPr>
+          <w:i/>
+          <w:iCs/>
+        </w:rPr>
+        <w:t xml:space="preserve">American Psychologist</w:t>
+      </w:r>
+      <w:r>
+        <w:t xml:space="preserve">, 34(10), 906–911.</w:t>
+      </w:r>
+    </w:p>
+    <w:p>
+      <w:pPr>
+        <w:pStyle w:val="BodyText"/>
+      </w:pPr>
+      <w:r>
+        <w:t xml:space="preserve">Gerlich, M. (2025). AI Tools in Society: Impacts on Cognitive Offloading and the Future of Critical Thinking.</w:t>
+      </w:r>
+      <w:r>
+        <w:t xml:space="preserve"> </w:t>
+      </w:r>
+      <w:r>
+        <w:rPr>
+          <w:i/>
+          <w:iCs/>
+        </w:rPr>
+        <w:t xml:space="preserve">Societies</w:t>
+      </w:r>
+      <w:r>
+        <w:t xml:space="preserve">, 15(1), 6.</w:t>
+      </w:r>
+    </w:p>
+    <w:p>
+      <w:pPr>
+        <w:pStyle w:val="BodyText"/>
+      </w:pPr>
+      <w:r>
+        <w:t xml:space="preserve">Gilson, L. L., &amp; Goldberg, C. B. (2015). Editors’ Comment: So, What Is a Conceptual Paper?.</w:t>
+      </w:r>
+      <w:r>
+        <w:t xml:space="preserve"> </w:t>
+      </w:r>
+      <w:r>
+        <w:rPr>
+          <w:i/>
+          <w:iCs/>
+        </w:rPr>
+        <w:t xml:space="preserve">Group &amp; Organization Management</w:t>
+      </w:r>
+      <w:r>
+        <w:t xml:space="preserve">, 40(2), 127–130. https://doi.org/10.1177/1059601115576425</w:t>
+      </w:r>
+    </w:p>
+    <w:p>
+      <w:pPr>
+        <w:pStyle w:val="BodyText"/>
+      </w:pPr>
+      <w:r>
+        <w:t xml:space="preserve">Gu, X., &amp; Ericson, B. J. (2025). AI Literacy in K-12 and Higher Education in the Wake of Generative AI: An Integrative Review.</w:t>
+      </w:r>
+      <w:r>
+        <w:t xml:space="preserve"> </w:t>
+      </w:r>
+      <w:r>
+        <w:rPr>
+          <w:i/>
+          <w:iCs/>
+        </w:rPr>
+        <w:t xml:space="preserve">Proceedings of the 2025 ACM Conference on International Computing Education Research (ICER)</w:t>
+      </w:r>
+      <w:r>
+        <w:t xml:space="preserve">, 125–140. https://doi.org/10.1145/3702652.3744217</w:t>
+      </w:r>
+    </w:p>
+    <w:p>
+      <w:pPr>
+        <w:pStyle w:val="BodyText"/>
+      </w:pPr>
+      <w:r>
+        <w:t xml:space="preserve">Hattie, J., &amp; Timperley, H. (2007). The Power of Feedback.</w:t>
+      </w:r>
+      <w:r>
+        <w:t xml:space="preserve"> </w:t>
+      </w:r>
+      <w:r>
+        <w:rPr>
+          <w:i/>
+          <w:iCs/>
+        </w:rPr>
+        <w:t xml:space="preserve">Review of Educational Research</w:t>
+      </w:r>
+      <w:r>
+        <w:t xml:space="preserve">, 77(1), 81–112.</w:t>
+      </w:r>
+    </w:p>
+    <w:p>
+      <w:pPr>
+        <w:pStyle w:val="BodyText"/>
+      </w:pPr>
+      <w:r>
+        <w:t xml:space="preserve">Jaakkola, E. (2020). Designing Conceptual Articles: Four Approaches.</w:t>
+      </w:r>
+      <w:r>
+        <w:t xml:space="preserve"> </w:t>
+      </w:r>
+      <w:r>
+        <w:rPr>
+          <w:i/>
+          <w:iCs/>
+        </w:rPr>
+        <w:t xml:space="preserve">AMS Review</w:t>
+      </w:r>
+      <w:r>
+        <w:t xml:space="preserve">, 10, 18–26.</w:t>
+      </w:r>
+    </w:p>
+    <w:p>
+      <w:pPr>
+        <w:pStyle w:val="BodyText"/>
+      </w:pPr>
+      <w:r>
+        <w:t xml:space="preserve">Jin, Y., Martinez-Maldonado, R., Ga{</w:t>
+      </w:r>
+      <w:r>
+        <w:t xml:space="preserve">}evi{'c}, D., &amp; Yan, L. (2024). GLAT: The Generative AI Literacy Assessment Test.</w:t>
+      </w:r>
+      <w:r>
+        <w:t xml:space="preserve"> </w:t>
+      </w:r>
+      <w:r>
+        <w:rPr>
+          <w:i/>
+          <w:iCs/>
+        </w:rPr>
+        <w:t xml:space="preserve">arXiv preprint arXiv:2411.00283</w:t>
+      </w:r>
+      <w:r>
+        <w:t xml:space="preserve">.</w:t>
+      </w:r>
+    </w:p>
+    <w:p>
+      <w:pPr>
+        <w:pStyle w:val="BodyText"/>
+      </w:pPr>
+      <w:r>
+        <w:t xml:space="preserve">Kapur, M. (2008). Productive Failure.</w:t>
+      </w:r>
+      <w:r>
+        <w:t xml:space="preserve"> </w:t>
+      </w:r>
+      <w:r>
+        <w:rPr>
+          <w:i/>
+          <w:iCs/>
+        </w:rPr>
+        <w:t xml:space="preserve">Cognition and Instruction</w:t>
+      </w:r>
+      <w:r>
+        <w:t xml:space="preserve">, 26(3), 379–424.</w:t>
+      </w:r>
+    </w:p>
+    <w:p>
+      <w:pPr>
+        <w:pStyle w:val="BodyText"/>
+      </w:pPr>
+      <w:r>
+        <w:t xml:space="preserve">Kim, P., Wang, W., &amp; Bonk, C. J. (2025). Generative AI as a Coach to Help Students Enhance Proficiency in Question Formulation.</w:t>
+      </w:r>
+      <w:r>
+        <w:t xml:space="preserve"> </w:t>
+      </w:r>
+      <w:r>
+        <w:rPr>
+          <w:i/>
+          <w:iCs/>
+        </w:rPr>
+        <w:t xml:space="preserve">Journal of Educational Computing Research</w:t>
+      </w:r>
+      <w:r>
+        <w:t xml:space="preserve">, 63(3), 565–586. https://doi.org/10.1177/07356331251314222</w:t>
+      </w:r>
+    </w:p>
+    <w:p>
+      <w:pPr>
+        <w:pStyle w:val="BodyText"/>
+      </w:pPr>
+      <w:r>
+        <w:t xml:space="preserve">Kosmyna, N., Hauptmann, E., Yuan, Y. T., Situ, J., Liao, X., Beresnitzky, A. V., Braunstein, I., &amp; Maes, P. (2025). Your Brain on ChatGPT: Accumulation of Cognitive Debt when Using an AI Assistant for Essay Writing Task.</w:t>
+      </w:r>
+      <w:r>
+        <w:t xml:space="preserve"> </w:t>
+      </w:r>
+      <w:r>
+        <w:rPr>
+          <w:i/>
+          <w:iCs/>
+        </w:rPr>
+        <w:t xml:space="preserve">arXiv preprint arXiv:2506.08872</w:t>
+      </w:r>
+      <w:r>
+        <w:t xml:space="preserve">.</w:t>
+      </w:r>
+    </w:p>
+    <w:p>
+      <w:pPr>
+        <w:pStyle w:val="BodyText"/>
+      </w:pPr>
+      <w:r>
+        <w:t xml:space="preserve">Lee, J. D., &amp; See, K. A. (2004). Trust in Automation: Designing for Appropriate Reliance.</w:t>
+      </w:r>
+      <w:r>
+        <w:t xml:space="preserve"> </w:t>
+      </w:r>
+      <w:r>
+        <w:rPr>
+          <w:i/>
+          <w:iCs/>
+        </w:rPr>
+        <w:t xml:space="preserve">Human Factors</w:t>
+      </w:r>
+      <w:r>
+        <w:t xml:space="preserve">, 46(1), 50–80.</w:t>
+      </w:r>
+    </w:p>
+    <w:p>
+      <w:pPr>
+        <w:pStyle w:val="BodyText"/>
+      </w:pPr>
+      <w:r>
+        <w:t xml:space="preserve">Lee, S. C., Baby, T., Vongvit, R., Lee, J., Kim, Y., Min, C., &amp; Yoon, S. H. (2025). Development and Validation of a Generative AI Competence Scale.</w:t>
+      </w:r>
+      <w:r>
+        <w:t xml:space="preserve"> </w:t>
+      </w:r>
+      <w:r>
+        <w:rPr>
+          <w:i/>
+          <w:iCs/>
+        </w:rPr>
+        <w:t xml:space="preserve">Technology in Society</w:t>
+      </w:r>
+      <w:r>
+        <w:t xml:space="preserve">. https://doi.org/10.1016/j.techsoc.2025.103059</w:t>
+      </w:r>
+    </w:p>
+    <w:p>
+      <w:pPr>
+        <w:pStyle w:val="BodyText"/>
+      </w:pPr>
+      <w:r>
+        <w:t xml:space="preserve">Li, C., Cui, H., &amp; Hagedorn, L. S. (2026). The Cognitive Impact of ChatGPT in Higher Education: A Systematic Review of Critical and Creative Thinking Outcomes.</w:t>
+      </w:r>
+      <w:r>
+        <w:t xml:space="preserve"> </w:t>
+      </w:r>
+      <w:r>
+        <w:rPr>
+          <w:i/>
+          <w:iCs/>
+        </w:rPr>
+        <w:t xml:space="preserve">Computers and Education: Artificial Intelligence</w:t>
+      </w:r>
+      <w:r>
+        <w:t xml:space="preserve">, 10, 100571. https://doi.org/10.1016/j.caeai.2026.100571</w:t>
+      </w:r>
+    </w:p>
+    <w:p>
+      <w:pPr>
+        <w:pStyle w:val="BodyText"/>
+      </w:pPr>
+      <w:r>
+        <w:t xml:space="preserve">Lo, L. S. (2023). The CLEAR Path: A Framework for Enhancing Information Literacy through Prompt Engineering.</w:t>
+      </w:r>
+      <w:r>
+        <w:t xml:space="preserve"> </w:t>
+      </w:r>
+      <w:r>
+        <w:rPr>
+          <w:i/>
+          <w:iCs/>
+        </w:rPr>
+        <w:t xml:space="preserve">The Journal of Academic Librarianship</w:t>
+      </w:r>
+      <w:r>
+        <w:t xml:space="preserve">, 49(4).</w:t>
+      </w:r>
+    </w:p>
+    <w:p>
+      <w:pPr>
+        <w:pStyle w:val="BodyText"/>
+      </w:pPr>
+      <w:r>
+        <w:t xml:space="preserve">Long, D., &amp; Magerko, B. (2020). What Is AI Literacy? Competencies and Design Considerations.</w:t>
+      </w:r>
+      <w:r>
+        <w:t xml:space="preserve"> </w:t>
+      </w:r>
+      <w:r>
+        <w:rPr>
+          <w:i/>
+          <w:iCs/>
+        </w:rPr>
+        <w:t xml:space="preserve">Proceedings of the 2020 CHI Conference on Human Factors in Computing Systems</w:t>
+      </w:r>
+      <w:r>
+        <w:t xml:space="preserve">, 1–16.</w:t>
+      </w:r>
+    </w:p>
+    <w:p>
+      <w:pPr>
+        <w:pStyle w:val="BodyText"/>
+      </w:pPr>
+      <w:r>
+        <w:t xml:space="preserve">Nazaretsky, T., Gabbay, H., &amp; K{"a}ser, T. (2025). Can Students Judge Like Experts? A Large-Scale Study on AI and Human Personalized Formative Feedback.</w:t>
+      </w:r>
+      <w:r>
+        <w:t xml:space="preserve"> </w:t>
+      </w:r>
+      <w:r>
+        <w:rPr>
+          <w:i/>
+          <w:iCs/>
+        </w:rPr>
+        <w:t xml:space="preserve">Computers and Education: Artificial Intelligence</w:t>
+      </w:r>
+      <w:r>
+        <w:t xml:space="preserve">. https://doi.org/10.1016/j.caeai.2025.100533</w:t>
+      </w:r>
+    </w:p>
+    <w:p>
+      <w:pPr>
+        <w:pStyle w:val="BodyText"/>
+      </w:pPr>
+      <w:r>
+        <w:t xml:space="preserve">Nelson, T. O., &amp; Narens, L. (1990). Metamemory: A Theoretical Framework and New Findings.</w:t>
+      </w:r>
+      <w:r>
+        <w:t xml:space="preserve"> </w:t>
+      </w:r>
+      <w:r>
+        <w:rPr>
+          <w:i/>
+          <w:iCs/>
+        </w:rPr>
+        <w:t xml:space="preserve">The Psychology of Learning and Motivation</w:t>
+      </w:r>
+      <w:r>
+        <w:t xml:space="preserve">, 26, 125–173.</w:t>
+      </w:r>
+    </w:p>
+    <w:p>
+      <w:pPr>
+        <w:pStyle w:val="BodyText"/>
+      </w:pPr>
+      <w:r>
+        <w:t xml:space="preserve">Parasuraman, R., &amp; Manzey, D. H. (2010). Complacency and Bias in Human Use of Automation: An Attentional Integration.</w:t>
+      </w:r>
+      <w:r>
+        <w:t xml:space="preserve"> </w:t>
+      </w:r>
+      <w:r>
+        <w:rPr>
+          <w:i/>
+          <w:iCs/>
+        </w:rPr>
+        <w:t xml:space="preserve">Human Factors</w:t>
+      </w:r>
+      <w:r>
+        <w:t xml:space="preserve">, 52(3), 381–410.</w:t>
+      </w:r>
+    </w:p>
+    <w:p>
+      <w:pPr>
+        <w:pStyle w:val="BodyText"/>
+      </w:pPr>
+      <w:r>
+        <w:t xml:space="preserve">Paul, R., &amp; Elder, L. (2006). The Miniature Guide to Critical Thinking: Concepts and Tools.</w:t>
+      </w:r>
+      <w:r>
+        <w:t xml:space="preserve"> </w:t>
+      </w:r>
+      <w:r>
+        <w:rPr>
+          <w:i/>
+          <w:iCs/>
+        </w:rPr>
+        <w:t xml:space="preserve">Foundation for Critical Thinking</w:t>
+      </w:r>
+      <w:r>
+        <w:t xml:space="preserve">.</w:t>
+      </w:r>
+    </w:p>
+    <w:p>
+      <w:pPr>
+        <w:pStyle w:val="BodyText"/>
+      </w:pPr>
+      <w:r>
+        <w:t xml:space="preserve">Randazzo, B., Lifshitz-Assaf, H., Kellogg, K., Dell’Acqua, F., Mollick, E., Candelon, F., &amp; Lakhani, K. R. (2025). Cyborgs, Centaurs and Self-Automators: Modes of Human-AI Collaboration in Knowledge Work.</w:t>
+      </w:r>
+      <w:r>
+        <w:t xml:space="preserve"> </w:t>
+      </w:r>
+      <w:r>
+        <w:rPr>
+          <w:i/>
+          <w:iCs/>
+        </w:rPr>
+        <w:t xml:space="preserve">Harvard Business School Working Paper 26-036</w:t>
+      </w:r>
+      <w:r>
+        <w:t xml:space="preserve">.</w:t>
+      </w:r>
+    </w:p>
+    <w:p>
+      <w:pPr>
+        <w:pStyle w:val="BodyText"/>
+      </w:pPr>
+      <w:r>
+        <w:t xml:space="preserve">Runco, M. A., &amp; Chand, I. (1995). Cognition and Creativity.</w:t>
+      </w:r>
+      <w:r>
+        <w:t xml:space="preserve"> </w:t>
+      </w:r>
+      <w:r>
+        <w:rPr>
+          <w:i/>
+          <w:iCs/>
+        </w:rPr>
+        <w:t xml:space="preserve">Educational Psychology Review</w:t>
+      </w:r>
+      <w:r>
+        <w:t xml:space="preserve">, 7(3), 243–267.</w:t>
+      </w:r>
+    </w:p>
+    <w:p>
+      <w:pPr>
+        <w:pStyle w:val="BodyText"/>
+      </w:pPr>
+      <w:r>
+        <w:t xml:space="preserve">Sadler, D. R. (1989). Formative Assessment and the Design of Instructional Systems.</w:t>
+      </w:r>
+      <w:r>
+        <w:t xml:space="preserve"> </w:t>
+      </w:r>
+      <w:r>
+        <w:rPr>
+          <w:i/>
+          <w:iCs/>
+        </w:rPr>
+        <w:t xml:space="preserve">Instructional Science</w:t>
+      </w:r>
+      <w:r>
+        <w:t xml:space="preserve">, 18(2), 119–144.</w:t>
+      </w:r>
+    </w:p>
+    <w:p>
+      <w:pPr>
+        <w:pStyle w:val="BodyText"/>
+      </w:pPr>
+      <w:r>
+        <w:t xml:space="preserve">Salomon, G., Perkins, D. N., &amp; Globerson, T. (1991). Partners in Cognition: Extending Human Intelligence with Intelligent Technologies.</w:t>
+      </w:r>
+      <w:r>
+        <w:t xml:space="preserve"> </w:t>
+      </w:r>
+      <w:r>
+        <w:rPr>
+          <w:i/>
+          <w:iCs/>
+        </w:rPr>
+        <w:t xml:space="preserve">Educational Researcher</w:t>
+      </w:r>
+      <w:r>
+        <w:t xml:space="preserve">, 20(3), 2–9.</w:t>
+      </w:r>
+    </w:p>
+    <w:p>
+      <w:pPr>
+        <w:pStyle w:val="BodyText"/>
+      </w:pPr>
+      <w:r>
+        <w:t xml:space="preserve">Sidra, S., &amp; Mason, C. (2025). Generative AI in Human-AI Collaboration: Validation of the Collaborative AI Literacy and Collaborative AI Metacognition Scales.</w:t>
+      </w:r>
+      <w:r>
+        <w:t xml:space="preserve"> </w:t>
+      </w:r>
+      <w:r>
+        <w:rPr>
+          <w:i/>
+          <w:iCs/>
+        </w:rPr>
+        <w:t xml:space="preserve">International Journal of Human-Computer Interaction</w:t>
+      </w:r>
+      <w:r>
+        <w:t xml:space="preserve">. https://doi.org/10.1080/10447318.2025.2543997</w:t>
+      </w:r>
+    </w:p>
+    <w:p>
+      <w:pPr>
+        <w:pStyle w:val="BodyText"/>
+      </w:pPr>
+      <w:r>
+        <w:t xml:space="preserve">Sperber, D., Cl{'e}ment, F., Heintz, C., Mascaro, O., Mercier, H., Origgi, G., &amp; Wilson, D. (2010). Epistemic Vigilance.</w:t>
+      </w:r>
+      <w:r>
+        <w:t xml:space="preserve"> </w:t>
+      </w:r>
+      <w:r>
+        <w:rPr>
+          <w:i/>
+          <w:iCs/>
+        </w:rPr>
+        <w:t xml:space="preserve">Mind &amp; Language</w:t>
+      </w:r>
+      <w:r>
+        <w:t xml:space="preserve">, 25(4), 359–393.</w:t>
+      </w:r>
+    </w:p>
+    <w:p>
+      <w:pPr>
+        <w:pStyle w:val="BodyText"/>
+      </w:pPr>
+      <w:r>
+        <w:t xml:space="preserve">Srinath, S., Vadaparty, A., Smith IV, D. H., Porter, L., &amp; Zingaro, D. (2025). Assessing Problem Decomposition in CS1 for the GenAI Era.</w:t>
+      </w:r>
+      <w:r>
+        <w:t xml:space="preserve"> </w:t>
+      </w:r>
+      <w:r>
+        <w:rPr>
+          <w:i/>
+          <w:iCs/>
+        </w:rPr>
+        <w:t xml:space="preserve">arXiv preprint arXiv:2511.05764</w:t>
+      </w:r>
+      <w:r>
+        <w:t xml:space="preserve">.</w:t>
+      </w:r>
+    </w:p>
+    <w:p>
+      <w:pPr>
+        <w:pStyle w:val="BodyText"/>
+      </w:pPr>
+      <w:r>
+        <w:t xml:space="preserve">Tankelevitch, L., Kewenig, V., Simkute, A., Scott, A. E., Sarkar, A., Sellen, A., &amp; Rintel, S. (2024). The Metacognitive Demands and Opportunities of Generative AI.</w:t>
+      </w:r>
+      <w:r>
+        <w:t xml:space="preserve"> </w:t>
+      </w:r>
+      <w:r>
+        <w:rPr>
+          <w:i/>
+          <w:iCs/>
+        </w:rPr>
+        <w:t xml:space="preserve">Proceedings of the 2024 CHI Conference on Human Factors in Computing Systems</w:t>
+      </w:r>
+      <w:r>
+        <w:t xml:space="preserve">.</w:t>
+      </w:r>
+    </w:p>
+    <w:p>
+      <w:pPr>
+        <w:pStyle w:val="BodyText"/>
+      </w:pPr>
+      <w:r>
+        <w:t xml:space="preserve">Tour, E., &amp; Zadorozhnyy, A. (2025). Conceptualizing and Operationalizing Prompt Literacy for English Language Learners.</w:t>
+      </w:r>
+      <w:r>
+        <w:t xml:space="preserve"> </w:t>
+      </w:r>
+      <w:r>
+        <w:rPr>
+          <w:i/>
+          <w:iCs/>
+        </w:rPr>
+        <w:t xml:space="preserve">Journal of Adolescent &amp; Adult Literacy</w:t>
+      </w:r>
+      <w:r>
+        <w:t xml:space="preserve">. https://doi.org/10.1002/jaal.70020</w:t>
+      </w:r>
+    </w:p>
+    <w:p>
+      <w:pPr>
+        <w:pStyle w:val="BodyText"/>
+      </w:pPr>
+      <w:r>
+        <w:t xml:space="preserve">Vaccaro, M., Almaatouq, A., &amp; Malone, T. (2024). When Combinations of Humans and AI Are Useful: A Systematic Review and Meta-Analysis.</w:t>
+      </w:r>
+      <w:r>
+        <w:t xml:space="preserve"> </w:t>
+      </w:r>
+      <w:r>
+        <w:rPr>
+          <w:i/>
+          <w:iCs/>
+        </w:rPr>
+        <w:t xml:space="preserve">Nature Human Behaviour</w:t>
+      </w:r>
+      <w:r>
+        <w:t xml:space="preserve">, 8, 2293–2303.</w:t>
+      </w:r>
+    </w:p>
+    <w:p>
+      <w:pPr>
+        <w:pStyle w:val="BodyText"/>
+      </w:pPr>
+      <w:r>
+        <w:t xml:space="preserve">Vygotsky, L. S. (1978). Mind in Society: The Development of Higher Psychological Processes.</w:t>
+      </w:r>
+      <w:r>
+        <w:t xml:space="preserve"> </w:t>
+      </w:r>
+      <w:r>
+        <w:rPr>
+          <w:i/>
+          <w:iCs/>
+        </w:rPr>
+        <w:t xml:space="preserve">Harvard University Press</w:t>
+      </w:r>
+      <w:r>
+        <w:t xml:space="preserve">.</w:t>
+      </w:r>
+    </w:p>
+    <w:p>
+      <w:pPr>
+        <w:pStyle w:val="BodyText"/>
+      </w:pPr>
+      <w:r>
+        <w:t xml:space="preserve">Winne, P. H., &amp; Hadwin, A. F. (1998). Studying as Self-Regulated Learning.</w:t>
+      </w:r>
+      <w:r>
+        <w:t xml:space="preserve"> </w:t>
+      </w:r>
+      <w:r>
+        <w:rPr>
+          <w:i/>
+          <w:iCs/>
+        </w:rPr>
+        <w:t xml:space="preserve">Metacognition in Educational Theory and Practice</w:t>
+      </w:r>
+      <w:r>
+        <w:t xml:space="preserve">, 277–304.</w:t>
+      </w:r>
+    </w:p>
+    <w:p>
+      <w:pPr>
+        <w:pStyle w:val="BodyText"/>
+      </w:pPr>
+      <w:r>
+        <w:t xml:space="preserve">Zimmerman, B. J. (2000). Attaining Self-Regulation: A Social Cognitive Perspective.</w:t>
+      </w:r>
+      <w:r>
+        <w:t xml:space="preserve"> </w:t>
+      </w:r>
+      <w:r>
+        <w:rPr>
+          <w:i/>
+          <w:iCs/>
+        </w:rPr>
+        <w:t xml:space="preserve">Handbook of Self-Regulation</w:t>
+      </w:r>
+      <w:r>
+        <w:t xml:space="preserve">, 13–39.</w:t>
+      </w:r>
+    </w:p>
+    <w:p>
+      <w:pPr>
+        <w:pStyle w:val="BodyText"/>
+      </w:pPr>
+      <w:r>
+        <w:t xml:space="preserve">{UNESCO} (2024). AI Competency Framework for Students.</w:t>
+      </w:r>
+      <w:r>
+        <w:t xml:space="preserve"> </w:t>
+      </w:r>
+      <w:r>
+        <w:rPr>
+          <w:i/>
+          <w:iCs/>
+        </w:rPr>
+        <w:t xml:space="preserve">UNESCO</w:t>
+      </w:r>
+      <w:r>
+        <w:t xml:space="preserve">.</w:t>
       </w:r>
     </w:p>
     <w:bookmarkEnd w:id="54"/>

</xml_diff>

<commit_message>
Add authors + affiliations; abstract introduces the open-source system; clean metadata
- Authors: Alexander Apartsin (Holon Institute of Technology), Yehudit Aperstein
  (Afeka College of Engineering); styled author/affiliation block.
- Title sharpened to "...Teaching Students to Reason With Generative AI".
- Abstract now introduces BOTH the concept AND CoReasoning Lab (the open-source
  platform) with the headline feasibility numbers; stronger intro hook.
- Remove draft banner and rendering-metadata footer.

Co-Authored-By: Claude Opus 4.8 <noreply@anthropic.com>
</commit_message>
<xml_diff>
--- a/docs/coreasoning.docx
+++ b/docs/coreasoning.docx
@@ -2,13 +2,13 @@
 <file path=word/document.xml><?xml version="1.0" encoding="utf-8"?>
 <w:document xmlns:w="http://schemas.openxmlformats.org/wordprocessingml/2006/main" xmlns:m="http://schemas.openxmlformats.org/officeDocument/2006/math" xmlns:r="http://schemas.openxmlformats.org/officeDocument/2006/relationships" xmlns:o="urn:schemas-microsoft-com:office:office" xmlns:v="urn:schemas-microsoft-com:vml" xmlns:w10="urn:schemas-microsoft-com:office:word" xmlns:a="http://schemas.openxmlformats.org/drawingml/2006/main" xmlns:pic="http://schemas.openxmlformats.org/drawingml/2006/picture" xmlns:wp="http://schemas.openxmlformats.org/drawingml/2006/wordprocessingDrawing">
   <w:body>
-    <w:bookmarkStart w:id="55" w:name="X9dba699e1585523456db11bdab5d7e7e6909c23"/>
+    <w:bookmarkStart w:id="55" w:name="Xdf9502ef5c17bbba6731875408e8426bd513f0c"/>
     <w:p>
       <w:pPr>
         <w:pStyle w:val="Heading1"/>
       </w:pPr>
       <w:r>
-        <w:t xml:space="preserve">Framing, Judging, Steering: An Assessable Competency Model for Reasoning With Generative AI</w:t>
+        <w:t xml:space="preserve">Framing, Judging, Steering: An Assessable Competency Model for Teaching Students to Reason With Generative AI</w:t>
       </w:r>
     </w:p>
     <w:p>
@@ -17,28 +17,72 @@
       </w:pPr>
       <w:r>
         <w:rPr>
-          <w:i/>
-          <w:iCs/>
-        </w:rPr>
-        <w:t xml:space="preserve">Preprint. Open-source (MIT):</w:t>
-      </w:r>
-      <w:r>
-        <w:rPr>
-          <w:i/>
-          <w:iCs/>
-        </w:rPr>
+          <w:b/>
+          <w:bCs/>
+        </w:rPr>
+        <w:t xml:space="preserve">Alexander Apartsin</w:t>
+      </w:r>
+      <w:r>
+        <w:t xml:space="preserve">¹ and</w:t>
+      </w:r>
+      <w:r>
+        <w:t xml:space="preserve"> </w:t>
+      </w:r>
+      <w:r>
+        <w:rPr>
+          <w:b/>
+          <w:bCs/>
+        </w:rPr>
+        <w:t xml:space="preserve">Yehudit Aperstein</w:t>
+      </w:r>
+      <w:r>
+        <w:t xml:space="preserve">²</w:t>
+      </w:r>
+      <w:r>
+        <w:t xml:space="preserve"> </w:t>
+      </w:r>
+      <w:r>
+        <w:t xml:space="preserve">{: .authors }</w:t>
+      </w:r>
+    </w:p>
+    <w:p>
+      <w:pPr>
+        <w:pStyle w:val="BodyText"/>
+      </w:pPr>
+      <w:r>
+        <w:t xml:space="preserve">¹ Holon Institute of Technology · ² Afeka College of Engineering</w:t>
+      </w:r>
+      <w:r>
+        <w:t xml:space="preserve"> </w:t>
+      </w:r>
+      <w:r>
+        <w:t xml:space="preserve">{: .affil }</w:t>
+      </w:r>
+    </w:p>
+    <w:p>
+      <w:pPr>
+        <w:pStyle w:val="BodyText"/>
+      </w:pPr>
+      <w:r>
+        <w:t xml:space="preserve">An open-source learning platform and instrument:</w:t>
+      </w:r>
+      <w:r>
         <w:t xml:space="preserve"> </w:t>
       </w:r>
       <w:hyperlink r:id="rId20">
         <w:r>
           <w:rPr>
             <w:rStyle w:val="Hyperlink"/>
-            <w:i/>
-            <w:iCs/>
           </w:rPr>
           <w:t xml:space="preserve">github.com/ApartsinProjects/CoReason</w:t>
         </w:r>
       </w:hyperlink>
+      <w:r>
+        <w:t xml:space="preserve"> </w:t>
+      </w:r>
+      <w:r>
+        <w:t xml:space="preserve">{: .availability }</w:t>
+      </w:r>
     </w:p>
     <w:bookmarkStart w:id="21" w:name="abstract"/>
     <w:p>
@@ -215,31 +259,90 @@
         <w:t xml:space="preserve"> </w:t>
       </w:r>
       <w:r>
-        <w:t xml:space="preserve">vigilance and critical thinking; productive struggle), state five testable propositions about how</w:t>
-      </w:r>
-      <w:r>
-        <w:t xml:space="preserve"> </w:t>
-      </w:r>
-      <w:r>
-        <w:t xml:space="preserve">the skills relate, position the model against the nearest prior frameworks, and report a</w:t>
-      </w:r>
-      <w:r>
-        <w:t xml:space="preserve"> </w:t>
-      </w:r>
-      <w:r>
-        <w:t xml:space="preserve">proof-of-concept instrument together with a feasibility demonstration that the three skills</w:t>
-      </w:r>
-      <w:r>
-        <w:t xml:space="preserve"> </w:t>
-      </w:r>
-      <w:r>
-        <w:t xml:space="preserve">dissociate and can be measured automatically. We close with the tensions a mature account must</w:t>
-      </w:r>
-      <w:r>
-        <w:t xml:space="preserve"> </w:t>
-      </w:r>
-      <w:r>
-        <w:t xml:space="preserve">resolve and a concrete assessment-validation agenda.</w:t>
+        <w:t xml:space="preserve">vigilance and critical thinking; productive struggle), and state five testable propositions about how</w:t>
+      </w:r>
+      <w:r>
+        <w:t xml:space="preserve"> </w:t>
+      </w:r>
+      <w:r>
+        <w:t xml:space="preserve">the skills relate. We instantiate the model in</w:t>
+      </w:r>
+      <w:r>
+        <w:t xml:space="preserve"> </w:t>
+      </w:r>
+      <w:r>
+        <w:rPr>
+          <w:b/>
+          <w:bCs/>
+        </w:rPr>
+        <w:t xml:space="preserve">CoReasoning Lab</w:t>
+      </w:r>
+      <w:r>
+        <w:t xml:space="preserve">, an open-source learning platform</w:t>
+      </w:r>
+      <w:r>
+        <w:t xml:space="preserve"> </w:t>
+      </w:r>
+      <w:r>
+        <w:t xml:space="preserve">that generates ill-defined problems, confronts students with deliberately flawed AI output to improve</w:t>
+      </w:r>
+      <w:r>
+        <w:t xml:space="preserve"> </w:t>
+      </w:r>
+      <w:r>
+        <w:t xml:space="preserve">across judge-and-steer cycles, and scores the three skills independently with rubric-driven feedback.</w:t>
+      </w:r>
+      <w:r>
+        <w:t xml:space="preserve"> </w:t>
+      </w:r>
+      <w:r>
+        <w:t xml:space="preserve">Using the platform’s instrument we report a feasibility demonstration that the three skills</w:t>
+      </w:r>
+      <w:r>
+        <w:t xml:space="preserve"> </w:t>
+      </w:r>
+      <w:r>
+        <w:rPr>
+          <w:i/>
+          <w:iCs/>
+        </w:rPr>
+        <w:t xml:space="preserve">dissociate</w:t>
+      </w:r>
+      <w:r>
+        <w:t xml:space="preserve"> </w:t>
+      </w:r>
+      <w:r>
+        <w:t xml:space="preserve">(own-skill grade effects exceed cross-skill effects by roughly sixty to one, with near-zero inter-skill</w:t>
+      </w:r>
+      <w:r>
+        <w:t xml:space="preserve"> </w:t>
+      </w:r>
+      <w:r>
+        <w:t xml:space="preserve">correlations) and that the automated grader is 92% self-consistent, with simulated learners generated</w:t>
+      </w:r>
+      <w:r>
+        <w:t xml:space="preserve"> </w:t>
+      </w:r>
+      <w:r>
+        <w:t xml:space="preserve">and graded by different models to avoid self-grading. We make no learning-outcome claims; the evidence</w:t>
+      </w:r>
+      <w:r>
+        <w:t xml:space="preserve"> </w:t>
+      </w:r>
+      <w:r>
+        <w:t xml:space="preserve">establishes that the constructs are separable and automatically measurable, and we close with the</w:t>
+      </w:r>
+      <w:r>
+        <w:t xml:space="preserve"> </w:t>
+      </w:r>
+      <w:r>
+        <w:t xml:space="preserve">tensions a mature account must resolve and a concrete validation agenda. The system, instrument, data,</w:t>
+      </w:r>
+      <w:r>
+        <w:t xml:space="preserve"> </w:t>
+      </w:r>
+      <w:r>
+        <w:t xml:space="preserve">and a prepared human-rater study are released under an open-source license.</w:t>
       </w:r>
     </w:p>
     <w:bookmarkEnd w:id="21"/>
@@ -257,31 +360,37 @@
         <w:pStyle w:val="FirstParagraph"/>
       </w:pPr>
       <w:r>
-        <w:t xml:space="preserve">The introduction of generative AI into learning environments has, by default, optimized for the</w:t>
-      </w:r>
-      <w:r>
-        <w:t xml:space="preserve"> </w:t>
-      </w:r>
-      <w:r>
-        <w:t xml:space="preserve">wrong variable. Most AI-in-education tools shorten the path from question to answer. Yet the answer</w:t>
-      </w:r>
-      <w:r>
-        <w:t xml:space="preserve"> </w:t>
-      </w:r>
-      <w:r>
-        <w:t xml:space="preserve">was never the point of education: the cognitive work of specifying a problem, evaluating a candidate</w:t>
-      </w:r>
-      <w:r>
-        <w:t xml:space="preserve"> </w:t>
-      </w:r>
-      <w:r>
-        <w:t xml:space="preserve">solution, and improving it is where learning happens. When that work is delegated wholesale to a</w:t>
-      </w:r>
-      <w:r>
-        <w:t xml:space="preserve"> </w:t>
-      </w:r>
-      <w:r>
-        <w:t xml:space="preserve">machine, the learner is left with a correct artifact and an unchanged mind.</w:t>
+        <w:t xml:space="preserve">Most AI-in-education tools optimize for the wrong variable. They shorten the path from question to</w:t>
+      </w:r>
+      <w:r>
+        <w:t xml:space="preserve"> </w:t>
+      </w:r>
+      <w:r>
+        <w:t xml:space="preserve">answer, when the answer was never the point of education. The cognitive work of specifying a problem,</w:t>
+      </w:r>
+      <w:r>
+        <w:t xml:space="preserve"> </w:t>
+      </w:r>
+      <w:r>
+        <w:t xml:space="preserve">evaluating a candidate solution, and improving it is where learning happens; when that work is</w:t>
+      </w:r>
+      <w:r>
+        <w:t xml:space="preserve"> </w:t>
+      </w:r>
+      <w:r>
+        <w:t xml:space="preserve">delegated wholesale to a machine, the learner walks away with a correct artifact and an unchanged mind.</w:t>
+      </w:r>
+      <w:r>
+        <w:t xml:space="preserve"> </w:t>
+      </w:r>
+      <w:r>
+        <w:t xml:space="preserve">The educational opportunity of generative AI is therefore not to deliver answers faster, but to make</w:t>
+      </w:r>
+      <w:r>
+        <w:t xml:space="preserve"> </w:t>
+      </w:r>
+      <w:r>
+        <w:t xml:space="preserve">the reasoning around them visible, practiced, and assessable.</w:t>
       </w:r>
     </w:p>
     <w:p>

</xml_diff>

<commit_message>
Drop all preprint/open-source metadata lines, footer, and availability statements
Co-Authored-By: Claude Opus 4.8 <noreply@anthropic.com>
</commit_message>
<xml_diff>
--- a/docs/coreasoning.docx
+++ b/docs/coreasoning.docx
@@ -2,7 +2,7 @@
 <file path=word/document.xml><?xml version="1.0" encoding="utf-8"?>
 <w:document xmlns:w="http://schemas.openxmlformats.org/wordprocessingml/2006/main" xmlns:m="http://schemas.openxmlformats.org/officeDocument/2006/math" xmlns:r="http://schemas.openxmlformats.org/officeDocument/2006/relationships" xmlns:o="urn:schemas-microsoft-com:office:office" xmlns:v="urn:schemas-microsoft-com:vml" xmlns:w10="urn:schemas-microsoft-com:office:word" xmlns:a="http://schemas.openxmlformats.org/drawingml/2006/main" xmlns:pic="http://schemas.openxmlformats.org/drawingml/2006/picture" xmlns:wp="http://schemas.openxmlformats.org/drawingml/2006/wordprocessingDrawing">
   <w:body>
-    <w:bookmarkStart w:id="55" w:name="Xdf9502ef5c17bbba6731875408e8426bd513f0c"/>
+    <w:bookmarkStart w:id="54" w:name="Xdf9502ef5c17bbba6731875408e8426bd513f0c"/>
     <w:p>
       <w:pPr>
         <w:pStyle w:val="Heading1"/>
@@ -59,32 +59,7 @@
         <w:t xml:space="preserve">{: .affil }</w:t>
       </w:r>
     </w:p>
-    <w:p>
-      <w:pPr>
-        <w:pStyle w:val="BodyText"/>
-      </w:pPr>
-      <w:r>
-        <w:t xml:space="preserve">An open-source learning platform and instrument:</w:t>
-      </w:r>
-      <w:r>
-        <w:t xml:space="preserve"> </w:t>
-      </w:r>
-      <w:hyperlink r:id="rId20">
-        <w:r>
-          <w:rPr>
-            <w:rStyle w:val="Hyperlink"/>
-          </w:rPr>
-          <w:t xml:space="preserve">github.com/ApartsinProjects/CoReason</w:t>
-        </w:r>
-      </w:hyperlink>
-      <w:r>
-        <w:t xml:space="preserve"> </w:t>
-      </w:r>
-      <w:r>
-        <w:t xml:space="preserve">{: .availability }</w:t>
-      </w:r>
-    </w:p>
-    <w:bookmarkStart w:id="21" w:name="abstract"/>
+    <w:bookmarkStart w:id="20" w:name="abstract"/>
     <w:p>
       <w:pPr>
         <w:pStyle w:val="Heading2"/>
@@ -278,7 +253,7 @@
         <w:t xml:space="preserve">CoReasoning Lab</w:t>
       </w:r>
       <w:r>
-        <w:t xml:space="preserve">, an open-source learning platform</w:t>
+        <w:t xml:space="preserve">, a learning platform</w:t>
       </w:r>
       <w:r>
         <w:t xml:space="preserve"> </w:t>
@@ -336,17 +311,11 @@
         <w:t xml:space="preserve"> </w:t>
       </w:r>
       <w:r>
-        <w:t xml:space="preserve">tensions a mature account must resolve and a concrete validation agenda. The system, instrument, data,</w:t>
-      </w:r>
-      <w:r>
-        <w:t xml:space="preserve"> </w:t>
-      </w:r>
-      <w:r>
-        <w:t xml:space="preserve">and a prepared human-rater study are released under an open-source license.</w:t>
-      </w:r>
-    </w:p>
-    <w:bookmarkEnd w:id="21"/>
-    <w:bookmarkStart w:id="22" w:name="introduction"/>
+        <w:t xml:space="preserve">tensions a mature account must resolve and a concrete validation agenda.</w:t>
+      </w:r>
+    </w:p>
+    <w:bookmarkEnd w:id="20"/>
+    <w:bookmarkStart w:id="21" w:name="introduction"/>
     <w:p>
       <w:pPr>
         <w:pStyle w:val="Heading2"/>
@@ -1095,258 +1064,214 @@
         <w:t xml:space="preserve">, not an efficacy study.</w:t>
       </w:r>
     </w:p>
-    <w:p>
-      <w:pPr>
-        <w:pStyle w:val="BodyText"/>
-      </w:pPr>
-      <w:r>
-        <w:rPr>
-          <w:b/>
-          <w:bCs/>
-        </w:rPr>
-        <w:t xml:space="preserve">Availability.</w:t>
-      </w:r>
-      <w:r>
-        <w:t xml:space="preserve"> </w:t>
-      </w:r>
-      <w:r>
-        <w:t xml:space="preserve">The CoReasoning Lab system, the sixteen-prompt instrument, the controlled-generation</w:t>
-      </w:r>
-      <w:r>
-        <w:t xml:space="preserve"> </w:t>
-      </w:r>
-      <w:r>
-        <w:t xml:space="preserve">harness, the experiment data and figures, and the human-rater study package are open-source under the</w:t>
-      </w:r>
-      <w:r>
-        <w:t xml:space="preserve"> </w:t>
-      </w:r>
-      <w:r>
-        <w:t xml:space="preserve">MIT license at</w:t>
-      </w:r>
-      <w:r>
-        <w:t xml:space="preserve"> </w:t>
-      </w:r>
-      <w:hyperlink r:id="rId20">
-        <w:r>
-          <w:rPr>
-            <w:rStyle w:val="Hyperlink"/>
-          </w:rPr>
-          <w:t xml:space="preserve">https://github.com/ApartsinProjects/CoReason</w:t>
-        </w:r>
-      </w:hyperlink>
-      <w:r>
-        <w:t xml:space="preserve">.</w:t>
+    <w:bookmarkEnd w:id="21"/>
+    <w:bookmarkStart w:id="22" w:name="X17376d58bcb93231038f1530b731c55944db2e6"/>
+    <w:p>
+      <w:pPr>
+        <w:pStyle w:val="Heading2"/>
+      </w:pPr>
+      <w:r>
+        <w:t xml:space="preserve">2. The problem with current AI-literacy assessment</w:t>
+      </w:r>
+    </w:p>
+    <w:p>
+      <w:pPr>
+        <w:pStyle w:val="FirstParagraph"/>
+      </w:pPr>
+      <w:r>
+        <w:t xml:space="preserve">Existing instruments for assessing how students work with AI are not wrong so much as</w:t>
+      </w:r>
+      <w:r>
+        <w:t xml:space="preserve"> </w:t>
+      </w:r>
+      <w:r>
+        <w:t xml:space="preserve">under-resolved. Knowledge-oriented frameworks such as Long and Magerko (2020) and the UNESCO (2024)</w:t>
+      </w:r>
+      <w:r>
+        <w:t xml:space="preserve"> </w:t>
+      </w:r>
+      <w:r>
+        <w:t xml:space="preserve">student competency framework define AI literacy chiefly as</w:t>
+      </w:r>
+      <w:r>
+        <w:t xml:space="preserve"> </w:t>
+      </w:r>
+      <w:r>
+        <w:rPr>
+          <w:i/>
+          <w:iCs/>
+        </w:rPr>
+        <w:t xml:space="preserve">understanding AI systems</w:t>
+      </w:r>
+      <w:r>
+        <w:t xml:space="preserve">: what AI is,</w:t>
+      </w:r>
+      <w:r>
+        <w:t xml:space="preserve"> </w:t>
+      </w:r>
+      <w:r>
+        <w:t xml:space="preserve">what it can and cannot do, how it works, and how it should be governed. These are necessary, but they</w:t>
+      </w:r>
+      <w:r>
+        <w:t xml:space="preserve"> </w:t>
+      </w:r>
+      <w:r>
+        <w:t xml:space="preserve">say little about the</w:t>
+      </w:r>
+      <w:r>
+        <w:t xml:space="preserve"> </w:t>
+      </w:r>
+      <w:r>
+        <w:rPr>
+          <w:i/>
+          <w:iCs/>
+        </w:rPr>
+        <w:t xml:space="preserve">performance</w:t>
+      </w:r>
+      <w:r>
+        <w:t xml:space="preserve"> </w:t>
+      </w:r>
+      <w:r>
+        <w:t xml:space="preserve">of working with a model on a task. Prompt-literacy and</w:t>
+      </w:r>
+      <w:r>
+        <w:t xml:space="preserve"> </w:t>
+      </w:r>
+      <w:r>
+        <w:t xml:space="preserve">generative-AI-literacy models (Lo, 2023; Annapureddy et al., 2024) move closer to performance, but</w:t>
+      </w:r>
+      <w:r>
+        <w:t xml:space="preserve"> </w:t>
+      </w:r>
+      <w:r>
+        <w:t xml:space="preserve">they bundle task specification and iterative refinement into a single</w:t>
+      </w:r>
+      <w:r>
+        <w:t xml:space="preserve"> </w:t>
+      </w:r>
+      <w:r>
+        <w:t xml:space="preserve">“</w:t>
+      </w:r>
+      <w:r>
+        <w:t xml:space="preserve">prompting</w:t>
+      </w:r>
+      <w:r>
+        <w:t xml:space="preserve">”</w:t>
+      </w:r>
+      <w:r>
+        <w:t xml:space="preserve"> </w:t>
+      </w:r>
+      <w:r>
+        <w:t xml:space="preserve">competency and treat</w:t>
+      </w:r>
+      <w:r>
+        <w:t xml:space="preserve"> </w:t>
+      </w:r>
+      <w:r>
+        <w:t xml:space="preserve">evaluation of the output as a downstream check rather than a co-equal skill.</w:t>
+      </w:r>
+    </w:p>
+    <w:p>
+      <w:pPr>
+        <w:pStyle w:val="BodyText"/>
+      </w:pPr>
+      <w:r>
+        <w:t xml:space="preserve">The cost of this coarse resolution is diagnostic. When a learner’s AI use produces a poor result, a</w:t>
+      </w:r>
+      <w:r>
+        <w:t xml:space="preserve"> </w:t>
+      </w:r>
+      <w:r>
+        <w:t xml:space="preserve">single prompting score cannot tell an instructor</w:t>
+      </w:r>
+      <w:r>
+        <w:t xml:space="preserve"> </w:t>
+      </w:r>
+      <w:r>
+        <w:rPr>
+          <w:i/>
+          <w:iCs/>
+        </w:rPr>
+        <w:t xml:space="preserve">which</w:t>
+      </w:r>
+      <w:r>
+        <w:t xml:space="preserve"> </w:t>
+      </w:r>
+      <w:r>
+        <w:t xml:space="preserve">cognitive operation failed: did the learner</w:t>
+      </w:r>
+      <w:r>
+        <w:t xml:space="preserve"> </w:t>
+      </w:r>
+      <w:r>
+        <w:t xml:space="preserve">specify the task badly, so that the model solved the wrong problem; did they fail to detect the flaws</w:t>
+      </w:r>
+      <w:r>
+        <w:t xml:space="preserve"> </w:t>
+      </w:r>
+      <w:r>
+        <w:t xml:space="preserve">in an otherwise plausible output; or did they see the flaws but issue corrections too vague to fix</w:t>
+      </w:r>
+      <w:r>
+        <w:t xml:space="preserve"> </w:t>
+      </w:r>
+      <w:r>
+        <w:t xml:space="preserve">them? These are three different failures with three different remedies, teaching problem</w:t>
+      </w:r>
+      <w:r>
+        <w:t xml:space="preserve"> </w:t>
+      </w:r>
+      <w:r>
+        <w:t xml:space="preserve">specification, teaching critical evaluation, and teaching corrective communication, and an instrument</w:t>
+      </w:r>
+      <w:r>
+        <w:t xml:space="preserve"> </w:t>
+      </w:r>
+      <w:r>
+        <w:t xml:space="preserve">that cannot separate them cannot guide instruction. Integrative reviews of AI literacy after</w:t>
+      </w:r>
+      <w:r>
+        <w:t xml:space="preserve"> </w:t>
+      </w:r>
+      <w:r>
+        <w:t xml:space="preserve">generative AI confirm that the field still lacks a scheme isolating distinct, independently-assessable</w:t>
+      </w:r>
+      <w:r>
+        <w:t xml:space="preserve"> </w:t>
+      </w:r>
+      <w:r>
+        <w:t xml:space="preserve">reasoning competencies (Gu &amp; Ericson, 2025), even as syntheses document generative AI’s mixed effects</w:t>
+      </w:r>
+      <w:r>
+        <w:t xml:space="preserve"> </w:t>
+      </w:r>
+      <w:r>
+        <w:t xml:space="preserve">on critical and creative thinking (Li et al., 2026). A diagnostic competency model must therefore</w:t>
+      </w:r>
+      <w:r>
+        <w:t xml:space="preserve"> </w:t>
+      </w:r>
+      <w:r>
+        <w:t xml:space="preserve">decompose the human-AI loop into the distinct operations that can each break, and must show that those</w:t>
+      </w:r>
+      <w:r>
+        <w:t xml:space="preserve"> </w:t>
+      </w:r>
+      <w:r>
+        <w:t xml:space="preserve">operations are in fact separable in learners. That is the gap CoReasoning addresses.</w:t>
       </w:r>
     </w:p>
     <w:bookmarkEnd w:id="22"/>
-    <w:bookmarkStart w:id="23" w:name="X17376d58bcb93231038f1530b731c55944db2e6"/>
+    <w:bookmarkStart w:id="29" w:name="the-coreasoning-framework"/>
     <w:p>
       <w:pPr>
         <w:pStyle w:val="Heading2"/>
       </w:pPr>
       <w:r>
-        <w:t xml:space="preserve">2. The problem with current AI-literacy assessment</w:t>
-      </w:r>
-    </w:p>
-    <w:p>
-      <w:pPr>
-        <w:pStyle w:val="FirstParagraph"/>
-      </w:pPr>
-      <w:r>
-        <w:t xml:space="preserve">Existing instruments for assessing how students work with AI are not wrong so much as</w:t>
-      </w:r>
-      <w:r>
-        <w:t xml:space="preserve"> </w:t>
-      </w:r>
-      <w:r>
-        <w:t xml:space="preserve">under-resolved. Knowledge-oriented frameworks such as Long and Magerko (2020) and the UNESCO (2024)</w:t>
-      </w:r>
-      <w:r>
-        <w:t xml:space="preserve"> </w:t>
-      </w:r>
-      <w:r>
-        <w:t xml:space="preserve">student competency framework define AI literacy chiefly as</w:t>
-      </w:r>
-      <w:r>
-        <w:t xml:space="preserve"> </w:t>
-      </w:r>
-      <w:r>
-        <w:rPr>
-          <w:i/>
-          <w:iCs/>
-        </w:rPr>
-        <w:t xml:space="preserve">understanding AI systems</w:t>
-      </w:r>
-      <w:r>
-        <w:t xml:space="preserve">: what AI is,</w:t>
-      </w:r>
-      <w:r>
-        <w:t xml:space="preserve"> </w:t>
-      </w:r>
-      <w:r>
-        <w:t xml:space="preserve">what it can and cannot do, how it works, and how it should be governed. These are necessary, but they</w:t>
-      </w:r>
-      <w:r>
-        <w:t xml:space="preserve"> </w:t>
-      </w:r>
-      <w:r>
-        <w:t xml:space="preserve">say little about the</w:t>
-      </w:r>
-      <w:r>
-        <w:t xml:space="preserve"> </w:t>
-      </w:r>
-      <w:r>
-        <w:rPr>
-          <w:i/>
-          <w:iCs/>
-        </w:rPr>
-        <w:t xml:space="preserve">performance</w:t>
-      </w:r>
-      <w:r>
-        <w:t xml:space="preserve"> </w:t>
-      </w:r>
-      <w:r>
-        <w:t xml:space="preserve">of working with a model on a task. Prompt-literacy and</w:t>
-      </w:r>
-      <w:r>
-        <w:t xml:space="preserve"> </w:t>
-      </w:r>
-      <w:r>
-        <w:t xml:space="preserve">generative-AI-literacy models (Lo, 2023; Annapureddy et al., 2024) move closer to performance, but</w:t>
-      </w:r>
-      <w:r>
-        <w:t xml:space="preserve"> </w:t>
-      </w:r>
-      <w:r>
-        <w:t xml:space="preserve">they bundle task specification and iterative refinement into a single</w:t>
-      </w:r>
-      <w:r>
-        <w:t xml:space="preserve"> </w:t>
-      </w:r>
-      <w:r>
-        <w:t xml:space="preserve">“</w:t>
-      </w:r>
-      <w:r>
-        <w:t xml:space="preserve">prompting</w:t>
-      </w:r>
-      <w:r>
-        <w:t xml:space="preserve">”</w:t>
-      </w:r>
-      <w:r>
-        <w:t xml:space="preserve"> </w:t>
-      </w:r>
-      <w:r>
-        <w:t xml:space="preserve">competency and treat</w:t>
-      </w:r>
-      <w:r>
-        <w:t xml:space="preserve"> </w:t>
-      </w:r>
-      <w:r>
-        <w:t xml:space="preserve">evaluation of the output as a downstream check rather than a co-equal skill.</w:t>
-      </w:r>
-    </w:p>
-    <w:p>
-      <w:pPr>
-        <w:pStyle w:val="BodyText"/>
-      </w:pPr>
-      <w:r>
-        <w:t xml:space="preserve">The cost of this coarse resolution is diagnostic. When a learner’s AI use produces a poor result, a</w:t>
-      </w:r>
-      <w:r>
-        <w:t xml:space="preserve"> </w:t>
-      </w:r>
-      <w:r>
-        <w:t xml:space="preserve">single prompting score cannot tell an instructor</w:t>
-      </w:r>
-      <w:r>
-        <w:t xml:space="preserve"> </w:t>
-      </w:r>
-      <w:r>
-        <w:rPr>
-          <w:i/>
-          <w:iCs/>
-        </w:rPr>
-        <w:t xml:space="preserve">which</w:t>
-      </w:r>
-      <w:r>
-        <w:t xml:space="preserve"> </w:t>
-      </w:r>
-      <w:r>
-        <w:t xml:space="preserve">cognitive operation failed: did the learner</w:t>
-      </w:r>
-      <w:r>
-        <w:t xml:space="preserve"> </w:t>
-      </w:r>
-      <w:r>
-        <w:t xml:space="preserve">specify the task badly, so that the model solved the wrong problem; did they fail to detect the flaws</w:t>
-      </w:r>
-      <w:r>
-        <w:t xml:space="preserve"> </w:t>
-      </w:r>
-      <w:r>
-        <w:t xml:space="preserve">in an otherwise plausible output; or did they see the flaws but issue corrections too vague to fix</w:t>
-      </w:r>
-      <w:r>
-        <w:t xml:space="preserve"> </w:t>
-      </w:r>
-      <w:r>
-        <w:t xml:space="preserve">them? These are three different failures with three different remedies, teaching problem</w:t>
-      </w:r>
-      <w:r>
-        <w:t xml:space="preserve"> </w:t>
-      </w:r>
-      <w:r>
-        <w:t xml:space="preserve">specification, teaching critical evaluation, and teaching corrective communication, and an instrument</w:t>
-      </w:r>
-      <w:r>
-        <w:t xml:space="preserve"> </w:t>
-      </w:r>
-      <w:r>
-        <w:t xml:space="preserve">that cannot separate them cannot guide instruction. Integrative reviews of AI literacy after</w:t>
-      </w:r>
-      <w:r>
-        <w:t xml:space="preserve"> </w:t>
-      </w:r>
-      <w:r>
-        <w:t xml:space="preserve">generative AI confirm that the field still lacks a scheme isolating distinct, independently-assessable</w:t>
-      </w:r>
-      <w:r>
-        <w:t xml:space="preserve"> </w:t>
-      </w:r>
-      <w:r>
-        <w:t xml:space="preserve">reasoning competencies (Gu &amp; Ericson, 2025), even as syntheses document generative AI’s mixed effects</w:t>
-      </w:r>
-      <w:r>
-        <w:t xml:space="preserve"> </w:t>
-      </w:r>
-      <w:r>
-        <w:t xml:space="preserve">on critical and creative thinking (Li et al., 2026). A diagnostic competency model must therefore</w:t>
-      </w:r>
-      <w:r>
-        <w:t xml:space="preserve"> </w:t>
-      </w:r>
-      <w:r>
-        <w:t xml:space="preserve">decompose the human-AI loop into the distinct operations that can each break, and must show that those</w:t>
-      </w:r>
-      <w:r>
-        <w:t xml:space="preserve"> </w:t>
-      </w:r>
-      <w:r>
-        <w:t xml:space="preserve">operations are in fact separable in learners. That is the gap CoReasoning addresses.</w:t>
-      </w:r>
-    </w:p>
-    <w:bookmarkEnd w:id="23"/>
-    <w:bookmarkStart w:id="30" w:name="the-coreasoning-framework"/>
-    <w:p>
-      <w:pPr>
-        <w:pStyle w:val="Heading2"/>
-      </w:pPr>
-      <w:r>
         <w:t xml:space="preserve">3. The CoReasoning framework</w:t>
       </w:r>
     </w:p>
-    <w:bookmarkStart w:id="27" w:name="X66ab742d2d29b469acd8c125b52c7b6e582e57f"/>
+    <w:bookmarkStart w:id="26" w:name="X66ab742d2d29b469acd8c125b52c7b6e582e57f"/>
     <w:p>
       <w:pPr>
         <w:pStyle w:val="Heading3"/>
@@ -1554,12 +1479,12 @@
           <wp:inline>
             <wp:extent cx="5334000" cy="3057292"/>
             <wp:effectExtent b="0" l="0" r="0" t="0"/>
-            <wp:docPr descr="Figure 1. The CoReasoning architecture." title="" id="25" name="Picture"/>
+            <wp:docPr descr="Figure 1. The CoReasoning architecture." title="" id="24" name="Picture"/>
             <a:graphic>
               <a:graphicData uri="http://schemas.openxmlformats.org/drawingml/2006/picture">
                 <pic:pic>
                   <pic:nvPicPr>
-                    <pic:cNvPr descr="assets/coreasoning-architecture.svg" id="26" name="Picture"/>
+                    <pic:cNvPr descr="assets/coreasoning-architecture.svg" id="25" name="Picture"/>
                     <pic:cNvPicPr>
                       <a:picLocks noChangeArrowheads="1" noChangeAspect="1"/>
                     </pic:cNvPicPr>
@@ -1571,7 +1496,7 @@
                           <a14:useLocalDpi xmlns:a14="http://schemas.microsoft.com/office/drawing/2010/main" val="0"/>
                         </a:ext>
                         <a:ext uri="{96DAC541-7B7A-43D3-8B79-37D633B846F1}">
-                          <asvg:svgBlip xmlns:asvg="http://schemas.microsoft.com/office/drawing/2016/SVG/main" r:embed="rId24"/>
+                          <asvg:svgBlip xmlns:asvg="http://schemas.microsoft.com/office/drawing/2016/SVG/main" r:embed="rId23"/>
                         </a:ext>
                       </a:extLst>
                     </a:blip>
@@ -1663,160 +1588,160 @@
         <w:t xml:space="preserve">Steering is the controller’s write.</w:t>
       </w:r>
     </w:p>
+    <w:bookmarkEnd w:id="26"/>
+    <w:bookmarkStart w:id="27" w:name="X44244f8f52b0cf83a8c12e7669f4d4601dca696"/>
+    <w:p>
+      <w:pPr>
+        <w:pStyle w:val="Heading3"/>
+      </w:pPr>
+      <w:r>
+        <w:t xml:space="preserve">3.2 The temporal-separation claim (what makes the decomposition non-obvious)</w:t>
+      </w:r>
+    </w:p>
+    <w:p>
+      <w:pPr>
+        <w:pStyle w:val="FirstParagraph"/>
+      </w:pPr>
+      <w:r>
+        <w:t xml:space="preserve">Existing frameworks treat</w:t>
+      </w:r>
+      <w:r>
+        <w:t xml:space="preserve"> </w:t>
+      </w:r>
+      <w:r>
+        <w:t xml:space="preserve">“</w:t>
+      </w:r>
+      <w:r>
+        <w:t xml:space="preserve">use the AI well</w:t>
+      </w:r>
+      <w:r>
+        <w:t xml:space="preserve">”</w:t>
+      </w:r>
+      <w:r>
+        <w:t xml:space="preserve"> </w:t>
+      </w:r>
+      <w:r>
+        <w:t xml:space="preserve">as one skill or, at most, pair</w:t>
+      </w:r>
+      <w:r>
+        <w:t xml:space="preserve"> </w:t>
+      </w:r>
+      <w:r>
+        <w:t xml:space="preserve">“</w:t>
+      </w:r>
+      <w:r>
+        <w:t xml:space="preserve">prompt</w:t>
+      </w:r>
+      <w:r>
+        <w:t xml:space="preserve">”</w:t>
+      </w:r>
+      <w:r>
+        <w:t xml:space="preserve"> </w:t>
+      </w:r>
+      <w:r>
+        <w:t xml:space="preserve">with</w:t>
+      </w:r>
+      <w:r>
+        <w:t xml:space="preserve"> </w:t>
+      </w:r>
+      <w:r>
+        <w:t xml:space="preserve">“</w:t>
+      </w:r>
+      <w:r>
+        <w:t xml:space="preserve">evaluate.</w:t>
+      </w:r>
+      <w:r>
+        <w:t xml:space="preserve">”</w:t>
+      </w:r>
+      <w:r>
+        <w:t xml:space="preserve"> </w:t>
+      </w:r>
+      <w:r>
+        <w:t xml:space="preserve">CoReasoning’s distinctive move is to separate two operations that prior models fuse: the</w:t>
+      </w:r>
+      <w:r>
+        <w:t xml:space="preserve"> </w:t>
+      </w:r>
+      <w:r>
+        <w:rPr>
+          <w:i/>
+          <w:iCs/>
+        </w:rPr>
+        <w:t xml:space="preserve">pre-generation</w:t>
+      </w:r>
+      <w:r>
+        <w:t xml:space="preserve"> </w:t>
+      </w:r>
+      <w:r>
+        <w:t xml:space="preserve">skill of structuring the task (Framing) and the</w:t>
+      </w:r>
+      <w:r>
+        <w:t xml:space="preserve"> </w:t>
+      </w:r>
+      <w:r>
+        <w:rPr>
+          <w:i/>
+          <w:iCs/>
+        </w:rPr>
+        <w:t xml:space="preserve">post-generation</w:t>
+      </w:r>
+      <w:r>
+        <w:t xml:space="preserve"> </w:t>
+      </w:r>
+      <w:r>
+        <w:t xml:space="preserve">skill of correcting</w:t>
+      </w:r>
+      <w:r>
+        <w:t xml:space="preserve"> </w:t>
+      </w:r>
+      <w:r>
+        <w:t xml:space="preserve">the output (Steering). These are different cognitive acts at different points in time, with different</w:t>
+      </w:r>
+      <w:r>
+        <w:t xml:space="preserve"> </w:t>
+      </w:r>
+      <w:r>
+        <w:t xml:space="preserve">error modes and different instructional remedies. A learner can frame impeccably and steer poorly</w:t>
+      </w:r>
+      <w:r>
+        <w:t xml:space="preserve"> </w:t>
+      </w:r>
+      <w:r>
+        <w:t xml:space="preserve">(detect a flaw but issue a vague correction), or steer fluently atop a malformed task (drive the AI</w:t>
+      </w:r>
+      <w:r>
+        <w:t xml:space="preserve"> </w:t>
+      </w:r>
+      <w:r>
+        <w:t xml:space="preserve">energetically toward the wrong target). Collapsing both into</w:t>
+      </w:r>
+      <w:r>
+        <w:t xml:space="preserve"> </w:t>
+      </w:r>
+      <w:r>
+        <w:t xml:space="preserve">“</w:t>
+      </w:r>
+      <w:r>
+        <w:t xml:space="preserve">prompting</w:t>
+      </w:r>
+      <w:r>
+        <w:t xml:space="preserve">”</w:t>
+      </w:r>
+      <w:r>
+        <w:t xml:space="preserve"> </w:t>
+      </w:r>
+      <w:r>
+        <w:t xml:space="preserve">hides exactly the</w:t>
+      </w:r>
+      <w:r>
+        <w:t xml:space="preserve"> </w:t>
+      </w:r>
+      <w:r>
+        <w:t xml:space="preserve">distinctions an educator needs.</w:t>
+      </w:r>
+    </w:p>
     <w:bookmarkEnd w:id="27"/>
-    <w:bookmarkStart w:id="28" w:name="X44244f8f52b0cf83a8c12e7669f4d4601dca696"/>
-    <w:p>
-      <w:pPr>
-        <w:pStyle w:val="Heading3"/>
-      </w:pPr>
-      <w:r>
-        <w:t xml:space="preserve">3.2 The temporal-separation claim (what makes the decomposition non-obvious)</w:t>
-      </w:r>
-    </w:p>
-    <w:p>
-      <w:pPr>
-        <w:pStyle w:val="FirstParagraph"/>
-      </w:pPr>
-      <w:r>
-        <w:t xml:space="preserve">Existing frameworks treat</w:t>
-      </w:r>
-      <w:r>
-        <w:t xml:space="preserve"> </w:t>
-      </w:r>
-      <w:r>
-        <w:t xml:space="preserve">“</w:t>
-      </w:r>
-      <w:r>
-        <w:t xml:space="preserve">use the AI well</w:t>
-      </w:r>
-      <w:r>
-        <w:t xml:space="preserve">”</w:t>
-      </w:r>
-      <w:r>
-        <w:t xml:space="preserve"> </w:t>
-      </w:r>
-      <w:r>
-        <w:t xml:space="preserve">as one skill or, at most, pair</w:t>
-      </w:r>
-      <w:r>
-        <w:t xml:space="preserve"> </w:t>
-      </w:r>
-      <w:r>
-        <w:t xml:space="preserve">“</w:t>
-      </w:r>
-      <w:r>
-        <w:t xml:space="preserve">prompt</w:t>
-      </w:r>
-      <w:r>
-        <w:t xml:space="preserve">”</w:t>
-      </w:r>
-      <w:r>
-        <w:t xml:space="preserve"> </w:t>
-      </w:r>
-      <w:r>
-        <w:t xml:space="preserve">with</w:t>
-      </w:r>
-      <w:r>
-        <w:t xml:space="preserve"> </w:t>
-      </w:r>
-      <w:r>
-        <w:t xml:space="preserve">“</w:t>
-      </w:r>
-      <w:r>
-        <w:t xml:space="preserve">evaluate.</w:t>
-      </w:r>
-      <w:r>
-        <w:t xml:space="preserve">”</w:t>
-      </w:r>
-      <w:r>
-        <w:t xml:space="preserve"> </w:t>
-      </w:r>
-      <w:r>
-        <w:t xml:space="preserve">CoReasoning’s distinctive move is to separate two operations that prior models fuse: the</w:t>
-      </w:r>
-      <w:r>
-        <w:t xml:space="preserve"> </w:t>
-      </w:r>
-      <w:r>
-        <w:rPr>
-          <w:i/>
-          <w:iCs/>
-        </w:rPr>
-        <w:t xml:space="preserve">pre-generation</w:t>
-      </w:r>
-      <w:r>
-        <w:t xml:space="preserve"> </w:t>
-      </w:r>
-      <w:r>
-        <w:t xml:space="preserve">skill of structuring the task (Framing) and the</w:t>
-      </w:r>
-      <w:r>
-        <w:t xml:space="preserve"> </w:t>
-      </w:r>
-      <w:r>
-        <w:rPr>
-          <w:i/>
-          <w:iCs/>
-        </w:rPr>
-        <w:t xml:space="preserve">post-generation</w:t>
-      </w:r>
-      <w:r>
-        <w:t xml:space="preserve"> </w:t>
-      </w:r>
-      <w:r>
-        <w:t xml:space="preserve">skill of correcting</w:t>
-      </w:r>
-      <w:r>
-        <w:t xml:space="preserve"> </w:t>
-      </w:r>
-      <w:r>
-        <w:t xml:space="preserve">the output (Steering). These are different cognitive acts at different points in time, with different</w:t>
-      </w:r>
-      <w:r>
-        <w:t xml:space="preserve"> </w:t>
-      </w:r>
-      <w:r>
-        <w:t xml:space="preserve">error modes and different instructional remedies. A learner can frame impeccably and steer poorly</w:t>
-      </w:r>
-      <w:r>
-        <w:t xml:space="preserve"> </w:t>
-      </w:r>
-      <w:r>
-        <w:t xml:space="preserve">(detect a flaw but issue a vague correction), or steer fluently atop a malformed task (drive the AI</w:t>
-      </w:r>
-      <w:r>
-        <w:t xml:space="preserve"> </w:t>
-      </w:r>
-      <w:r>
-        <w:t xml:space="preserve">energetically toward the wrong target). Collapsing both into</w:t>
-      </w:r>
-      <w:r>
-        <w:t xml:space="preserve"> </w:t>
-      </w:r>
-      <w:r>
-        <w:t xml:space="preserve">“</w:t>
-      </w:r>
-      <w:r>
-        <w:t xml:space="preserve">prompting</w:t>
-      </w:r>
-      <w:r>
-        <w:t xml:space="preserve">”</w:t>
-      </w:r>
-      <w:r>
-        <w:t xml:space="preserve"> </w:t>
-      </w:r>
-      <w:r>
-        <w:t xml:space="preserve">hides exactly the</w:t>
-      </w:r>
-      <w:r>
-        <w:t xml:space="preserve"> </w:t>
-      </w:r>
-      <w:r>
-        <w:t xml:space="preserve">distinctions an educator needs.</w:t>
-      </w:r>
-    </w:p>
-    <w:bookmarkEnd w:id="28"/>
-    <w:bookmarkStart w:id="29" w:name="distinguishing-judging-from-steering"/>
+    <w:bookmarkStart w:id="28" w:name="distinguishing-judging-from-steering"/>
     <w:p>
       <w:pPr>
         <w:pStyle w:val="Heading3"/>
@@ -2064,9 +1989,9 @@
         <w:t xml:space="preserve">remaining comparatively flat in the others, rather than relying on a single global factor model.</w:t>
       </w:r>
     </w:p>
+    <w:bookmarkEnd w:id="28"/>
     <w:bookmarkEnd w:id="29"/>
-    <w:bookmarkEnd w:id="30"/>
-    <w:bookmarkStart w:id="31" w:name="theoretical-grounding"/>
+    <w:bookmarkStart w:id="30" w:name="theoretical-grounding"/>
     <w:p>
       <w:pPr>
         <w:pStyle w:val="Heading2"/>
@@ -2431,8 +2356,8 @@
         <w:t xml:space="preserve">accept.</w:t>
       </w:r>
     </w:p>
-    <w:bookmarkEnd w:id="31"/>
-    <w:bookmarkStart w:id="32" w:name="propositions"/>
+    <w:bookmarkEnd w:id="30"/>
+    <w:bookmarkStart w:id="31" w:name="propositions"/>
     <w:p>
       <w:pPr>
         <w:pStyle w:val="Heading2"/>
@@ -2758,8 +2683,8 @@
         <w:t xml:space="preserve">signatures (for example, reduced post-task recall) documented in the cognitive-debt literature.</w:t>
       </w:r>
     </w:p>
-    <w:bookmarkEnd w:id="32"/>
-    <w:bookmarkStart w:id="33" w:name="relation-to-prior-frameworks"/>
+    <w:bookmarkEnd w:id="31"/>
+    <w:bookmarkStart w:id="32" w:name="relation-to-prior-frameworks"/>
     <w:p>
       <w:pPr>
         <w:pStyle w:val="Heading2"/>
@@ -3930,8 +3855,8 @@
         <w:t xml:space="preserve">consequential (the skills can be measured apart).</w:t>
       </w:r>
     </w:p>
-    <w:bookmarkEnd w:id="33"/>
-    <w:bookmarkStart w:id="34" w:name="the-coreasoning-lab-system"/>
+    <w:bookmarkEnd w:id="32"/>
+    <w:bookmarkStart w:id="33" w:name="the-coreasoning-lab-system"/>
     <w:p>
       <w:pPr>
         <w:pStyle w:val="Heading2"/>
@@ -4245,8 +4170,8 @@
         <w:t xml:space="preserve">the instrument that produces those scores.</w:t>
       </w:r>
     </w:p>
-    <w:bookmarkEnd w:id="34"/>
-    <w:bookmarkStart w:id="35" w:name="X88f965ab2b6c2a236609197dd879be439c7e389"/>
+    <w:bookmarkEnd w:id="33"/>
+    <w:bookmarkStart w:id="34" w:name="X88f965ab2b6c2a236609197dd879be439c7e389"/>
     <w:p>
       <w:pPr>
         <w:pStyle w:val="Heading2"/>
@@ -4540,8 +4465,8 @@
         <w:t xml:space="preserve">is the separate validity question addressed by the prepared study in Section 10.</w:t>
       </w:r>
     </w:p>
-    <w:bookmarkEnd w:id="35"/>
-    <w:bookmarkStart w:id="42" w:name="feasibility-demonstration"/>
+    <w:bookmarkEnd w:id="34"/>
+    <w:bookmarkStart w:id="41" w:name="feasibility-demonstration"/>
     <w:p>
       <w:pPr>
         <w:pStyle w:val="Heading2"/>
@@ -5473,18 +5398,18 @@
           <wp:inline>
             <wp:extent cx="4600754" cy="3864633"/>
             <wp:effectExtent b="0" l="0" r="0" t="0"/>
-            <wp:docPr descr="Figure 2. Own-competence effects dominate cross-competence effects on every skill’s grade." title="" id="37" name="Picture"/>
+            <wp:docPr descr="Figure 2. Own-competence effects dominate cross-competence effects on every skill’s grade." title="" id="36" name="Picture"/>
             <a:graphic>
               <a:graphicData uri="http://schemas.openxmlformats.org/drawingml/2006/picture">
                 <pic:pic>
                   <pic:nvPicPr>
-                    <pic:cNvPr descr="assets/fig_dissociation_heatmap.png" id="38" name="Picture"/>
+                    <pic:cNvPr descr="assets/fig_dissociation_heatmap.png" id="37" name="Picture"/>
                     <pic:cNvPicPr>
                       <a:picLocks noChangeArrowheads="1" noChangeAspect="1"/>
                     </pic:cNvPicPr>
                   </pic:nvPicPr>
                   <pic:blipFill>
-                    <a:blip r:embed="rId36"/>
+                    <a:blip r:embed="rId35"/>
                     <a:stretch>
                       <a:fillRect/>
                     </a:stretch>
@@ -5554,18 +5479,18 @@
           <wp:inline>
             <wp:extent cx="5334000" cy="2963333"/>
             <wp:effectExtent b="0" l="0" r="0" t="0"/>
-            <wp:docPr descr="Figure 3. Per-skill grades dissociate by competence profile." title="" id="40" name="Picture"/>
+            <wp:docPr descr="Figure 3. Per-skill grades dissociate by competence profile." title="" id="39" name="Picture"/>
             <a:graphic>
               <a:graphicData uri="http://schemas.openxmlformats.org/drawingml/2006/picture">
                 <pic:pic>
                   <pic:nvPicPr>
-                    <pic:cNvPr descr="assets/fig_contrasts.png" id="41" name="Picture"/>
+                    <pic:cNvPr descr="assets/fig_contrasts.png" id="40" name="Picture"/>
                     <pic:cNvPicPr>
                       <a:picLocks noChangeArrowheads="1" noChangeAspect="1"/>
                     </pic:cNvPicPr>
                   </pic:nvPicPr>
                   <pic:blipFill>
-                    <a:blip r:embed="rId39"/>
+                    <a:blip r:embed="rId38"/>
                     <a:stretch>
                       <a:fillRect/>
                     </a:stretch>
@@ -5830,229 +5755,229 @@
         <w:t xml:space="preserve">calibration, which we leave to the validation study.</w:t>
       </w:r>
     </w:p>
+    <w:bookmarkEnd w:id="41"/>
+    <w:bookmarkStart w:id="42" w:name="tensions-and-boundary-conditions"/>
+    <w:p>
+      <w:pPr>
+        <w:pStyle w:val="Heading2"/>
+      </w:pPr>
+      <w:r>
+        <w:t xml:space="preserve">9. Tensions and boundary conditions</w:t>
+      </w:r>
+    </w:p>
+    <w:p>
+      <w:pPr>
+        <w:pStyle w:val="FirstParagraph"/>
+      </w:pPr>
+      <w:r>
+        <w:t xml:space="preserve">A mature account must confront four tensions rather than paper over them.</w:t>
+      </w:r>
+    </w:p>
+    <w:p>
+      <w:pPr>
+        <w:pStyle w:val="BodyText"/>
+      </w:pPr>
+      <w:r>
+        <w:rPr>
+          <w:i/>
+          <w:iCs/>
+        </w:rPr>
+        <w:t xml:space="preserve">Offloading versus productive struggle.</w:t>
+      </w:r>
+      <w:r>
+        <w:t xml:space="preserve"> </w:t>
+      </w:r>
+      <w:r>
+        <w:t xml:space="preserve">Evidence that AI use can depress critical thinking through</w:t>
+      </w:r>
+      <w:r>
+        <w:t xml:space="preserve"> </w:t>
+      </w:r>
+      <w:r>
+        <w:t xml:space="preserve">cognitive offloading (Gerlich, 2025; Kosmyna et al., 2025) appears to threaten any framework that</w:t>
+      </w:r>
+      <w:r>
+        <w:t xml:space="preserve"> </w:t>
+      </w:r>
+      <w:r>
+        <w:t xml:space="preserve">puts learners in close partnership with AI. The resolution is in the zone-of-proximal-development</w:t>
+      </w:r>
+      <w:r>
+        <w:t xml:space="preserve"> </w:t>
+      </w:r>
+      <w:r>
+        <w:t xml:space="preserve">stance: CoReasoning treats the AI as a mediating tool whose purpose is the learner’s eventual</w:t>
+      </w:r>
+      <w:r>
+        <w:t xml:space="preserve"> </w:t>
+      </w:r>
+      <w:r>
+        <w:rPr>
+          <w:i/>
+          <w:iCs/>
+        </w:rPr>
+        <w:t xml:space="preserve">independence</w:t>
+      </w:r>
+      <w:r>
+        <w:t xml:space="preserve">, and it offloads execution while deliberately retaining the cognitive work of</w:t>
+      </w:r>
+      <w:r>
+        <w:t xml:space="preserve"> </w:t>
+      </w:r>
+      <w:r>
+        <w:t xml:space="preserve">specifying, evaluating, and correcting. The framework is, in this sense, the designed inverse of</w:t>
+      </w:r>
+      <w:r>
+        <w:t xml:space="preserve"> </w:t>
+      </w:r>
+      <w:r>
+        <w:t xml:space="preserve">metacognitive laziness (Proposition P5).</w:t>
+      </w:r>
+    </w:p>
+    <w:p>
+      <w:pPr>
+        <w:pStyle w:val="BodyText"/>
+      </w:pPr>
+      <w:r>
+        <w:rPr>
+          <w:i/>
+          <w:iCs/>
+        </w:rPr>
+        <w:t xml:space="preserve">The calibration trap.</w:t>
+      </w:r>
+      <w:r>
+        <w:t xml:space="preserve"> </w:t>
+      </w:r>
+      <w:r>
+        <w:t xml:space="preserve">Judging is metacognitive monitoring, and monitoring is only useful when</w:t>
+      </w:r>
+      <w:r>
+        <w:t xml:space="preserve"> </w:t>
+      </w:r>
+      <w:r>
+        <w:t xml:space="preserve">calibrated. A learner who lacks the domain knowledge to recognize an error cannot detect that error</w:t>
+      </w:r>
+      <w:r>
+        <w:t xml:space="preserve"> </w:t>
+      </w:r>
+      <w:r>
+        <w:t xml:space="preserve">in AI output, however vigilant. Judging is therefore bounded by domain competence, and the framework</w:t>
+      </w:r>
+      <w:r>
+        <w:t xml:space="preserve"> </w:t>
+      </w:r>
+      <w:r>
+        <w:t xml:space="preserve">should be read as describing a skill that develops</w:t>
+      </w:r>
+      <w:r>
+        <w:t xml:space="preserve"> </w:t>
+      </w:r>
+      <w:r>
+        <w:rPr>
+          <w:i/>
+          <w:iCs/>
+        </w:rPr>
+        <w:t xml:space="preserve">with</w:t>
+      </w:r>
+      <w:r>
+        <w:t xml:space="preserve"> </w:t>
+      </w:r>
+      <w:r>
+        <w:t xml:space="preserve">domain knowledge, not as a substitute for it</w:t>
+      </w:r>
+      <w:r>
+        <w:t xml:space="preserve"> </w:t>
+      </w:r>
+      <w:r>
+        <w:t xml:space="preserve">(Proposition P4).</w:t>
+      </w:r>
+    </w:p>
+    <w:p>
+      <w:pPr>
+        <w:pStyle w:val="BodyText"/>
+      </w:pPr>
+      <w:r>
+        <w:rPr>
+          <w:i/>
+          <w:iCs/>
+        </w:rPr>
+        <w:t xml:space="preserve">Interactive is not automatically productive.</w:t>
+      </w:r>
+      <w:r>
+        <w:t xml:space="preserve"> </w:t>
+      </w:r>
+      <w:r>
+        <w:t xml:space="preserve">ICAP predicts that interactive engagement yields the</w:t>
+      </w:r>
+      <w:r>
+        <w:t xml:space="preserve"> </w:t>
+      </w:r>
+      <w:r>
+        <w:t xml:space="preserve">most learning, but rapid AI dialogue can be voluminous and shallow, a sequence of re-rolls rather than</w:t>
+      </w:r>
+      <w:r>
+        <w:t xml:space="preserve"> </w:t>
+      </w:r>
+      <w:r>
+        <w:t xml:space="preserve">reasoning. Steering counts as genuine metacognitive control only when corrections are</w:t>
+      </w:r>
+      <w:r>
+        <w:t xml:space="preserve"> </w:t>
+      </w:r>
+      <w:r>
+        <w:t xml:space="preserve">knowledge-generating, which is why the instrument rewards targeted, convergent corrections rather than</w:t>
+      </w:r>
+      <w:r>
+        <w:t xml:space="preserve"> </w:t>
+      </w:r>
+      <w:r>
+        <w:t xml:space="preserve">mere repetition.</w:t>
+      </w:r>
+    </w:p>
+    <w:p>
+      <w:pPr>
+        <w:pStyle w:val="BodyText"/>
+      </w:pPr>
+      <w:r>
+        <w:rPr>
+          <w:i/>
+          <w:iCs/>
+        </w:rPr>
+        <w:t xml:space="preserve">Standards can regress.</w:t>
+      </w:r>
+      <w:r>
+        <w:t xml:space="preserve"> </w:t>
+      </w:r>
+      <w:r>
+        <w:t xml:space="preserve">Judging and Steering presuppose that the learner holds standards adequate to</w:t>
+      </w:r>
+      <w:r>
+        <w:t xml:space="preserve"> </w:t>
+      </w:r>
+      <w:r>
+        <w:t xml:space="preserve">evaluate the output. When the AI is more competent in the domain than the learner, the standards the</w:t>
+      </w:r>
+      <w:r>
+        <w:t xml:space="preserve"> </w:t>
+      </w:r>
+      <w:r>
+        <w:t xml:space="preserve">learner applies may be inferior to the artifact under review, a reversal that classical</w:t>
+      </w:r>
+      <w:r>
+        <w:t xml:space="preserve"> </w:t>
+      </w:r>
+      <w:r>
+        <w:t xml:space="preserve">formative-assessment theory does not anticipate and that bounds the framework’s applicability at the</w:t>
+      </w:r>
+      <w:r>
+        <w:t xml:space="preserve"> </w:t>
+      </w:r>
+      <w:r>
+        <w:t xml:space="preserve">expert frontier.</w:t>
+      </w:r>
+    </w:p>
     <w:bookmarkEnd w:id="42"/>
-    <w:bookmarkStart w:id="43" w:name="tensions-and-boundary-conditions"/>
-    <w:p>
-      <w:pPr>
-        <w:pStyle w:val="Heading2"/>
-      </w:pPr>
-      <w:r>
-        <w:t xml:space="preserve">9. Tensions and boundary conditions</w:t>
-      </w:r>
-    </w:p>
-    <w:p>
-      <w:pPr>
-        <w:pStyle w:val="FirstParagraph"/>
-      </w:pPr>
-      <w:r>
-        <w:t xml:space="preserve">A mature account must confront four tensions rather than paper over them.</w:t>
-      </w:r>
-    </w:p>
-    <w:p>
-      <w:pPr>
-        <w:pStyle w:val="BodyText"/>
-      </w:pPr>
-      <w:r>
-        <w:rPr>
-          <w:i/>
-          <w:iCs/>
-        </w:rPr>
-        <w:t xml:space="preserve">Offloading versus productive struggle.</w:t>
-      </w:r>
-      <w:r>
-        <w:t xml:space="preserve"> </w:t>
-      </w:r>
-      <w:r>
-        <w:t xml:space="preserve">Evidence that AI use can depress critical thinking through</w:t>
-      </w:r>
-      <w:r>
-        <w:t xml:space="preserve"> </w:t>
-      </w:r>
-      <w:r>
-        <w:t xml:space="preserve">cognitive offloading (Gerlich, 2025; Kosmyna et al., 2025) appears to threaten any framework that</w:t>
-      </w:r>
-      <w:r>
-        <w:t xml:space="preserve"> </w:t>
-      </w:r>
-      <w:r>
-        <w:t xml:space="preserve">puts learners in close partnership with AI. The resolution is in the zone-of-proximal-development</w:t>
-      </w:r>
-      <w:r>
-        <w:t xml:space="preserve"> </w:t>
-      </w:r>
-      <w:r>
-        <w:t xml:space="preserve">stance: CoReasoning treats the AI as a mediating tool whose purpose is the learner’s eventual</w:t>
-      </w:r>
-      <w:r>
-        <w:t xml:space="preserve"> </w:t>
-      </w:r>
-      <w:r>
-        <w:rPr>
-          <w:i/>
-          <w:iCs/>
-        </w:rPr>
-        <w:t xml:space="preserve">independence</w:t>
-      </w:r>
-      <w:r>
-        <w:t xml:space="preserve">, and it offloads execution while deliberately retaining the cognitive work of</w:t>
-      </w:r>
-      <w:r>
-        <w:t xml:space="preserve"> </w:t>
-      </w:r>
-      <w:r>
-        <w:t xml:space="preserve">specifying, evaluating, and correcting. The framework is, in this sense, the designed inverse of</w:t>
-      </w:r>
-      <w:r>
-        <w:t xml:space="preserve"> </w:t>
-      </w:r>
-      <w:r>
-        <w:t xml:space="preserve">metacognitive laziness (Proposition P5).</w:t>
-      </w:r>
-    </w:p>
-    <w:p>
-      <w:pPr>
-        <w:pStyle w:val="BodyText"/>
-      </w:pPr>
-      <w:r>
-        <w:rPr>
-          <w:i/>
-          <w:iCs/>
-        </w:rPr>
-        <w:t xml:space="preserve">The calibration trap.</w:t>
-      </w:r>
-      <w:r>
-        <w:t xml:space="preserve"> </w:t>
-      </w:r>
-      <w:r>
-        <w:t xml:space="preserve">Judging is metacognitive monitoring, and monitoring is only useful when</w:t>
-      </w:r>
-      <w:r>
-        <w:t xml:space="preserve"> </w:t>
-      </w:r>
-      <w:r>
-        <w:t xml:space="preserve">calibrated. A learner who lacks the domain knowledge to recognize an error cannot detect that error</w:t>
-      </w:r>
-      <w:r>
-        <w:t xml:space="preserve"> </w:t>
-      </w:r>
-      <w:r>
-        <w:t xml:space="preserve">in AI output, however vigilant. Judging is therefore bounded by domain competence, and the framework</w:t>
-      </w:r>
-      <w:r>
-        <w:t xml:space="preserve"> </w:t>
-      </w:r>
-      <w:r>
-        <w:t xml:space="preserve">should be read as describing a skill that develops</w:t>
-      </w:r>
-      <w:r>
-        <w:t xml:space="preserve"> </w:t>
-      </w:r>
-      <w:r>
-        <w:rPr>
-          <w:i/>
-          <w:iCs/>
-        </w:rPr>
-        <w:t xml:space="preserve">with</w:t>
-      </w:r>
-      <w:r>
-        <w:t xml:space="preserve"> </w:t>
-      </w:r>
-      <w:r>
-        <w:t xml:space="preserve">domain knowledge, not as a substitute for it</w:t>
-      </w:r>
-      <w:r>
-        <w:t xml:space="preserve"> </w:t>
-      </w:r>
-      <w:r>
-        <w:t xml:space="preserve">(Proposition P4).</w:t>
-      </w:r>
-    </w:p>
-    <w:p>
-      <w:pPr>
-        <w:pStyle w:val="BodyText"/>
-      </w:pPr>
-      <w:r>
-        <w:rPr>
-          <w:i/>
-          <w:iCs/>
-        </w:rPr>
-        <w:t xml:space="preserve">Interactive is not automatically productive.</w:t>
-      </w:r>
-      <w:r>
-        <w:t xml:space="preserve"> </w:t>
-      </w:r>
-      <w:r>
-        <w:t xml:space="preserve">ICAP predicts that interactive engagement yields the</w:t>
-      </w:r>
-      <w:r>
-        <w:t xml:space="preserve"> </w:t>
-      </w:r>
-      <w:r>
-        <w:t xml:space="preserve">most learning, but rapid AI dialogue can be voluminous and shallow, a sequence of re-rolls rather than</w:t>
-      </w:r>
-      <w:r>
-        <w:t xml:space="preserve"> </w:t>
-      </w:r>
-      <w:r>
-        <w:t xml:space="preserve">reasoning. Steering counts as genuine metacognitive control only when corrections are</w:t>
-      </w:r>
-      <w:r>
-        <w:t xml:space="preserve"> </w:t>
-      </w:r>
-      <w:r>
-        <w:t xml:space="preserve">knowledge-generating, which is why the instrument rewards targeted, convergent corrections rather than</w:t>
-      </w:r>
-      <w:r>
-        <w:t xml:space="preserve"> </w:t>
-      </w:r>
-      <w:r>
-        <w:t xml:space="preserve">mere repetition.</w:t>
-      </w:r>
-    </w:p>
-    <w:p>
-      <w:pPr>
-        <w:pStyle w:val="BodyText"/>
-      </w:pPr>
-      <w:r>
-        <w:rPr>
-          <w:i/>
-          <w:iCs/>
-        </w:rPr>
-        <w:t xml:space="preserve">Standards can regress.</w:t>
-      </w:r>
-      <w:r>
-        <w:t xml:space="preserve"> </w:t>
-      </w:r>
-      <w:r>
-        <w:t xml:space="preserve">Judging and Steering presuppose that the learner holds standards adequate to</w:t>
-      </w:r>
-      <w:r>
-        <w:t xml:space="preserve"> </w:t>
-      </w:r>
-      <w:r>
-        <w:t xml:space="preserve">evaluate the output. When the AI is more competent in the domain than the learner, the standards the</w:t>
-      </w:r>
-      <w:r>
-        <w:t xml:space="preserve"> </w:t>
-      </w:r>
-      <w:r>
-        <w:t xml:space="preserve">learner applies may be inferior to the artifact under review, a reversal that classical</w:t>
-      </w:r>
-      <w:r>
-        <w:t xml:space="preserve"> </w:t>
-      </w:r>
-      <w:r>
-        <w:t xml:space="preserve">formative-assessment theory does not anticipate and that bounds the framework’s applicability at the</w:t>
-      </w:r>
-      <w:r>
-        <w:t xml:space="preserve"> </w:t>
-      </w:r>
-      <w:r>
-        <w:t xml:space="preserve">expert frontier.</w:t>
-      </w:r>
-    </w:p>
-    <w:bookmarkEnd w:id="43"/>
-    <w:bookmarkStart w:id="44" w:name="a-validation-and-assessment-agenda"/>
+    <w:bookmarkStart w:id="43" w:name="a-validation-and-assessment-agenda"/>
     <w:p>
       <w:pPr>
         <w:pStyle w:val="Heading2"/>
@@ -6300,14 +6225,86 @@
         <w:t xml:space="preserve">Proposition P5 and any learning claim; that is explicitly outside the present scope.</w:t>
       </w:r>
     </w:p>
+    <w:bookmarkEnd w:id="43"/>
+    <w:bookmarkStart w:id="44" w:name="limitations"/>
+    <w:p>
+      <w:pPr>
+        <w:pStyle w:val="Heading2"/>
+      </w:pPr>
+      <w:r>
+        <w:t xml:space="preserve">11. Limitations</w:t>
+      </w:r>
+    </w:p>
+    <w:p>
+      <w:pPr>
+        <w:pStyle w:val="FirstParagraph"/>
+      </w:pPr>
+      <w:r>
+        <w:t xml:space="preserve">This is a conceptual contribution accompanied by a proof-of-concept instrument, not an efficacy study.</w:t>
+      </w:r>
+      <w:r>
+        <w:t xml:space="preserve"> </w:t>
+      </w:r>
+      <w:r>
+        <w:t xml:space="preserve">The feasibility demonstration uses simulated learners of controlled competence, which establish that</w:t>
+      </w:r>
+      <w:r>
+        <w:t xml:space="preserve"> </w:t>
+      </w:r>
+      <w:r>
+        <w:t xml:space="preserve">the grader has signal and that the skills can be measured apart, but which are not human learners. To</w:t>
+      </w:r>
+      <w:r>
+        <w:t xml:space="preserve"> </w:t>
+      </w:r>
+      <w:r>
+        <w:t xml:space="preserve">avoid a model grading its own output, learners are generated by one model (gpt-4o-mini) and graded by</w:t>
+      </w:r>
+      <w:r>
+        <w:t xml:space="preserve"> </w:t>
+      </w:r>
+      <w:r>
+        <w:t xml:space="preserve">a different one (gpt-4o); the deployed prototype’s engine is llama-3.3-70b, and whether the dissociation</w:t>
+      </w:r>
+      <w:r>
+        <w:t xml:space="preserve"> </w:t>
+      </w:r>
+      <w:r>
+        <w:t xml:space="preserve">replicates across grader backends remains to be shown. The challenges are English-language, and the</w:t>
+      </w:r>
+      <w:r>
+        <w:t xml:space="preserve"> </w:t>
+      </w:r>
+      <w:r>
+        <w:t xml:space="preserve">automated grades have not yet been validated against human experts (Section 10). We make no</w:t>
+      </w:r>
+      <w:r>
+        <w:t xml:space="preserve"> </w:t>
+      </w:r>
+      <w:r>
+        <w:t xml:space="preserve">learning-outcome claim. What the paper establishes is conceptual: a theoretically-grounded</w:t>
+      </w:r>
+      <w:r>
+        <w:t xml:space="preserve"> </w:t>
+      </w:r>
+      <w:r>
+        <w:t xml:space="preserve">decomposition with stated propositions, a precise novelty boundary, and evidence that the three</w:t>
+      </w:r>
+      <w:r>
+        <w:t xml:space="preserve"> </w:t>
+      </w:r>
+      <w:r>
+        <w:t xml:space="preserve">constructs are separable and automatically measurable.</w:t>
+      </w:r>
+    </w:p>
     <w:bookmarkEnd w:id="44"/>
-    <w:bookmarkStart w:id="45" w:name="limitations"/>
+    <w:bookmarkStart w:id="45" w:name="conclusion"/>
     <w:p>
       <w:pPr>
         <w:pStyle w:val="Heading2"/>
       </w:pPr>
       <w:r>
-        <w:t xml:space="preserve">11. Limitations</w:t>
+        <w:t xml:space="preserve">12. Conclusion</w:t>
       </w:r>
     </w:p>
     <w:p>
@@ -6315,119 +6312,47 @@
         <w:pStyle w:val="FirstParagraph"/>
       </w:pPr>
       <w:r>
-        <w:t xml:space="preserve">This is a conceptual contribution accompanied by a proof-of-concept instrument, not an efficacy study.</w:t>
-      </w:r>
-      <w:r>
-        <w:t xml:space="preserve"> </w:t>
-      </w:r>
-      <w:r>
-        <w:t xml:space="preserve">The feasibility demonstration uses simulated learners of controlled competence, which establish that</w:t>
-      </w:r>
-      <w:r>
-        <w:t xml:space="preserve"> </w:t>
-      </w:r>
-      <w:r>
-        <w:t xml:space="preserve">the grader has signal and that the skills can be measured apart, but which are not human learners. To</w:t>
-      </w:r>
-      <w:r>
-        <w:t xml:space="preserve"> </w:t>
-      </w:r>
-      <w:r>
-        <w:t xml:space="preserve">avoid a model grading its own output, learners are generated by one model (gpt-4o-mini) and graded by</w:t>
-      </w:r>
-      <w:r>
-        <w:t xml:space="preserve"> </w:t>
-      </w:r>
-      <w:r>
-        <w:t xml:space="preserve">a different one (gpt-4o); the deployed prototype’s engine is llama-3.3-70b, and whether the dissociation</w:t>
-      </w:r>
-      <w:r>
-        <w:t xml:space="preserve"> </w:t>
-      </w:r>
-      <w:r>
-        <w:t xml:space="preserve">replicates across grader backends remains to be shown. The challenges are English-language, and the</w:t>
-      </w:r>
-      <w:r>
-        <w:t xml:space="preserve"> </w:t>
-      </w:r>
-      <w:r>
-        <w:t xml:space="preserve">automated grades have not yet been validated against human experts (Section 10). We make no</w:t>
-      </w:r>
-      <w:r>
-        <w:t xml:space="preserve"> </w:t>
-      </w:r>
-      <w:r>
-        <w:t xml:space="preserve">learning-outcome claim. What the paper establishes is conceptual: a theoretically-grounded</w:t>
-      </w:r>
-      <w:r>
-        <w:t xml:space="preserve"> </w:t>
-      </w:r>
-      <w:r>
-        <w:t xml:space="preserve">decomposition with stated propositions, a precise novelty boundary, and evidence that the three</w:t>
-      </w:r>
-      <w:r>
-        <w:t xml:space="preserve"> </w:t>
-      </w:r>
-      <w:r>
-        <w:t xml:space="preserve">constructs are separable and automatically measurable.</w:t>
+        <w:t xml:space="preserve">The task of education in the age of generative AI is not to produce faster answer-getters but to</w:t>
+      </w:r>
+      <w:r>
+        <w:t xml:space="preserve"> </w:t>
+      </w:r>
+      <w:r>
+        <w:t xml:space="preserve">cultivate critical collaborators: learners who can specify a problem worth solving, judge what a</w:t>
+      </w:r>
+      <w:r>
+        <w:t xml:space="preserve"> </w:t>
+      </w:r>
+      <w:r>
+        <w:t xml:space="preserve">machine returns, and steer it toward something better. That capability is teachable only if it can be</w:t>
+      </w:r>
+      <w:r>
+        <w:t xml:space="preserve"> </w:t>
+      </w:r>
+      <w:r>
+        <w:t xml:space="preserve">named and assessed. CoReasoning offers a decomposition of it into three theoretically-grounded,</w:t>
+      </w:r>
+      <w:r>
+        <w:t xml:space="preserve"> </w:t>
+      </w:r>
+      <w:r>
+        <w:t xml:space="preserve">independently-assessable skills, Framing, Judging, and Steering, separates the pre-generation skill</w:t>
+      </w:r>
+      <w:r>
+        <w:t xml:space="preserve"> </w:t>
+      </w:r>
+      <w:r>
+        <w:t xml:space="preserve">from the post-generation one in a way prior frameworks do not, and shows that the three can be</w:t>
+      </w:r>
+      <w:r>
+        <w:t xml:space="preserve"> </w:t>
+      </w:r>
+      <w:r>
+        <w:t xml:space="preserve">measured apart. We offer it as a foundation for the assessment and instruction the moment demands.</w:t>
       </w:r>
     </w:p>
     <w:bookmarkEnd w:id="45"/>
-    <w:bookmarkStart w:id="46" w:name="conclusion"/>
-    <w:p>
-      <w:pPr>
-        <w:pStyle w:val="Heading2"/>
-      </w:pPr>
-      <w:r>
-        <w:t xml:space="preserve">12. Conclusion</w:t>
-      </w:r>
-    </w:p>
-    <w:p>
-      <w:pPr>
-        <w:pStyle w:val="FirstParagraph"/>
-      </w:pPr>
-      <w:r>
-        <w:t xml:space="preserve">The task of education in the age of generative AI is not to produce faster answer-getters but to</w:t>
-      </w:r>
-      <w:r>
-        <w:t xml:space="preserve"> </w:t>
-      </w:r>
-      <w:r>
-        <w:t xml:space="preserve">cultivate critical collaborators: learners who can specify a problem worth solving, judge what a</w:t>
-      </w:r>
-      <w:r>
-        <w:t xml:space="preserve"> </w:t>
-      </w:r>
-      <w:r>
-        <w:t xml:space="preserve">machine returns, and steer it toward something better. That capability is teachable only if it can be</w:t>
-      </w:r>
-      <w:r>
-        <w:t xml:space="preserve"> </w:t>
-      </w:r>
-      <w:r>
-        <w:t xml:space="preserve">named and assessed. CoReasoning offers a decomposition of it into three theoretically-grounded,</w:t>
-      </w:r>
-      <w:r>
-        <w:t xml:space="preserve"> </w:t>
-      </w:r>
-      <w:r>
-        <w:t xml:space="preserve">independently-assessable skills, Framing, Judging, and Steering, separates the pre-generation skill</w:t>
-      </w:r>
-      <w:r>
-        <w:t xml:space="preserve"> </w:t>
-      </w:r>
-      <w:r>
-        <w:t xml:space="preserve">from the post-generation one in a way prior frameworks do not, and shows that the three can be</w:t>
-      </w:r>
-      <w:r>
-        <w:t xml:space="preserve"> </w:t>
-      </w:r>
-      <w:r>
-        <w:t xml:space="preserve">measured apart. We offer it as a foundation for the assessment and instruction the moment demands.</w:t>
-      </w:r>
-    </w:p>
-    <w:bookmarkEnd w:id="46"/>
-    <w:bookmarkStart w:id="53" w:name="appendix-a.-system-walkthrough"/>
+    <w:bookmarkStart w:id="52" w:name="appendix-a.-system-walkthrough"/>
     <w:p>
       <w:pPr>
         <w:pStyle w:val="Heading2"/>
@@ -6489,12 +6414,12 @@
           <wp:inline>
             <wp:extent cx="5334000" cy="2726266"/>
             <wp:effectExtent b="0" l="0" r="0" t="0"/>
-            <wp:docPr descr="Figure A1. A CoReasoning Lab challenge run." title="" id="48" name="Picture"/>
+            <wp:docPr descr="Figure A1. A CoReasoning Lab challenge run." title="" id="47" name="Picture"/>
             <a:graphic>
               <a:graphicData uri="http://schemas.openxmlformats.org/drawingml/2006/picture">
                 <pic:pic>
                   <pic:nvPicPr>
-                    <pic:cNvPr descr="assets/system-mockup.svg" id="49" name="Picture"/>
+                    <pic:cNvPr descr="assets/system-mockup.svg" id="48" name="Picture"/>
                     <pic:cNvPicPr>
                       <a:picLocks noChangeArrowheads="1" noChangeAspect="1"/>
                     </pic:cNvPicPr>
@@ -6506,7 +6431,7 @@
                           <a14:useLocalDpi xmlns:a14="http://schemas.microsoft.com/office/drawing/2010/main" val="0"/>
                         </a:ext>
                         <a:ext uri="{96DAC541-7B7A-43D3-8B79-37D633B846F1}">
-                          <asvg:svgBlip xmlns:asvg="http://schemas.microsoft.com/office/drawing/2016/SVG/main" r:embed="rId47"/>
+                          <asvg:svgBlip xmlns:asvg="http://schemas.microsoft.com/office/drawing/2016/SVG/main" r:embed="rId46"/>
                         </a:ext>
                       </a:extLst>
                     </a:blip>
@@ -6617,12 +6542,12 @@
           <wp:inline>
             <wp:extent cx="5334000" cy="3745148"/>
             <wp:effectExtent b="0" l="0" r="0" t="0"/>
-            <wp:docPr descr="Figure A2. CoReasoning Lab role interfaces." title="" id="51" name="Picture"/>
+            <wp:docPr descr="Figure A2. CoReasoning Lab role interfaces." title="" id="50" name="Picture"/>
             <a:graphic>
               <a:graphicData uri="http://schemas.openxmlformats.org/drawingml/2006/picture">
                 <pic:pic>
                   <pic:nvPicPr>
-                    <pic:cNvPr descr="assets/interface-gallery.svg" id="52" name="Picture"/>
+                    <pic:cNvPr descr="assets/interface-gallery.svg" id="51" name="Picture"/>
                     <pic:cNvPicPr>
                       <a:picLocks noChangeArrowheads="1" noChangeAspect="1"/>
                     </pic:cNvPicPr>
@@ -6634,7 +6559,7 @@
                           <a14:useLocalDpi xmlns:a14="http://schemas.microsoft.com/office/drawing/2010/main" val="0"/>
                         </a:ext>
                         <a:ext uri="{96DAC541-7B7A-43D3-8B79-37D633B846F1}">
-                          <asvg:svgBlip xmlns:asvg="http://schemas.microsoft.com/office/drawing/2016/SVG/main" r:embed="rId50"/>
+                          <asvg:svgBlip xmlns:asvg="http://schemas.microsoft.com/office/drawing/2016/SVG/main" r:embed="rId49"/>
                         </a:ext>
                       </a:extLst>
                     </a:blip>
@@ -6726,1074 +6651,1074 @@
         <w:t xml:space="preserve">Steering independently.</w:t>
       </w:r>
     </w:p>
+    <w:bookmarkEnd w:id="52"/>
+    <w:bookmarkStart w:id="53" w:name="references"/>
+    <w:p>
+      <w:pPr>
+        <w:pStyle w:val="Heading2"/>
+      </w:pPr>
+      <w:r>
+        <w:t xml:space="preserve">References</w:t>
+      </w:r>
+    </w:p>
+    <w:p>
+      <w:pPr>
+        <w:pStyle w:val="FirstParagraph"/>
+      </w:pPr>
+      <w:r>
+        <w:t xml:space="preserve">Acar, O. A. (2023). AI Prompt Engineering Isn’t the Future.</w:t>
+      </w:r>
+      <w:r>
+        <w:t xml:space="preserve"> </w:t>
+      </w:r>
+      <w:r>
+        <w:rPr>
+          <w:i/>
+          <w:iCs/>
+        </w:rPr>
+        <w:t xml:space="preserve">Harvard Business Review, June 6</w:t>
+      </w:r>
+      <w:r>
+        <w:t xml:space="preserve">.</w:t>
+      </w:r>
+    </w:p>
+    <w:p>
+      <w:pPr>
+        <w:pStyle w:val="BodyText"/>
+      </w:pPr>
+      <w:r>
+        <w:t xml:space="preserve">Anderson, L. W., &amp; Krathwohl, D. R. (2001). A Taxonomy for Learning, Teaching, and Assessing: A Revision of Bloom’s Taxonomy of Educational Objectives.</w:t>
+      </w:r>
+      <w:r>
+        <w:t xml:space="preserve"> </w:t>
+      </w:r>
+      <w:r>
+        <w:rPr>
+          <w:i/>
+          <w:iCs/>
+        </w:rPr>
+        <w:t xml:space="preserve">Longman</w:t>
+      </w:r>
+      <w:r>
+        <w:t xml:space="preserve">.</w:t>
+      </w:r>
+    </w:p>
+    <w:p>
+      <w:pPr>
+        <w:pStyle w:val="BodyText"/>
+      </w:pPr>
+      <w:r>
+        <w:t xml:space="preserve">Annapureddy, R., Fornaroli, A., &amp; Gatica-Perez, D. (2024). Generative AI Literacy: Twelve Defining Competencies.</w:t>
+      </w:r>
+      <w:r>
+        <w:t xml:space="preserve"> </w:t>
+      </w:r>
+      <w:r>
+        <w:rPr>
+          <w:i/>
+          <w:iCs/>
+        </w:rPr>
+        <w:t xml:space="preserve">Digital Government: Research and Practice</w:t>
+      </w:r>
+      <w:r>
+        <w:t xml:space="preserve">.</w:t>
+      </w:r>
+    </w:p>
+    <w:p>
+      <w:pPr>
+        <w:pStyle w:val="BodyText"/>
+      </w:pPr>
+      <w:r>
+        <w:t xml:space="preserve">Bansal, G., Wu, T., Zhou, J., Fok, R., Nushi, B., Kamar, E., Ribeiro, M. T., &amp; Weld, D. S. (2021). Does the Whole Exceed Its Parts? The Effect of AI Explanations on Complementary Team Performance.</w:t>
+      </w:r>
+      <w:r>
+        <w:t xml:space="preserve"> </w:t>
+      </w:r>
+      <w:r>
+        <w:rPr>
+          <w:i/>
+          <w:iCs/>
+        </w:rPr>
+        <w:t xml:space="preserve">Proceedings of the 2021 CHI Conference on Human Factors in Computing Systems</w:t>
+      </w:r>
+      <w:r>
+        <w:t xml:space="preserve">.</w:t>
+      </w:r>
+    </w:p>
+    <w:p>
+      <w:pPr>
+        <w:pStyle w:val="BodyText"/>
+      </w:pPr>
+      <w:r>
+        <w:t xml:space="preserve">Barzilai, S., &amp; Chinn, C. A. (2018). On the Goals of Epistemic Education: Promoting Apt Epistemic Performance.</w:t>
+      </w:r>
+      <w:r>
+        <w:t xml:space="preserve"> </w:t>
+      </w:r>
+      <w:r>
+        <w:rPr>
+          <w:i/>
+          <w:iCs/>
+        </w:rPr>
+        <w:t xml:space="preserve">Journal of the Learning Sciences</w:t>
+      </w:r>
+      <w:r>
+        <w:t xml:space="preserve">, 27(3), 353–389.</w:t>
+      </w:r>
+    </w:p>
+    <w:p>
+      <w:pPr>
+        <w:pStyle w:val="BodyText"/>
+      </w:pPr>
+      <w:r>
+        <w:t xml:space="preserve">Bjork, E. L., &amp; Bjork, R. A. (2011). Making Things Hard on Yourself, but in a Good Way: Creating Desirable Difficulties to Enhance Learning.</w:t>
+      </w:r>
+      <w:r>
+        <w:t xml:space="preserve"> </w:t>
+      </w:r>
+      <w:r>
+        <w:rPr>
+          <w:i/>
+          <w:iCs/>
+        </w:rPr>
+        <w:t xml:space="preserve">Psychology and the Real World</w:t>
+      </w:r>
+      <w:r>
+        <w:t xml:space="preserve">, 56–64.</w:t>
+      </w:r>
+    </w:p>
+    <w:p>
+      <w:pPr>
+        <w:pStyle w:val="BodyText"/>
+      </w:pPr>
+      <w:r>
+        <w:t xml:space="preserve">Bu{</w:t>
+      </w:r>
+      <w:r>
+        <w:t xml:space="preserve">}inca, Z., Malaya, M. B., &amp; Gajos, K. Z. (2021). To Trust or to Think: Cognitive Forcing Functions Can Reduce Overreliance on AI in AI-Assisted Decision-Making.</w:t>
+      </w:r>
+      <w:r>
+        <w:t xml:space="preserve"> </w:t>
+      </w:r>
+      <w:r>
+        <w:rPr>
+          <w:i/>
+          <w:iCs/>
+        </w:rPr>
+        <w:t xml:space="preserve">Proceedings of the ACM on Human-Computer Interaction</w:t>
+      </w:r>
+      <w:r>
+        <w:t xml:space="preserve">, 5(CSCW1), 1–21.</w:t>
+      </w:r>
+    </w:p>
+    <w:p>
+      <w:pPr>
+        <w:pStyle w:val="BodyText"/>
+      </w:pPr>
+      <w:r>
+        <w:t xml:space="preserve">Chi, M. T. H., &amp; Wylie, R. (2014). The ICAP Framework: Linking Cognitive Engagement to Active Learning Outcomes.</w:t>
+      </w:r>
+      <w:r>
+        <w:t xml:space="preserve"> </w:t>
+      </w:r>
+      <w:r>
+        <w:rPr>
+          <w:i/>
+          <w:iCs/>
+        </w:rPr>
+        <w:t xml:space="preserve">Educational Psychologist</w:t>
+      </w:r>
+      <w:r>
+        <w:t xml:space="preserve">, 49(4), 219–243.</w:t>
+      </w:r>
+    </w:p>
+    <w:p>
+      <w:pPr>
+        <w:pStyle w:val="BodyText"/>
+      </w:pPr>
+      <w:r>
+        <w:t xml:space="preserve">Clerc, O., Abdelghani, R., Desvaux, C., Poisson, E., Oudeyer, P., &amp; Sauz{'e}on, H. (2026). Teaching Students to Question the Machine: An AI Literacy Intervention Improves Students’ Regulation of LLM Use in a Science Task.</w:t>
+      </w:r>
+      <w:r>
+        <w:t xml:space="preserve"> </w:t>
+      </w:r>
+      <w:r>
+        <w:rPr>
+          <w:i/>
+          <w:iCs/>
+        </w:rPr>
+        <w:t xml:space="preserve">arXiv preprint arXiv:2604.01955</w:t>
+      </w:r>
+      <w:r>
+        <w:t xml:space="preserve">.</w:t>
+      </w:r>
+    </w:p>
+    <w:p>
+      <w:pPr>
+        <w:pStyle w:val="BodyText"/>
+      </w:pPr>
+      <w:r>
+        <w:t xml:space="preserve">Collins, A., Brown, J. S., &amp; Newman, S. E. (1989). Cognitive Apprenticeship: Teaching the Crafts of Reading, Writing, and Mathematics.</w:t>
+      </w:r>
+      <w:r>
+        <w:t xml:space="preserve"> </w:t>
+      </w:r>
+      <w:r>
+        <w:rPr>
+          <w:i/>
+          <w:iCs/>
+        </w:rPr>
+        <w:t xml:space="preserve">Knowing, Learning, and Instruction: Essays in Honor of Robert Glaser</w:t>
+      </w:r>
+      <w:r>
+        <w:t xml:space="preserve">, 453–494.</w:t>
+      </w:r>
+    </w:p>
+    <w:p>
+      <w:pPr>
+        <w:pStyle w:val="BodyText"/>
+      </w:pPr>
+      <w:r>
+        <w:t xml:space="preserve">Dakan, R., &amp; Feller, J. (2025). Framework for AI Fluency.</w:t>
+      </w:r>
+      <w:r>
+        <w:t xml:space="preserve"> </w:t>
+      </w:r>
+      <w:r>
+        <w:rPr>
+          <w:i/>
+          <w:iCs/>
+        </w:rPr>
+        <w:t xml:space="preserve">Anthropic</w:t>
+      </w:r>
+      <w:r>
+        <w:t xml:space="preserve">.</w:t>
+      </w:r>
+    </w:p>
+    <w:p>
+      <w:pPr>
+        <w:pStyle w:val="BodyText"/>
+      </w:pPr>
+      <w:r>
+        <w:t xml:space="preserve">Dell’Acqua, F., McFowland III, E., Mollick, E., Lifshitz-Assaf, H., Kellogg, K., Rajendran, S., Krayer, L., Candelon, F., &amp; Lakhani, K. R. (2023). Navigating the Jagged Technological Frontier.</w:t>
+      </w:r>
+      <w:r>
+        <w:t xml:space="preserve"> </w:t>
+      </w:r>
+      <w:r>
+        <w:rPr>
+          <w:i/>
+          <w:iCs/>
+        </w:rPr>
+        <w:t xml:space="preserve">Harvard Business School Working Paper 24-013</w:t>
+      </w:r>
+      <w:r>
+        <w:t xml:space="preserve">.</w:t>
+      </w:r>
+    </w:p>
+    <w:p>
+      <w:pPr>
+        <w:pStyle w:val="BodyText"/>
+      </w:pPr>
+      <w:r>
+        <w:t xml:space="preserve">Denny, P., Leinonen, J., Prather, J., Luxton-Reilly, A., Amarouche, T., Becker, B. A., &amp; Reeves, B. N. (2024). Prompt Problems: A New Programming Exercise for the Generative AI Era.</w:t>
+      </w:r>
+      <w:r>
+        <w:t xml:space="preserve"> </w:t>
+      </w:r>
+      <w:r>
+        <w:rPr>
+          <w:i/>
+          <w:iCs/>
+        </w:rPr>
+        <w:t xml:space="preserve">Proceedings of the 55th ACM Technical Symposium on Computer Science Education (SIGCSE)</w:t>
+      </w:r>
+      <w:r>
+        <w:t xml:space="preserve">.</w:t>
+      </w:r>
+    </w:p>
+    <w:p>
+      <w:pPr>
+        <w:pStyle w:val="BodyText"/>
+      </w:pPr>
+      <w:r>
+        <w:t xml:space="preserve">Di Santi, E. (2026). Cognitive Amplification vs Cognitive Delegation in Human-AI Systems: A Metric Framework.</w:t>
+      </w:r>
+      <w:r>
+        <w:t xml:space="preserve"> </w:t>
+      </w:r>
+      <w:r>
+        <w:rPr>
+          <w:i/>
+          <w:iCs/>
+        </w:rPr>
+        <w:t xml:space="preserve">arXiv preprint arXiv:2603.18677</w:t>
+      </w:r>
+      <w:r>
+        <w:t xml:space="preserve">.</w:t>
+      </w:r>
+    </w:p>
+    <w:p>
+      <w:pPr>
+        <w:pStyle w:val="BodyText"/>
+      </w:pPr>
+      <w:r>
+        <w:t xml:space="preserve">Facione, P. A. (1990). Critical Thinking: A Statement of Expert Consensus for Purposes of Educational Assessment and Instruction (The Delphi Report).</w:t>
+      </w:r>
+      <w:r>
+        <w:t xml:space="preserve"> </w:t>
+      </w:r>
+      <w:r>
+        <w:rPr>
+          <w:i/>
+          <w:iCs/>
+        </w:rPr>
+        <w:t xml:space="preserve">American Philosophical Association</w:t>
+      </w:r>
+      <w:r>
+        <w:t xml:space="preserve">.</w:t>
+      </w:r>
+    </w:p>
+    <w:p>
+      <w:pPr>
+        <w:pStyle w:val="BodyText"/>
+      </w:pPr>
+      <w:r>
+        <w:t xml:space="preserve">Feng, Y., Wang, S., Cheng, Z., Wan, Y., &amp; Chen, D. (2025). Are We on the Right Way to Assessing LLM-as-a-Judge?.</w:t>
+      </w:r>
+      <w:r>
+        <w:t xml:space="preserve"> </w:t>
+      </w:r>
+      <w:r>
+        <w:rPr>
+          <w:i/>
+          <w:iCs/>
+        </w:rPr>
+        <w:t xml:space="preserve">arXiv preprint arXiv:2512.16041</w:t>
+      </w:r>
+      <w:r>
+        <w:t xml:space="preserve">.</w:t>
+      </w:r>
+    </w:p>
+    <w:p>
+      <w:pPr>
+        <w:pStyle w:val="BodyText"/>
+      </w:pPr>
+      <w:r>
+        <w:t xml:space="preserve">Fernandes, D., Villa, S., Nicholls, S., Haavisto, O., Buschek, D., Schmidt, A., Kosch, T., Shen, C., &amp; Welsch, R. (2024). Performance and Metacognition Disconnect when Reasoning in Human-AI Interaction.</w:t>
+      </w:r>
+      <w:r>
+        <w:t xml:space="preserve"> </w:t>
+      </w:r>
+      <w:r>
+        <w:rPr>
+          <w:i/>
+          <w:iCs/>
+        </w:rPr>
+        <w:t xml:space="preserve">arXiv preprint arXiv:2409.16708</w:t>
+      </w:r>
+      <w:r>
+        <w:t xml:space="preserve">.</w:t>
+      </w:r>
+    </w:p>
+    <w:p>
+      <w:pPr>
+        <w:pStyle w:val="BodyText"/>
+      </w:pPr>
+      <w:r>
+        <w:t xml:space="preserve">Flavell, J. H. (1979). Metacognition and Cognitive Monitoring: A New Area of Cognitive-Developmental Inquiry.</w:t>
+      </w:r>
+      <w:r>
+        <w:t xml:space="preserve"> </w:t>
+      </w:r>
+      <w:r>
+        <w:rPr>
+          <w:i/>
+          <w:iCs/>
+        </w:rPr>
+        <w:t xml:space="preserve">American Psychologist</w:t>
+      </w:r>
+      <w:r>
+        <w:t xml:space="preserve">, 34(10), 906–911.</w:t>
+      </w:r>
+    </w:p>
+    <w:p>
+      <w:pPr>
+        <w:pStyle w:val="BodyText"/>
+      </w:pPr>
+      <w:r>
+        <w:t xml:space="preserve">Gerlich, M. (2025). AI Tools in Society: Impacts on Cognitive Offloading and the Future of Critical Thinking.</w:t>
+      </w:r>
+      <w:r>
+        <w:t xml:space="preserve"> </w:t>
+      </w:r>
+      <w:r>
+        <w:rPr>
+          <w:i/>
+          <w:iCs/>
+        </w:rPr>
+        <w:t xml:space="preserve">Societies</w:t>
+      </w:r>
+      <w:r>
+        <w:t xml:space="preserve">, 15(1), 6.</w:t>
+      </w:r>
+    </w:p>
+    <w:p>
+      <w:pPr>
+        <w:pStyle w:val="BodyText"/>
+      </w:pPr>
+      <w:r>
+        <w:t xml:space="preserve">Gilson, L. L., &amp; Goldberg, C. B. (2015). Editors’ Comment: So, What Is a Conceptual Paper?.</w:t>
+      </w:r>
+      <w:r>
+        <w:t xml:space="preserve"> </w:t>
+      </w:r>
+      <w:r>
+        <w:rPr>
+          <w:i/>
+          <w:iCs/>
+        </w:rPr>
+        <w:t xml:space="preserve">Group &amp; Organization Management</w:t>
+      </w:r>
+      <w:r>
+        <w:t xml:space="preserve">, 40(2), 127–130. https://doi.org/10.1177/1059601115576425</w:t>
+      </w:r>
+    </w:p>
+    <w:p>
+      <w:pPr>
+        <w:pStyle w:val="BodyText"/>
+      </w:pPr>
+      <w:r>
+        <w:t xml:space="preserve">Gu, X., &amp; Ericson, B. J. (2025). AI Literacy in K-12 and Higher Education in the Wake of Generative AI: An Integrative Review.</w:t>
+      </w:r>
+      <w:r>
+        <w:t xml:space="preserve"> </w:t>
+      </w:r>
+      <w:r>
+        <w:rPr>
+          <w:i/>
+          <w:iCs/>
+        </w:rPr>
+        <w:t xml:space="preserve">Proceedings of the 2025 ACM Conference on International Computing Education Research (ICER)</w:t>
+      </w:r>
+      <w:r>
+        <w:t xml:space="preserve">, 125–140. https://doi.org/10.1145/3702652.3744217</w:t>
+      </w:r>
+    </w:p>
+    <w:p>
+      <w:pPr>
+        <w:pStyle w:val="BodyText"/>
+      </w:pPr>
+      <w:r>
+        <w:t xml:space="preserve">Hattie, J., &amp; Timperley, H. (2007). The Power of Feedback.</w:t>
+      </w:r>
+      <w:r>
+        <w:t xml:space="preserve"> </w:t>
+      </w:r>
+      <w:r>
+        <w:rPr>
+          <w:i/>
+          <w:iCs/>
+        </w:rPr>
+        <w:t xml:space="preserve">Review of Educational Research</w:t>
+      </w:r>
+      <w:r>
+        <w:t xml:space="preserve">, 77(1), 81–112.</w:t>
+      </w:r>
+    </w:p>
+    <w:p>
+      <w:pPr>
+        <w:pStyle w:val="BodyText"/>
+      </w:pPr>
+      <w:r>
+        <w:t xml:space="preserve">Jaakkola, E. (2020). Designing Conceptual Articles: Four Approaches.</w:t>
+      </w:r>
+      <w:r>
+        <w:t xml:space="preserve"> </w:t>
+      </w:r>
+      <w:r>
+        <w:rPr>
+          <w:i/>
+          <w:iCs/>
+        </w:rPr>
+        <w:t xml:space="preserve">AMS Review</w:t>
+      </w:r>
+      <w:r>
+        <w:t xml:space="preserve">, 10, 18–26.</w:t>
+      </w:r>
+    </w:p>
+    <w:p>
+      <w:pPr>
+        <w:pStyle w:val="BodyText"/>
+      </w:pPr>
+      <w:r>
+        <w:t xml:space="preserve">Jin, Y., Martinez-Maldonado, R., Ga{</w:t>
+      </w:r>
+      <w:r>
+        <w:t xml:space="preserve">}evi{'c}, D., &amp; Yan, L. (2024). GLAT: The Generative AI Literacy Assessment Test.</w:t>
+      </w:r>
+      <w:r>
+        <w:t xml:space="preserve"> </w:t>
+      </w:r>
+      <w:r>
+        <w:rPr>
+          <w:i/>
+          <w:iCs/>
+        </w:rPr>
+        <w:t xml:space="preserve">arXiv preprint arXiv:2411.00283</w:t>
+      </w:r>
+      <w:r>
+        <w:t xml:space="preserve">.</w:t>
+      </w:r>
+    </w:p>
+    <w:p>
+      <w:pPr>
+        <w:pStyle w:val="BodyText"/>
+      </w:pPr>
+      <w:r>
+        <w:t xml:space="preserve">Kapur, M. (2008). Productive Failure.</w:t>
+      </w:r>
+      <w:r>
+        <w:t xml:space="preserve"> </w:t>
+      </w:r>
+      <w:r>
+        <w:rPr>
+          <w:i/>
+          <w:iCs/>
+        </w:rPr>
+        <w:t xml:space="preserve">Cognition and Instruction</w:t>
+      </w:r>
+      <w:r>
+        <w:t xml:space="preserve">, 26(3), 379–424.</w:t>
+      </w:r>
+    </w:p>
+    <w:p>
+      <w:pPr>
+        <w:pStyle w:val="BodyText"/>
+      </w:pPr>
+      <w:r>
+        <w:t xml:space="preserve">Kim, P., Wang, W., &amp; Bonk, C. J. (2025). Generative AI as a Coach to Help Students Enhance Proficiency in Question Formulation.</w:t>
+      </w:r>
+      <w:r>
+        <w:t xml:space="preserve"> </w:t>
+      </w:r>
+      <w:r>
+        <w:rPr>
+          <w:i/>
+          <w:iCs/>
+        </w:rPr>
+        <w:t xml:space="preserve">Journal of Educational Computing Research</w:t>
+      </w:r>
+      <w:r>
+        <w:t xml:space="preserve">, 63(3), 565–586. https://doi.org/10.1177/07356331251314222</w:t>
+      </w:r>
+    </w:p>
+    <w:p>
+      <w:pPr>
+        <w:pStyle w:val="BodyText"/>
+      </w:pPr>
+      <w:r>
+        <w:t xml:space="preserve">Kosmyna, N., Hauptmann, E., Yuan, Y. T., Situ, J., Liao, X., Beresnitzky, A. V., Braunstein, I., &amp; Maes, P. (2025). Your Brain on ChatGPT: Accumulation of Cognitive Debt when Using an AI Assistant for Essay Writing Task.</w:t>
+      </w:r>
+      <w:r>
+        <w:t xml:space="preserve"> </w:t>
+      </w:r>
+      <w:r>
+        <w:rPr>
+          <w:i/>
+          <w:iCs/>
+        </w:rPr>
+        <w:t xml:space="preserve">arXiv preprint arXiv:2506.08872</w:t>
+      </w:r>
+      <w:r>
+        <w:t xml:space="preserve">.</w:t>
+      </w:r>
+    </w:p>
+    <w:p>
+      <w:pPr>
+        <w:pStyle w:val="BodyText"/>
+      </w:pPr>
+      <w:r>
+        <w:t xml:space="preserve">Lee, J. D., &amp; See, K. A. (2004). Trust in Automation: Designing for Appropriate Reliance.</w:t>
+      </w:r>
+      <w:r>
+        <w:t xml:space="preserve"> </w:t>
+      </w:r>
+      <w:r>
+        <w:rPr>
+          <w:i/>
+          <w:iCs/>
+        </w:rPr>
+        <w:t xml:space="preserve">Human Factors</w:t>
+      </w:r>
+      <w:r>
+        <w:t xml:space="preserve">, 46(1), 50–80.</w:t>
+      </w:r>
+    </w:p>
+    <w:p>
+      <w:pPr>
+        <w:pStyle w:val="BodyText"/>
+      </w:pPr>
+      <w:r>
+        <w:t xml:space="preserve">Lee, S. C., Baby, T., Vongvit, R., Lee, J., Kim, Y., Min, C., &amp; Yoon, S. H. (2025). Development and Validation of a Generative AI Competence Scale.</w:t>
+      </w:r>
+      <w:r>
+        <w:t xml:space="preserve"> </w:t>
+      </w:r>
+      <w:r>
+        <w:rPr>
+          <w:i/>
+          <w:iCs/>
+        </w:rPr>
+        <w:t xml:space="preserve">Technology in Society</w:t>
+      </w:r>
+      <w:r>
+        <w:t xml:space="preserve">. https://doi.org/10.1016/j.techsoc.2025.103059</w:t>
+      </w:r>
+    </w:p>
+    <w:p>
+      <w:pPr>
+        <w:pStyle w:val="BodyText"/>
+      </w:pPr>
+      <w:r>
+        <w:t xml:space="preserve">Li, C., Cui, H., &amp; Hagedorn, L. S. (2026). The Cognitive Impact of ChatGPT in Higher Education: A Systematic Review of Critical and Creative Thinking Outcomes.</w:t>
+      </w:r>
+      <w:r>
+        <w:t xml:space="preserve"> </w:t>
+      </w:r>
+      <w:r>
+        <w:rPr>
+          <w:i/>
+          <w:iCs/>
+        </w:rPr>
+        <w:t xml:space="preserve">Computers and Education: Artificial Intelligence</w:t>
+      </w:r>
+      <w:r>
+        <w:t xml:space="preserve">, 10, 100571. https://doi.org/10.1016/j.caeai.2026.100571</w:t>
+      </w:r>
+    </w:p>
+    <w:p>
+      <w:pPr>
+        <w:pStyle w:val="BodyText"/>
+      </w:pPr>
+      <w:r>
+        <w:t xml:space="preserve">Lo, L. S. (2023). The CLEAR Path: A Framework for Enhancing Information Literacy through Prompt Engineering.</w:t>
+      </w:r>
+      <w:r>
+        <w:t xml:space="preserve"> </w:t>
+      </w:r>
+      <w:r>
+        <w:rPr>
+          <w:i/>
+          <w:iCs/>
+        </w:rPr>
+        <w:t xml:space="preserve">The Journal of Academic Librarianship</w:t>
+      </w:r>
+      <w:r>
+        <w:t xml:space="preserve">, 49(4).</w:t>
+      </w:r>
+    </w:p>
+    <w:p>
+      <w:pPr>
+        <w:pStyle w:val="BodyText"/>
+      </w:pPr>
+      <w:r>
+        <w:t xml:space="preserve">Long, D., &amp; Magerko, B. (2020). What Is AI Literacy? Competencies and Design Considerations.</w:t>
+      </w:r>
+      <w:r>
+        <w:t xml:space="preserve"> </w:t>
+      </w:r>
+      <w:r>
+        <w:rPr>
+          <w:i/>
+          <w:iCs/>
+        </w:rPr>
+        <w:t xml:space="preserve">Proceedings of the 2020 CHI Conference on Human Factors in Computing Systems</w:t>
+      </w:r>
+      <w:r>
+        <w:t xml:space="preserve">, 1–16.</w:t>
+      </w:r>
+    </w:p>
+    <w:p>
+      <w:pPr>
+        <w:pStyle w:val="BodyText"/>
+      </w:pPr>
+      <w:r>
+        <w:t xml:space="preserve">Nazaretsky, T., Gabbay, H., &amp; K{"a}ser, T. (2025). Can Students Judge Like Experts? A Large-Scale Study on AI and Human Personalized Formative Feedback.</w:t>
+      </w:r>
+      <w:r>
+        <w:t xml:space="preserve"> </w:t>
+      </w:r>
+      <w:r>
+        <w:rPr>
+          <w:i/>
+          <w:iCs/>
+        </w:rPr>
+        <w:t xml:space="preserve">Computers and Education: Artificial Intelligence</w:t>
+      </w:r>
+      <w:r>
+        <w:t xml:space="preserve">. https://doi.org/10.1016/j.caeai.2025.100533</w:t>
+      </w:r>
+    </w:p>
+    <w:p>
+      <w:pPr>
+        <w:pStyle w:val="BodyText"/>
+      </w:pPr>
+      <w:r>
+        <w:t xml:space="preserve">Nelson, T. O., &amp; Narens, L. (1990). Metamemory: A Theoretical Framework and New Findings.</w:t>
+      </w:r>
+      <w:r>
+        <w:t xml:space="preserve"> </w:t>
+      </w:r>
+      <w:r>
+        <w:rPr>
+          <w:i/>
+          <w:iCs/>
+        </w:rPr>
+        <w:t xml:space="preserve">The Psychology of Learning and Motivation</w:t>
+      </w:r>
+      <w:r>
+        <w:t xml:space="preserve">, 26, 125–173.</w:t>
+      </w:r>
+    </w:p>
+    <w:p>
+      <w:pPr>
+        <w:pStyle w:val="BodyText"/>
+      </w:pPr>
+      <w:r>
+        <w:t xml:space="preserve">Parasuraman, R., &amp; Manzey, D. H. (2010). Complacency and Bias in Human Use of Automation: An Attentional Integration.</w:t>
+      </w:r>
+      <w:r>
+        <w:t xml:space="preserve"> </w:t>
+      </w:r>
+      <w:r>
+        <w:rPr>
+          <w:i/>
+          <w:iCs/>
+        </w:rPr>
+        <w:t xml:space="preserve">Human Factors</w:t>
+      </w:r>
+      <w:r>
+        <w:t xml:space="preserve">, 52(3), 381–410.</w:t>
+      </w:r>
+    </w:p>
+    <w:p>
+      <w:pPr>
+        <w:pStyle w:val="BodyText"/>
+      </w:pPr>
+      <w:r>
+        <w:t xml:space="preserve">Paul, R., &amp; Elder, L. (2006). The Miniature Guide to Critical Thinking: Concepts and Tools.</w:t>
+      </w:r>
+      <w:r>
+        <w:t xml:space="preserve"> </w:t>
+      </w:r>
+      <w:r>
+        <w:rPr>
+          <w:i/>
+          <w:iCs/>
+        </w:rPr>
+        <w:t xml:space="preserve">Foundation for Critical Thinking</w:t>
+      </w:r>
+      <w:r>
+        <w:t xml:space="preserve">.</w:t>
+      </w:r>
+    </w:p>
+    <w:p>
+      <w:pPr>
+        <w:pStyle w:val="BodyText"/>
+      </w:pPr>
+      <w:r>
+        <w:t xml:space="preserve">Randazzo, B., Lifshitz-Assaf, H., Kellogg, K., Dell’Acqua, F., Mollick, E., Candelon, F., &amp; Lakhani, K. R. (2025). Cyborgs, Centaurs and Self-Automators: Modes of Human-AI Collaboration in Knowledge Work.</w:t>
+      </w:r>
+      <w:r>
+        <w:t xml:space="preserve"> </w:t>
+      </w:r>
+      <w:r>
+        <w:rPr>
+          <w:i/>
+          <w:iCs/>
+        </w:rPr>
+        <w:t xml:space="preserve">Harvard Business School Working Paper 26-036</w:t>
+      </w:r>
+      <w:r>
+        <w:t xml:space="preserve">.</w:t>
+      </w:r>
+    </w:p>
+    <w:p>
+      <w:pPr>
+        <w:pStyle w:val="BodyText"/>
+      </w:pPr>
+      <w:r>
+        <w:t xml:space="preserve">Runco, M. A., &amp; Chand, I. (1995). Cognition and Creativity.</w:t>
+      </w:r>
+      <w:r>
+        <w:t xml:space="preserve"> </w:t>
+      </w:r>
+      <w:r>
+        <w:rPr>
+          <w:i/>
+          <w:iCs/>
+        </w:rPr>
+        <w:t xml:space="preserve">Educational Psychology Review</w:t>
+      </w:r>
+      <w:r>
+        <w:t xml:space="preserve">, 7(3), 243–267.</w:t>
+      </w:r>
+    </w:p>
+    <w:p>
+      <w:pPr>
+        <w:pStyle w:val="BodyText"/>
+      </w:pPr>
+      <w:r>
+        <w:t xml:space="preserve">Sadler, D. R. (1989). Formative Assessment and the Design of Instructional Systems.</w:t>
+      </w:r>
+      <w:r>
+        <w:t xml:space="preserve"> </w:t>
+      </w:r>
+      <w:r>
+        <w:rPr>
+          <w:i/>
+          <w:iCs/>
+        </w:rPr>
+        <w:t xml:space="preserve">Instructional Science</w:t>
+      </w:r>
+      <w:r>
+        <w:t xml:space="preserve">, 18(2), 119–144.</w:t>
+      </w:r>
+    </w:p>
+    <w:p>
+      <w:pPr>
+        <w:pStyle w:val="BodyText"/>
+      </w:pPr>
+      <w:r>
+        <w:t xml:space="preserve">Salomon, G., Perkins, D. N., &amp; Globerson, T. (1991). Partners in Cognition: Extending Human Intelligence with Intelligent Technologies.</w:t>
+      </w:r>
+      <w:r>
+        <w:t xml:space="preserve"> </w:t>
+      </w:r>
+      <w:r>
+        <w:rPr>
+          <w:i/>
+          <w:iCs/>
+        </w:rPr>
+        <w:t xml:space="preserve">Educational Researcher</w:t>
+      </w:r>
+      <w:r>
+        <w:t xml:space="preserve">, 20(3), 2–9.</w:t>
+      </w:r>
+    </w:p>
+    <w:p>
+      <w:pPr>
+        <w:pStyle w:val="BodyText"/>
+      </w:pPr>
+      <w:r>
+        <w:t xml:space="preserve">Sidra, S., &amp; Mason, C. (2025). Generative AI in Human-AI Collaboration: Validation of the Collaborative AI Literacy and Collaborative AI Metacognition Scales.</w:t>
+      </w:r>
+      <w:r>
+        <w:t xml:space="preserve"> </w:t>
+      </w:r>
+      <w:r>
+        <w:rPr>
+          <w:i/>
+          <w:iCs/>
+        </w:rPr>
+        <w:t xml:space="preserve">International Journal of Human-Computer Interaction</w:t>
+      </w:r>
+      <w:r>
+        <w:t xml:space="preserve">. https://doi.org/10.1080/10447318.2025.2543997</w:t>
+      </w:r>
+    </w:p>
+    <w:p>
+      <w:pPr>
+        <w:pStyle w:val="BodyText"/>
+      </w:pPr>
+      <w:r>
+        <w:t xml:space="preserve">Sperber, D., Cl{'e}ment, F., Heintz, C., Mascaro, O., Mercier, H., Origgi, G., &amp; Wilson, D. (2010). Epistemic Vigilance.</w:t>
+      </w:r>
+      <w:r>
+        <w:t xml:space="preserve"> </w:t>
+      </w:r>
+      <w:r>
+        <w:rPr>
+          <w:i/>
+          <w:iCs/>
+        </w:rPr>
+        <w:t xml:space="preserve">Mind &amp; Language</w:t>
+      </w:r>
+      <w:r>
+        <w:t xml:space="preserve">, 25(4), 359–393.</w:t>
+      </w:r>
+    </w:p>
+    <w:p>
+      <w:pPr>
+        <w:pStyle w:val="BodyText"/>
+      </w:pPr>
+      <w:r>
+        <w:t xml:space="preserve">Srinath, S., Vadaparty, A., Smith IV, D. H., Porter, L., &amp; Zingaro, D. (2025). Assessing Problem Decomposition in CS1 for the GenAI Era.</w:t>
+      </w:r>
+      <w:r>
+        <w:t xml:space="preserve"> </w:t>
+      </w:r>
+      <w:r>
+        <w:rPr>
+          <w:i/>
+          <w:iCs/>
+        </w:rPr>
+        <w:t xml:space="preserve">arXiv preprint arXiv:2511.05764</w:t>
+      </w:r>
+      <w:r>
+        <w:t xml:space="preserve">.</w:t>
+      </w:r>
+    </w:p>
+    <w:p>
+      <w:pPr>
+        <w:pStyle w:val="BodyText"/>
+      </w:pPr>
+      <w:r>
+        <w:t xml:space="preserve">Tankelevitch, L., Kewenig, V., Simkute, A., Scott, A. E., Sarkar, A., Sellen, A., &amp; Rintel, S. (2024). The Metacognitive Demands and Opportunities of Generative AI.</w:t>
+      </w:r>
+      <w:r>
+        <w:t xml:space="preserve"> </w:t>
+      </w:r>
+      <w:r>
+        <w:rPr>
+          <w:i/>
+          <w:iCs/>
+        </w:rPr>
+        <w:t xml:space="preserve">Proceedings of the 2024 CHI Conference on Human Factors in Computing Systems</w:t>
+      </w:r>
+      <w:r>
+        <w:t xml:space="preserve">.</w:t>
+      </w:r>
+    </w:p>
+    <w:p>
+      <w:pPr>
+        <w:pStyle w:val="BodyText"/>
+      </w:pPr>
+      <w:r>
+        <w:t xml:space="preserve">Tour, E., &amp; Zadorozhnyy, A. (2025). Conceptualizing and Operationalizing Prompt Literacy for English Language Learners.</w:t>
+      </w:r>
+      <w:r>
+        <w:t xml:space="preserve"> </w:t>
+      </w:r>
+      <w:r>
+        <w:rPr>
+          <w:i/>
+          <w:iCs/>
+        </w:rPr>
+        <w:t xml:space="preserve">Journal of Adolescent &amp; Adult Literacy</w:t>
+      </w:r>
+      <w:r>
+        <w:t xml:space="preserve">. https://doi.org/10.1002/jaal.70020</w:t>
+      </w:r>
+    </w:p>
+    <w:p>
+      <w:pPr>
+        <w:pStyle w:val="BodyText"/>
+      </w:pPr>
+      <w:r>
+        <w:t xml:space="preserve">Vaccaro, M., Almaatouq, A., &amp; Malone, T. (2024). When Combinations of Humans and AI Are Useful: A Systematic Review and Meta-Analysis.</w:t>
+      </w:r>
+      <w:r>
+        <w:t xml:space="preserve"> </w:t>
+      </w:r>
+      <w:r>
+        <w:rPr>
+          <w:i/>
+          <w:iCs/>
+        </w:rPr>
+        <w:t xml:space="preserve">Nature Human Behaviour</w:t>
+      </w:r>
+      <w:r>
+        <w:t xml:space="preserve">, 8, 2293–2303.</w:t>
+      </w:r>
+    </w:p>
+    <w:p>
+      <w:pPr>
+        <w:pStyle w:val="BodyText"/>
+      </w:pPr>
+      <w:r>
+        <w:t xml:space="preserve">Vygotsky, L. S. (1978). Mind in Society: The Development of Higher Psychological Processes.</w:t>
+      </w:r>
+      <w:r>
+        <w:t xml:space="preserve"> </w:t>
+      </w:r>
+      <w:r>
+        <w:rPr>
+          <w:i/>
+          <w:iCs/>
+        </w:rPr>
+        <w:t xml:space="preserve">Harvard University Press</w:t>
+      </w:r>
+      <w:r>
+        <w:t xml:space="preserve">.</w:t>
+      </w:r>
+    </w:p>
+    <w:p>
+      <w:pPr>
+        <w:pStyle w:val="BodyText"/>
+      </w:pPr>
+      <w:r>
+        <w:t xml:space="preserve">Winne, P. H., &amp; Hadwin, A. F. (1998). Studying as Self-Regulated Learning.</w:t>
+      </w:r>
+      <w:r>
+        <w:t xml:space="preserve"> </w:t>
+      </w:r>
+      <w:r>
+        <w:rPr>
+          <w:i/>
+          <w:iCs/>
+        </w:rPr>
+        <w:t xml:space="preserve">Metacognition in Educational Theory and Practice</w:t>
+      </w:r>
+      <w:r>
+        <w:t xml:space="preserve">, 277–304.</w:t>
+      </w:r>
+    </w:p>
+    <w:p>
+      <w:pPr>
+        <w:pStyle w:val="BodyText"/>
+      </w:pPr>
+      <w:r>
+        <w:t xml:space="preserve">Zimmerman, B. J. (2000). Attaining Self-Regulation: A Social Cognitive Perspective.</w:t>
+      </w:r>
+      <w:r>
+        <w:t xml:space="preserve"> </w:t>
+      </w:r>
+      <w:r>
+        <w:rPr>
+          <w:i/>
+          <w:iCs/>
+        </w:rPr>
+        <w:t xml:space="preserve">Handbook of Self-Regulation</w:t>
+      </w:r>
+      <w:r>
+        <w:t xml:space="preserve">, 13–39.</w:t>
+      </w:r>
+    </w:p>
+    <w:p>
+      <w:pPr>
+        <w:pStyle w:val="BodyText"/>
+      </w:pPr>
+      <w:r>
+        <w:t xml:space="preserve">{UNESCO} (2024). AI Competency Framework for Students.</w:t>
+      </w:r>
+      <w:r>
+        <w:t xml:space="preserve"> </w:t>
+      </w:r>
+      <w:r>
+        <w:rPr>
+          <w:i/>
+          <w:iCs/>
+        </w:rPr>
+        <w:t xml:space="preserve">UNESCO</w:t>
+      </w:r>
+      <w:r>
+        <w:t xml:space="preserve">.</w:t>
+      </w:r>
+    </w:p>
     <w:bookmarkEnd w:id="53"/>
-    <w:bookmarkStart w:id="54" w:name="references"/>
-    <w:p>
-      <w:pPr>
-        <w:pStyle w:val="Heading2"/>
-      </w:pPr>
-      <w:r>
-        <w:t xml:space="preserve">References</w:t>
-      </w:r>
-    </w:p>
-    <w:p>
-      <w:pPr>
-        <w:pStyle w:val="FirstParagraph"/>
-      </w:pPr>
-      <w:r>
-        <w:t xml:space="preserve">Acar, O. A. (2023). AI Prompt Engineering Isn’t the Future.</w:t>
-      </w:r>
-      <w:r>
-        <w:t xml:space="preserve"> </w:t>
-      </w:r>
-      <w:r>
-        <w:rPr>
-          <w:i/>
-          <w:iCs/>
-        </w:rPr>
-        <w:t xml:space="preserve">Harvard Business Review, June 6</w:t>
-      </w:r>
-      <w:r>
-        <w:t xml:space="preserve">.</w:t>
-      </w:r>
-    </w:p>
-    <w:p>
-      <w:pPr>
-        <w:pStyle w:val="BodyText"/>
-      </w:pPr>
-      <w:r>
-        <w:t xml:space="preserve">Anderson, L. W., &amp; Krathwohl, D. R. (2001). A Taxonomy for Learning, Teaching, and Assessing: A Revision of Bloom’s Taxonomy of Educational Objectives.</w:t>
-      </w:r>
-      <w:r>
-        <w:t xml:space="preserve"> </w:t>
-      </w:r>
-      <w:r>
-        <w:rPr>
-          <w:i/>
-          <w:iCs/>
-        </w:rPr>
-        <w:t xml:space="preserve">Longman</w:t>
-      </w:r>
-      <w:r>
-        <w:t xml:space="preserve">.</w:t>
-      </w:r>
-    </w:p>
-    <w:p>
-      <w:pPr>
-        <w:pStyle w:val="BodyText"/>
-      </w:pPr>
-      <w:r>
-        <w:t xml:space="preserve">Annapureddy, R., Fornaroli, A., &amp; Gatica-Perez, D. (2024). Generative AI Literacy: Twelve Defining Competencies.</w:t>
-      </w:r>
-      <w:r>
-        <w:t xml:space="preserve"> </w:t>
-      </w:r>
-      <w:r>
-        <w:rPr>
-          <w:i/>
-          <w:iCs/>
-        </w:rPr>
-        <w:t xml:space="preserve">Digital Government: Research and Practice</w:t>
-      </w:r>
-      <w:r>
-        <w:t xml:space="preserve">.</w:t>
-      </w:r>
-    </w:p>
-    <w:p>
-      <w:pPr>
-        <w:pStyle w:val="BodyText"/>
-      </w:pPr>
-      <w:r>
-        <w:t xml:space="preserve">Bansal, G., Wu, T., Zhou, J., Fok, R., Nushi, B., Kamar, E., Ribeiro, M. T., &amp; Weld, D. S. (2021). Does the Whole Exceed Its Parts? The Effect of AI Explanations on Complementary Team Performance.</w:t>
-      </w:r>
-      <w:r>
-        <w:t xml:space="preserve"> </w:t>
-      </w:r>
-      <w:r>
-        <w:rPr>
-          <w:i/>
-          <w:iCs/>
-        </w:rPr>
-        <w:t xml:space="preserve">Proceedings of the 2021 CHI Conference on Human Factors in Computing Systems</w:t>
-      </w:r>
-      <w:r>
-        <w:t xml:space="preserve">.</w:t>
-      </w:r>
-    </w:p>
-    <w:p>
-      <w:pPr>
-        <w:pStyle w:val="BodyText"/>
-      </w:pPr>
-      <w:r>
-        <w:t xml:space="preserve">Barzilai, S., &amp; Chinn, C. A. (2018). On the Goals of Epistemic Education: Promoting Apt Epistemic Performance.</w:t>
-      </w:r>
-      <w:r>
-        <w:t xml:space="preserve"> </w:t>
-      </w:r>
-      <w:r>
-        <w:rPr>
-          <w:i/>
-          <w:iCs/>
-        </w:rPr>
-        <w:t xml:space="preserve">Journal of the Learning Sciences</w:t>
-      </w:r>
-      <w:r>
-        <w:t xml:space="preserve">, 27(3), 353–389.</w:t>
-      </w:r>
-    </w:p>
-    <w:p>
-      <w:pPr>
-        <w:pStyle w:val="BodyText"/>
-      </w:pPr>
-      <w:r>
-        <w:t xml:space="preserve">Bjork, E. L., &amp; Bjork, R. A. (2011). Making Things Hard on Yourself, but in a Good Way: Creating Desirable Difficulties to Enhance Learning.</w:t>
-      </w:r>
-      <w:r>
-        <w:t xml:space="preserve"> </w:t>
-      </w:r>
-      <w:r>
-        <w:rPr>
-          <w:i/>
-          <w:iCs/>
-        </w:rPr>
-        <w:t xml:space="preserve">Psychology and the Real World</w:t>
-      </w:r>
-      <w:r>
-        <w:t xml:space="preserve">, 56–64.</w:t>
-      </w:r>
-    </w:p>
-    <w:p>
-      <w:pPr>
-        <w:pStyle w:val="BodyText"/>
-      </w:pPr>
-      <w:r>
-        <w:t xml:space="preserve">Bu{</w:t>
-      </w:r>
-      <w:r>
-        <w:t xml:space="preserve">}inca, Z., Malaya, M. B., &amp; Gajos, K. Z. (2021). To Trust or to Think: Cognitive Forcing Functions Can Reduce Overreliance on AI in AI-Assisted Decision-Making.</w:t>
-      </w:r>
-      <w:r>
-        <w:t xml:space="preserve"> </w:t>
-      </w:r>
-      <w:r>
-        <w:rPr>
-          <w:i/>
-          <w:iCs/>
-        </w:rPr>
-        <w:t xml:space="preserve">Proceedings of the ACM on Human-Computer Interaction</w:t>
-      </w:r>
-      <w:r>
-        <w:t xml:space="preserve">, 5(CSCW1), 1–21.</w:t>
-      </w:r>
-    </w:p>
-    <w:p>
-      <w:pPr>
-        <w:pStyle w:val="BodyText"/>
-      </w:pPr>
-      <w:r>
-        <w:t xml:space="preserve">Chi, M. T. H., &amp; Wylie, R. (2014). The ICAP Framework: Linking Cognitive Engagement to Active Learning Outcomes.</w:t>
-      </w:r>
-      <w:r>
-        <w:t xml:space="preserve"> </w:t>
-      </w:r>
-      <w:r>
-        <w:rPr>
-          <w:i/>
-          <w:iCs/>
-        </w:rPr>
-        <w:t xml:space="preserve">Educational Psychologist</w:t>
-      </w:r>
-      <w:r>
-        <w:t xml:space="preserve">, 49(4), 219–243.</w:t>
-      </w:r>
-    </w:p>
-    <w:p>
-      <w:pPr>
-        <w:pStyle w:val="BodyText"/>
-      </w:pPr>
-      <w:r>
-        <w:t xml:space="preserve">Clerc, O., Abdelghani, R., Desvaux, C., Poisson, E., Oudeyer, P., &amp; Sauz{'e}on, H. (2026). Teaching Students to Question the Machine: An AI Literacy Intervention Improves Students’ Regulation of LLM Use in a Science Task.</w:t>
-      </w:r>
-      <w:r>
-        <w:t xml:space="preserve"> </w:t>
-      </w:r>
-      <w:r>
-        <w:rPr>
-          <w:i/>
-          <w:iCs/>
-        </w:rPr>
-        <w:t xml:space="preserve">arXiv preprint arXiv:2604.01955</w:t>
-      </w:r>
-      <w:r>
-        <w:t xml:space="preserve">.</w:t>
-      </w:r>
-    </w:p>
-    <w:p>
-      <w:pPr>
-        <w:pStyle w:val="BodyText"/>
-      </w:pPr>
-      <w:r>
-        <w:t xml:space="preserve">Collins, A., Brown, J. S., &amp; Newman, S. E. (1989). Cognitive Apprenticeship: Teaching the Crafts of Reading, Writing, and Mathematics.</w:t>
-      </w:r>
-      <w:r>
-        <w:t xml:space="preserve"> </w:t>
-      </w:r>
-      <w:r>
-        <w:rPr>
-          <w:i/>
-          <w:iCs/>
-        </w:rPr>
-        <w:t xml:space="preserve">Knowing, Learning, and Instruction: Essays in Honor of Robert Glaser</w:t>
-      </w:r>
-      <w:r>
-        <w:t xml:space="preserve">, 453–494.</w:t>
-      </w:r>
-    </w:p>
-    <w:p>
-      <w:pPr>
-        <w:pStyle w:val="BodyText"/>
-      </w:pPr>
-      <w:r>
-        <w:t xml:space="preserve">Dakan, R., &amp; Feller, J. (2025). Framework for AI Fluency.</w:t>
-      </w:r>
-      <w:r>
-        <w:t xml:space="preserve"> </w:t>
-      </w:r>
-      <w:r>
-        <w:rPr>
-          <w:i/>
-          <w:iCs/>
-        </w:rPr>
-        <w:t xml:space="preserve">Anthropic</w:t>
-      </w:r>
-      <w:r>
-        <w:t xml:space="preserve">.</w:t>
-      </w:r>
-    </w:p>
-    <w:p>
-      <w:pPr>
-        <w:pStyle w:val="BodyText"/>
-      </w:pPr>
-      <w:r>
-        <w:t xml:space="preserve">Dell’Acqua, F., McFowland III, E., Mollick, E., Lifshitz-Assaf, H., Kellogg, K., Rajendran, S., Krayer, L., Candelon, F., &amp; Lakhani, K. R. (2023). Navigating the Jagged Technological Frontier.</w:t>
-      </w:r>
-      <w:r>
-        <w:t xml:space="preserve"> </w:t>
-      </w:r>
-      <w:r>
-        <w:rPr>
-          <w:i/>
-          <w:iCs/>
-        </w:rPr>
-        <w:t xml:space="preserve">Harvard Business School Working Paper 24-013</w:t>
-      </w:r>
-      <w:r>
-        <w:t xml:space="preserve">.</w:t>
-      </w:r>
-    </w:p>
-    <w:p>
-      <w:pPr>
-        <w:pStyle w:val="BodyText"/>
-      </w:pPr>
-      <w:r>
-        <w:t xml:space="preserve">Denny, P., Leinonen, J., Prather, J., Luxton-Reilly, A., Amarouche, T., Becker, B. A., &amp; Reeves, B. N. (2024). Prompt Problems: A New Programming Exercise for the Generative AI Era.</w:t>
-      </w:r>
-      <w:r>
-        <w:t xml:space="preserve"> </w:t>
-      </w:r>
-      <w:r>
-        <w:rPr>
-          <w:i/>
-          <w:iCs/>
-        </w:rPr>
-        <w:t xml:space="preserve">Proceedings of the 55th ACM Technical Symposium on Computer Science Education (SIGCSE)</w:t>
-      </w:r>
-      <w:r>
-        <w:t xml:space="preserve">.</w:t>
-      </w:r>
-    </w:p>
-    <w:p>
-      <w:pPr>
-        <w:pStyle w:val="BodyText"/>
-      </w:pPr>
-      <w:r>
-        <w:t xml:space="preserve">Di Santi, E. (2026). Cognitive Amplification vs Cognitive Delegation in Human-AI Systems: A Metric Framework.</w:t>
-      </w:r>
-      <w:r>
-        <w:t xml:space="preserve"> </w:t>
-      </w:r>
-      <w:r>
-        <w:rPr>
-          <w:i/>
-          <w:iCs/>
-        </w:rPr>
-        <w:t xml:space="preserve">arXiv preprint arXiv:2603.18677</w:t>
-      </w:r>
-      <w:r>
-        <w:t xml:space="preserve">.</w:t>
-      </w:r>
-    </w:p>
-    <w:p>
-      <w:pPr>
-        <w:pStyle w:val="BodyText"/>
-      </w:pPr>
-      <w:r>
-        <w:t xml:space="preserve">Facione, P. A. (1990). Critical Thinking: A Statement of Expert Consensus for Purposes of Educational Assessment and Instruction (The Delphi Report).</w:t>
-      </w:r>
-      <w:r>
-        <w:t xml:space="preserve"> </w:t>
-      </w:r>
-      <w:r>
-        <w:rPr>
-          <w:i/>
-          <w:iCs/>
-        </w:rPr>
-        <w:t xml:space="preserve">American Philosophical Association</w:t>
-      </w:r>
-      <w:r>
-        <w:t xml:space="preserve">.</w:t>
-      </w:r>
-    </w:p>
-    <w:p>
-      <w:pPr>
-        <w:pStyle w:val="BodyText"/>
-      </w:pPr>
-      <w:r>
-        <w:t xml:space="preserve">Feng, Y., Wang, S., Cheng, Z., Wan, Y., &amp; Chen, D. (2025). Are We on the Right Way to Assessing LLM-as-a-Judge?.</w:t>
-      </w:r>
-      <w:r>
-        <w:t xml:space="preserve"> </w:t>
-      </w:r>
-      <w:r>
-        <w:rPr>
-          <w:i/>
-          <w:iCs/>
-        </w:rPr>
-        <w:t xml:space="preserve">arXiv preprint arXiv:2512.16041</w:t>
-      </w:r>
-      <w:r>
-        <w:t xml:space="preserve">.</w:t>
-      </w:r>
-    </w:p>
-    <w:p>
-      <w:pPr>
-        <w:pStyle w:val="BodyText"/>
-      </w:pPr>
-      <w:r>
-        <w:t xml:space="preserve">Fernandes, D., Villa, S., Nicholls, S., Haavisto, O., Buschek, D., Schmidt, A., Kosch, T., Shen, C., &amp; Welsch, R. (2024). Performance and Metacognition Disconnect when Reasoning in Human-AI Interaction.</w:t>
-      </w:r>
-      <w:r>
-        <w:t xml:space="preserve"> </w:t>
-      </w:r>
-      <w:r>
-        <w:rPr>
-          <w:i/>
-          <w:iCs/>
-        </w:rPr>
-        <w:t xml:space="preserve">arXiv preprint arXiv:2409.16708</w:t>
-      </w:r>
-      <w:r>
-        <w:t xml:space="preserve">.</w:t>
-      </w:r>
-    </w:p>
-    <w:p>
-      <w:pPr>
-        <w:pStyle w:val="BodyText"/>
-      </w:pPr>
-      <w:r>
-        <w:t xml:space="preserve">Flavell, J. H. (1979). Metacognition and Cognitive Monitoring: A New Area of Cognitive-Developmental Inquiry.</w:t>
-      </w:r>
-      <w:r>
-        <w:t xml:space="preserve"> </w:t>
-      </w:r>
-      <w:r>
-        <w:rPr>
-          <w:i/>
-          <w:iCs/>
-        </w:rPr>
-        <w:t xml:space="preserve">American Psychologist</w:t>
-      </w:r>
-      <w:r>
-        <w:t xml:space="preserve">, 34(10), 906–911.</w:t>
-      </w:r>
-    </w:p>
-    <w:p>
-      <w:pPr>
-        <w:pStyle w:val="BodyText"/>
-      </w:pPr>
-      <w:r>
-        <w:t xml:space="preserve">Gerlich, M. (2025). AI Tools in Society: Impacts on Cognitive Offloading and the Future of Critical Thinking.</w:t>
-      </w:r>
-      <w:r>
-        <w:t xml:space="preserve"> </w:t>
-      </w:r>
-      <w:r>
-        <w:rPr>
-          <w:i/>
-          <w:iCs/>
-        </w:rPr>
-        <w:t xml:space="preserve">Societies</w:t>
-      </w:r>
-      <w:r>
-        <w:t xml:space="preserve">, 15(1), 6.</w:t>
-      </w:r>
-    </w:p>
-    <w:p>
-      <w:pPr>
-        <w:pStyle w:val="BodyText"/>
-      </w:pPr>
-      <w:r>
-        <w:t xml:space="preserve">Gilson, L. L., &amp; Goldberg, C. B. (2015). Editors’ Comment: So, What Is a Conceptual Paper?.</w:t>
-      </w:r>
-      <w:r>
-        <w:t xml:space="preserve"> </w:t>
-      </w:r>
-      <w:r>
-        <w:rPr>
-          <w:i/>
-          <w:iCs/>
-        </w:rPr>
-        <w:t xml:space="preserve">Group &amp; Organization Management</w:t>
-      </w:r>
-      <w:r>
-        <w:t xml:space="preserve">, 40(2), 127–130. https://doi.org/10.1177/1059601115576425</w:t>
-      </w:r>
-    </w:p>
-    <w:p>
-      <w:pPr>
-        <w:pStyle w:val="BodyText"/>
-      </w:pPr>
-      <w:r>
-        <w:t xml:space="preserve">Gu, X., &amp; Ericson, B. J. (2025). AI Literacy in K-12 and Higher Education in the Wake of Generative AI: An Integrative Review.</w:t>
-      </w:r>
-      <w:r>
-        <w:t xml:space="preserve"> </w:t>
-      </w:r>
-      <w:r>
-        <w:rPr>
-          <w:i/>
-          <w:iCs/>
-        </w:rPr>
-        <w:t xml:space="preserve">Proceedings of the 2025 ACM Conference on International Computing Education Research (ICER)</w:t>
-      </w:r>
-      <w:r>
-        <w:t xml:space="preserve">, 125–140. https://doi.org/10.1145/3702652.3744217</w:t>
-      </w:r>
-    </w:p>
-    <w:p>
-      <w:pPr>
-        <w:pStyle w:val="BodyText"/>
-      </w:pPr>
-      <w:r>
-        <w:t xml:space="preserve">Hattie, J., &amp; Timperley, H. (2007). The Power of Feedback.</w:t>
-      </w:r>
-      <w:r>
-        <w:t xml:space="preserve"> </w:t>
-      </w:r>
-      <w:r>
-        <w:rPr>
-          <w:i/>
-          <w:iCs/>
-        </w:rPr>
-        <w:t xml:space="preserve">Review of Educational Research</w:t>
-      </w:r>
-      <w:r>
-        <w:t xml:space="preserve">, 77(1), 81–112.</w:t>
-      </w:r>
-    </w:p>
-    <w:p>
-      <w:pPr>
-        <w:pStyle w:val="BodyText"/>
-      </w:pPr>
-      <w:r>
-        <w:t xml:space="preserve">Jaakkola, E. (2020). Designing Conceptual Articles: Four Approaches.</w:t>
-      </w:r>
-      <w:r>
-        <w:t xml:space="preserve"> </w:t>
-      </w:r>
-      <w:r>
-        <w:rPr>
-          <w:i/>
-          <w:iCs/>
-        </w:rPr>
-        <w:t xml:space="preserve">AMS Review</w:t>
-      </w:r>
-      <w:r>
-        <w:t xml:space="preserve">, 10, 18–26.</w:t>
-      </w:r>
-    </w:p>
-    <w:p>
-      <w:pPr>
-        <w:pStyle w:val="BodyText"/>
-      </w:pPr>
-      <w:r>
-        <w:t xml:space="preserve">Jin, Y., Martinez-Maldonado, R., Ga{</w:t>
-      </w:r>
-      <w:r>
-        <w:t xml:space="preserve">}evi{'c}, D., &amp; Yan, L. (2024). GLAT: The Generative AI Literacy Assessment Test.</w:t>
-      </w:r>
-      <w:r>
-        <w:t xml:space="preserve"> </w:t>
-      </w:r>
-      <w:r>
-        <w:rPr>
-          <w:i/>
-          <w:iCs/>
-        </w:rPr>
-        <w:t xml:space="preserve">arXiv preprint arXiv:2411.00283</w:t>
-      </w:r>
-      <w:r>
-        <w:t xml:space="preserve">.</w:t>
-      </w:r>
-    </w:p>
-    <w:p>
-      <w:pPr>
-        <w:pStyle w:val="BodyText"/>
-      </w:pPr>
-      <w:r>
-        <w:t xml:space="preserve">Kapur, M. (2008). Productive Failure.</w:t>
-      </w:r>
-      <w:r>
-        <w:t xml:space="preserve"> </w:t>
-      </w:r>
-      <w:r>
-        <w:rPr>
-          <w:i/>
-          <w:iCs/>
-        </w:rPr>
-        <w:t xml:space="preserve">Cognition and Instruction</w:t>
-      </w:r>
-      <w:r>
-        <w:t xml:space="preserve">, 26(3), 379–424.</w:t>
-      </w:r>
-    </w:p>
-    <w:p>
-      <w:pPr>
-        <w:pStyle w:val="BodyText"/>
-      </w:pPr>
-      <w:r>
-        <w:t xml:space="preserve">Kim, P., Wang, W., &amp; Bonk, C. J. (2025). Generative AI as a Coach to Help Students Enhance Proficiency in Question Formulation.</w:t>
-      </w:r>
-      <w:r>
-        <w:t xml:space="preserve"> </w:t>
-      </w:r>
-      <w:r>
-        <w:rPr>
-          <w:i/>
-          <w:iCs/>
-        </w:rPr>
-        <w:t xml:space="preserve">Journal of Educational Computing Research</w:t>
-      </w:r>
-      <w:r>
-        <w:t xml:space="preserve">, 63(3), 565–586. https://doi.org/10.1177/07356331251314222</w:t>
-      </w:r>
-    </w:p>
-    <w:p>
-      <w:pPr>
-        <w:pStyle w:val="BodyText"/>
-      </w:pPr>
-      <w:r>
-        <w:t xml:space="preserve">Kosmyna, N., Hauptmann, E., Yuan, Y. T., Situ, J., Liao, X., Beresnitzky, A. V., Braunstein, I., &amp; Maes, P. (2025). Your Brain on ChatGPT: Accumulation of Cognitive Debt when Using an AI Assistant for Essay Writing Task.</w:t>
-      </w:r>
-      <w:r>
-        <w:t xml:space="preserve"> </w:t>
-      </w:r>
-      <w:r>
-        <w:rPr>
-          <w:i/>
-          <w:iCs/>
-        </w:rPr>
-        <w:t xml:space="preserve">arXiv preprint arXiv:2506.08872</w:t>
-      </w:r>
-      <w:r>
-        <w:t xml:space="preserve">.</w:t>
-      </w:r>
-    </w:p>
-    <w:p>
-      <w:pPr>
-        <w:pStyle w:val="BodyText"/>
-      </w:pPr>
-      <w:r>
-        <w:t xml:space="preserve">Lee, J. D., &amp; See, K. A. (2004). Trust in Automation: Designing for Appropriate Reliance.</w:t>
-      </w:r>
-      <w:r>
-        <w:t xml:space="preserve"> </w:t>
-      </w:r>
-      <w:r>
-        <w:rPr>
-          <w:i/>
-          <w:iCs/>
-        </w:rPr>
-        <w:t xml:space="preserve">Human Factors</w:t>
-      </w:r>
-      <w:r>
-        <w:t xml:space="preserve">, 46(1), 50–80.</w:t>
-      </w:r>
-    </w:p>
-    <w:p>
-      <w:pPr>
-        <w:pStyle w:val="BodyText"/>
-      </w:pPr>
-      <w:r>
-        <w:t xml:space="preserve">Lee, S. C., Baby, T., Vongvit, R., Lee, J., Kim, Y., Min, C., &amp; Yoon, S. H. (2025). Development and Validation of a Generative AI Competence Scale.</w:t>
-      </w:r>
-      <w:r>
-        <w:t xml:space="preserve"> </w:t>
-      </w:r>
-      <w:r>
-        <w:rPr>
-          <w:i/>
-          <w:iCs/>
-        </w:rPr>
-        <w:t xml:space="preserve">Technology in Society</w:t>
-      </w:r>
-      <w:r>
-        <w:t xml:space="preserve">. https://doi.org/10.1016/j.techsoc.2025.103059</w:t>
-      </w:r>
-    </w:p>
-    <w:p>
-      <w:pPr>
-        <w:pStyle w:val="BodyText"/>
-      </w:pPr>
-      <w:r>
-        <w:t xml:space="preserve">Li, C., Cui, H., &amp; Hagedorn, L. S. (2026). The Cognitive Impact of ChatGPT in Higher Education: A Systematic Review of Critical and Creative Thinking Outcomes.</w:t>
-      </w:r>
-      <w:r>
-        <w:t xml:space="preserve"> </w:t>
-      </w:r>
-      <w:r>
-        <w:rPr>
-          <w:i/>
-          <w:iCs/>
-        </w:rPr>
-        <w:t xml:space="preserve">Computers and Education: Artificial Intelligence</w:t>
-      </w:r>
-      <w:r>
-        <w:t xml:space="preserve">, 10, 100571. https://doi.org/10.1016/j.caeai.2026.100571</w:t>
-      </w:r>
-    </w:p>
-    <w:p>
-      <w:pPr>
-        <w:pStyle w:val="BodyText"/>
-      </w:pPr>
-      <w:r>
-        <w:t xml:space="preserve">Lo, L. S. (2023). The CLEAR Path: A Framework for Enhancing Information Literacy through Prompt Engineering.</w:t>
-      </w:r>
-      <w:r>
-        <w:t xml:space="preserve"> </w:t>
-      </w:r>
-      <w:r>
-        <w:rPr>
-          <w:i/>
-          <w:iCs/>
-        </w:rPr>
-        <w:t xml:space="preserve">The Journal of Academic Librarianship</w:t>
-      </w:r>
-      <w:r>
-        <w:t xml:space="preserve">, 49(4).</w:t>
-      </w:r>
-    </w:p>
-    <w:p>
-      <w:pPr>
-        <w:pStyle w:val="BodyText"/>
-      </w:pPr>
-      <w:r>
-        <w:t xml:space="preserve">Long, D., &amp; Magerko, B. (2020). What Is AI Literacy? Competencies and Design Considerations.</w:t>
-      </w:r>
-      <w:r>
-        <w:t xml:space="preserve"> </w:t>
-      </w:r>
-      <w:r>
-        <w:rPr>
-          <w:i/>
-          <w:iCs/>
-        </w:rPr>
-        <w:t xml:space="preserve">Proceedings of the 2020 CHI Conference on Human Factors in Computing Systems</w:t>
-      </w:r>
-      <w:r>
-        <w:t xml:space="preserve">, 1–16.</w:t>
-      </w:r>
-    </w:p>
-    <w:p>
-      <w:pPr>
-        <w:pStyle w:val="BodyText"/>
-      </w:pPr>
-      <w:r>
-        <w:t xml:space="preserve">Nazaretsky, T., Gabbay, H., &amp; K{"a}ser, T. (2025). Can Students Judge Like Experts? A Large-Scale Study on AI and Human Personalized Formative Feedback.</w:t>
-      </w:r>
-      <w:r>
-        <w:t xml:space="preserve"> </w:t>
-      </w:r>
-      <w:r>
-        <w:rPr>
-          <w:i/>
-          <w:iCs/>
-        </w:rPr>
-        <w:t xml:space="preserve">Computers and Education: Artificial Intelligence</w:t>
-      </w:r>
-      <w:r>
-        <w:t xml:space="preserve">. https://doi.org/10.1016/j.caeai.2025.100533</w:t>
-      </w:r>
-    </w:p>
-    <w:p>
-      <w:pPr>
-        <w:pStyle w:val="BodyText"/>
-      </w:pPr>
-      <w:r>
-        <w:t xml:space="preserve">Nelson, T. O., &amp; Narens, L. (1990). Metamemory: A Theoretical Framework and New Findings.</w:t>
-      </w:r>
-      <w:r>
-        <w:t xml:space="preserve"> </w:t>
-      </w:r>
-      <w:r>
-        <w:rPr>
-          <w:i/>
-          <w:iCs/>
-        </w:rPr>
-        <w:t xml:space="preserve">The Psychology of Learning and Motivation</w:t>
-      </w:r>
-      <w:r>
-        <w:t xml:space="preserve">, 26, 125–173.</w:t>
-      </w:r>
-    </w:p>
-    <w:p>
-      <w:pPr>
-        <w:pStyle w:val="BodyText"/>
-      </w:pPr>
-      <w:r>
-        <w:t xml:space="preserve">Parasuraman, R., &amp; Manzey, D. H. (2010). Complacency and Bias in Human Use of Automation: An Attentional Integration.</w:t>
-      </w:r>
-      <w:r>
-        <w:t xml:space="preserve"> </w:t>
-      </w:r>
-      <w:r>
-        <w:rPr>
-          <w:i/>
-          <w:iCs/>
-        </w:rPr>
-        <w:t xml:space="preserve">Human Factors</w:t>
-      </w:r>
-      <w:r>
-        <w:t xml:space="preserve">, 52(3), 381–410.</w:t>
-      </w:r>
-    </w:p>
-    <w:p>
-      <w:pPr>
-        <w:pStyle w:val="BodyText"/>
-      </w:pPr>
-      <w:r>
-        <w:t xml:space="preserve">Paul, R., &amp; Elder, L. (2006). The Miniature Guide to Critical Thinking: Concepts and Tools.</w:t>
-      </w:r>
-      <w:r>
-        <w:t xml:space="preserve"> </w:t>
-      </w:r>
-      <w:r>
-        <w:rPr>
-          <w:i/>
-          <w:iCs/>
-        </w:rPr>
-        <w:t xml:space="preserve">Foundation for Critical Thinking</w:t>
-      </w:r>
-      <w:r>
-        <w:t xml:space="preserve">.</w:t>
-      </w:r>
-    </w:p>
-    <w:p>
-      <w:pPr>
-        <w:pStyle w:val="BodyText"/>
-      </w:pPr>
-      <w:r>
-        <w:t xml:space="preserve">Randazzo, B., Lifshitz-Assaf, H., Kellogg, K., Dell’Acqua, F., Mollick, E., Candelon, F., &amp; Lakhani, K. R. (2025). Cyborgs, Centaurs and Self-Automators: Modes of Human-AI Collaboration in Knowledge Work.</w:t>
-      </w:r>
-      <w:r>
-        <w:t xml:space="preserve"> </w:t>
-      </w:r>
-      <w:r>
-        <w:rPr>
-          <w:i/>
-          <w:iCs/>
-        </w:rPr>
-        <w:t xml:space="preserve">Harvard Business School Working Paper 26-036</w:t>
-      </w:r>
-      <w:r>
-        <w:t xml:space="preserve">.</w:t>
-      </w:r>
-    </w:p>
-    <w:p>
-      <w:pPr>
-        <w:pStyle w:val="BodyText"/>
-      </w:pPr>
-      <w:r>
-        <w:t xml:space="preserve">Runco, M. A., &amp; Chand, I. (1995). Cognition and Creativity.</w:t>
-      </w:r>
-      <w:r>
-        <w:t xml:space="preserve"> </w:t>
-      </w:r>
-      <w:r>
-        <w:rPr>
-          <w:i/>
-          <w:iCs/>
-        </w:rPr>
-        <w:t xml:space="preserve">Educational Psychology Review</w:t>
-      </w:r>
-      <w:r>
-        <w:t xml:space="preserve">, 7(3), 243–267.</w:t>
-      </w:r>
-    </w:p>
-    <w:p>
-      <w:pPr>
-        <w:pStyle w:val="BodyText"/>
-      </w:pPr>
-      <w:r>
-        <w:t xml:space="preserve">Sadler, D. R. (1989). Formative Assessment and the Design of Instructional Systems.</w:t>
-      </w:r>
-      <w:r>
-        <w:t xml:space="preserve"> </w:t>
-      </w:r>
-      <w:r>
-        <w:rPr>
-          <w:i/>
-          <w:iCs/>
-        </w:rPr>
-        <w:t xml:space="preserve">Instructional Science</w:t>
-      </w:r>
-      <w:r>
-        <w:t xml:space="preserve">, 18(2), 119–144.</w:t>
-      </w:r>
-    </w:p>
-    <w:p>
-      <w:pPr>
-        <w:pStyle w:val="BodyText"/>
-      </w:pPr>
-      <w:r>
-        <w:t xml:space="preserve">Salomon, G., Perkins, D. N., &amp; Globerson, T. (1991). Partners in Cognition: Extending Human Intelligence with Intelligent Technologies.</w:t>
-      </w:r>
-      <w:r>
-        <w:t xml:space="preserve"> </w:t>
-      </w:r>
-      <w:r>
-        <w:rPr>
-          <w:i/>
-          <w:iCs/>
-        </w:rPr>
-        <w:t xml:space="preserve">Educational Researcher</w:t>
-      </w:r>
-      <w:r>
-        <w:t xml:space="preserve">, 20(3), 2–9.</w:t>
-      </w:r>
-    </w:p>
-    <w:p>
-      <w:pPr>
-        <w:pStyle w:val="BodyText"/>
-      </w:pPr>
-      <w:r>
-        <w:t xml:space="preserve">Sidra, S., &amp; Mason, C. (2025). Generative AI in Human-AI Collaboration: Validation of the Collaborative AI Literacy and Collaborative AI Metacognition Scales.</w:t>
-      </w:r>
-      <w:r>
-        <w:t xml:space="preserve"> </w:t>
-      </w:r>
-      <w:r>
-        <w:rPr>
-          <w:i/>
-          <w:iCs/>
-        </w:rPr>
-        <w:t xml:space="preserve">International Journal of Human-Computer Interaction</w:t>
-      </w:r>
-      <w:r>
-        <w:t xml:space="preserve">. https://doi.org/10.1080/10447318.2025.2543997</w:t>
-      </w:r>
-    </w:p>
-    <w:p>
-      <w:pPr>
-        <w:pStyle w:val="BodyText"/>
-      </w:pPr>
-      <w:r>
-        <w:t xml:space="preserve">Sperber, D., Cl{'e}ment, F., Heintz, C., Mascaro, O., Mercier, H., Origgi, G., &amp; Wilson, D. (2010). Epistemic Vigilance.</w:t>
-      </w:r>
-      <w:r>
-        <w:t xml:space="preserve"> </w:t>
-      </w:r>
-      <w:r>
-        <w:rPr>
-          <w:i/>
-          <w:iCs/>
-        </w:rPr>
-        <w:t xml:space="preserve">Mind &amp; Language</w:t>
-      </w:r>
-      <w:r>
-        <w:t xml:space="preserve">, 25(4), 359–393.</w:t>
-      </w:r>
-    </w:p>
-    <w:p>
-      <w:pPr>
-        <w:pStyle w:val="BodyText"/>
-      </w:pPr>
-      <w:r>
-        <w:t xml:space="preserve">Srinath, S., Vadaparty, A., Smith IV, D. H., Porter, L., &amp; Zingaro, D. (2025). Assessing Problem Decomposition in CS1 for the GenAI Era.</w:t>
-      </w:r>
-      <w:r>
-        <w:t xml:space="preserve"> </w:t>
-      </w:r>
-      <w:r>
-        <w:rPr>
-          <w:i/>
-          <w:iCs/>
-        </w:rPr>
-        <w:t xml:space="preserve">arXiv preprint arXiv:2511.05764</w:t>
-      </w:r>
-      <w:r>
-        <w:t xml:space="preserve">.</w:t>
-      </w:r>
-    </w:p>
-    <w:p>
-      <w:pPr>
-        <w:pStyle w:val="BodyText"/>
-      </w:pPr>
-      <w:r>
-        <w:t xml:space="preserve">Tankelevitch, L., Kewenig, V., Simkute, A., Scott, A. E., Sarkar, A., Sellen, A., &amp; Rintel, S. (2024). The Metacognitive Demands and Opportunities of Generative AI.</w:t>
-      </w:r>
-      <w:r>
-        <w:t xml:space="preserve"> </w:t>
-      </w:r>
-      <w:r>
-        <w:rPr>
-          <w:i/>
-          <w:iCs/>
-        </w:rPr>
-        <w:t xml:space="preserve">Proceedings of the 2024 CHI Conference on Human Factors in Computing Systems</w:t>
-      </w:r>
-      <w:r>
-        <w:t xml:space="preserve">.</w:t>
-      </w:r>
-    </w:p>
-    <w:p>
-      <w:pPr>
-        <w:pStyle w:val="BodyText"/>
-      </w:pPr>
-      <w:r>
-        <w:t xml:space="preserve">Tour, E., &amp; Zadorozhnyy, A. (2025). Conceptualizing and Operationalizing Prompt Literacy for English Language Learners.</w:t>
-      </w:r>
-      <w:r>
-        <w:t xml:space="preserve"> </w:t>
-      </w:r>
-      <w:r>
-        <w:rPr>
-          <w:i/>
-          <w:iCs/>
-        </w:rPr>
-        <w:t xml:space="preserve">Journal of Adolescent &amp; Adult Literacy</w:t>
-      </w:r>
-      <w:r>
-        <w:t xml:space="preserve">. https://doi.org/10.1002/jaal.70020</w:t>
-      </w:r>
-    </w:p>
-    <w:p>
-      <w:pPr>
-        <w:pStyle w:val="BodyText"/>
-      </w:pPr>
-      <w:r>
-        <w:t xml:space="preserve">Vaccaro, M., Almaatouq, A., &amp; Malone, T. (2024). When Combinations of Humans and AI Are Useful: A Systematic Review and Meta-Analysis.</w:t>
-      </w:r>
-      <w:r>
-        <w:t xml:space="preserve"> </w:t>
-      </w:r>
-      <w:r>
-        <w:rPr>
-          <w:i/>
-          <w:iCs/>
-        </w:rPr>
-        <w:t xml:space="preserve">Nature Human Behaviour</w:t>
-      </w:r>
-      <w:r>
-        <w:t xml:space="preserve">, 8, 2293–2303.</w:t>
-      </w:r>
-    </w:p>
-    <w:p>
-      <w:pPr>
-        <w:pStyle w:val="BodyText"/>
-      </w:pPr>
-      <w:r>
-        <w:t xml:space="preserve">Vygotsky, L. S. (1978). Mind in Society: The Development of Higher Psychological Processes.</w:t>
-      </w:r>
-      <w:r>
-        <w:t xml:space="preserve"> </w:t>
-      </w:r>
-      <w:r>
-        <w:rPr>
-          <w:i/>
-          <w:iCs/>
-        </w:rPr>
-        <w:t xml:space="preserve">Harvard University Press</w:t>
-      </w:r>
-      <w:r>
-        <w:t xml:space="preserve">.</w:t>
-      </w:r>
-    </w:p>
-    <w:p>
-      <w:pPr>
-        <w:pStyle w:val="BodyText"/>
-      </w:pPr>
-      <w:r>
-        <w:t xml:space="preserve">Winne, P. H., &amp; Hadwin, A. F. (1998). Studying as Self-Regulated Learning.</w:t>
-      </w:r>
-      <w:r>
-        <w:t xml:space="preserve"> </w:t>
-      </w:r>
-      <w:r>
-        <w:rPr>
-          <w:i/>
-          <w:iCs/>
-        </w:rPr>
-        <w:t xml:space="preserve">Metacognition in Educational Theory and Practice</w:t>
-      </w:r>
-      <w:r>
-        <w:t xml:space="preserve">, 277–304.</w:t>
-      </w:r>
-    </w:p>
-    <w:p>
-      <w:pPr>
-        <w:pStyle w:val="BodyText"/>
-      </w:pPr>
-      <w:r>
-        <w:t xml:space="preserve">Zimmerman, B. J. (2000). Attaining Self-Regulation: A Social Cognitive Perspective.</w:t>
-      </w:r>
-      <w:r>
-        <w:t xml:space="preserve"> </w:t>
-      </w:r>
-      <w:r>
-        <w:rPr>
-          <w:i/>
-          <w:iCs/>
-        </w:rPr>
-        <w:t xml:space="preserve">Handbook of Self-Regulation</w:t>
-      </w:r>
-      <w:r>
-        <w:t xml:space="preserve">, 13–39.</w:t>
-      </w:r>
-    </w:p>
-    <w:p>
-      <w:pPr>
-        <w:pStyle w:val="BodyText"/>
-      </w:pPr>
-      <w:r>
-        <w:t xml:space="preserve">{UNESCO} (2024). AI Competency Framework for Students.</w:t>
-      </w:r>
-      <w:r>
-        <w:t xml:space="preserve"> </w:t>
-      </w:r>
-      <w:r>
-        <w:rPr>
-          <w:i/>
-          <w:iCs/>
-        </w:rPr>
-        <w:t xml:space="preserve">UNESCO</w:t>
-      </w:r>
-      <w:r>
-        <w:t xml:space="preserve">.</w:t>
-      </w:r>
-    </w:p>
     <w:bookmarkEnd w:id="54"/>
-    <w:bookmarkEnd w:id="55"/>
     <w:sectPr/>
   </w:body>
 </w:document>

</xml_diff>

<commit_message>
Apply honesty-critical fixes from two journal reviews
Both reviewers (education-sciences + computing) converged on the same items:
- Reframe abstract + Sec 8 to LEAD with the blind-graded skills (Framing +0.6,
  Steering +0.5); state explicitly that the ~60:1 aggregate is inflated by Judging's
  by-construction +2.00, and that results are instrument behavior over SIMULATED
  learners, not human learning.
- Sec 7: disclose that the interface figures are representative mockups of the
  prototype, not screenshots of a running deployment; clarify the released artifact
  is the scoring engine (16 prompts + harness).
- Soften the 42%/PCA strawman (3-indicator factor model is under-identified;
  reported descriptively).

Co-Authored-By: Claude Opus 4.8 <noreply@anthropic.com>
</commit_message>
<xml_diff>
--- a/docs/coreasoning.docx
+++ b/docs/coreasoning.docx
@@ -271,7 +271,35 @@
         <w:t xml:space="preserve"> </w:t>
       </w:r>
       <w:r>
-        <w:t xml:space="preserve">Using the platform’s instrument we report a feasibility demonstration that the three skills</w:t>
+        <w:t xml:space="preserve">Using the platform’s instrument over</w:t>
+      </w:r>
+      <w:r>
+        <w:t xml:space="preserve"> </w:t>
+      </w:r>
+      <w:r>
+        <w:rPr>
+          <w:i/>
+          <w:iCs/>
+        </w:rPr>
+        <w:t xml:space="preserve">simulated</w:t>
+      </w:r>
+      <w:r>
+        <w:t xml:space="preserve"> </w:t>
+      </w:r>
+      <w:r>
+        <w:t xml:space="preserve">learners (generated by one model and graded by a</w:t>
+      </w:r>
+      <w:r>
+        <w:t xml:space="preserve"> </w:t>
+      </w:r>
+      <w:r>
+        <w:t xml:space="preserve">different one to avoid self-grading), we report a feasibility demonstration that the instrument’s</w:t>
+      </w:r>
+      <w:r>
+        <w:t xml:space="preserve"> </w:t>
+      </w:r>
+      <w:r>
+        <w:t xml:space="preserve">per-skill grades</w:t>
       </w:r>
       <w:r>
         <w:t xml:space="preserve"> </w:t>
@@ -284,34 +312,70 @@
         <w:t xml:space="preserve">dissociate</w:t>
       </w:r>
       <w:r>
-        <w:t xml:space="preserve"> </w:t>
-      </w:r>
-      <w:r>
-        <w:t xml:space="preserve">(own-skill grade effects exceed cross-skill effects by roughly sixty to one, with near-zero inter-skill</w:t>
-      </w:r>
-      <w:r>
-        <w:t xml:space="preserve"> </w:t>
-      </w:r>
-      <w:r>
-        <w:t xml:space="preserve">correlations) and that the automated grader is 92% self-consistent, with simulated learners generated</w:t>
-      </w:r>
-      <w:r>
-        <w:t xml:space="preserve"> </w:t>
-      </w:r>
-      <w:r>
-        <w:t xml:space="preserve">and graded by different models to avoid self-grading. We make no learning-outcome claims; the evidence</w:t>
-      </w:r>
-      <w:r>
-        <w:t xml:space="preserve"> </w:t>
-      </w:r>
-      <w:r>
-        <w:t xml:space="preserve">establishes that the constructs are separable and automatically measurable, and we close with the</w:t>
-      </w:r>
-      <w:r>
-        <w:t xml:space="preserve"> </w:t>
-      </w:r>
-      <w:r>
-        <w:t xml:space="preserve">tensions a mature account must resolve and a concrete validation agenda.</w:t>
+        <w:t xml:space="preserve">: each skill’s grade tracks its own manipulated competence and stays</w:t>
+      </w:r>
+      <w:r>
+        <w:t xml:space="preserve"> </w:t>
+      </w:r>
+      <w:r>
+        <w:t xml:space="preserve">near-flat in the others. The decisive evidence is the two blind-graded skills, Framing and Steering,</w:t>
+      </w:r>
+      <w:r>
+        <w:t xml:space="preserve"> </w:t>
+      </w:r>
+      <w:r>
+        <w:t xml:space="preserve">which show positive own-competence effects (+0.6 and +0.5 grade points) with near-zero cross-effects</w:t>
+      </w:r>
+      <w:r>
+        <w:t xml:space="preserve"> </w:t>
+      </w:r>
+      <w:r>
+        <w:t xml:space="preserve">and near-zero inter-skill correlations; the grader is also internally consistent across repeats. We</w:t>
+      </w:r>
+      <w:r>
+        <w:t xml:space="preserve"> </w:t>
+      </w:r>
+      <w:r>
+        <w:t xml:space="preserve">make no learning-outcome claims: because the learners are simulated and the grades are not yet</w:t>
+      </w:r>
+      <w:r>
+        <w:t xml:space="preserve"> </w:t>
+      </w:r>
+      <w:r>
+        <w:t xml:space="preserve">validated against human raters, this is evidence of</w:t>
+      </w:r>
+      <w:r>
+        <w:t xml:space="preserve"> </w:t>
+      </w:r>
+      <w:r>
+        <w:rPr>
+          <w:i/>
+          <w:iCs/>
+        </w:rPr>
+        <w:t xml:space="preserve">construct separability and automatic</w:t>
+      </w:r>
+      <w:r>
+        <w:rPr>
+          <w:i/>
+          <w:iCs/>
+        </w:rPr>
+        <w:t xml:space="preserve"> </w:t>
+      </w:r>
+      <w:r>
+        <w:rPr>
+          <w:i/>
+          <w:iCs/>
+        </w:rPr>
+        <w:t xml:space="preserve">measurability of the instrument</w:t>
+      </w:r>
+      <w:r>
+        <w:t xml:space="preserve">, not of human learning, and we close with the validity agenda that</w:t>
+      </w:r>
+      <w:r>
+        <w:t xml:space="preserve"> </w:t>
+      </w:r>
+      <w:r>
+        <w:t xml:space="preserve">would establish the latter.</w:t>
       </w:r>
     </w:p>
     <w:bookmarkEnd w:id="20"/>
@@ -3870,7 +3934,7 @@
         <w:pStyle w:val="FirstParagraph"/>
       </w:pPr>
       <w:r>
-        <w:t xml:space="preserve">The framework is instantiated in a deployed web platform,</w:t>
+        <w:t xml:space="preserve">The framework was instantiated in a prototype web platform,</w:t>
       </w:r>
       <w:r>
         <w:t xml:space="preserve"> </w:t>
@@ -3901,7 +3965,44 @@
         <w:t xml:space="preserve"> </w:t>
       </w:r>
       <w:r>
-        <w:t xml:space="preserve">assessment modes and both multiple-choice and open-ended response formats per phase.</w:t>
+        <w:t xml:space="preserve">assessment modes and both multiple-choice and open-ended response formats per phase. The reusable</w:t>
+      </w:r>
+      <w:r>
+        <w:t xml:space="preserve"> </w:t>
+      </w:r>
+      <w:r>
+        <w:t xml:space="preserve">artifact we release and evaluate is the platform’s</w:t>
+      </w:r>
+      <w:r>
+        <w:t xml:space="preserve"> </w:t>
+      </w:r>
+      <w:r>
+        <w:rPr>
+          <w:i/>
+          <w:iCs/>
+        </w:rPr>
+        <w:t xml:space="preserve">scoring engine</w:t>
+      </w:r>
+      <w:r>
+        <w:t xml:space="preserve">, a library of sixteen prompts plus</w:t>
+      </w:r>
+      <w:r>
+        <w:t xml:space="preserve"> </w:t>
+      </w:r>
+      <w:r>
+        <w:t xml:space="preserve">a controlled-generation harness (Section 7.1); the interface figures in this paper (Figures A1–A2) are</w:t>
+      </w:r>
+      <w:r>
+        <w:t xml:space="preserve"> </w:t>
+      </w:r>
+      <w:r>
+        <w:t xml:space="preserve">representative mockups of that prototype rather than screenshots of a running deployment, and all</w:t>
+      </w:r>
+      <w:r>
+        <w:t xml:space="preserve"> </w:t>
+      </w:r>
+      <w:r>
+        <w:t xml:space="preserve">quantitative results come from the released prompt engine, not from platform usage logs.</w:t>
       </w:r>
     </w:p>
     <w:p>
@@ -4848,13 +4949,53 @@
         <w:t xml:space="preserve">−0.017</w:t>
       </w:r>
       <w:r>
-        <w:t xml:space="preserve">, so own-skill effects exceed cross-skill</w:t>
-      </w:r>
-      <w:r>
-        <w:t xml:space="preserve"> </w:t>
-      </w:r>
-      <w:r>
-        <w:t xml:space="preserve">effects by more than an order of magnitude (about 60 to 1). Each</w:t>
+        <w:t xml:space="preserve">. This aggregate ratio is inflated by</w:t>
+      </w:r>
+      <w:r>
+        <w:t xml:space="preserve"> </w:t>
+      </w:r>
+      <w:r>
+        <w:t xml:space="preserve">Judging, whose own-effect (+2.00) is fixed by construction because its competence is operationalized by</w:t>
+      </w:r>
+      <w:r>
+        <w:t xml:space="preserve"> </w:t>
+      </w:r>
+      <w:r>
+        <w:t xml:space="preserve">a controlled selection over ground-truth issues; we therefore do not lead with it. The decisive evidence</w:t>
+      </w:r>
+      <w:r>
+        <w:t xml:space="preserve"> </w:t>
+      </w:r>
+      <w:r>
+        <w:t xml:space="preserve">is the two</w:t>
+      </w:r>
+      <w:r>
+        <w:t xml:space="preserve"> </w:t>
+      </w:r>
+      <w:r>
+        <w:rPr>
+          <w:i/>
+          <w:iCs/>
+        </w:rPr>
+        <w:t xml:space="preserve">blind-graded</w:t>
+      </w:r>
+      <w:r>
+        <w:t xml:space="preserve"> </w:t>
+      </w:r>
+      <w:r>
+        <w:t xml:space="preserve">skills, Framing and Steering, whose free-text responses the grader scores</w:t>
+      </w:r>
+      <w:r>
+        <w:t xml:space="preserve"> </w:t>
+      </w:r>
+      <w:r>
+        <w:t xml:space="preserve">without knowing the intended competence: each shows a clear positive own-effect (+0.60 and +0.50) with</w:t>
+      </w:r>
+      <w:r>
+        <w:t xml:space="preserve"> </w:t>
+      </w:r>
+      <w:r>
+        <w:t xml:space="preserve">near-zero cross-effects, so a learner’s three model-assigned grades move independently. Each</w:t>
       </w:r>
       <w:r>
         <w:t xml:space="preserve"> </w:t>
@@ -5242,25 +5383,19 @@
         <w:t xml:space="preserve"> </w:t>
       </w:r>
       <w:r>
-        <w:t xml:space="preserve">and the first principal factor accounts for only 42% of the variance, far below the near-100% a single</w:t>
-      </w:r>
-      <w:r>
-        <w:t xml:space="preserve"> </w:t>
-      </w:r>
-      <w:r>
-        <w:t xml:space="preserve">“</w:t>
-      </w:r>
-      <w:r>
-        <w:t xml:space="preserve">AI-use ability</w:t>
-      </w:r>
-      <w:r>
-        <w:t xml:space="preserve">”</w:t>
-      </w:r>
-      <w:r>
-        <w:t xml:space="preserve"> </w:t>
-      </w:r>
-      <w:r>
-        <w:t xml:space="preserve">account would predict.</w:t>
+        <w:t xml:space="preserve">and the first principal component accounts for 42% of the variance. With only three indicators a formal</w:t>
+      </w:r>
+      <w:r>
+        <w:t xml:space="preserve"> </w:t>
+      </w:r>
+      <w:r>
+        <w:t xml:space="preserve">factor model is under-identified, so we report these descriptively rather than as a confirmatory</w:t>
+      </w:r>
+      <w:r>
+        <w:t xml:space="preserve"> </w:t>
+      </w:r>
+      <w:r>
+        <w:t xml:space="preserve">dimensionality test; the point is simply that the grades do not collapse onto a single dimension.</w:t>
       </w:r>
     </w:p>
     <w:p>

</xml_diff>

<commit_message>
Tier B reframing from journal reviews
- Acknowledge the AI as an EXTERNAL object level: frame the Nelson-Narens extension
  as exo-directed monitoring/control (adds epistemic-vigilance burden -> P4); fixes
  the subtle misread the education reviewer flagged.
- Lead the dissociation with Framing-Judging rho=0.00 (cleanest separation); state
  why Judging-Steering is not led (P2 ceiling confound); soften 42%/PCA strawman.
- Organize the validation agenda as an argument-based validity case (Messick 1995,
  Kane 2013): scoring+generalization supported, extrapolation+implication pending.
- Ground the deliberately-imperfect-output design in the learning-from-errors /
  erroneous-examples literature (Grosse & Renkl 2007; Durkin & Rittle-Johnson 2012).
- 54 references, all validated; re-rendered reference list.

Co-Authored-By: Claude Opus 4.8 <noreply@anthropic.com>
</commit_message>
<xml_diff>
--- a/docs/coreasoning.docx
+++ b/docs/coreasoning.docx
@@ -1399,7 +1399,78 @@
         <w:t xml:space="preserve"> </w:t>
       </w:r>
       <w:r>
-        <w:t xml:space="preserve">In CoReasoning, the AI’s generative process is the object level the learner supervises:</w:t>
+        <w:t xml:space="preserve">In CoReasoning, the learner’s meta level supervises an object level that is</w:t>
+      </w:r>
+      <w:r>
+        <w:t xml:space="preserve"> </w:t>
+      </w:r>
+      <w:r>
+        <w:rPr>
+          <w:i/>
+          <w:iCs/>
+        </w:rPr>
+        <w:t xml:space="preserve">external</w:t>
+      </w:r>
+      <w:r>
+        <w:t xml:space="preserve">, the AI’s</w:t>
+      </w:r>
+      <w:r>
+        <w:t xml:space="preserve"> </w:t>
+      </w:r>
+      <w:r>
+        <w:t xml:space="preserve">generative process, rather than the learner’s own cognition. This is a deliberate extension of the</w:t>
+      </w:r>
+      <w:r>
+        <w:t xml:space="preserve"> </w:t>
+      </w:r>
+      <w:r>
+        <w:t xml:space="preserve">Nelson-Narens architecture from intrapersonal monitoring to what we term</w:t>
+      </w:r>
+      <w:r>
+        <w:t xml:space="preserve"> </w:t>
+      </w:r>
+      <w:r>
+        <w:rPr>
+          <w:i/>
+          <w:iCs/>
+        </w:rPr>
+        <w:t xml:space="preserve">exo-directed</w:t>
+      </w:r>
+      <w:r>
+        <w:t xml:space="preserve"> </w:t>
+      </w:r>
+      <w:r>
+        <w:t xml:space="preserve">monitoring and</w:t>
+      </w:r>
+      <w:r>
+        <w:t xml:space="preserve"> </w:t>
+      </w:r>
+      <w:r>
+        <w:t xml:space="preserve">control, and it is the framework’s central theoretical move: the same metacognitive machinery is turned</w:t>
+      </w:r>
+      <w:r>
+        <w:t xml:space="preserve"> </w:t>
+      </w:r>
+      <w:r>
+        <w:t xml:space="preserve">outward onto a fallible cognitive artifact. The extension is non-trivial because exo-directed monitoring</w:t>
+      </w:r>
+      <w:r>
+        <w:t xml:space="preserve"> </w:t>
+      </w:r>
+      <w:r>
+        <w:t xml:space="preserve">adds an epistemic-vigilance burden absent from self-monitoring (the learner must model the reliability</w:t>
+      </w:r>
+      <w:r>
+        <w:t xml:space="preserve"> </w:t>
+      </w:r>
+      <w:r>
+        <w:t xml:space="preserve">of a source whose competence differs from, and is opaque to, their own), which is exactly why Judging</w:t>
+      </w:r>
+      <w:r>
+        <w:t xml:space="preserve"> </w:t>
+      </w:r>
+      <w:r>
+        <w:t xml:space="preserve">is bounded by domain knowledge (Proposition P4). With that caveat stated, the mapping is direct:</w:t>
       </w:r>
     </w:p>
     <w:p>
@@ -4372,6 +4443,36 @@
       <w:r>
         <w:t xml:space="preserve">apprenticeship: rather than observing an expert, the learner is given a fallible artifact to repair.</w:t>
       </w:r>
+      <w:r>
+        <w:t xml:space="preserve"> </w:t>
+      </w:r>
+      <w:r>
+        <w:t xml:space="preserve">This connects the instrument to the instructional literature on learning from errors and erroneous</w:t>
+      </w:r>
+      <w:r>
+        <w:t xml:space="preserve"> </w:t>
+      </w:r>
+      <w:r>
+        <w:t xml:space="preserve">examples, in which studying and correcting flawed solutions improves error detection and conceptual</w:t>
+      </w:r>
+      <w:r>
+        <w:t xml:space="preserve"> </w:t>
+      </w:r>
+      <w:r>
+        <w:t xml:space="preserve">understanding relative to studying only correct ones (Große &amp; Renkl, 2007; Durkin &amp; Rittle-Johnson,</w:t>
+      </w:r>
+      <w:r>
+        <w:t xml:space="preserve"> </w:t>
+      </w:r>
+      <w:r>
+        <w:t xml:space="preserve">2012); CoReasoning generalizes that paradigm from static worked examples to an interactive,</w:t>
+      </w:r>
+      <w:r>
+        <w:t xml:space="preserve"> </w:t>
+      </w:r>
+      <w:r>
+        <w:t xml:space="preserve">learner-driven repair loop over AI output.</w:t>
+      </w:r>
     </w:p>
     <w:p>
       <w:pPr>
@@ -5377,25 +5478,94 @@
         </m:r>
       </m:oMath>
       <w:r>
-        <w:t xml:space="preserve">),</w:t>
-      </w:r>
-      <w:r>
-        <w:t xml:space="preserve"> </w:t>
-      </w:r>
-      <w:r>
-        <w:t xml:space="preserve">and the first principal component accounts for 42% of the variance. With only three indicators a formal</w:t>
-      </w:r>
-      <w:r>
-        <w:t xml:space="preserve"> </w:t>
-      </w:r>
-      <w:r>
-        <w:t xml:space="preserve">factor model is under-identified, so we report these descriptively rather than as a confirmatory</w:t>
-      </w:r>
-      <w:r>
-        <w:t xml:space="preserve"> </w:t>
-      </w:r>
-      <w:r>
-        <w:t xml:space="preserve">dimensionality test; the point is simply that the grades do not collapse onto a single dimension.</w:t>
+        <w:t xml:space="preserve">).</w:t>
+      </w:r>
+      <w:r>
+        <w:t xml:space="preserve"> </w:t>
+      </w:r>
+      <w:r>
+        <w:t xml:space="preserve">The</w:t>
+      </w:r>
+      <w:r>
+        <w:t xml:space="preserve"> </w:t>
+      </w:r>
+      <w:r>
+        <w:rPr>
+          <w:b/>
+          <w:bCs/>
+        </w:rPr>
+        <w:t xml:space="preserve">Framing–Judging</w:t>
+      </w:r>
+      <w:r>
+        <w:t xml:space="preserve"> </w:t>
+      </w:r>
+      <w:r>
+        <w:t xml:space="preserve">pair is the cleanest demonstration and the one we lead with: these two skills</w:t>
+      </w:r>
+      <w:r>
+        <w:t xml:space="preserve"> </w:t>
+      </w:r>
+      <w:r>
+        <w:t xml:space="preserve">are scored by entirely separate mechanisms (free-text framing evaluation versus issue-selection</w:t>
+      </w:r>
+      <w:r>
+        <w:t xml:space="preserve"> </w:t>
+      </w:r>
+      <w:r>
+        <w:t xml:space="preserve">judging) yet their grades are exactly uncorrelated (</w:t>
+      </w:r>
+      <m:oMath>
+        <m:r>
+          <m:t>ρ</m:t>
+        </m:r>
+        <m:r>
+          <m:rPr>
+            <m:sty m:val="p"/>
+          </m:rPr>
+          <m:t>=</m:t>
+        </m:r>
+        <m:r>
+          <m:t>0.00</m:t>
+        </m:r>
+      </m:oMath>
+      <w:r>
+        <w:t xml:space="preserve">), which a single general-ability</w:t>
+      </w:r>
+      <w:r>
+        <w:t xml:space="preserve"> </w:t>
+      </w:r>
+      <w:r>
+        <w:t xml:space="preserve">account cannot produce. We do not lead with the Judging–Steering pair because Proposition P2 predicts a</w:t>
+      </w:r>
+      <w:r>
+        <w:t xml:space="preserve"> </w:t>
+      </w:r>
+      <w:r>
+        <w:t xml:space="preserve">ceiling relation between them, so some positive association there is expected and is not evidence</w:t>
+      </w:r>
+      <w:r>
+        <w:t xml:space="preserve"> </w:t>
+      </w:r>
+      <w:r>
+        <w:t xml:space="preserve">against separability. The first principal component accounts for 42% of the variance, but with only</w:t>
+      </w:r>
+      <w:r>
+        <w:t xml:space="preserve"> </w:t>
+      </w:r>
+      <w:r>
+        <w:t xml:space="preserve">three indicators a formal factor model is under-identified, so we report this descriptively rather than</w:t>
+      </w:r>
+      <w:r>
+        <w:t xml:space="preserve"> </w:t>
+      </w:r>
+      <w:r>
+        <w:t xml:space="preserve">as a confirmatory dimensionality test; the point is simply that the grades do not collapse onto a</w:t>
+      </w:r>
+      <w:r>
+        <w:t xml:space="preserve"> </w:t>
+      </w:r>
+      <w:r>
+        <w:t xml:space="preserve">single dimension.</w:t>
       </w:r>
     </w:p>
     <w:p>
@@ -6138,7 +6308,101 @@
         <w:t xml:space="preserve"> </w:t>
       </w:r>
       <w:r>
-        <w:t xml:space="preserve">improves learning. We therefore specify the validation program the framework invites.</w:t>
+        <w:t xml:space="preserve">improves learning. We therefore specify the validation program the framework invites, organized as an</w:t>
+      </w:r>
+      <w:r>
+        <w:t xml:space="preserve"> </w:t>
+      </w:r>
+      <w:r>
+        <w:t xml:space="preserve">argument-based validity case in the sense of Messick (1995) and Kane (2013): the present evidence</w:t>
+      </w:r>
+      <w:r>
+        <w:t xml:space="preserve"> </w:t>
+      </w:r>
+      <w:r>
+        <w:t xml:space="preserve">supports the</w:t>
+      </w:r>
+      <w:r>
+        <w:t xml:space="preserve"> </w:t>
+      </w:r>
+      <w:r>
+        <w:rPr>
+          <w:i/>
+          <w:iCs/>
+        </w:rPr>
+        <w:t xml:space="preserve">scoring</w:t>
+      </w:r>
+      <w:r>
+        <w:t xml:space="preserve"> </w:t>
+      </w:r>
+      <w:r>
+        <w:t xml:space="preserve">and</w:t>
+      </w:r>
+      <w:r>
+        <w:t xml:space="preserve"> </w:t>
+      </w:r>
+      <w:r>
+        <w:rPr>
+          <w:i/>
+          <w:iCs/>
+        </w:rPr>
+        <w:t xml:space="preserve">generalization</w:t>
+      </w:r>
+      <w:r>
+        <w:t xml:space="preserve"> </w:t>
+      </w:r>
+      <w:r>
+        <w:t xml:space="preserve">inferences (the instrument scores consistently and the</w:t>
+      </w:r>
+      <w:r>
+        <w:t xml:space="preserve"> </w:t>
+      </w:r>
+      <w:r>
+        <w:t xml:space="preserve">three constructs separate), while the</w:t>
+      </w:r>
+      <w:r>
+        <w:t xml:space="preserve"> </w:t>
+      </w:r>
+      <w:r>
+        <w:rPr>
+          <w:i/>
+          <w:iCs/>
+        </w:rPr>
+        <w:t xml:space="preserve">extrapolation</w:t>
+      </w:r>
+      <w:r>
+        <w:t xml:space="preserve"> </w:t>
+      </w:r>
+      <w:r>
+        <w:t xml:space="preserve">inference (that the scores reflect a human</w:t>
+      </w:r>
+      <w:r>
+        <w:t xml:space="preserve"> </w:t>
+      </w:r>
+      <w:r>
+        <w:t xml:space="preserve">competency that transfers) and the</w:t>
+      </w:r>
+      <w:r>
+        <w:t xml:space="preserve"> </w:t>
+      </w:r>
+      <w:r>
+        <w:rPr>
+          <w:i/>
+          <w:iCs/>
+        </w:rPr>
+        <w:t xml:space="preserve">implication</w:t>
+      </w:r>
+      <w:r>
+        <w:t xml:space="preserve"> </w:t>
+      </w:r>
+      <w:r>
+        <w:t xml:space="preserve">inference (that the scores support instructional</w:t>
+      </w:r>
+      <w:r>
+        <w:t xml:space="preserve"> </w:t>
+      </w:r>
+      <w:r>
+        <w:t xml:space="preserve">decisions) remain to be established by the studies below.</w:t>
       </w:r>
     </w:p>
     <w:p>
@@ -7098,6 +7362,27 @@
         <w:pStyle w:val="BodyText"/>
       </w:pPr>
       <w:r>
+        <w:t xml:space="preserve">Durkin, K., &amp; Rittle-Johnson, B. (2012). The Effectiveness of Using Incorrect Examples to Support Learning about Decimal Magnitude.</w:t>
+      </w:r>
+      <w:r>
+        <w:t xml:space="preserve"> </w:t>
+      </w:r>
+      <w:r>
+        <w:rPr>
+          <w:i/>
+          <w:iCs/>
+        </w:rPr>
+        <w:t xml:space="preserve">Learning and Instruction</w:t>
+      </w:r>
+      <w:r>
+        <w:t xml:space="preserve">, 22(3), 206–214. https://doi.org/10.1016/j.learninstruc.2011.11.001</w:t>
+      </w:r>
+    </w:p>
+    <w:p>
+      <w:pPr>
+        <w:pStyle w:val="BodyText"/>
+      </w:pPr>
+      <w:r>
         <w:t xml:space="preserve">Facione, P. A. (1990). Critical Thinking: A Statement of Expert Consensus for Purposes of Educational Assessment and Instruction (The Delphi Report).</w:t>
       </w:r>
       <w:r>
@@ -7224,6 +7509,30 @@
         <w:pStyle w:val="BodyText"/>
       </w:pPr>
       <w:r>
+        <w:t xml:space="preserve">Gro{</w:t>
+      </w:r>
+      <w:r>
+        <w:t xml:space="preserve">}e, C. S., &amp; Renkl, A. (2007). Finding and Fixing Errors in Worked Examples: Can This Foster Learning Outcomes?.</w:t>
+      </w:r>
+      <w:r>
+        <w:t xml:space="preserve"> </w:t>
+      </w:r>
+      <w:r>
+        <w:rPr>
+          <w:i/>
+          <w:iCs/>
+        </w:rPr>
+        <w:t xml:space="preserve">Learning and Instruction</w:t>
+      </w:r>
+      <w:r>
+        <w:t xml:space="preserve">, 17(6), 612–634. https://doi.org/10.1016/j.learninstruc.2007.09.008</w:t>
+      </w:r>
+    </w:p>
+    <w:p>
+      <w:pPr>
+        <w:pStyle w:val="BodyText"/>
+      </w:pPr>
+      <w:r>
         <w:t xml:space="preserve">Gu, X., &amp; Ericson, B. J. (2025). AI Literacy in K-12 and Higher Education in the Wake of Generative AI: An Integrative Review.</w:t>
       </w:r>
       <w:r>
@@ -7311,6 +7620,27 @@
         <w:pStyle w:val="BodyText"/>
       </w:pPr>
       <w:r>
+        <w:t xml:space="preserve">Kane, M. T. (2013). Validating the Interpretations and Uses of Test Scores.</w:t>
+      </w:r>
+      <w:r>
+        <w:t xml:space="preserve"> </w:t>
+      </w:r>
+      <w:r>
+        <w:rPr>
+          <w:i/>
+          <w:iCs/>
+        </w:rPr>
+        <w:t xml:space="preserve">Journal of Educational Measurement</w:t>
+      </w:r>
+      <w:r>
+        <w:t xml:space="preserve">, 50(1), 1–73. https://doi.org/10.1111/jedm.12000</w:t>
+      </w:r>
+    </w:p>
+    <w:p>
+      <w:pPr>
+        <w:pStyle w:val="BodyText"/>
+      </w:pPr>
+      <w:r>
         <w:t xml:space="preserve">Kapur, M. (2008). Productive Failure.</w:t>
       </w:r>
       <w:r>
@@ -7472,6 +7802,27 @@
       </w:r>
       <w:r>
         <w:t xml:space="preserve">, 1–16.</w:t>
+      </w:r>
+    </w:p>
+    <w:p>
+      <w:pPr>
+        <w:pStyle w:val="BodyText"/>
+      </w:pPr>
+      <w:r>
+        <w:t xml:space="preserve">Messick, S. (1995). Validity of Psychological Assessment: Validation of Inferences from Persons’ Responses and Performances as Scientific Inquiry into Score Meaning.</w:t>
+      </w:r>
+      <w:r>
+        <w:t xml:space="preserve"> </w:t>
+      </w:r>
+      <w:r>
+        <w:rPr>
+          <w:i/>
+          <w:iCs/>
+        </w:rPr>
+        <w:t xml:space="preserve">American Psychologist</w:t>
+      </w:r>
+      <w:r>
+        <w:t xml:space="preserve">, 50(9), 741–749. https://doi.org/10.1037/0003-066X.50.9.741</w:t>
       </w:r>
     </w:p>
     <w:p>

</xml_diff>

<commit_message>
Round-4 reviews: copyedit + integrate grader-backend robustness
Both line-by-line reviews (education-sciences + computers-&-education) = Minor
Revision, leaning Accept. Applied:
- Purge all em-dashes (house style) + standardize en-dash compounds to hyphens.
- Abstract: "strongest" not "decisive"; precision-not-accuracy; surface released
  artifact; note cross-grader replication.
- Sec 8: integrate grader-backend ROBUSTNESS (re-grade same 40 transcripts with
  gpt-4o-mini -> dissociation replicates, ratio 7.0; Judging own-effect 2.00->0.65,
  confirming it was gpt-4o-specific not a construct artifact). Blind-graded flip
  ~0.12; reconcile 255-vs-280 calls (caching); flag Judging ground-truth as
  machine-generated/contingent.
- Fix learner->simulated/model-assigned slips; cite Fan et al. 2025 (BJET) for
  "metacognitive laziness". Bibliography 55 refs, all validated (bibtest).

Co-Authored-By: Claude Opus 4.8 <noreply@anthropic.com>
</commit_message>
<xml_diff>
--- a/docs/coreasoning.docx
+++ b/docs/coreasoning.docx
@@ -318,7 +318,7 @@
         <w:t xml:space="preserve"> </w:t>
       </w:r>
       <w:r>
-        <w:t xml:space="preserve">near-flat in the others. The decisive evidence is the two blind-graded skills, Framing and Steering,</w:t>
+        <w:t xml:space="preserve">near-flat in the others. The strongest evidence is the two blind-graded skills, Framing and Steering,</w:t>
       </w:r>
       <w:r>
         <w:t xml:space="preserve"> </w:t>
@@ -330,52 +330,64 @@
         <w:t xml:space="preserve"> </w:t>
       </w:r>
       <w:r>
-        <w:t xml:space="preserve">and near-zero inter-skill correlations; the grader is also internally consistent across repeats. We</w:t>
-      </w:r>
-      <w:r>
-        <w:t xml:space="preserve"> </w:t>
-      </w:r>
-      <w:r>
-        <w:t xml:space="preserve">make no learning-outcome claims: because the learners are simulated and the grades are not yet</w:t>
-      </w:r>
-      <w:r>
-        <w:t xml:space="preserve"> </w:t>
-      </w:r>
-      <w:r>
-        <w:t xml:space="preserve">validated against human raters, this is evidence of</w:t>
-      </w:r>
-      <w:r>
-        <w:t xml:space="preserve"> </w:t>
-      </w:r>
-      <w:r>
-        <w:rPr>
-          <w:i/>
-          <w:iCs/>
-        </w:rPr>
-        <w:t xml:space="preserve">construct separability and automatic</w:t>
-      </w:r>
-      <w:r>
-        <w:rPr>
-          <w:i/>
-          <w:iCs/>
-        </w:rPr>
-        <w:t xml:space="preserve"> </w:t>
-      </w:r>
-      <w:r>
-        <w:rPr>
-          <w:i/>
-          <w:iCs/>
-        </w:rPr>
-        <w:t xml:space="preserve">measurability of the instrument</w:t>
-      </w:r>
-      <w:r>
-        <w:t xml:space="preserve">, not of human learning, and we close with the validity agenda that</w:t>
-      </w:r>
-      <w:r>
-        <w:t xml:space="preserve"> </w:t>
-      </w:r>
-      <w:r>
-        <w:t xml:space="preserve">would establish the latter.</w:t>
+        <w:t xml:space="preserve">and near-zero inter-skill correlations; the grader is also internally consistent across repeats (a</w:t>
+      </w:r>
+      <w:r>
+        <w:t xml:space="preserve"> </w:t>
+      </w:r>
+      <w:r>
+        <w:t xml:space="preserve">precision, not an accuracy, property), and the dissociation replicates when a different grader model is</w:t>
+      </w:r>
+      <w:r>
+        <w:t xml:space="preserve"> </w:t>
+      </w:r>
+      <w:r>
+        <w:t xml:space="preserve">substituted. We release the prototype’s scoring engine (sixteen prompts), the controlled-generation</w:t>
+      </w:r>
+      <w:r>
+        <w:t xml:space="preserve"> </w:t>
+      </w:r>
+      <w:r>
+        <w:t xml:space="preserve">harness, and all data and figures. We make no learning-outcome claims: because the learners are</w:t>
+      </w:r>
+      <w:r>
+        <w:t xml:space="preserve"> </w:t>
+      </w:r>
+      <w:r>
+        <w:t xml:space="preserve">simulated and the grades are not yet validated against human raters, this is evidence of</w:t>
+      </w:r>
+      <w:r>
+        <w:t xml:space="preserve"> </w:t>
+      </w:r>
+      <w:r>
+        <w:rPr>
+          <w:i/>
+          <w:iCs/>
+        </w:rPr>
+        <w:t xml:space="preserve">construct</w:t>
+      </w:r>
+      <w:r>
+        <w:rPr>
+          <w:i/>
+          <w:iCs/>
+        </w:rPr>
+        <w:t xml:space="preserve"> </w:t>
+      </w:r>
+      <w:r>
+        <w:rPr>
+          <w:i/>
+          <w:iCs/>
+        </w:rPr>
+        <w:t xml:space="preserve">separability and automatic measurability of the instrument</w:t>
+      </w:r>
+      <w:r>
+        <w:t xml:space="preserve">, not of human learning, and we close with</w:t>
+      </w:r>
+      <w:r>
+        <w:t xml:space="preserve"> </w:t>
+      </w:r>
+      <w:r>
+        <w:t xml:space="preserve">the validity agenda that would establish the latter.</w:t>
       </w:r>
     </w:p>
     <w:bookmarkEnd w:id="20"/>
@@ -473,7 +485,7 @@
         <w:t xml:space="preserve"> </w:t>
       </w:r>
       <w:r>
-        <w:t xml:space="preserve">revising (the 2024 essay-writing literature), and neurophysiological work describes an accumulation</w:t>
+        <w:t xml:space="preserve">revising (Fan et al., 2025), and neurophysiological work describes an accumulation</w:t>
       </w:r>
       <w:r>
         <w:t xml:space="preserve"> </w:t>
@@ -1335,13 +1347,13 @@
         <w:t xml:space="preserve">3. The CoReasoning framework</w:t>
       </w:r>
     </w:p>
-    <w:bookmarkStart w:id="26" w:name="X66ab742d2d29b469acd8c125b52c7b6e582e57f"/>
+    <w:bookmarkStart w:id="26" w:name="Xb3d8dd490355320c562ac16a94db5803d599e73"/>
     <w:p>
       <w:pPr>
         <w:pStyle w:val="Heading3"/>
       </w:pPr>
       <w:r>
-        <w:t xml:space="preserve">3.1 A monitor–control architecture with an upstream task-definition</w:t>
+        <w:t xml:space="preserve">3.1 A monitor-control architecture with an upstream task-definition</w:t>
       </w:r>
     </w:p>
     <w:p>
@@ -1692,7 +1704,7 @@
           <w:i/>
           <w:iCs/>
         </w:rPr>
-        <w:t xml:space="preserve">forethought activity) sets the standards against which a metacognitive monitor–control cycle (Judging</w:t>
+        <w:t xml:space="preserve">forethought activity) sets the standards against which a metacognitive monitor-control cycle (Judging</w:t>
       </w:r>
       <w:r>
         <w:rPr>
@@ -3073,7 +3085,7 @@
         <w:t xml:space="preserve"> </w:t>
       </w:r>
       <w:r>
-        <w:t xml:space="preserve">a learner’s Framing and Steering grades can diverge.</w:t>
+        <w:t xml:space="preserve">a simulated learner’s model-assigned Framing and Steering grades can diverge.</w:t>
       </w:r>
     </w:p>
     <w:p>
@@ -4149,7 +4161,7 @@
           <w:i/>
           <w:iCs/>
         </w:rPr>
-        <w:t xml:space="preserve">Phase 1 — Framing.</w:t>
+        <w:t xml:space="preserve">Phase 1: Framing.</w:t>
       </w:r>
       <w:r>
         <w:t xml:space="preserve"> </w:t>
@@ -4205,7 +4217,7 @@
           <w:i/>
           <w:iCs/>
         </w:rPr>
-        <w:t xml:space="preserve">Phase 2 — Judge/Steer cycles.</w:t>
+        <w:t xml:space="preserve">Phase 2: Judge/Steer cycles.</w:t>
       </w:r>
       <w:r>
         <w:t xml:space="preserve"> </w:t>
@@ -4856,37 +4868,49 @@
         <w:t xml:space="preserve"> </w:t>
       </w:r>
       <w:r>
-        <w:t xml:space="preserve">learners and 255 blind grading calls (each learner is scored by up to seven grader calls, three</w:t>
-      </w:r>
-      <w:r>
-        <w:t xml:space="preserve"> </w:t>
-      </w:r>
-      <w:r>
-        <w:t xml:space="preserve">skill evaluators plus a grading pass each and one steering-update call, with identical inputs cached</w:t>
-      </w:r>
-      <w:r>
-        <w:t xml:space="preserve"> </w:t>
-      </w:r>
-      <w:r>
-        <w:t xml:space="preserve">across profiles). Framing and Steering responses are generated by the</w:t>
-      </w:r>
-      <w:r>
-        <w:t xml:space="preserve"> </w:t>
-      </w:r>
-      <w:r>
-        <w:t xml:space="preserve">competence-conditioned learner model; Judging is operationalized by a competence-conditioned selection</w:t>
-      </w:r>
-      <w:r>
-        <w:t xml:space="preserve"> </w:t>
-      </w:r>
-      <w:r>
-        <w:t xml:space="preserve">over the challenge’s ground-truth seeded issues (a strong judge flags all real issues and no false</w:t>
-      </w:r>
-      <w:r>
-        <w:t xml:space="preserve"> </w:t>
-      </w:r>
-      <w:r>
-        <w:t xml:space="preserve">ones; a weak judge flags few real issues and some false ones). Because the manipulation is per skill,</w:t>
+        <w:t xml:space="preserve">learners. At seven grader calls each (three skill evaluators, a grading pass per skill, and one</w:t>
+      </w:r>
+      <w:r>
+        <w:t xml:space="preserve"> </w:t>
+      </w:r>
+      <w:r>
+        <w:t xml:space="preserve">steering-update call) the nominal total is 280; 255 calls were actually issued because grading inputs</w:t>
+      </w:r>
+      <w:r>
+        <w:t xml:space="preserve"> </w:t>
+      </w:r>
+      <w:r>
+        <w:t xml:space="preserve">that are identical across profiles are cached and reused. Framing and Steering responses are generated</w:t>
+      </w:r>
+      <w:r>
+        <w:t xml:space="preserve"> </w:t>
+      </w:r>
+      <w:r>
+        <w:t xml:space="preserve">by the competence-conditioned learner model; Judging is operationalized by a competence-conditioned</w:t>
+      </w:r>
+      <w:r>
+        <w:t xml:space="preserve"> </w:t>
+      </w:r>
+      <w:r>
+        <w:t xml:space="preserve">selection over the challenge’s ground-truth seeded issues (a strong judge flags all real issues and no</w:t>
+      </w:r>
+      <w:r>
+        <w:t xml:space="preserve"> </w:t>
+      </w:r>
+      <w:r>
+        <w:t xml:space="preserve">false ones; a weak judge flags few real issues and some false ones). These seeded issues and the</w:t>
+      </w:r>
+      <w:r>
+        <w:t xml:space="preserve"> </w:t>
+      </w:r>
+      <w:r>
+        <w:t xml:space="preserve">distractors are themselves machine-generated and not yet human-verified, so Judging’s by-construction</w:t>
+      </w:r>
+      <w:r>
+        <w:t xml:space="preserve"> </w:t>
+      </w:r>
+      <w:r>
+        <w:t xml:space="preserve">own-effect is explicitly contingent on that ground truth being correct. Because the manipulation is per skill,</w:t>
       </w:r>
       <w:r>
         <w:t xml:space="preserve"> </w:t>
@@ -5096,7 +5120,7 @@
         <w:t xml:space="preserve"> </w:t>
       </w:r>
       <w:r>
-        <w:t xml:space="preserve">near-zero cross-effects, so a learner’s three model-assigned grades move independently. Each</w:t>
+        <w:t xml:space="preserve">near-zero cross-effects, so a simulated learner’s three model-assigned grades move independently. Each</w:t>
       </w:r>
       <w:r>
         <w:t xml:space="preserve"> </w:t>
@@ -5380,7 +5404,7 @@
         <w:t xml:space="preserve"> </w:t>
       </w:r>
       <w:r>
-        <w:t xml:space="preserve">inter-skill grade correlations across the 40 learners: Framing–Judging</w:t>
+        <w:t xml:space="preserve">inter-skill grade correlations across the 40 learners: Framing-Judging</w:t>
       </w:r>
       <w:r>
         <w:t xml:space="preserve"> </w:t>
@@ -5406,7 +5430,7 @@
         <w:t xml:space="preserve"> </w:t>
       </w:r>
       <w:r>
-        <w:t xml:space="preserve">Framing–Steering</w:t>
+        <w:t xml:space="preserve">Framing-Steering</w:t>
       </w:r>
       <w:r>
         <w:t xml:space="preserve"> </w:t>
@@ -5432,7 +5456,7 @@
         </m:r>
       </m:oMath>
       <w:r>
-        <w:t xml:space="preserve">, Judging–Steering</w:t>
+        <w:t xml:space="preserve">, Judging-Steering</w:t>
       </w:r>
       <w:r>
         <w:t xml:space="preserve"> </w:t>
@@ -5494,7 +5518,7 @@
           <w:b/>
           <w:bCs/>
         </w:rPr>
-        <w:t xml:space="preserve">Framing–Judging</w:t>
+        <w:t xml:space="preserve">Framing-Judging</w:t>
       </w:r>
       <w:r>
         <w:t xml:space="preserve"> </w:t>
@@ -5535,7 +5559,7 @@
         <w:t xml:space="preserve"> </w:t>
       </w:r>
       <w:r>
-        <w:t xml:space="preserve">account cannot produce. We do not lead with the Judging–Steering pair because Proposition P2 predicts a</w:t>
+        <w:t xml:space="preserve">account cannot produce. We do not lead with the Judging-Steering pair because Proposition P2 predicts a</w:t>
       </w:r>
       <w:r>
         <w:t xml:space="preserve"> </w:t>
@@ -5573,7 +5597,31 @@
         <w:pStyle w:val="BodyText"/>
       </w:pPr>
       <w:r>
-        <w:t xml:space="preserve">The designed-contrast personas make the separation concrete (Figure 3). A</w:t>
+        <w:t xml:space="preserve">The own-skill effects are directionally consistent across subjects: broken down by the five subject</w:t>
+      </w:r>
+      <w:r>
+        <w:t xml:space="preserve"> </w:t>
+      </w:r>
+      <w:r>
+        <w:t xml:space="preserve">areas (eight learners each), Framing and Steering each show a positive own-competence effect in four of</w:t>
+      </w:r>
+      <w:r>
+        <w:t xml:space="preserve"> </w:t>
+      </w:r>
+      <w:r>
+        <w:t xml:space="preserve">five subjects, with the two exceptions (Framing in statistics, Steering in microeconomics) reflecting</w:t>
+      </w:r>
+      <w:r>
+        <w:t xml:space="preserve"> </w:t>
+      </w:r>
+      <w:r>
+        <w:t xml:space="preserve">the small per-subject sample rather than a sign reversal; Judging is fixed by construction in every</w:t>
+      </w:r>
+      <w:r>
+        <w:t xml:space="preserve"> </w:t>
+      </w:r>
+      <w:r>
+        <w:t xml:space="preserve">subject. The designed-contrast personas make the separation concrete (Figure 3). A</w:t>
       </w:r>
       <w:r>
         <w:t xml:space="preserve"> </w:t>
@@ -5955,7 +6003,91 @@
         <w:t xml:space="preserve"> </w:t>
       </w:r>
       <w:r>
-        <w:t xml:space="preserve">against humans (Section 10).</w:t>
+        <w:t xml:space="preserve">against humans (Section 10). The pooled 0.08 flip rate is</w:t>
+      </w:r>
+      <w:r>
+        <w:t xml:space="preserve"> </w:t>
+      </w:r>
+      <w:r>
+        <w:t xml:space="preserve">itself optimistic because Judging contributes a flip rate of zero by construction; the load-bearing</w:t>
+      </w:r>
+      <w:r>
+        <w:t xml:space="preserve"> </w:t>
+      </w:r>
+      <w:r>
+        <w:t xml:space="preserve">figure is the blind-graded skills, whose flip rate is near 0.12.</w:t>
+      </w:r>
+    </w:p>
+    <w:p>
+      <w:pPr>
+        <w:pStyle w:val="BodyText"/>
+      </w:pPr>
+      <w:r>
+        <w:rPr>
+          <w:b/>
+          <w:bCs/>
+        </w:rPr>
+        <w:t xml:space="preserve">Grader-backend robustness.</w:t>
+      </w:r>
+      <w:r>
+        <w:t xml:space="preserve"> </w:t>
+      </w:r>
+      <w:r>
+        <w:t xml:space="preserve">All grades above come from a single grader model (gpt-4o), while the</w:t>
+      </w:r>
+      <w:r>
+        <w:t xml:space="preserve"> </w:t>
+      </w:r>
+      <w:r>
+        <w:t xml:space="preserve">deployed prototype used a different engine (llama-3.3-70b). To probe whether the dissociation is an</w:t>
+      </w:r>
+      <w:r>
+        <w:t xml:space="preserve"> </w:t>
+      </w:r>
+      <w:r>
+        <w:t xml:space="preserve">artifact of one grader, we re-graded the identical 40 transcripts (challenges and learner responses</w:t>
+      </w:r>
+      <w:r>
+        <w:t xml:space="preserve"> </w:t>
+      </w:r>
+      <w:r>
+        <w:t xml:space="preserve">held fixed) with a different model, gpt-4o-mini. The dissociation replicates: own-skill effects again</w:t>
+      </w:r>
+      <w:r>
+        <w:t xml:space="preserve"> </w:t>
+      </w:r>
+      <w:r>
+        <w:t xml:space="preserve">dominate cross-skill effects (diagonal +0.47 versus off-diagonal +0.07). Notably, under the weaker</w:t>
+      </w:r>
+      <w:r>
+        <w:t xml:space="preserve"> </w:t>
+      </w:r>
+      <w:r>
+        <w:t xml:space="preserve">grader Judging’s own-effect falls from +2.00 to +0.65, comparable to Framing’s +0.65, which confirms</w:t>
+      </w:r>
+      <w:r>
+        <w:t xml:space="preserve"> </w:t>
+      </w:r>
+      <w:r>
+        <w:t xml:space="preserve">that the large +2.00 was specific to gpt-4o’s strict adherence to the seeded-issue selection rather</w:t>
+      </w:r>
+      <w:r>
+        <w:t xml:space="preserve"> </w:t>
+      </w:r>
+      <w:r>
+        <w:t xml:space="preserve">than a property of the construct; the separation holds, and in fact becomes more balanced across the</w:t>
+      </w:r>
+      <w:r>
+        <w:t xml:space="preserve"> </w:t>
+      </w:r>
+      <w:r>
+        <w:t xml:space="preserve">three skills, under a second backend. (Steering’s own-effect remains the weakest, +0.10 here, again</w:t>
+      </w:r>
+      <w:r>
+        <w:t xml:space="preserve"> </w:t>
+      </w:r>
+      <w:r>
+        <w:t xml:space="preserve">indicating grader leniency on steering rather than absence of the construct.)</w:t>
       </w:r>
     </w:p>
     <w:p>
@@ -6877,7 +7009,7 @@
           <w:i/>
           <w:iCs/>
         </w:rPr>
-        <w:t xml:space="preserve">Figure A1. The learner experience: Framing (Phase 1), the Judge–Steer cycle (Phase 2), and the</w:t>
+        <w:t xml:space="preserve">Figure A1. The learner experience: Framing (Phase 1), the Judge-Steer cycle (Phase 2), and the</w:t>
       </w:r>
       <w:r>
         <w:rPr>
@@ -7397,6 +7529,30 @@
       </w:r>
       <w:r>
         <w:t xml:space="preserve">.</w:t>
+      </w:r>
+    </w:p>
+    <w:p>
+      <w:pPr>
+        <w:pStyle w:val="BodyText"/>
+      </w:pPr>
+      <w:r>
+        <w:t xml:space="preserve">Fan, Y., Tang, L., Le, H., Shen, K., Tan, S., Zhao, Y., Shen, Y., Li, X., &amp; Ga{</w:t>
+      </w:r>
+      <w:r>
+        <w:t xml:space="preserve">}evi{'c}, D. (2025). Beware of Metacognitive Laziness: Effects of Generative Artificial Intelligence on Learning Motivation, Processes, and Performance.</w:t>
+      </w:r>
+      <w:r>
+        <w:t xml:space="preserve"> </w:t>
+      </w:r>
+      <w:r>
+        <w:rPr>
+          <w:i/>
+          <w:iCs/>
+        </w:rPr>
+        <w:t xml:space="preserve">British Journal of Educational Technology</w:t>
+      </w:r>
+      <w:r>
+        <w:t xml:space="preserve">, 56(2), 489–530. https://doi.org/10.1111/bjet.13544</w:t>
       </w:r>
     </w:p>
     <w:p>

</xml_diff>

<commit_message>
Harsher-Steering ablation: refutes the leniency hypothesis (honest negative)
Re-graded all 40 transcripts under a deliberately strict steering rubric. The strict
rubric did NOT recover a larger steering own-effect (+0.40 vs +0.50, indistinguishable);
the dissociation persisted (ratio 27.5, designed contrasts still decouple). So the weak
steering signal is NOT a rubric-leniency artifact, corrected the earlier interpretation
to point at the P2 confound + simulated-response homogeneity (best resolved with human
steering data). Adds run_prompt system_suffix + COREASON_STRICT_STEER ablation mode.

Co-Authored-By: Claude Opus 4.8 <noreply@anthropic.com>
</commit_message>
<xml_diff>
--- a/docs/coreasoning.docx
+++ b/docs/coreasoning.docx
@@ -6081,13 +6081,13 @@
         <w:t xml:space="preserve"> </w:t>
       </w:r>
       <w:r>
-        <w:t xml:space="preserve">three skills, under a second backend. (Steering’s own-effect remains the weakest, +0.10 here, again</w:t>
-      </w:r>
-      <w:r>
-        <w:t xml:space="preserve"> </w:t>
-      </w:r>
-      <w:r>
-        <w:t xml:space="preserve">indicating grader leniency on steering rather than absence of the construct.)</w:t>
+        <w:t xml:space="preserve">three skills, under a second backend. (Steering’s own-effect remains the weakest, +0.10 here,</w:t>
+      </w:r>
+      <w:r>
+        <w:t xml:space="preserve"> </w:t>
+      </w:r>
+      <w:r>
+        <w:t xml:space="preserve">consistent with the Proposition-P2 confound discussed below rather than absence of the construct.)</w:t>
       </w:r>
     </w:p>
     <w:p>
@@ -6159,37 +6159,77 @@
         <w:t xml:space="preserve"> </w:t>
       </w:r>
       <w:r>
-        <w:t xml:space="preserve">rather than an exploratory factor analysis. (iv) Steering shows the weakest own-effect (+0.50); Figure</w:t>
-      </w:r>
-      <w:r>
-        <w:t xml:space="preserve"> </w:t>
-      </w:r>
-      <w:r>
-        <w:t xml:space="preserve">3 indicates a grader-leniency floor, weak steering is seldom graded all the way to C, which compresses</w:t>
-      </w:r>
-      <w:r>
-        <w:t xml:space="preserve"> </w:t>
-      </w:r>
-      <w:r>
-        <w:t xml:space="preserve">the effect. This is partly an instrument artifact (the steering evaluator is lenient and would benefit</w:t>
-      </w:r>
-      <w:r>
-        <w:t xml:space="preserve"> </w:t>
-      </w:r>
-      <w:r>
-        <w:t xml:space="preserve">from a stricter rubric) and partly the confound that Proposition P2 predicts (steering quality is</w:t>
-      </w:r>
-      <w:r>
-        <w:t xml:space="preserve"> </w:t>
-      </w:r>
-      <w:r>
-        <w:t xml:space="preserve">bounded by the judging it follows). Disentangling the two requires a harsher steering rubric and human</w:t>
-      </w:r>
-      <w:r>
-        <w:t xml:space="preserve"> </w:t>
-      </w:r>
-      <w:r>
-        <w:t xml:space="preserve">calibration, which we leave to the validation study.</w:t>
+        <w:t xml:space="preserve">rather than an exploratory factor analysis. (iv) Steering shows the weakest own-effect (+0.50). We</w:t>
+      </w:r>
+      <w:r>
+        <w:t xml:space="preserve"> </w:t>
+      </w:r>
+      <w:r>
+        <w:t xml:space="preserve">initially attributed this to grader leniency and tested that hypothesis directly with an ablation:</w:t>
+      </w:r>
+      <w:r>
+        <w:t xml:space="preserve"> </w:t>
+      </w:r>
+      <w:r>
+        <w:t xml:space="preserve">re-grading every transcript under a deliberately strict steering rubric (which mandates a C for vague</w:t>
+      </w:r>
+      <w:r>
+        <w:t xml:space="preserve"> </w:t>
+      </w:r>
+      <w:r>
+        <w:t xml:space="preserve">or non-prioritized commands). The strict rubric did</w:t>
+      </w:r>
+      <w:r>
+        <w:t xml:space="preserve"> </w:t>
+      </w:r>
+      <w:r>
+        <w:rPr>
+          <w:i/>
+          <w:iCs/>
+        </w:rPr>
+        <w:t xml:space="preserve">not</w:t>
+      </w:r>
+      <w:r>
+        <w:t xml:space="preserve"> </w:t>
+      </w:r>
+      <w:r>
+        <w:t xml:space="preserve">recover a larger effect, the steering</w:t>
+      </w:r>
+      <w:r>
+        <w:t xml:space="preserve"> </w:t>
+      </w:r>
+      <w:r>
+        <w:t xml:space="preserve">own-effect was +0.40, statistically indistinguishable from +0.50, while the overall dissociation</w:t>
+      </w:r>
+      <w:r>
+        <w:t xml:space="preserve"> </w:t>
+      </w:r>
+      <w:r>
+        <w:t xml:space="preserve">persisted (ratio 27.5; the designed contrasts still decouple). The weak steering signal is therefore</w:t>
+      </w:r>
+      <w:r>
+        <w:t xml:space="preserve"> </w:t>
+      </w:r>
+      <w:r>
+        <w:t xml:space="preserve">not a simple rubric-leniency artifact. The more likely causes are the confound that Proposition P2</w:t>
+      </w:r>
+      <w:r>
+        <w:t xml:space="preserve"> </w:t>
+      </w:r>
+      <w:r>
+        <w:t xml:space="preserve">predicts (steering quality is bounded by the judging it follows, so a competence manipulation on</w:t>
+      </w:r>
+      <w:r>
+        <w:t xml:space="preserve"> </w:t>
+      </w:r>
+      <w:r>
+        <w:t xml:space="preserve">steering alone has limited headroom) and homogeneity in the simulated steering responses; both are best</w:t>
+      </w:r>
+      <w:r>
+        <w:t xml:space="preserve"> </w:t>
+      </w:r>
+      <w:r>
+        <w:t xml:space="preserve">resolved with human steering data, which we leave to the validation study.</w:t>
       </w:r>
     </w:p>
     <w:bookmarkEnd w:id="41"/>

</xml_diff>

<commit_message>
Expand to N=80 (10 subjects) + integrate both strengthening results
- Expand-N: +5 subjects (operating systems, calculus, organic chemistry, linguistics,
  corporate finance) -> N=80. Effect matrix: Framing +0.62 [0.46,0.77], Steering
  +0.43 [0.20,0.65], Judging +2.00; diag +1.02 vs cross +0.008. F-J rho=-0.03 (ns),
  F-S rho=-0.12 (ns), J-S rho=+0.25 (p=0.02) -- the P2 ceiling now significant with
  power, supporting the lead-with-F-J framing. Own-effects positive in 9/10 subjects.
  Figures regenerated at N=80; N=40 backed up.
- Update Sec 8 (design, Table 2, CIs, correlations, per-subject) + abstract to N=80.

Co-Authored-By: Claude Opus 4.8 <noreply@anthropic.com>
</commit_message>
<xml_diff>
--- a/docs/coreasoning.docx
+++ b/docs/coreasoning.docx
@@ -324,7 +324,7 @@
         <w:t xml:space="preserve"> </w:t>
       </w:r>
       <w:r>
-        <w:t xml:space="preserve">which show positive own-competence effects (+0.6 and +0.5 grade points) with near-zero cross-effects</w:t>
+        <w:t xml:space="preserve">which show positive own-competence effects (+0.6 and +0.4 grade points) with near-zero cross-effects</w:t>
       </w:r>
       <w:r>
         <w:t xml:space="preserve"> </w:t>
@@ -4856,31 +4856,37 @@
         <w:t xml:space="preserve"> </w:t>
       </w:r>
       <w:r>
-        <w:t xml:space="preserve">profiles, crossed with five challenges across distinct</w:t>
-      </w:r>
-      <w:r>
-        <w:t xml:space="preserve"> </w:t>
-      </w:r>
-      <w:r>
-        <w:t xml:space="preserve">subjects (algorithms, microeconomics, machine learning, databases, statistics), for 40 simulated</w:t>
-      </w:r>
-      <w:r>
-        <w:t xml:space="preserve"> </w:t>
-      </w:r>
-      <w:r>
-        <w:t xml:space="preserve">learners. At seven grader calls each (three skill evaluators, a grading pass per skill, and one</w:t>
-      </w:r>
-      <w:r>
-        <w:t xml:space="preserve"> </w:t>
-      </w:r>
-      <w:r>
-        <w:t xml:space="preserve">steering-update call) the nominal total is 280; 255 calls were actually issued because grading inputs</w:t>
-      </w:r>
-      <w:r>
-        <w:t xml:space="preserve"> </w:t>
-      </w:r>
-      <w:r>
-        <w:t xml:space="preserve">that are identical across profiles are cached and reused. Framing and Steering responses are generated</w:t>
+        <w:t xml:space="preserve">profiles, crossed with ten challenges across ten distinct</w:t>
+      </w:r>
+      <w:r>
+        <w:t xml:space="preserve"> </w:t>
+      </w:r>
+      <w:r>
+        <w:t xml:space="preserve">subjects (algorithms, microeconomics, machine learning, databases, statistics, operating systems,</w:t>
+      </w:r>
+      <w:r>
+        <w:t xml:space="preserve"> </w:t>
+      </w:r>
+      <w:r>
+        <w:t xml:space="preserve">calculus, organic chemistry, linguistics, and corporate finance), for 80 simulated learners. Each</w:t>
+      </w:r>
+      <w:r>
+        <w:t xml:space="preserve"> </w:t>
+      </w:r>
+      <w:r>
+        <w:t xml:space="preserve">learner is scored by seven grader calls (three skill evaluators, a grading pass per skill, and one</w:t>
+      </w:r>
+      <w:r>
+        <w:t xml:space="preserve"> </w:t>
+      </w:r>
+      <w:r>
+        <w:t xml:space="preserve">steering-update call); grading inputs that are identical across profiles are cached and reused, so the</w:t>
+      </w:r>
+      <w:r>
+        <w:t xml:space="preserve"> </w:t>
+      </w:r>
+      <w:r>
+        <w:t xml:space="preserve">issued total is below the 560 nominal. Framing and Steering responses are generated</w:t>
       </w:r>
       <w:r>
         <w:t xml:space="preserve"> </w:t>
@@ -5036,7 +5042,7 @@
           <w:b/>
           <w:bCs/>
         </w:rPr>
-        <w:t xml:space="preserve">+1.03</w:t>
+        <w:t xml:space="preserve">+1.02</w:t>
       </w:r>
       <w:r>
         <w:t xml:space="preserve">; the off-diagonal (the</w:t>
@@ -5071,7 +5077,7 @@
           <w:b/>
           <w:bCs/>
         </w:rPr>
-        <w:t xml:space="preserve">−0.017</w:t>
+        <w:t xml:space="preserve">+0.008</w:t>
       </w:r>
       <w:r>
         <w:t xml:space="preserve">. This aggregate ratio is inflated by</w:t>
@@ -5086,13 +5092,13 @@
         <w:t xml:space="preserve"> </w:t>
       </w:r>
       <w:r>
-        <w:t xml:space="preserve">a controlled selection over ground-truth issues; we therefore do not lead with it. The decisive evidence</w:t>
-      </w:r>
-      <w:r>
-        <w:t xml:space="preserve"> </w:t>
-      </w:r>
-      <w:r>
-        <w:t xml:space="preserve">is the two</w:t>
+        <w:t xml:space="preserve">a controlled selection over ground-truth issues; we therefore do not lead with it. The strongest</w:t>
+      </w:r>
+      <w:r>
+        <w:t xml:space="preserve"> </w:t>
+      </w:r>
+      <w:r>
+        <w:t xml:space="preserve">evidence is the two</w:t>
       </w:r>
       <w:r>
         <w:t xml:space="preserve"> </w:t>
@@ -5108,25 +5114,25 @@
         <w:t xml:space="preserve"> </w:t>
       </w:r>
       <w:r>
-        <w:t xml:space="preserve">skills, Framing and Steering, whose free-text responses the grader scores</w:t>
-      </w:r>
-      <w:r>
-        <w:t xml:space="preserve"> </w:t>
-      </w:r>
-      <w:r>
-        <w:t xml:space="preserve">without knowing the intended competence: each shows a clear positive own-effect (+0.60 and +0.50) with</w:t>
-      </w:r>
-      <w:r>
-        <w:t xml:space="preserve"> </w:t>
-      </w:r>
-      <w:r>
-        <w:t xml:space="preserve">near-zero cross-effects, so a simulated learner’s three model-assigned grades move independently. Each</w:t>
-      </w:r>
-      <w:r>
-        <w:t xml:space="preserve"> </w:t>
-      </w:r>
-      <w:r>
-        <w:t xml:space="preserve">grade responds to its own skill and is essentially flat in the others (Figure 2).</w:t>
+        <w:t xml:space="preserve">skills, Framing and Steering, whose free-text responses the grader</w:t>
+      </w:r>
+      <w:r>
+        <w:t xml:space="preserve"> </w:t>
+      </w:r>
+      <w:r>
+        <w:t xml:space="preserve">scores without knowing the intended competence: each shows a clear positive own-effect (+0.62 and</w:t>
+      </w:r>
+      <w:r>
+        <w:t xml:space="preserve"> </w:t>
+      </w:r>
+      <w:r>
+        <w:t xml:space="preserve">+0.43) with near-zero cross-effects, so a simulated learner’s three model-assigned grades move</w:t>
+      </w:r>
+      <w:r>
+        <w:t xml:space="preserve"> </w:t>
+      </w:r>
+      <w:r>
+        <w:t xml:space="preserve">independently. Each grade responds to its own skill and is essentially flat in the others (Figure 2).</w:t>
       </w:r>
     </w:p>
     <w:p>
@@ -5138,7 +5144,7 @@
           <w:b/>
           <w:bCs/>
         </w:rPr>
-        <w:t xml:space="preserve">Table 2. Effect on each skill’s grade of manipulating each skill’s competence (grade Δ, strong − weak; N=40).</w:t>
+        <w:t xml:space="preserve">Table 2. Effect on each skill’s grade of manipulating each skill’s competence (grade Δ, strong − weak; N=80).</w:t>
       </w:r>
     </w:p>
     <w:tbl>
@@ -5235,7 +5241,7 @@
                 <w:b/>
                 <w:bCs/>
               </w:rPr>
-              <w:t xml:space="preserve">+0.60</w:t>
+              <w:t xml:space="preserve">+0.62</w:t>
             </w:r>
           </w:p>
         </w:tc>
@@ -5247,7 +5253,7 @@
               <w:jc w:val="left"/>
             </w:pPr>
             <w:r>
-              <w:t xml:space="preserve">+0.00</w:t>
+              <w:t xml:space="preserve">−0.02</w:t>
             </w:r>
           </w:p>
         </w:tc>
@@ -5259,7 +5265,7 @@
               <w:jc w:val="left"/>
             </w:pPr>
             <w:r>
-              <w:t xml:space="preserve">−0.10</w:t>
+              <w:t xml:space="preserve">−0.07</w:t>
             </w:r>
           </w:p>
         </w:tc>
@@ -5347,7 +5353,7 @@
               <w:jc w:val="left"/>
             </w:pPr>
             <w:r>
-              <w:t xml:space="preserve">−0.20</w:t>
+              <w:t xml:space="preserve">−0.12</w:t>
             </w:r>
           </w:p>
         </w:tc>
@@ -5359,7 +5365,7 @@
               <w:jc w:val="left"/>
             </w:pPr>
             <w:r>
-              <w:t xml:space="preserve">+0.20</w:t>
+              <w:t xml:space="preserve">+0.27</w:t>
             </w:r>
           </w:p>
         </w:tc>
@@ -5375,7 +5381,7 @@
                 <w:b/>
                 <w:bCs/>
               </w:rPr>
-              <w:t xml:space="preserve">+0.50</w:t>
+              <w:t xml:space="preserve">+0.43</w:t>
             </w:r>
           </w:p>
         </w:tc>
@@ -5392,45 +5398,19 @@
         <w:t xml:space="preserve"> </w:t>
       </w:r>
       <w:r>
-        <w:t xml:space="preserve">(2,000 resamples) exclude zero for Framing (+0.60, CI [+0.38, +0.81]) and Steering (+0.50, CI</w:t>
-      </w:r>
-      <w:r>
-        <w:t xml:space="preserve"> </w:t>
-      </w:r>
-      <w:r>
-        <w:t xml:space="preserve">[+0.18, +0.82]); Judging is deterministic by construction (+2.00). The same separation appears in the</w:t>
-      </w:r>
-      <w:r>
-        <w:t xml:space="preserve"> </w:t>
-      </w:r>
-      <w:r>
-        <w:t xml:space="preserve">inter-skill grade correlations across the 40 learners: Framing-Judging</w:t>
-      </w:r>
-      <w:r>
-        <w:t xml:space="preserve"> </w:t>
-      </w:r>
-      <m:oMath>
-        <m:r>
-          <m:t>ρ</m:t>
-        </m:r>
-        <m:r>
-          <m:rPr>
-            <m:sty m:val="p"/>
-          </m:rPr>
-          <m:t>=</m:t>
-        </m:r>
-        <m:r>
-          <m:t>0.00</m:t>
-        </m:r>
-      </m:oMath>
-      <w:r>
-        <w:t xml:space="preserve">,</w:t>
-      </w:r>
-      <w:r>
-        <w:t xml:space="preserve"> </w:t>
-      </w:r>
-      <w:r>
-        <w:t xml:space="preserve">Framing-Steering</w:t>
+        <w:t xml:space="preserve">(2,000 resamples) exclude zero for Framing (+0.62, CI [+0.46, +0.77]) and Steering (+0.43, CI</w:t>
+      </w:r>
+      <w:r>
+        <w:t xml:space="preserve"> </w:t>
+      </w:r>
+      <w:r>
+        <w:t xml:space="preserve">[+0.20, +0.65]); Judging is deterministic by construction (+2.00). The same separation appears in the</w:t>
+      </w:r>
+      <w:r>
+        <w:t xml:space="preserve"> </w:t>
+      </w:r>
+      <w:r>
+        <w:t xml:space="preserve">inter-skill grade correlations across the 80 learners: Framing-Judging</w:t>
       </w:r>
       <w:r>
         <w:t xml:space="preserve"> </w:t>
@@ -5452,11 +5432,83 @@
           <m:t>−</m:t>
         </m:r>
         <m:r>
-          <m:t>0.22</m:t>
+          <m:t>0.03</m:t>
         </m:r>
       </m:oMath>
       <w:r>
-        <w:t xml:space="preserve">, Judging-Steering</w:t>
+        <w:t xml:space="preserve"> </w:t>
+      </w:r>
+      <w:r>
+        <w:t xml:space="preserve">(</w:t>
+      </w:r>
+      <m:oMath>
+        <m:r>
+          <m:t>p</m:t>
+        </m:r>
+        <m:r>
+          <m:rPr>
+            <m:sty m:val="p"/>
+          </m:rPr>
+          <m:t>=</m:t>
+        </m:r>
+        <m:r>
+          <m:t>0.82</m:t>
+        </m:r>
+      </m:oMath>
+      <w:r>
+        <w:t xml:space="preserve">) and</w:t>
+      </w:r>
+      <w:r>
+        <w:t xml:space="preserve"> </w:t>
+      </w:r>
+      <w:r>
+        <w:t xml:space="preserve">Framing-Steering</w:t>
+      </w:r>
+      <w:r>
+        <w:t xml:space="preserve"> </w:t>
+      </w:r>
+      <m:oMath>
+        <m:r>
+          <m:t>ρ</m:t>
+        </m:r>
+        <m:r>
+          <m:rPr>
+            <m:sty m:val="p"/>
+          </m:rPr>
+          <m:t>=</m:t>
+        </m:r>
+        <m:r>
+          <m:rPr>
+            <m:sty m:val="p"/>
+          </m:rPr>
+          <m:t>−</m:t>
+        </m:r>
+        <m:r>
+          <m:t>0.12</m:t>
+        </m:r>
+      </m:oMath>
+      <w:r>
+        <w:t xml:space="preserve"> </w:t>
+      </w:r>
+      <w:r>
+        <w:t xml:space="preserve">(</w:t>
+      </w:r>
+      <m:oMath>
+        <m:r>
+          <m:t>p</m:t>
+        </m:r>
+        <m:r>
+          <m:rPr>
+            <m:sty m:val="p"/>
+          </m:rPr>
+          <m:t>=</m:t>
+        </m:r>
+        <m:r>
+          <m:t>0.29</m:t>
+        </m:r>
+      </m:oMath>
+      <w:r>
+        <w:t xml:space="preserve">) are both non-significant, while Judging-Steering</w:t>
       </w:r>
       <w:r>
         <w:t xml:space="preserve"> </w:t>
@@ -5478,14 +5530,14 @@
           <m:t>+</m:t>
         </m:r>
         <m:r>
-          <m:t>0.17</m:t>
+          <m:t>0.25</m:t>
         </m:r>
       </m:oMath>
       <w:r>
-        <w:t xml:space="preserve">, none significant (all</w:t>
-      </w:r>
-      <w:r>
-        <w:t xml:space="preserve"> </w:t>
+        <w:t xml:space="preserve"> </w:t>
+      </w:r>
+      <w:r>
+        <w:t xml:space="preserve">(</w:t>
       </w:r>
       <m:oMath>
         <m:r>
@@ -5495,121 +5547,98 @@
           <m:rPr>
             <m:sty m:val="p"/>
           </m:rPr>
-          <m:t>&gt;</m:t>
-        </m:r>
-        <m:r>
-          <m:t>0.17</m:t>
-        </m:r>
-      </m:oMath>
-      <w:r>
-        <w:t xml:space="preserve">).</w:t>
-      </w:r>
-      <w:r>
-        <w:t xml:space="preserve"> </w:t>
-      </w:r>
-      <w:r>
-        <w:t xml:space="preserve">The</w:t>
-      </w:r>
-      <w:r>
-        <w:t xml:space="preserve"> </w:t>
-      </w:r>
-      <w:r>
-        <w:rPr>
-          <w:b/>
-          <w:bCs/>
-        </w:rPr>
-        <w:t xml:space="preserve">Framing-Judging</w:t>
-      </w:r>
-      <w:r>
-        <w:t xml:space="preserve"> </w:t>
-      </w:r>
-      <w:r>
-        <w:t xml:space="preserve">pair is the cleanest demonstration and the one we lead with: these two skills</w:t>
-      </w:r>
-      <w:r>
-        <w:t xml:space="preserve"> </w:t>
-      </w:r>
-      <w:r>
-        <w:t xml:space="preserve">are scored by entirely separate mechanisms (free-text framing evaluation versus issue-selection</w:t>
-      </w:r>
-      <w:r>
-        <w:t xml:space="preserve"> </w:t>
-      </w:r>
-      <w:r>
-        <w:t xml:space="preserve">judging) yet their grades are exactly uncorrelated (</w:t>
-      </w:r>
-      <m:oMath>
-        <m:r>
-          <m:t>ρ</m:t>
-        </m:r>
-        <m:r>
-          <m:rPr>
-            <m:sty m:val="p"/>
-          </m:rPr>
           <m:t>=</m:t>
         </m:r>
         <m:r>
-          <m:t>0.00</m:t>
+          <m:t>0.02</m:t>
         </m:r>
       </m:oMath>
       <w:r>
-        <w:t xml:space="preserve">), which a single general-ability</w:t>
-      </w:r>
-      <w:r>
-        <w:t xml:space="preserve"> </w:t>
-      </w:r>
-      <w:r>
-        <w:t xml:space="preserve">account cannot produce. We do not lead with the Judging-Steering pair because Proposition P2 predicts a</w:t>
-      </w:r>
-      <w:r>
-        <w:t xml:space="preserve"> </w:t>
-      </w:r>
-      <w:r>
-        <w:t xml:space="preserve">ceiling relation between them, so some positive association there is expected and is not evidence</w:t>
-      </w:r>
-      <w:r>
-        <w:t xml:space="preserve"> </w:t>
-      </w:r>
-      <w:r>
-        <w:t xml:space="preserve">against separability. The first principal component accounts for 42% of the variance, but with only</w:t>
-      </w:r>
-      <w:r>
-        <w:t xml:space="preserve"> </w:t>
-      </w:r>
-      <w:r>
-        <w:t xml:space="preserve">three indicators a formal factor model is under-identified, so we report this descriptively rather than</w:t>
-      </w:r>
-      <w:r>
-        <w:t xml:space="preserve"> </w:t>
-      </w:r>
-      <w:r>
-        <w:t xml:space="preserve">as a confirmatory dimensionality test; the point is simply that the grades do not collapse onto a</w:t>
-      </w:r>
-      <w:r>
-        <w:t xml:space="preserve"> </w:t>
-      </w:r>
-      <w:r>
-        <w:t xml:space="preserve">single dimension.</w:t>
-      </w:r>
-    </w:p>
-    <w:p>
-      <w:pPr>
-        <w:pStyle w:val="BodyText"/>
-      </w:pPr>
-      <w:r>
-        <w:t xml:space="preserve">The own-skill effects are directionally consistent across subjects: broken down by the five subject</w:t>
-      </w:r>
-      <w:r>
-        <w:t xml:space="preserve"> </w:t>
-      </w:r>
-      <w:r>
-        <w:t xml:space="preserve">areas (eight learners each), Framing and Steering each show a positive own-competence effect in four of</w:t>
-      </w:r>
-      <w:r>
-        <w:t xml:space="preserve"> </w:t>
-      </w:r>
-      <w:r>
-        <w:t xml:space="preserve">five subjects, with the two exceptions (Framing in statistics, Steering in microeconomics) reflecting</w:t>
+        <w:t xml:space="preserve">) is positive and significant. The</w:t>
+      </w:r>
+      <w:r>
+        <w:t xml:space="preserve"> </w:t>
+      </w:r>
+      <w:r>
+        <w:rPr>
+          <w:b/>
+          <w:bCs/>
+        </w:rPr>
+        <w:t xml:space="preserve">Framing-Judging</w:t>
+      </w:r>
+      <w:r>
+        <w:t xml:space="preserve"> </w:t>
+      </w:r>
+      <w:r>
+        <w:t xml:space="preserve">pair is the cleanest</w:t>
+      </w:r>
+      <w:r>
+        <w:t xml:space="preserve"> </w:t>
+      </w:r>
+      <w:r>
+        <w:t xml:space="preserve">demonstration and the one we lead with: these two skills are scored by entirely separate mechanisms</w:t>
+      </w:r>
+      <w:r>
+        <w:t xml:space="preserve"> </w:t>
+      </w:r>
+      <w:r>
+        <w:t xml:space="preserve">(free-text framing evaluation versus issue-selection judging) yet their grades are uncorrelated, which</w:t>
+      </w:r>
+      <w:r>
+        <w:t xml:space="preserve"> </w:t>
+      </w:r>
+      <w:r>
+        <w:t xml:space="preserve">a single general-ability account cannot produce. We do not lead with the Judging-Steering pair: its</w:t>
+      </w:r>
+      <w:r>
+        <w:t xml:space="preserve"> </w:t>
+      </w:r>
+      <w:r>
+        <w:t xml:space="preserve">significant positive correlation is exactly what Proposition P2 predicts (a ceiling relation, judging</w:t>
+      </w:r>
+      <w:r>
+        <w:t xml:space="preserve"> </w:t>
+      </w:r>
+      <w:r>
+        <w:t xml:space="preserve">gates steering) and so is expected rather than evidence against separability. The first principal</w:t>
+      </w:r>
+      <w:r>
+        <w:t xml:space="preserve"> </w:t>
+      </w:r>
+      <w:r>
+        <w:t xml:space="preserve">component accounts for 43% of the variance, but with only three indicators a formal factor model is</w:t>
+      </w:r>
+      <w:r>
+        <w:t xml:space="preserve"> </w:t>
+      </w:r>
+      <w:r>
+        <w:t xml:space="preserve">under-identified, so we report this descriptively rather than as a confirmatory dimensionality test;</w:t>
+      </w:r>
+      <w:r>
+        <w:t xml:space="preserve"> </w:t>
+      </w:r>
+      <w:r>
+        <w:t xml:space="preserve">the point is simply that the grades do not collapse onto a single dimension.</w:t>
+      </w:r>
+    </w:p>
+    <w:p>
+      <w:pPr>
+        <w:pStyle w:val="BodyText"/>
+      </w:pPr>
+      <w:r>
+        <w:t xml:space="preserve">The own-skill effects are directionally consistent across subjects: broken down by the ten subject</w:t>
+      </w:r>
+      <w:r>
+        <w:t xml:space="preserve"> </w:t>
+      </w:r>
+      <w:r>
+        <w:t xml:space="preserve">areas (eight learners each), Framing and Steering each show a positive own-competence effect in nine of</w:t>
+      </w:r>
+      <w:r>
+        <w:t xml:space="preserve"> </w:t>
+      </w:r>
+      <w:r>
+        <w:t xml:space="preserve">ten subjects, with the two exceptions (Framing in statistics, Steering in microeconomics) reflecting</w:t>
       </w:r>
       <w:r>
         <w:t xml:space="preserve"> </w:t>

</xml_diff>

<commit_message>
E4 ground-truth ablation: skill-specific dependence (integrated)
Re-graded with gold-framing + seeded-issue ground truth stripped. Sharply
skill-specific: Framing UNAFFECTED (+0.75 vs +0.60; rubric+LLM carry it), Judging
COLLAPSES (+2.00->+0.45; loses recall/precision anchor), Steering partial
(+0.50->+0.25). Separability survives (ratio 29). Clarifies that Judging-as-
instrumented is close to answer-key agreement (explains +2.00, bounds keyless
transfer); Framing/Steering are rubric-guided model judgment. Empirical program
complete; INDEX + PROJECT_LOG updated.

Co-Authored-By: Claude Opus 4.8 <noreply@anthropic.com>
</commit_message>
<xml_diff>
--- a/docs/coreasoning.docx
+++ b/docs/coreasoning.docx
@@ -6117,6 +6117,112 @@
       </w:r>
       <w:r>
         <w:t xml:space="preserve">consistent with the Proposition-P2 confound discussed below rather than absence of the construct.)</w:t>
+      </w:r>
+    </w:p>
+    <w:p>
+      <w:pPr>
+        <w:pStyle w:val="BodyText"/>
+      </w:pPr>
+      <w:r>
+        <w:rPr>
+          <w:b/>
+          <w:bCs/>
+        </w:rPr>
+        <w:t xml:space="preserve">Dependence on ground-truth scaffolding.</w:t>
+      </w:r>
+      <w:r>
+        <w:t xml:space="preserve"> </w:t>
+      </w:r>
+      <w:r>
+        <w:t xml:space="preserve">To probe how much the instrument’s discrimination relies on</w:t>
+      </w:r>
+      <w:r>
+        <w:t xml:space="preserve"> </w:t>
+      </w:r>
+      <w:r>
+        <w:t xml:space="preserve">the seeded ground truth (the gold framing supplied to the framing evaluator and the known seeded issues</w:t>
+      </w:r>
+      <w:r>
+        <w:t xml:space="preserve"> </w:t>
+      </w:r>
+      <w:r>
+        <w:t xml:space="preserve">supplied to the judging evaluator) versus the model’s own judgment, we re-graded the transcripts with</w:t>
+      </w:r>
+      <w:r>
+        <w:t xml:space="preserve"> </w:t>
+      </w:r>
+      <w:r>
+        <w:t xml:space="preserve">that scaffolding removed. The effect is sharply skill-specific. Framing discrimination is essentially</w:t>
+      </w:r>
+      <w:r>
+        <w:t xml:space="preserve"> </w:t>
+      </w:r>
+      <w:r>
+        <w:t xml:space="preserve">unaffected (own-effect +0.75 without the gold reference, versus +0.60 with it): the rubric and the</w:t>
+      </w:r>
+      <w:r>
+        <w:t xml:space="preserve"> </w:t>
+      </w:r>
+      <w:r>
+        <w:t xml:space="preserve">model’s own judgment carry it. Judging discrimination, by contrast, largely collapses (+2.00 to +0.45):</w:t>
+      </w:r>
+      <w:r>
+        <w:t xml:space="preserve"> </w:t>
+      </w:r>
+      <w:r>
+        <w:t xml:space="preserve">without the known issues the grader has no recall-precision anchor and can barely separate strong from</w:t>
+      </w:r>
+      <w:r>
+        <w:t xml:space="preserve"> </w:t>
+      </w:r>
+      <w:r>
+        <w:t xml:space="preserve">weak judging. Steering falls in between (+0.50 to +0.25). Separability itself survives (the skills still</w:t>
+      </w:r>
+      <w:r>
+        <w:t xml:space="preserve"> </w:t>
+      </w:r>
+      <w:r>
+        <w:t xml:space="preserve">dissociate, ratio 29), but the result clarifies what each grade measures: Framing and Steering are</w:t>
+      </w:r>
+      <w:r>
+        <w:t xml:space="preserve"> </w:t>
+      </w:r>
+      <w:r>
+        <w:t xml:space="preserve">scored largely by rubric-guided model judgment, whereas Judging</w:t>
+      </w:r>
+      <w:r>
+        <w:t xml:space="preserve"> </w:t>
+      </w:r>
+      <w:r>
+        <w:rPr>
+          <w:i/>
+          <w:iCs/>
+        </w:rPr>
+        <w:t xml:space="preserve">as instrumented here</w:t>
+      </w:r>
+      <w:r>
+        <w:t xml:space="preserve"> </w:t>
+      </w:r>
+      <w:r>
+        <w:t xml:space="preserve">is close to a</w:t>
+      </w:r>
+      <w:r>
+        <w:t xml:space="preserve"> </w:t>
+      </w:r>
+      <w:r>
+        <w:t xml:space="preserve">measurement of agreement with a known answer key. This both explains Judging’s by-construction +2.00</w:t>
+      </w:r>
+      <w:r>
+        <w:t xml:space="preserve"> </w:t>
+      </w:r>
+      <w:r>
+        <w:t xml:space="preserve">and bounds its transfer to open-ended settings where no such key exists, an important caveat for any</w:t>
+      </w:r>
+      <w:r>
+        <w:t xml:space="preserve"> </w:t>
+      </w:r>
+      <w:r>
+        <w:t xml:space="preserve">deployment that scores judging without seeded ground truth.</w:t>
       </w:r>
     </w:p>
     <w:p>

</xml_diff>

<commit_message>
Final consistency pass: limitations reflect E4 + robustness; clarify ablation N
Co-Authored-By: Claude Opus 4.8 <noreply@anthropic.com>
</commit_message>
<xml_diff>
--- a/docs/coreasoning.docx
+++ b/docs/coreasoning.docx
@@ -6146,13 +6146,19 @@
         <w:t xml:space="preserve"> </w:t>
       </w:r>
       <w:r>
-        <w:t xml:space="preserve">supplied to the judging evaluator) versus the model’s own judgment, we re-graded the transcripts with</w:t>
-      </w:r>
-      <w:r>
-        <w:t xml:space="preserve"> </w:t>
-      </w:r>
-      <w:r>
-        <w:t xml:space="preserve">that scaffolding removed. The effect is sharply skill-specific. Framing discrimination is essentially</w:t>
+        <w:t xml:space="preserve">supplied to the judging evaluator) versus the model’s own judgment, we re-graded the original</w:t>
+      </w:r>
+      <w:r>
+        <w:t xml:space="preserve"> </w:t>
+      </w:r>
+      <w:r>
+        <w:t xml:space="preserve">40-learner subset with that scaffolding removed (comparing against that subset’s own baseline, where</w:t>
+      </w:r>
+      <w:r>
+        <w:t xml:space="preserve"> </w:t>
+      </w:r>
+      <w:r>
+        <w:t xml:space="preserve">the effects are Framing +0.60, Judging +2.00, Steering +0.50). The effect is sharply skill-specific. Framing discrimination is essentially</w:t>
       </w:r>
       <w:r>
         <w:t xml:space="preserve"> </w:t>
@@ -6306,7 +6312,7 @@
         <w:t xml:space="preserve"> </w:t>
       </w:r>
       <w:r>
-        <w:t xml:space="preserve">re-grading every transcript under a deliberately strict steering rubric (which mandates a C for vague</w:t>
+        <w:t xml:space="preserve">re-grading the original 40-learner subset under a deliberately strict steering rubric (which mandates a C for vague</w:t>
       </w:r>
       <w:r>
         <w:t xml:space="preserve"> </w:t>
@@ -6970,37 +6976,67 @@
         <w:t xml:space="preserve"> </w:t>
       </w:r>
       <w:r>
-        <w:t xml:space="preserve">a different one (gpt-4o); the deployed prototype’s engine is llama-3.3-70b, and whether the dissociation</w:t>
-      </w:r>
-      <w:r>
-        <w:t xml:space="preserve"> </w:t>
-      </w:r>
-      <w:r>
-        <w:t xml:space="preserve">replicates across grader backends remains to be shown. The challenges are English-language, and the</w:t>
-      </w:r>
-      <w:r>
-        <w:t xml:space="preserve"> </w:t>
-      </w:r>
-      <w:r>
-        <w:t xml:space="preserve">automated grades have not yet been validated against human experts (Section 10). We make no</w:t>
-      </w:r>
-      <w:r>
-        <w:t xml:space="preserve"> </w:t>
-      </w:r>
-      <w:r>
-        <w:t xml:space="preserve">learning-outcome claim. What the paper establishes is conceptual: a theoretically-grounded</w:t>
-      </w:r>
-      <w:r>
-        <w:t xml:space="preserve"> </w:t>
-      </w:r>
-      <w:r>
-        <w:t xml:space="preserve">decomposition with stated propositions, a precise novelty boundary, and evidence that the three</w:t>
-      </w:r>
-      <w:r>
-        <w:t xml:space="preserve"> </w:t>
-      </w:r>
-      <w:r>
-        <w:t xml:space="preserve">constructs are separable and automatically measurable.</w:t>
+        <w:t xml:space="preserve">a different one (gpt-4o); the dissociation replicates under a second grader backend, but both are from</w:t>
+      </w:r>
+      <w:r>
+        <w:t xml:space="preserve"> </w:t>
+      </w:r>
+      <w:r>
+        <w:t xml:space="preserve">one provider, and the deployed prototype’s engine (llama-3.3-70b) differs again, so cross-vendor</w:t>
+      </w:r>
+      <w:r>
+        <w:t xml:space="preserve"> </w:t>
+      </w:r>
+      <w:r>
+        <w:t xml:space="preserve">robustness is only partly established. The challenges are English-language, and the automated grades</w:t>
+      </w:r>
+      <w:r>
+        <w:t xml:space="preserve"> </w:t>
+      </w:r>
+      <w:r>
+        <w:t xml:space="preserve">have not yet been validated against human experts (Section 10). Two construct-specific limits deserve</w:t>
+      </w:r>
+      <w:r>
+        <w:t xml:space="preserve"> </w:t>
+      </w:r>
+      <w:r>
+        <w:t xml:space="preserve">emphasis. First, Judging as instrumented here is close to a measurement of agreement with a seeded</w:t>
+      </w:r>
+      <w:r>
+        <w:t xml:space="preserve"> </w:t>
+      </w:r>
+      <w:r>
+        <w:t xml:space="preserve">answer key: removing that key collapses its discrimination (Section 8), so the instrument’s judging</w:t>
+      </w:r>
+      <w:r>
+        <w:t xml:space="preserve"> </w:t>
+      </w:r>
+      <w:r>
+        <w:t xml:space="preserve">score would not transfer unchanged to open-ended settings without ground truth. Second, Steering yields</w:t>
+      </w:r>
+      <w:r>
+        <w:t xml:space="preserve"> </w:t>
+      </w:r>
+      <w:r>
+        <w:t xml:space="preserve">the weakest and partly confounded signal (it is bounded by the judging it follows, Proposition P2), and</w:t>
+      </w:r>
+      <w:r>
+        <w:t xml:space="preserve"> </w:t>
+      </w:r>
+      <w:r>
+        <w:t xml:space="preserve">its measurement is the least mature. We make no learning-outcome claim. What the paper establishes is</w:t>
+      </w:r>
+      <w:r>
+        <w:t xml:space="preserve"> </w:t>
+      </w:r>
+      <w:r>
+        <w:t xml:space="preserve">conceptual: a theoretically-grounded decomposition with stated propositions, a precise novelty</w:t>
+      </w:r>
+      <w:r>
+        <w:t xml:space="preserve"> </w:t>
+      </w:r>
+      <w:r>
+        <w:t xml:space="preserve">boundary, and evidence that the three constructs are separable and automatically measurable.</w:t>
       </w:r>
     </w:p>
     <w:bookmarkEnd w:id="44"/>

</xml_diff>

<commit_message>
Final readiness fix: N=80 in Sec 8 caveats; Paul & Elder year; dedupe factor caveat
Resolves the one MUST-FIX from the final readiness review (stale N=40 own-effects
+0.60/+0.50 in caveats (i)/(iv) now +0.62/+0.43 matching Table 2/abstract; the +0.50
strict-steer baseline clarified as the 40-subset value). Paul & Elder (2006) year
added; duplicated factor-model caveat trimmed. Paper is submit-ready.

Co-Authored-By: Claude Opus 4.8 <noreply@anthropic.com>
</commit_message>
<xml_diff>
--- a/docs/coreasoning.docx
+++ b/docs/coreasoning.docx
@@ -2248,7 +2248,7 @@
         <w:t xml:space="preserve"> </w:t>
       </w:r>
       <w:r>
-        <w:t xml:space="preserve">analysis and evaluation (Facione, 1990) and the Paul-Elder intellectual standards, which supply a</w:t>
+        <w:t xml:space="preserve">analysis and evaluation (Facione, 1990) and the Paul and Elder (2006) intellectual standards, which supply a</w:t>
       </w:r>
       <w:r>
         <w:t xml:space="preserve"> </w:t>
@@ -6270,7 +6270,7 @@
         <w:t xml:space="preserve"> </w:t>
       </w:r>
       <w:r>
-        <w:t xml:space="preserve">free-text and blind-graded, so their positive own-effects (+0.60, +0.50) with near-zero cross-effects</w:t>
+        <w:t xml:space="preserve">free-text and blind-graded, so their positive own-effects (+0.62, +0.43) with near-zero cross-effects</w:t>
       </w:r>
       <w:r>
         <w:t xml:space="preserve"> </w:t>
@@ -6288,37 +6288,43 @@
         <w:t xml:space="preserve"> </w:t>
       </w:r>
       <w:r>
-        <w:t xml:space="preserve">questions deferred to Section 10. (iii) With three grade indicators a stable factor model is</w:t>
-      </w:r>
-      <w:r>
-        <w:t xml:space="preserve"> </w:t>
-      </w:r>
-      <w:r>
-        <w:t xml:space="preserve">under-identified, so we report the manipulation-based effect matrix and the inter-skill correlations</w:t>
-      </w:r>
-      <w:r>
-        <w:t xml:space="preserve"> </w:t>
-      </w:r>
-      <w:r>
-        <w:t xml:space="preserve">rather than an exploratory factor analysis. (iv) Steering shows the weakest own-effect (+0.50). We</w:t>
-      </w:r>
-      <w:r>
-        <w:t xml:space="preserve"> </w:t>
-      </w:r>
-      <w:r>
-        <w:t xml:space="preserve">initially attributed this to grader leniency and tested that hypothesis directly with an ablation:</w:t>
-      </w:r>
-      <w:r>
-        <w:t xml:space="preserve"> </w:t>
-      </w:r>
-      <w:r>
-        <w:t xml:space="preserve">re-grading the original 40-learner subset under a deliberately strict steering rubric (which mandates a C for vague</w:t>
-      </w:r>
-      <w:r>
-        <w:t xml:space="preserve"> </w:t>
-      </w:r>
-      <w:r>
-        <w:t xml:space="preserve">or non-prioritized commands). The strict rubric did</w:t>
+        <w:t xml:space="preserve">questions deferred to Section 10. (iii) As noted above, with three indicators a factor model is</w:t>
+      </w:r>
+      <w:r>
+        <w:t xml:space="preserve"> </w:t>
+      </w:r>
+      <w:r>
+        <w:t xml:space="preserve">under-identified, so the separability evidence rests on the manipulation-based effect matrix and the</w:t>
+      </w:r>
+      <w:r>
+        <w:t xml:space="preserve"> </w:t>
+      </w:r>
+      <w:r>
+        <w:t xml:space="preserve">inter-skill correlations, not on a confirmatory dimensionality test. (iv) Steering shows the weakest own-effect (+0.43 at N=80).</w:t>
+      </w:r>
+      <w:r>
+        <w:t xml:space="preserve"> </w:t>
+      </w:r>
+      <w:r>
+        <w:t xml:space="preserve">We initially attributed this to grader leniency and tested that hypothesis directly with an ablation:</w:t>
+      </w:r>
+      <w:r>
+        <w:t xml:space="preserve"> </w:t>
+      </w:r>
+      <w:r>
+        <w:t xml:space="preserve">re-grading the original 40-learner subset under a deliberately strict steering rubric (which mandates a</w:t>
+      </w:r>
+      <w:r>
+        <w:t xml:space="preserve"> </w:t>
+      </w:r>
+      <w:r>
+        <w:t xml:space="preserve">C for vague or non-prioritized commands). On that subset the standard rubric gives a steering own-effect</w:t>
+      </w:r>
+      <w:r>
+        <w:t xml:space="preserve"> </w:t>
+      </w:r>
+      <w:r>
+        <w:t xml:space="preserve">of +0.50; the strict rubric did</w:t>
       </w:r>
       <w:r>
         <w:t xml:space="preserve"> </w:t>
@@ -6334,13 +6340,13 @@
         <w:t xml:space="preserve"> </w:t>
       </w:r>
       <w:r>
-        <w:t xml:space="preserve">recover a larger effect, the steering</w:t>
-      </w:r>
-      <w:r>
-        <w:t xml:space="preserve"> </w:t>
-      </w:r>
-      <w:r>
-        <w:t xml:space="preserve">own-effect was +0.40, statistically indistinguishable from +0.50, while the overall dissociation</w:t>
+        <w:t xml:space="preserve">recover a larger effect (+0.40, statistically indistinguishable),</w:t>
+      </w:r>
+      <w:r>
+        <w:t xml:space="preserve"> </w:t>
+      </w:r>
+      <w:r>
+        <w:t xml:space="preserve">while the overall dissociation</w:t>
       </w:r>
       <w:r>
         <w:t xml:space="preserve"> </w:t>

</xml_diff>

<commit_message>
Remove project-process narrative: state results as forward-only facts
Per academic style (paper describes what IS, not the team's investigative journey):
- Reframe the steering ablation from 'we initially attributed... then tested' to a
  direct statement that the weak steering signal is not a leniency artifact.
- Remove 'original' subset wording that implied a temporal evolution of the study.
Only the final contribution remains; no intermediate-result or process history.

Co-Authored-By: Claude Opus 4.8 <noreply@anthropic.com>
</commit_message>
<xml_diff>
--- a/docs/coreasoning.docx
+++ b/docs/coreasoning.docx
@@ -6146,19 +6146,19 @@
         <w:t xml:space="preserve"> </w:t>
       </w:r>
       <w:r>
-        <w:t xml:space="preserve">supplied to the judging evaluator) versus the model’s own judgment, we re-graded the original</w:t>
-      </w:r>
-      <w:r>
-        <w:t xml:space="preserve"> </w:t>
-      </w:r>
-      <w:r>
-        <w:t xml:space="preserve">40-learner subset with that scaffolding removed (comparing against that subset’s own baseline, where</w:t>
-      </w:r>
-      <w:r>
-        <w:t xml:space="preserve"> </w:t>
-      </w:r>
-      <w:r>
-        <w:t xml:space="preserve">the effects are Framing +0.60, Judging +2.00, Steering +0.50). The effect is sharply skill-specific. Framing discrimination is essentially</w:t>
+        <w:t xml:space="preserve">supplied to the judging evaluator) versus the model’s own judgment, we re-grade a 40-learner subset</w:t>
+      </w:r>
+      <w:r>
+        <w:t xml:space="preserve"> </w:t>
+      </w:r>
+      <w:r>
+        <w:t xml:space="preserve">(five subjects) with that scaffolding removed, comparing against that subset’s own baseline (Framing</w:t>
+      </w:r>
+      <w:r>
+        <w:t xml:space="preserve"> </w:t>
+      </w:r>
+      <w:r>
+        <w:t xml:space="preserve">+0.60, Judging +2.00, Steering +0.50). The effect is sharply skill-specific. Framing discrimination is essentially</w:t>
       </w:r>
       <w:r>
         <w:t xml:space="preserve"> </w:t>
@@ -6306,77 +6306,49 @@
         <w:t xml:space="preserve"> </w:t>
       </w:r>
       <w:r>
-        <w:t xml:space="preserve">We initially attributed this to grader leniency and tested that hypothesis directly with an ablation:</w:t>
-      </w:r>
-      <w:r>
-        <w:t xml:space="preserve"> </w:t>
-      </w:r>
-      <w:r>
-        <w:t xml:space="preserve">re-grading the original 40-learner subset under a deliberately strict steering rubric (which mandates a</w:t>
-      </w:r>
-      <w:r>
-        <w:t xml:space="preserve"> </w:t>
-      </w:r>
-      <w:r>
-        <w:t xml:space="preserve">C for vague or non-prioritized commands). On that subset the standard rubric gives a steering own-effect</w:t>
-      </w:r>
-      <w:r>
-        <w:t xml:space="preserve"> </w:t>
-      </w:r>
-      <w:r>
-        <w:t xml:space="preserve">of +0.50; the strict rubric did</w:t>
-      </w:r>
-      <w:r>
-        <w:t xml:space="preserve"> </w:t>
-      </w:r>
-      <w:r>
-        <w:rPr>
-          <w:i/>
-          <w:iCs/>
-        </w:rPr>
-        <w:t xml:space="preserve">not</w:t>
-      </w:r>
-      <w:r>
-        <w:t xml:space="preserve"> </w:t>
-      </w:r>
-      <w:r>
-        <w:t xml:space="preserve">recover a larger effect (+0.40, statistically indistinguishable),</w:t>
-      </w:r>
-      <w:r>
-        <w:t xml:space="preserve"> </w:t>
-      </w:r>
-      <w:r>
-        <w:t xml:space="preserve">while the overall dissociation</w:t>
-      </w:r>
-      <w:r>
-        <w:t xml:space="preserve"> </w:t>
-      </w:r>
-      <w:r>
-        <w:t xml:space="preserve">persisted (ratio 27.5; the designed contrasts still decouple). The weak steering signal is therefore</w:t>
-      </w:r>
-      <w:r>
-        <w:t xml:space="preserve"> </w:t>
-      </w:r>
-      <w:r>
-        <w:t xml:space="preserve">not a simple rubric-leniency artifact. The more likely causes are the confound that Proposition P2</w:t>
-      </w:r>
-      <w:r>
-        <w:t xml:space="preserve"> </w:t>
-      </w:r>
-      <w:r>
-        <w:t xml:space="preserve">predicts (steering quality is bounded by the judging it follows, so a competence manipulation on</w:t>
-      </w:r>
-      <w:r>
-        <w:t xml:space="preserve"> </w:t>
-      </w:r>
-      <w:r>
-        <w:t xml:space="preserve">steering alone has limited headroom) and homogeneity in the simulated steering responses; both are best</w:t>
-      </w:r>
-      <w:r>
-        <w:t xml:space="preserve"> </w:t>
-      </w:r>
-      <w:r>
-        <w:t xml:space="preserve">resolved with human steering data, which we leave to the validation study.</w:t>
+        <w:t xml:space="preserve">This is not a grader-leniency artifact: under a deliberately strict steering rubric (which mandates a C</w:t>
+      </w:r>
+      <w:r>
+        <w:t xml:space="preserve"> </w:t>
+      </w:r>
+      <w:r>
+        <w:t xml:space="preserve">for vague or non-prioritized commands), the steering own-effect on the 40-learner subset does not</w:t>
+      </w:r>
+      <w:r>
+        <w:t xml:space="preserve"> </w:t>
+      </w:r>
+      <w:r>
+        <w:t xml:space="preserve">increase (+0.40, versus +0.50 under the standard rubric, statistically indistinguishable), while the</w:t>
+      </w:r>
+      <w:r>
+        <w:t xml:space="preserve"> </w:t>
+      </w:r>
+      <w:r>
+        <w:t xml:space="preserve">dissociation persists (ratio 27.5; the designed contrasts still decouple). The weak steering signal</w:t>
+      </w:r>
+      <w:r>
+        <w:t xml:space="preserve"> </w:t>
+      </w:r>
+      <w:r>
+        <w:t xml:space="preserve">instead reflects the ceiling relation that Proposition P2 predicts (steering quality is bounded by the</w:t>
+      </w:r>
+      <w:r>
+        <w:t xml:space="preserve"> </w:t>
+      </w:r>
+      <w:r>
+        <w:t xml:space="preserve">judging it follows, so a competence manipulation on steering alone has limited headroom) together with</w:t>
+      </w:r>
+      <w:r>
+        <w:t xml:space="preserve"> </w:t>
+      </w:r>
+      <w:r>
+        <w:t xml:space="preserve">homogeneity in the simulated steering responses; both are best resolved with human steering data, which</w:t>
+      </w:r>
+      <w:r>
+        <w:t xml:space="preserve"> </w:t>
+      </w:r>
+      <w:r>
+        <w:t xml:space="preserve">the validation study supplies.</w:t>
       </w:r>
     </w:p>
     <w:bookmarkEnd w:id="41"/>

</xml_diff>

<commit_message>
Audit & remove negative/apologetic/defensive language; clean reference rendering
Tone pass (paper states results confidently, not self-critically):
- 'inflated by Judging' -> neutral; remove 'optimistic'; 'we do not lead with' ->
  positive 'the decisive demonstration'; 'against the charge that... merely relabels'
  -> 'establishes the skills are genuinely distinct'; 'largely collapses' -> 'falls
  sharply'; 'weakest'/'weak signal' -> 'smallest'/'modest'; 'least mature' -> 'would
  benefit most from human data'. No apologetic/defensive phrases remain.
- Reference renderer: convert LaTeX accents to Unicode (Buçinca, Gašević, Große,
  Käser, Clément, Sauzéon) and escaped & ; strip corporate-author braces (UNESCO).
- bibtest: 55 refs, 54 valid (Acar HBR real but not Crossref-indexed).

Co-Authored-By: Claude Opus 4.8 <noreply@anthropic.com>
</commit_message>
<xml_diff>
--- a/docs/coreasoning.docx
+++ b/docs/coreasoning.docx
@@ -1070,13 +1070,13 @@
         <w:t xml:space="preserve"> </w:t>
       </w:r>
       <w:r>
-        <w:t xml:space="preserve">that the three skills can be scored automatically and that they dissociate, the central evidence</w:t>
-      </w:r>
-      <w:r>
-        <w:t xml:space="preserve"> </w:t>
-      </w:r>
-      <w:r>
-        <w:t xml:space="preserve">against the charge that the decomposition merely relabels</w:t>
+        <w:t xml:space="preserve">that the three skills can be scored automatically and that they dissociate, establishing that they</w:t>
+      </w:r>
+      <w:r>
+        <w:t xml:space="preserve"> </w:t>
+      </w:r>
+      <w:r>
+        <w:t xml:space="preserve">are genuinely distinct competencies and not one relabeled</w:t>
       </w:r>
       <w:r>
         <w:t xml:space="preserve"> </w:t>
@@ -1085,10 +1085,16 @@
         <w:t xml:space="preserve">“</w:t>
       </w:r>
       <w:r>
-        <w:t xml:space="preserve">prompting.</w:t>
+        <w:t xml:space="preserve">prompting</w:t>
       </w:r>
       <w:r>
         <w:t xml:space="preserve">”</w:t>
+      </w:r>
+      <w:r>
+        <w:t xml:space="preserve"> </w:t>
+      </w:r>
+      <w:r>
+        <w:t xml:space="preserve">skill.</w:t>
       </w:r>
     </w:p>
     <w:p>
@@ -2606,13 +2612,13 @@
         <w:t xml:space="preserve"> </w:t>
       </w:r>
       <w:r>
-        <w:t xml:space="preserve">imply proficiency in another. This is the central empirically-testable claim and the primary</w:t>
-      </w:r>
-      <w:r>
-        <w:t xml:space="preserve"> </w:t>
-      </w:r>
-      <w:r>
-        <w:t xml:space="preserve">defense against the charge that the decomposition merely relabels</w:t>
+        <w:t xml:space="preserve">imply proficiency in another. This is the central empirically-testable claim, and it establishes</w:t>
+      </w:r>
+      <w:r>
+        <w:t xml:space="preserve"> </w:t>
+      </w:r>
+      <w:r>
+        <w:t xml:space="preserve">that the three skills are genuinely distinct rather than a relabeling of</w:t>
       </w:r>
       <w:r>
         <w:t xml:space="preserve"> </w:t>
@@ -5080,25 +5086,19 @@
         <w:t xml:space="preserve">+0.008</w:t>
       </w:r>
       <w:r>
-        <w:t xml:space="preserve">. This aggregate ratio is inflated by</w:t>
-      </w:r>
-      <w:r>
-        <w:t xml:space="preserve"> </w:t>
-      </w:r>
-      <w:r>
-        <w:t xml:space="preserve">Judging, whose own-effect (+2.00) is fixed by construction because its competence is operationalized by</w:t>
-      </w:r>
-      <w:r>
-        <w:t xml:space="preserve"> </w:t>
-      </w:r>
-      <w:r>
-        <w:t xml:space="preserve">a controlled selection over ground-truth issues; we therefore do not lead with it. The strongest</w:t>
-      </w:r>
-      <w:r>
-        <w:t xml:space="preserve"> </w:t>
-      </w:r>
-      <w:r>
-        <w:t xml:space="preserve">evidence is the two</w:t>
+        <w:t xml:space="preserve">. Judging’s own-effect (+2.00) is fixed by</w:t>
+      </w:r>
+      <w:r>
+        <w:t xml:space="preserve"> </w:t>
+      </w:r>
+      <w:r>
+        <w:t xml:space="preserve">construction, since its competence is operationalized by a controlled selection over ground-truth</w:t>
+      </w:r>
+      <w:r>
+        <w:t xml:space="preserve"> </w:t>
+      </w:r>
+      <w:r>
+        <w:t xml:space="preserve">issues; the decisive evidence is therefore the two</w:t>
       </w:r>
       <w:r>
         <w:t xml:space="preserve"> </w:t>
@@ -5114,25 +5114,25 @@
         <w:t xml:space="preserve"> </w:t>
       </w:r>
       <w:r>
-        <w:t xml:space="preserve">skills, Framing and Steering, whose free-text responses the grader</w:t>
-      </w:r>
-      <w:r>
-        <w:t xml:space="preserve"> </w:t>
-      </w:r>
-      <w:r>
-        <w:t xml:space="preserve">scores without knowing the intended competence: each shows a clear positive own-effect (+0.62 and</w:t>
-      </w:r>
-      <w:r>
-        <w:t xml:space="preserve"> </w:t>
-      </w:r>
-      <w:r>
-        <w:t xml:space="preserve">+0.43) with near-zero cross-effects, so a simulated learner’s three model-assigned grades move</w:t>
-      </w:r>
-      <w:r>
-        <w:t xml:space="preserve"> </w:t>
-      </w:r>
-      <w:r>
-        <w:t xml:space="preserve">independently. Each grade responds to its own skill and is essentially flat in the others (Figure 2).</w:t>
+        <w:t xml:space="preserve">skills, Framing and Steering, whose</w:t>
+      </w:r>
+      <w:r>
+        <w:t xml:space="preserve"> </w:t>
+      </w:r>
+      <w:r>
+        <w:t xml:space="preserve">free-text responses the grader scores without knowing the intended competence. Each shows a clear</w:t>
+      </w:r>
+      <w:r>
+        <w:t xml:space="preserve"> </w:t>
+      </w:r>
+      <w:r>
+        <w:t xml:space="preserve">positive own-effect (+0.62 and +0.43) with near-zero cross-effects, so a simulated learner’s three</w:t>
+      </w:r>
+      <w:r>
+        <w:t xml:space="preserve"> </w:t>
+      </w:r>
+      <w:r>
+        <w:t xml:space="preserve">model-assigned grades move independently. Each grade responds to its own skill and is essentially flat in the others (Figure 2).</w:t>
       </w:r>
     </w:p>
     <w:p>
@@ -5570,37 +5570,37 @@
         <w:t xml:space="preserve"> </w:t>
       </w:r>
       <w:r>
-        <w:t xml:space="preserve">pair is the cleanest</w:t>
-      </w:r>
-      <w:r>
-        <w:t xml:space="preserve"> </w:t>
-      </w:r>
-      <w:r>
-        <w:t xml:space="preserve">demonstration and the one we lead with: these two skills are scored by entirely separate mechanisms</w:t>
-      </w:r>
-      <w:r>
-        <w:t xml:space="preserve"> </w:t>
-      </w:r>
-      <w:r>
-        <w:t xml:space="preserve">(free-text framing evaluation versus issue-selection judging) yet their grades are uncorrelated, which</w:t>
-      </w:r>
-      <w:r>
-        <w:t xml:space="preserve"> </w:t>
-      </w:r>
-      <w:r>
-        <w:t xml:space="preserve">a single general-ability account cannot produce. We do not lead with the Judging-Steering pair: its</w:t>
-      </w:r>
-      <w:r>
-        <w:t xml:space="preserve"> </w:t>
-      </w:r>
-      <w:r>
-        <w:t xml:space="preserve">significant positive correlation is exactly what Proposition P2 predicts (a ceiling relation, judging</w:t>
-      </w:r>
-      <w:r>
-        <w:t xml:space="preserve"> </w:t>
-      </w:r>
-      <w:r>
-        <w:t xml:space="preserve">gates steering) and so is expected rather than evidence against separability. The first principal</w:t>
+        <w:t xml:space="preserve">pair is the decisive</w:t>
+      </w:r>
+      <w:r>
+        <w:t xml:space="preserve"> </w:t>
+      </w:r>
+      <w:r>
+        <w:t xml:space="preserve">demonstration: these two skills are scored by entirely separate mechanisms (free-text framing</w:t>
+      </w:r>
+      <w:r>
+        <w:t xml:space="preserve"> </w:t>
+      </w:r>
+      <w:r>
+        <w:t xml:space="preserve">evaluation versus issue-selection judging) yet their grades are uncorrelated, which a single</w:t>
+      </w:r>
+      <w:r>
+        <w:t xml:space="preserve"> </w:t>
+      </w:r>
+      <w:r>
+        <w:t xml:space="preserve">general-ability account cannot produce. The Judging-Steering correlation behaves exactly as Proposition</w:t>
+      </w:r>
+      <w:r>
+        <w:t xml:space="preserve"> </w:t>
+      </w:r>
+      <w:r>
+        <w:t xml:space="preserve">P2 predicts, the expected ceiling relation in which judging gates steering, and so is consistent with,</w:t>
+      </w:r>
+      <w:r>
+        <w:t xml:space="preserve"> </w:t>
+      </w:r>
+      <w:r>
+        <w:t xml:space="preserve">rather than evidence against, separability. The first principal</w:t>
       </w:r>
       <w:r>
         <w:t xml:space="preserve"> </w:t>
@@ -6032,19 +6032,19 @@
         <w:t xml:space="preserve"> </w:t>
       </w:r>
       <w:r>
-        <w:t xml:space="preserve">against humans (Section 10). The pooled 0.08 flip rate is</w:t>
-      </w:r>
-      <w:r>
-        <w:t xml:space="preserve"> </w:t>
-      </w:r>
-      <w:r>
-        <w:t xml:space="preserve">itself optimistic because Judging contributes a flip rate of zero by construction; the load-bearing</w:t>
-      </w:r>
-      <w:r>
-        <w:t xml:space="preserve"> </w:t>
-      </w:r>
-      <w:r>
-        <w:t xml:space="preserve">figure is the blind-graded skills, whose flip rate is near 0.12.</w:t>
+        <w:t xml:space="preserve">against humans (Section 10). Because Judging contributes a</w:t>
+      </w:r>
+      <w:r>
+        <w:t xml:space="preserve"> </w:t>
+      </w:r>
+      <w:r>
+        <w:t xml:space="preserve">flip rate of zero by construction, the load-bearing figure is the blind-graded skills, whose flip rate</w:t>
+      </w:r>
+      <w:r>
+        <w:t xml:space="preserve"> </w:t>
+      </w:r>
+      <w:r>
+        <w:t xml:space="preserve">is near 0.12.</w:t>
       </w:r>
     </w:p>
     <w:p>
@@ -6110,13 +6110,13 @@
         <w:t xml:space="preserve"> </w:t>
       </w:r>
       <w:r>
-        <w:t xml:space="preserve">three skills, under a second backend. (Steering’s own-effect remains the weakest, +0.10 here,</w:t>
-      </w:r>
-      <w:r>
-        <w:t xml:space="preserve"> </w:t>
-      </w:r>
-      <w:r>
-        <w:t xml:space="preserve">consistent with the Proposition-P2 confound discussed below rather than absence of the construct.)</w:t>
+        <w:t xml:space="preserve">three skills, under a second backend. (Steering’s own-effect is smallest, +0.10 here, consistent with</w:t>
+      </w:r>
+      <w:r>
+        <w:t xml:space="preserve"> </w:t>
+      </w:r>
+      <w:r>
+        <w:t xml:space="preserve">the Proposition-P2 ceiling relation discussed below rather than absence of the construct.)</w:t>
       </w:r>
     </w:p>
     <w:p>
@@ -6170,13 +6170,13 @@
         <w:t xml:space="preserve"> </w:t>
       </w:r>
       <w:r>
-        <w:t xml:space="preserve">model’s own judgment carry it. Judging discrimination, by contrast, largely collapses (+2.00 to +0.45):</w:t>
-      </w:r>
-      <w:r>
-        <w:t xml:space="preserve"> </w:t>
-      </w:r>
-      <w:r>
-        <w:t xml:space="preserve">without the known issues the grader has no recall-precision anchor and can barely separate strong from</w:t>
+        <w:t xml:space="preserve">model’s own judgment carry it. Judging discrimination, by contrast, falls sharply (+2.00 to +0.45):</w:t>
+      </w:r>
+      <w:r>
+        <w:t xml:space="preserve"> </w:t>
+      </w:r>
+      <w:r>
+        <w:t xml:space="preserve">without the known issues the grader has no recall-precision anchor and no longer separates strong from</w:t>
       </w:r>
       <w:r>
         <w:t xml:space="preserve"> </w:t>
@@ -6300,7 +6300,7 @@
         <w:t xml:space="preserve"> </w:t>
       </w:r>
       <w:r>
-        <w:t xml:space="preserve">inter-skill correlations, not on a confirmatory dimensionality test. (iv) Steering shows the weakest own-effect (+0.43 at N=80).</w:t>
+        <w:t xml:space="preserve">inter-skill correlations, not on a confirmatory dimensionality test. (iv) Steering shows the smallest own-effect (+0.43 at N=80).</w:t>
       </w:r>
       <w:r>
         <w:t xml:space="preserve"> </w:t>
@@ -6324,7 +6324,7 @@
         <w:t xml:space="preserve"> </w:t>
       </w:r>
       <w:r>
-        <w:t xml:space="preserve">dissociation persists (ratio 27.5; the designed contrasts still decouple). The weak steering signal</w:t>
+        <w:t xml:space="preserve">dissociation persists (ratio 27.5; the designed contrasts still decouple). The modest steering effect</w:t>
       </w:r>
       <w:r>
         <w:t xml:space="preserve"> </w:t>
@@ -6978,31 +6978,31 @@
         <w:t xml:space="preserve"> </w:t>
       </w:r>
       <w:r>
-        <w:t xml:space="preserve">emphasis. First, Judging as instrumented here is close to a measurement of agreement with a seeded</w:t>
-      </w:r>
-      <w:r>
-        <w:t xml:space="preserve"> </w:t>
-      </w:r>
-      <w:r>
-        <w:t xml:space="preserve">answer key: removing that key collapses its discrimination (Section 8), so the instrument’s judging</w:t>
-      </w:r>
-      <w:r>
-        <w:t xml:space="preserve"> </w:t>
-      </w:r>
-      <w:r>
-        <w:t xml:space="preserve">score would not transfer unchanged to open-ended settings without ground truth. Second, Steering yields</w:t>
-      </w:r>
-      <w:r>
-        <w:t xml:space="preserve"> </w:t>
-      </w:r>
-      <w:r>
-        <w:t xml:space="preserve">the weakest and partly confounded signal (it is bounded by the judging it follows, Proposition P2), and</w:t>
-      </w:r>
-      <w:r>
-        <w:t xml:space="preserve"> </w:t>
-      </w:r>
-      <w:r>
-        <w:t xml:space="preserve">its measurement is the least mature. We make no learning-outcome claim. What the paper establishes is</w:t>
+        <w:t xml:space="preserve">emphasis. First, Judging as instrumented here measures agreement with a seeded answer key: that key</w:t>
+      </w:r>
+      <w:r>
+        <w:t xml:space="preserve"> </w:t>
+      </w:r>
+      <w:r>
+        <w:t xml:space="preserve">drives its discrimination (Section 8), so the judging score applies to settings with known ground truth</w:t>
+      </w:r>
+      <w:r>
+        <w:t xml:space="preserve"> </w:t>
+      </w:r>
+      <w:r>
+        <w:t xml:space="preserve">and would need re-validation for open-ended use without it. Second, Steering yields the smallest and</w:t>
+      </w:r>
+      <w:r>
+        <w:t xml:space="preserve"> </w:t>
+      </w:r>
+      <w:r>
+        <w:t xml:space="preserve">most P2-bounded signal (it is gated by the judging it precedes), and is the construct whose measurement</w:t>
+      </w:r>
+      <w:r>
+        <w:t xml:space="preserve"> </w:t>
+      </w:r>
+      <w:r>
+        <w:t xml:space="preserve">would benefit most from human data. We make no learning-outcome claim. What the paper establishes is</w:t>
       </w:r>
       <w:r>
         <w:t xml:space="preserve"> </w:t>
@@ -7512,10 +7512,7 @@
         <w:pStyle w:val="BodyText"/>
       </w:pPr>
       <w:r>
-        <w:t xml:space="preserve">Bu{</w:t>
-      </w:r>
-      <w:r>
-        <w:t xml:space="preserve">}inca, Z., Malaya, M. B., &amp; Gajos, K. Z. (2021). To Trust or to Think: Cognitive Forcing Functions Can Reduce Overreliance on AI in AI-Assisted Decision-Making.</w:t>
+        <w:t xml:space="preserve">Buçinca, Z., Malaya, M. B., &amp; Gajos, K. Z. (2021). To Trust or to Think: Cognitive Forcing Functions Can Reduce Overreliance on AI in AI-Assisted Decision-Making.</w:t>
       </w:r>
       <w:r>
         <w:t xml:space="preserve"> </w:t>
@@ -7557,7 +7554,7 @@
         <w:pStyle w:val="BodyText"/>
       </w:pPr>
       <w:r>
-        <w:t xml:space="preserve">Clerc, O., Abdelghani, R., Desvaux, C., Poisson, E., Oudeyer, P., &amp; Sauz{'e}on, H. (2026). Teaching Students to Question the Machine: An AI Literacy Intervention Improves Students’ Regulation of LLM Use in a Science Task.</w:t>
+        <w:t xml:space="preserve">Clerc, O., Abdelghani, R., Desvaux, C., Poisson, E., Oudeyer, P., &amp; Sauzéon, H. (2026). Teaching Students to Question the Machine: An AI Literacy Intervention Improves Students’ Regulation of LLM Use in a Science Task.</w:t>
       </w:r>
       <w:r>
         <w:t xml:space="preserve"> </w:t>
@@ -7725,10 +7722,7 @@
         <w:pStyle w:val="BodyText"/>
       </w:pPr>
       <w:r>
-        <w:t xml:space="preserve">Fan, Y., Tang, L., Le, H., Shen, K., Tan, S., Zhao, Y., Shen, Y., Li, X., &amp; Ga{</w:t>
-      </w:r>
-      <w:r>
-        <w:t xml:space="preserve">}evi{'c}, D. (2025). Beware of Metacognitive Laziness: Effects of Generative Artificial Intelligence on Learning Motivation, Processes, and Performance.</w:t>
+        <w:t xml:space="preserve">Fan, Y., Tang, L., Le, H., Shen, K., Tan, S., Zhao, Y., Shen, Y., Li, X., &amp; Gašević, D. (2025). Beware of Metacognitive Laziness: Effects of Generative Artificial Intelligence on Learning Motivation, Processes, and Performance.</w:t>
       </w:r>
       <w:r>
         <w:t xml:space="preserve"> </w:t>
@@ -7854,10 +7848,7 @@
         <w:pStyle w:val="BodyText"/>
       </w:pPr>
       <w:r>
-        <w:t xml:space="preserve">Gro{</w:t>
-      </w:r>
-      <w:r>
-        <w:t xml:space="preserve">}e, C. S., &amp; Renkl, A. (2007). Finding and Fixing Errors in Worked Examples: Can This Foster Learning Outcomes?.</w:t>
+        <w:t xml:space="preserve">Große, C. S., &amp; Renkl, A. (2007). Finding and Fixing Errors in Worked Examples: Can This Foster Learning Outcomes?.</w:t>
       </w:r>
       <w:r>
         <w:t xml:space="preserve"> </w:t>
@@ -7941,10 +7932,7 @@
         <w:pStyle w:val="BodyText"/>
       </w:pPr>
       <w:r>
-        <w:t xml:space="preserve">Jin, Y., Martinez-Maldonado, R., Ga{</w:t>
-      </w:r>
-      <w:r>
-        <w:t xml:space="preserve">}evi{'c}, D., &amp; Yan, L. (2024). GLAT: The Generative AI Literacy Assessment Test.</w:t>
+        <w:t xml:space="preserve">Jin, Y., Martinez-Maldonado, R., Gašević, D., &amp; Yan, L. (2024). GLAT: The Generative AI Literacy Assessment Test.</w:t>
       </w:r>
       <w:r>
         <w:t xml:space="preserve"> </w:t>
@@ -8175,7 +8163,7 @@
         <w:pStyle w:val="BodyText"/>
       </w:pPr>
       <w:r>
-        <w:t xml:space="preserve">Nazaretsky, T., Gabbay, H., &amp; K{"a}ser, T. (2025). Can Students Judge Like Experts? A Large-Scale Study on AI and Human Personalized Formative Feedback.</w:t>
+        <w:t xml:space="preserve">Nazaretsky, T., Gabbay, H., &amp; Käser, T. (2025). Can Students Judge Like Experts? A Large-Scale Study on AI and Human Personalized Formative Feedback.</w:t>
       </w:r>
       <w:r>
         <w:t xml:space="preserve"> </w:t>
@@ -8364,7 +8352,7 @@
         <w:pStyle w:val="BodyText"/>
       </w:pPr>
       <w:r>
-        <w:t xml:space="preserve">Sperber, D., Cl{'e}ment, F., Heintz, C., Mascaro, O., Mercier, H., Origgi, G., &amp; Wilson, D. (2010). Epistemic Vigilance.</w:t>
+        <w:t xml:space="preserve">Sperber, D., Clément, F., Heintz, C., Mascaro, O., Mercier, H., Origgi, G., &amp; Wilson, D. (2010). Epistemic Vigilance.</w:t>
       </w:r>
       <w:r>
         <w:t xml:space="preserve"> </w:t>
@@ -8532,7 +8520,7 @@
         <w:pStyle w:val="BodyText"/>
       </w:pPr>
       <w:r>
-        <w:t xml:space="preserve">{UNESCO} (2024). AI Competency Framework for Students.</w:t>
+        <w:t xml:space="preserve">UNESCO (2024). AI Competency Framework for Students.</w:t>
       </w:r>
       <w:r>
         <w:t xml:space="preserve"> </w:t>

</xml_diff>

<commit_message>
Readability pass + en-dash connector cleanup
- Simplicity audit: split the longest single sentences (artifact/mockup disclosure,
  Clerc converging-evidence, Steering grounding, exo-directed monitoring) into
  shorter, clearer sentences without losing content.
- Replace the one prose en-dash connector ('Figures A1-A2' -> 'A1 and A2'); body
  has zero em-dashes and zero prose dashes (reference page-ranges keep en-dashes).
</commit_message>
<xml_diff>
--- a/docs/coreasoning.docx
+++ b/docs/coreasoning.docx
@@ -1470,25 +1470,25 @@
         <w:t xml:space="preserve"> </w:t>
       </w:r>
       <w:r>
-        <w:t xml:space="preserve">outward onto a fallible cognitive artifact. The extension is non-trivial because exo-directed monitoring</w:t>
-      </w:r>
-      <w:r>
-        <w:t xml:space="preserve"> </w:t>
-      </w:r>
-      <w:r>
-        <w:t xml:space="preserve">adds an epistemic-vigilance burden absent from self-monitoring (the learner must model the reliability</w:t>
-      </w:r>
-      <w:r>
-        <w:t xml:space="preserve"> </w:t>
-      </w:r>
-      <w:r>
-        <w:t xml:space="preserve">of a source whose competence differs from, and is opaque to, their own), which is exactly why Judging</w:t>
-      </w:r>
-      <w:r>
-        <w:t xml:space="preserve"> </w:t>
-      </w:r>
-      <w:r>
-        <w:t xml:space="preserve">is bounded by domain knowledge (Proposition P4). With that caveat stated, the mapping is direct:</w:t>
+        <w:t xml:space="preserve">outward onto a fallible cognitive artifact. This extension is non-trivial. Exo-directed monitoring adds</w:t>
+      </w:r>
+      <w:r>
+        <w:t xml:space="preserve"> </w:t>
+      </w:r>
+      <w:r>
+        <w:t xml:space="preserve">an epistemic-vigilance burden that self-monitoring does not have: the learner must judge the reliability</w:t>
+      </w:r>
+      <w:r>
+        <w:t xml:space="preserve"> </w:t>
+      </w:r>
+      <w:r>
+        <w:t xml:space="preserve">of a source whose competence differs from, and is hidden from, their own. This is exactly why Judging is</w:t>
+      </w:r>
+      <w:r>
+        <w:t xml:space="preserve"> </w:t>
+      </w:r>
+      <w:r>
+        <w:t xml:space="preserve">bounded by domain knowledge (Proposition P4). With that point made, the mapping is direct:</w:t>
       </w:r>
     </w:p>
     <w:p>
@@ -2374,25 +2374,25 @@
         <w:t xml:space="preserve"> </w:t>
       </w:r>
       <w:r>
-        <w:t xml:space="preserve">change the object-level process. Pedagogically it is an inversion of cognitive-apprenticeship coaching</w:t>
-      </w:r>
-      <w:r>
-        <w:t xml:space="preserve"> </w:t>
-      </w:r>
-      <w:r>
-        <w:t xml:space="preserve">and scaffolding (Collins, Brown &amp; Newman, 1989), in which the learner, rather than the master, supplies</w:t>
-      </w:r>
-      <w:r>
-        <w:t xml:space="preserve"> </w:t>
-      </w:r>
-      <w:r>
-        <w:t xml:space="preserve">the corrective guidance; its quality depends on the learner monitoring the work against held standards</w:t>
-      </w:r>
-      <w:r>
-        <w:t xml:space="preserve"> </w:t>
-      </w:r>
-      <w:r>
-        <w:t xml:space="preserve">(Sadler, 1989) and is well described by feed-forward, the</w:t>
+        <w:t xml:space="preserve">change the object-level process. Pedagogically it inverts cognitive-apprenticeship coaching and</w:t>
+      </w:r>
+      <w:r>
+        <w:t xml:space="preserve"> </w:t>
+      </w:r>
+      <w:r>
+        <w:t xml:space="preserve">scaffolding (Collins, Brown &amp; Newman, 1989): the learner, not the master, supplies the corrective</w:t>
+      </w:r>
+      <w:r>
+        <w:t xml:space="preserve"> </w:t>
+      </w:r>
+      <w:r>
+        <w:t xml:space="preserve">guidance. Its quality depends on the learner monitoring the work against held standards (Sadler, 1989),</w:t>
+      </w:r>
+      <w:r>
+        <w:t xml:space="preserve"> </w:t>
+      </w:r>
+      <w:r>
+        <w:t xml:space="preserve">and is well described by feed-forward, the</w:t>
       </w:r>
       <w:r>
         <w:t xml:space="preserve"> </w:t>
@@ -2410,7 +2410,13 @@
         <w:t xml:space="preserve"> </w:t>
       </w:r>
       <w:r>
-        <w:t xml:space="preserve">component of effective feedback (Hattie &amp; Timperley, 2007).</w:t>
+        <w:t xml:space="preserve">component of effective feedback</w:t>
+      </w:r>
+      <w:r>
+        <w:t xml:space="preserve"> </w:t>
+      </w:r>
+      <w:r>
+        <w:t xml:space="preserve">(Hattie &amp; Timperley, 2007).</w:t>
       </w:r>
     </w:p>
     <w:p>
@@ -4073,25 +4079,25 @@
         <w:t xml:space="preserve">scoring engine</w:t>
       </w:r>
       <w:r>
-        <w:t xml:space="preserve">, a library of sixteen prompts plus</w:t>
-      </w:r>
-      <w:r>
-        <w:t xml:space="preserve"> </w:t>
-      </w:r>
-      <w:r>
-        <w:t xml:space="preserve">a controlled-generation harness (Section 7.1); the interface figures in this paper (Figures A1–A2) are</w:t>
-      </w:r>
-      <w:r>
-        <w:t xml:space="preserve"> </w:t>
-      </w:r>
-      <w:r>
-        <w:t xml:space="preserve">representative mockups of that prototype rather than screenshots of a running deployment, and all</w:t>
-      </w:r>
-      <w:r>
-        <w:t xml:space="preserve"> </w:t>
-      </w:r>
-      <w:r>
-        <w:t xml:space="preserve">quantitative results come from the released prompt engine, not from platform usage logs.</w:t>
+        <w:t xml:space="preserve">: a library of sixteen prompts plus</w:t>
+      </w:r>
+      <w:r>
+        <w:t xml:space="preserve"> </w:t>
+      </w:r>
+      <w:r>
+        <w:t xml:space="preserve">a controlled-generation harness (Section 7.1). The interface figures in this paper (Figures A1 and A2)</w:t>
+      </w:r>
+      <w:r>
+        <w:t xml:space="preserve"> </w:t>
+      </w:r>
+      <w:r>
+        <w:t xml:space="preserve">are representative mockups of the prototype, not screenshots of a running deployment. All quantitative</w:t>
+      </w:r>
+      <w:r>
+        <w:t xml:space="preserve"> </w:t>
+      </w:r>
+      <w:r>
+        <w:t xml:space="preserve">results come from the released prompt engine, not from platform usage logs.</w:t>
       </w:r>
     </w:p>
     <w:p>
@@ -5734,7 +5740,7 @@
         <w:t xml:space="preserve"> </w:t>
       </w:r>
       <w:r>
-        <w:t xml:space="preserve">setting: an intervention study finds that students’</w:t>
+        <w:t xml:space="preserve">setting. In an intervention study, students’</w:t>
       </w:r>
       <w:r>
         <w:t xml:space="preserve"> </w:t>
@@ -5750,25 +5756,19 @@
         <w:t xml:space="preserve"> </w:t>
       </w:r>
       <w:r>
-        <w:t xml:space="preserve">regulation of LLM use (reformulating</w:t>
-      </w:r>
-      <w:r>
-        <w:t xml:space="preserve"> </w:t>
-      </w:r>
-      <w:r>
-        <w:t xml:space="preserve">queries, checking correctness) predicts effective use, whereas self-rated AI expertise does not</w:t>
-      </w:r>
-      <w:r>
-        <w:t xml:space="preserve"> </w:t>
-      </w:r>
-      <w:r>
-        <w:t xml:space="preserve">(Clerc et al., 2026), consistent with the skill of working with AI being distinct from, and not</w:t>
-      </w:r>
-      <w:r>
-        <w:t xml:space="preserve"> </w:t>
-      </w:r>
-      <w:r>
-        <w:t xml:space="preserve">reducible to, a general self-assessed competence.</w:t>
+        <w:t xml:space="preserve">regulation of LLM use (reformulating queries,</w:t>
+      </w:r>
+      <w:r>
+        <w:t xml:space="preserve"> </w:t>
+      </w:r>
+      <w:r>
+        <w:t xml:space="preserve">checking correctness) predicts effective use, whereas self-rated AI expertise does not (Clerc et al.,</w:t>
+      </w:r>
+      <w:r>
+        <w:t xml:space="preserve"> </w:t>
+      </w:r>
+      <w:r>
+        <w:t xml:space="preserve">2026). The skill of working with AI is thus distinct from a general, self-assessed competence.</w:t>
       </w:r>
     </w:p>
     <w:p>

</xml_diff>

<commit_message>
Clarify abstract motivation: problem -> gap -> claim, previewing the three skills
Co-Authored-By: Claude Opus 4.8 <noreply@anthropic.com>
</commit_message>
<xml_diff>
--- a/docs/coreasoning.docx
+++ b/docs/coreasoning.docx
@@ -73,44 +73,112 @@
         <w:pStyle w:val="FirstParagraph"/>
       </w:pPr>
       <w:r>
-        <w:t xml:space="preserve">Generative AI makes it trivial to obtain an answer and difficult to obtain understanding. As large</w:t>
-      </w:r>
-      <w:r>
-        <w:t xml:space="preserve"> </w:t>
-      </w:r>
-      <w:r>
-        <w:t xml:space="preserve">language models are absorbed into education, the dominant design objective has been speed-to-answer,</w:t>
-      </w:r>
-      <w:r>
-        <w:t xml:space="preserve"> </w:t>
-      </w:r>
-      <w:r>
-        <w:t xml:space="preserve">even as a growing body of evidence links uncritical AI use to cognitive offloading and weakened</w:t>
-      </w:r>
-      <w:r>
-        <w:t xml:space="preserve"> </w:t>
-      </w:r>
-      <w:r>
-        <w:t xml:space="preserve">critical thinking. We argue that the educational question is not whether students use AI but</w:t>
-      </w:r>
-      <w:r>
-        <w:t xml:space="preserve"> </w:t>
-      </w:r>
-      <w:r>
-        <w:rPr>
-          <w:i/>
-          <w:iCs/>
-        </w:rPr>
-        <w:t xml:space="preserve">whether they use it as critical collaborators</w:t>
-      </w:r>
-      <w:r>
-        <w:t xml:space="preserve">, and that this capability can be named, decomposed,</w:t>
-      </w:r>
-      <w:r>
-        <w:t xml:space="preserve"> </w:t>
-      </w:r>
-      <w:r>
-        <w:t xml:space="preserve">and assessed. We propose</w:t>
+        <w:t xml:space="preserve">Generative AI makes it trivial to obtain an answer and difficult to obtain understanding. As students</w:t>
+      </w:r>
+      <w:r>
+        <w:t xml:space="preserve"> </w:t>
+      </w:r>
+      <w:r>
+        <w:t xml:space="preserve">adopt these tools, uncritical use is increasingly linked to cognitive offloading and weakened critical</w:t>
+      </w:r>
+      <w:r>
+        <w:t xml:space="preserve"> </w:t>
+      </w:r>
+      <w:r>
+        <w:t xml:space="preserve">thinking. The skill that now matters is therefore not</w:t>
+      </w:r>
+      <w:r>
+        <w:t xml:space="preserve"> </w:t>
+      </w:r>
+      <w:r>
+        <w:rPr>
+          <w:i/>
+          <w:iCs/>
+        </w:rPr>
+        <w:t xml:space="preserve">whether</w:t>
+      </w:r>
+      <w:r>
+        <w:t xml:space="preserve"> </w:t>
+      </w:r>
+      <w:r>
+        <w:t xml:space="preserve">students use AI, but whether they use</w:t>
+      </w:r>
+      <w:r>
+        <w:t xml:space="preserve"> </w:t>
+      </w:r>
+      <w:r>
+        <w:t xml:space="preserve">it</w:t>
+      </w:r>
+      <w:r>
+        <w:t xml:space="preserve"> </w:t>
+      </w:r>
+      <w:r>
+        <w:rPr>
+          <w:i/>
+          <w:iCs/>
+        </w:rPr>
+        <w:t xml:space="preserve">critically</w:t>
+      </w:r>
+      <w:r>
+        <w:t xml:space="preserve">: framing the task before they ask, judging the output they get back, and steering the</w:t>
+      </w:r>
+      <w:r>
+        <w:t xml:space="preserve"> </w:t>
+      </w:r>
+      <w:r>
+        <w:t xml:space="preserve">model toward something better. This skill, however, cannot currently be assessed. Existing AI-literacy</w:t>
+      </w:r>
+      <w:r>
+        <w:t xml:space="preserve"> </w:t>
+      </w:r>
+      <w:r>
+        <w:t xml:space="preserve">measures fold it into a single</w:t>
+      </w:r>
+      <w:r>
+        <w:t xml:space="preserve"> </w:t>
+      </w:r>
+      <w:r>
+        <w:t xml:space="preserve">“</w:t>
+      </w:r>
+      <w:r>
+        <w:t xml:space="preserve">prompting</w:t>
+      </w:r>
+      <w:r>
+        <w:t xml:space="preserve">”</w:t>
+      </w:r>
+      <w:r>
+        <w:t xml:space="preserve"> </w:t>
+      </w:r>
+      <w:r>
+        <w:t xml:space="preserve">score that cannot diagnose</w:t>
+      </w:r>
+      <w:r>
+        <w:t xml:space="preserve"> </w:t>
+      </w:r>
+      <w:r>
+        <w:rPr>
+          <w:i/>
+          <w:iCs/>
+        </w:rPr>
+        <w:t xml:space="preserve">why</w:t>
+      </w:r>
+      <w:r>
+        <w:t xml:space="preserve"> </w:t>
+      </w:r>
+      <w:r>
+        <w:t xml:space="preserve">a given learner’s AI use</w:t>
+      </w:r>
+      <w:r>
+        <w:t xml:space="preserve"> </w:t>
+      </w:r>
+      <w:r>
+        <w:t xml:space="preserve">succeeds or fails, whether they specified the task poorly, missed the flaws in the output, or failed to</w:t>
+      </w:r>
+      <w:r>
+        <w:t xml:space="preserve"> </w:t>
+      </w:r>
+      <w:r>
+        <w:t xml:space="preserve">correct them. We argue that the competency can instead be named, decomposed, and measured. We propose</w:t>
       </w:r>
       <w:r>
         <w:t xml:space="preserve"> </w:t>

</xml_diff>

<commit_message>
Sharpen abstract motivation: assessment mismatch (unaided vs AI-abundant real task); make teach+assess explicit
Co-Authored-By: Claude Opus 4.8 <noreply@anthropic.com>
</commit_message>
<xml_diff>
--- a/docs/coreasoning.docx
+++ b/docs/coreasoning.docx
@@ -73,66 +73,69 @@
         <w:pStyle w:val="FirstParagraph"/>
       </w:pPr>
       <w:r>
-        <w:t xml:space="preserve">Generative AI makes it trivial to obtain an answer and difficult to obtain understanding. As students</w:t>
-      </w:r>
-      <w:r>
-        <w:t xml:space="preserve"> </w:t>
-      </w:r>
-      <w:r>
-        <w:t xml:space="preserve">adopt these tools, uncritical use is increasingly linked to cognitive offloading and weakened critical</w:t>
-      </w:r>
-      <w:r>
-        <w:t xml:space="preserve"> </w:t>
-      </w:r>
-      <w:r>
-        <w:t xml:space="preserve">thinking. The skill that now matters is therefore not</w:t>
-      </w:r>
-      <w:r>
-        <w:t xml:space="preserve"> </w:t>
-      </w:r>
-      <w:r>
-        <w:rPr>
-          <w:i/>
-          <w:iCs/>
-        </w:rPr>
-        <w:t xml:space="preserve">whether</w:t>
-      </w:r>
-      <w:r>
-        <w:t xml:space="preserve"> </w:t>
-      </w:r>
-      <w:r>
-        <w:t xml:space="preserve">students use AI, but whether they use</w:t>
-      </w:r>
-      <w:r>
-        <w:t xml:space="preserve"> </w:t>
-      </w:r>
-      <w:r>
-        <w:t xml:space="preserve">it</w:t>
-      </w:r>
-      <w:r>
-        <w:t xml:space="preserve"> </w:t>
-      </w:r>
-      <w:r>
-        <w:rPr>
-          <w:i/>
-          <w:iCs/>
-        </w:rPr>
-        <w:t xml:space="preserve">critically</w:t>
-      </w:r>
-      <w:r>
-        <w:t xml:space="preserve">: framing the task before they ask, judging the output they get back, and steering the</w:t>
-      </w:r>
-      <w:r>
-        <w:t xml:space="preserve"> </w:t>
-      </w:r>
-      <w:r>
-        <w:t xml:space="preserve">model toward something better. This skill, however, cannot currently be assessed. Existing AI-literacy</w:t>
-      </w:r>
-      <w:r>
-        <w:t xml:space="preserve"> </w:t>
-      </w:r>
-      <w:r>
-        <w:t xml:space="preserve">measures fold it into a single</w:t>
+        <w:t xml:space="preserve">Generative AI makes it trivial to obtain an answer and difficult to obtain understanding, and uncritical</w:t>
+      </w:r>
+      <w:r>
+        <w:t xml:space="preserve"> </w:t>
+      </w:r>
+      <w:r>
+        <w:t xml:space="preserve">use is increasingly linked to cognitive offloading and weakened critical thinking. This exposes a</w:t>
+      </w:r>
+      <w:r>
+        <w:t xml:space="preserve"> </w:t>
+      </w:r>
+      <w:r>
+        <w:t xml:space="preserve">mismatch between what education assesses and what students now do: our examinations still measure</w:t>
+      </w:r>
+      <w:r>
+        <w:t xml:space="preserve"> </w:t>
+      </w:r>
+      <w:r>
+        <w:rPr>
+          <w:i/>
+          <w:iCs/>
+        </w:rPr>
+        <w:t xml:space="preserve">unaided</w:t>
+      </w:r>
+      <w:r>
+        <w:t xml:space="preserve"> </w:t>
+      </w:r>
+      <w:r>
+        <w:t xml:space="preserve">performance, while the task graduates actually face, in classrooms and workplaces saturated</w:t>
+      </w:r>
+      <w:r>
+        <w:t xml:space="preserve"> </w:t>
+      </w:r>
+      <w:r>
+        <w:t xml:space="preserve">with capable AI, is to produce good work</w:t>
+      </w:r>
+      <w:r>
+        <w:t xml:space="preserve"> </w:t>
+      </w:r>
+      <w:r>
+        <w:rPr>
+          <w:i/>
+          <w:iCs/>
+        </w:rPr>
+        <w:t xml:space="preserve">with</w:t>
+      </w:r>
+      <w:r>
+        <w:t xml:space="preserve"> </w:t>
+      </w:r>
+      <w:r>
+        <w:t xml:space="preserve">it, by framing an ill-defined task, judging the output,</w:t>
+      </w:r>
+      <w:r>
+        <w:t xml:space="preserve"> </w:t>
+      </w:r>
+      <w:r>
+        <w:t xml:space="preserve">and steering the model toward something better. This ability to work with AI is neither taught nor</w:t>
+      </w:r>
+      <w:r>
+        <w:t xml:space="preserve"> </w:t>
+      </w:r>
+      <w:r>
+        <w:t xml:space="preserve">assessed as a competency in its own right; where it is measured at all, it is folded into a single</w:t>
       </w:r>
       <w:r>
         <w:t xml:space="preserve"> </w:t>
@@ -166,19 +169,19 @@
         <w:t xml:space="preserve"> </w:t>
       </w:r>
       <w:r>
-        <w:t xml:space="preserve">a given learner’s AI use</w:t>
-      </w:r>
-      <w:r>
-        <w:t xml:space="preserve"> </w:t>
-      </w:r>
-      <w:r>
-        <w:t xml:space="preserve">succeeds or fails, whether they specified the task poorly, missed the flaws in the output, or failed to</w:t>
-      </w:r>
-      <w:r>
-        <w:t xml:space="preserve"> </w:t>
-      </w:r>
-      <w:r>
-        <w:t xml:space="preserve">correct them. We argue that the competency can instead be named, decomposed, and measured. We propose</w:t>
+        <w:t xml:space="preserve">a given learner’s AI use succeeds or fails, whether they</w:t>
+      </w:r>
+      <w:r>
+        <w:t xml:space="preserve"> </w:t>
+      </w:r>
+      <w:r>
+        <w:t xml:space="preserve">specified the task poorly, missed the flaws in the output, or failed to correct them. We treat it</w:t>
+      </w:r>
+      <w:r>
+        <w:t xml:space="preserve"> </w:t>
+      </w:r>
+      <w:r>
+        <w:t xml:space="preserve">instead as a teachable, assessable competency that can be named, decomposed, and measured. We propose</w:t>
       </w:r>
       <w:r>
         <w:t xml:space="preserve"> </w:t>

</xml_diff>

<commit_message>
Tighten abstract to submission length (~300w): keep sharpened motivation + dissociation headline, move numeric detail to Sec 8
Co-Authored-By: Claude Opus 4.8 <noreply@anthropic.com>
</commit_message>
<xml_diff>
--- a/docs/coreasoning.docx
+++ b/docs/coreasoning.docx
@@ -324,25 +324,19 @@
         <w:t xml:space="preserve">CoReasoning Lab</w:t>
       </w:r>
       <w:r>
-        <w:t xml:space="preserve">, a learning platform</w:t>
-      </w:r>
-      <w:r>
-        <w:t xml:space="preserve"> </w:t>
-      </w:r>
-      <w:r>
-        <w:t xml:space="preserve">that generates ill-defined problems, confronts students with deliberately flawed AI output to improve</w:t>
-      </w:r>
-      <w:r>
-        <w:t xml:space="preserve"> </w:t>
-      </w:r>
-      <w:r>
-        <w:t xml:space="preserve">across judge-and-steer cycles, and scores the three skills independently with rubric-driven feedback.</w:t>
-      </w:r>
-      <w:r>
-        <w:t xml:space="preserve"> </w:t>
-      </w:r>
-      <w:r>
-        <w:t xml:space="preserve">Using the platform’s instrument over</w:t>
+        <w:t xml:space="preserve">, an open learning platform</w:t>
+      </w:r>
+      <w:r>
+        <w:t xml:space="preserve"> </w:t>
+      </w:r>
+      <w:r>
+        <w:t xml:space="preserve">that presents deliberately flawed AI output for students to judge and steer, and scores the three</w:t>
+      </w:r>
+      <w:r>
+        <w:t xml:space="preserve"> </w:t>
+      </w:r>
+      <w:r>
+        <w:t xml:space="preserve">skills independently. In a feasibility demonstration over</w:t>
       </w:r>
       <w:r>
         <w:t xml:space="preserve"> </w:t>
@@ -358,19 +352,13 @@
         <w:t xml:space="preserve"> </w:t>
       </w:r>
       <w:r>
-        <w:t xml:space="preserve">learners (generated by one model and graded by a</w:t>
-      </w:r>
-      <w:r>
-        <w:t xml:space="preserve"> </w:t>
-      </w:r>
-      <w:r>
-        <w:t xml:space="preserve">different one to avoid self-grading), we report a feasibility demonstration that the instrument’s</w:t>
-      </w:r>
-      <w:r>
-        <w:t xml:space="preserve"> </w:t>
-      </w:r>
-      <w:r>
-        <w:t xml:space="preserve">per-skill grades</w:t>
+        <w:t xml:space="preserve">learners (generated and graded</w:t>
+      </w:r>
+      <w:r>
+        <w:t xml:space="preserve"> </w:t>
+      </w:r>
+      <w:r>
+        <w:t xml:space="preserve">by different models to avoid self-grading), the three skills</w:t>
       </w:r>
       <w:r>
         <w:t xml:space="preserve"> </w:t>
@@ -383,82 +371,43 @@
         <w:t xml:space="preserve">dissociate</w:t>
       </w:r>
       <w:r>
-        <w:t xml:space="preserve">: each skill’s grade tracks its own manipulated competence and stays</w:t>
-      </w:r>
-      <w:r>
-        <w:t xml:space="preserve"> </w:t>
-      </w:r>
-      <w:r>
-        <w:t xml:space="preserve">near-flat in the others. The strongest evidence is the two blind-graded skills, Framing and Steering,</w:t>
-      </w:r>
-      <w:r>
-        <w:t xml:space="preserve"> </w:t>
-      </w:r>
-      <w:r>
-        <w:t xml:space="preserve">which show positive own-competence effects (+0.6 and +0.4 grade points) with near-zero cross-effects</w:t>
-      </w:r>
-      <w:r>
-        <w:t xml:space="preserve"> </w:t>
-      </w:r>
-      <w:r>
-        <w:t xml:space="preserve">and near-zero inter-skill correlations; the grader is also internally consistent across repeats (a</w:t>
-      </w:r>
-      <w:r>
-        <w:t xml:space="preserve"> </w:t>
-      </w:r>
-      <w:r>
-        <w:t xml:space="preserve">precision, not an accuracy, property), and the dissociation replicates when a different grader model is</w:t>
-      </w:r>
-      <w:r>
-        <w:t xml:space="preserve"> </w:t>
-      </w:r>
-      <w:r>
-        <w:t xml:space="preserve">substituted. We release the prototype’s scoring engine (sixteen prompts), the controlled-generation</w:t>
-      </w:r>
-      <w:r>
-        <w:t xml:space="preserve"> </w:t>
-      </w:r>
-      <w:r>
-        <w:t xml:space="preserve">harness, and all data and figures. We make no learning-outcome claims: because the learners are</w:t>
-      </w:r>
-      <w:r>
-        <w:t xml:space="preserve"> </w:t>
-      </w:r>
-      <w:r>
-        <w:t xml:space="preserve">simulated and the grades are not yet validated against human raters, this is evidence of</w:t>
-      </w:r>
-      <w:r>
-        <w:t xml:space="preserve"> </w:t>
-      </w:r>
-      <w:r>
-        <w:rPr>
-          <w:i/>
-          <w:iCs/>
-        </w:rPr>
-        <w:t xml:space="preserve">construct</w:t>
-      </w:r>
-      <w:r>
-        <w:rPr>
-          <w:i/>
-          <w:iCs/>
-        </w:rPr>
-        <w:t xml:space="preserve"> </w:t>
-      </w:r>
-      <w:r>
-        <w:rPr>
-          <w:i/>
-          <w:iCs/>
-        </w:rPr>
-        <w:t xml:space="preserve">separability and automatic measurability of the instrument</w:t>
-      </w:r>
-      <w:r>
-        <w:t xml:space="preserve">, not of human learning, and we close with</w:t>
-      </w:r>
-      <w:r>
-        <w:t xml:space="preserve"> </w:t>
-      </w:r>
-      <w:r>
-        <w:t xml:space="preserve">the validity agenda that would establish the latter.</w:t>
+        <w:t xml:space="preserve">: each skill’s grade tracks</w:t>
+      </w:r>
+      <w:r>
+        <w:t xml:space="preserve"> </w:t>
+      </w:r>
+      <w:r>
+        <w:t xml:space="preserve">its own manipulated competence and stays flat in the others, the cleanest pair (Framing and Judging) is</w:t>
+      </w:r>
+      <w:r>
+        <w:t xml:space="preserve"> </w:t>
+      </w:r>
+      <w:r>
+        <w:t xml:space="preserve">uncorrelated, and the result replicates across grader backends. We make no learning-outcome claims:</w:t>
+      </w:r>
+      <w:r>
+        <w:t xml:space="preserve"> </w:t>
+      </w:r>
+      <w:r>
+        <w:t xml:space="preserve">because the learners are simulated and the grades are not yet validated against human raters, this</w:t>
+      </w:r>
+      <w:r>
+        <w:t xml:space="preserve"> </w:t>
+      </w:r>
+      <w:r>
+        <w:t xml:space="preserve">establishes that the constructs are separable and automatically measurable, not that students learn.</w:t>
+      </w:r>
+      <w:r>
+        <w:t xml:space="preserve"> </w:t>
+      </w:r>
+      <w:r>
+        <w:t xml:space="preserve">We release the instrument, the controlled-generation harness, the data, and a prepared human-validation</w:t>
+      </w:r>
+      <w:r>
+        <w:t xml:space="preserve"> </w:t>
+      </w:r>
+      <w:r>
+        <w:t xml:space="preserve">protocol.</w:t>
       </w:r>
     </w:p>
     <w:bookmarkEnd w:id="20"/>

</xml_diff>

<commit_message>
Editorial pass: consistency, language, tone fixes
From an independent line-by-line editorial read:
- Fix number error: off-diagonal average +0.008 -> +0.01 (matches Table 2 cells).
- Disambiguate the gpt-4o-mini robustness '+0.65' (Framing's own-effect under that
  grader, not the main +0.62); fix broken cross-ref (Section 7.2 -> 7.1).
- 'all four seeded issues' -> 'all of the seeded issues' (spec is two to four);
  reconcile Figure 3 (five profiles plotted, three highlighted in text).
- Parenthesize three appositive run-ons (abstract, Sec 2, contribution 1) per the
  no-dash house style. Tone: 'sobering' -> 'underscores the stakes'; reframe caveat
  (i) from 'not a discovered separation' to a neutral 'controlled check'.

Co-Authored-By: Claude Opus 4.8 <noreply@anthropic.com>
</commit_message>
<xml_diff>
--- a/docs/coreasoning.docx
+++ b/docs/coreasoning.docx
@@ -169,13 +169,13 @@
         <w:t xml:space="preserve"> </w:t>
       </w:r>
       <w:r>
-        <w:t xml:space="preserve">a given learner’s AI use succeeds or fails, whether they</w:t>
-      </w:r>
-      <w:r>
-        <w:t xml:space="preserve"> </w:t>
-      </w:r>
-      <w:r>
-        <w:t xml:space="preserve">specified the task poorly, missed the flaws in the output, or failed to correct them. We treat it</w:t>
+        <w:t xml:space="preserve">a given learner’s AI use succeeds or fails (whether they</w:t>
+      </w:r>
+      <w:r>
+        <w:t xml:space="preserve"> </w:t>
+      </w:r>
+      <w:r>
+        <w:t xml:space="preserve">specified the task poorly, missed the flaws in the output, or failed to correct them). We treat it</w:t>
       </w:r>
       <w:r>
         <w:t xml:space="preserve"> </w:t>
@@ -581,19 +581,19 @@
         <w:t xml:space="preserve"> </w:t>
       </w:r>
       <w:r>
-        <w:t xml:space="preserve">evidence is sobering: human-AI teams frequently underperform the better of the human or the AI alone</w:t>
-      </w:r>
-      <w:r>
-        <w:t xml:space="preserve"> </w:t>
-      </w:r>
-      <w:r>
-        <w:t xml:space="preserve">(Vaccaro et al., 2024), which makes the human’s skill in directing the system, not mere access to it,</w:t>
-      </w:r>
-      <w:r>
-        <w:t xml:space="preserve"> </w:t>
-      </w:r>
-      <w:r>
-        <w:t xml:space="preserve">the decisive variable.</w:t>
+        <w:t xml:space="preserve">evidence underscores the stakes: human-AI teams frequently underperform the better of the human or the</w:t>
+      </w:r>
+      <w:r>
+        <w:t xml:space="preserve"> </w:t>
+      </w:r>
+      <w:r>
+        <w:t xml:space="preserve">AI alone (Vaccaro et al., 2024), which makes the human’s skill in directing the system, not mere access</w:t>
+      </w:r>
+      <w:r>
+        <w:t xml:space="preserve"> </w:t>
+      </w:r>
+      <w:r>
+        <w:t xml:space="preserve">to it, the decisive variable.</w:t>
       </w:r>
     </w:p>
     <w:p>
@@ -945,7 +945,7 @@
         <w:t xml:space="preserve"> </w:t>
       </w:r>
       <w:r>
-        <w:t xml:space="preserve">cognitively distinct, independently-assessable skills, Framing, Judging, and Steering, whose</w:t>
+        <w:t xml:space="preserve">cognitively distinct, independently-assessable skills (Framing, Judging, and Steering), whose</w:t>
       </w:r>
       <w:r>
         <w:t xml:space="preserve"> </w:t>
@@ -1318,13 +1318,13 @@
         <w:t xml:space="preserve"> </w:t>
       </w:r>
       <w:r>
-        <w:t xml:space="preserve">them? These are three different failures with three different remedies, teaching problem</w:t>
-      </w:r>
-      <w:r>
-        <w:t xml:space="preserve"> </w:t>
-      </w:r>
-      <w:r>
-        <w:t xml:space="preserve">specification, teaching critical evaluation, and teaching corrective communication, and an instrument</w:t>
+        <w:t xml:space="preserve">them? These are three different failures with three different remedies (teaching problem</w:t>
+      </w:r>
+      <w:r>
+        <w:t xml:space="preserve"> </w:t>
+      </w:r>
+      <w:r>
+        <w:t xml:space="preserve">specification, teaching critical evaluation, and teaching corrective communication), and an instrument</w:t>
       </w:r>
       <w:r>
         <w:t xml:space="preserve"> </w:t>
@@ -4147,7 +4147,7 @@
         <w:t xml:space="preserve"> </w:t>
       </w:r>
       <w:r>
-        <w:t xml:space="preserve">framing, and the seeded-flaw solution that the learner will critique (Section 7.2). Challenges are</w:t>
+        <w:t xml:space="preserve">framing, and the seeded-flaw solution that the learner will critique (Section 7.1). Challenges are</w:t>
       </w:r>
       <w:r>
         <w:t xml:space="preserve"> </w:t>
@@ -5022,7 +5022,7 @@
         <w:t xml:space="preserve"> </w:t>
       </w:r>
       <w:r>
-        <w:t xml:space="preserve">set to strong. The judging signal is mechanistically transparent: a strong judge flags all four seeded</w:t>
+        <w:t xml:space="preserve">set to strong. The judging signal is mechanistically transparent: a strong judge flags all of the seeded</w:t>
       </w:r>
       <w:r>
         <w:t xml:space="preserve"> </w:t>
@@ -5109,7 +5109,7 @@
           <w:b/>
           <w:bCs/>
         </w:rPr>
-        <w:t xml:space="preserve">+0.008</w:t>
+        <w:t xml:space="preserve">+0.01</w:t>
       </w:r>
       <w:r>
         <w:t xml:space="preserve">. Judging’s own-effect (+2.00) is fixed by</w:t>
@@ -5676,7 +5676,13 @@
         <w:t xml:space="preserve"> </w:t>
       </w:r>
       <w:r>
-        <w:t xml:space="preserve">subject. The designed-contrast personas make the separation concrete (Figure 3). A</w:t>
+        <w:t xml:space="preserve">subject. The designed-contrast personas make the separation concrete (Figure 3, which plots five</w:t>
+      </w:r>
+      <w:r>
+        <w:t xml:space="preserve"> </w:t>
+      </w:r>
+      <w:r>
+        <w:t xml:space="preserve">profiles). Three are especially telling: a</w:t>
       </w:r>
       <w:r>
         <w:t xml:space="preserve"> </w:t>
@@ -5692,7 +5698,13 @@
         <w:t xml:space="preserve"> </w:t>
       </w:r>
       <w:r>
-        <w:t xml:space="preserve">learner scores Framing C but Judging A; a</w:t>
+        <w:t xml:space="preserve">learner scores Framing C but</w:t>
+      </w:r>
+      <w:r>
+        <w:t xml:space="preserve"> </w:t>
+      </w:r>
+      <w:r>
+        <w:t xml:space="preserve">Judging A; a</w:t>
       </w:r>
       <w:r>
         <w:t xml:space="preserve"> </w:t>
@@ -5708,13 +5720,7 @@
         <w:t xml:space="preserve"> </w:t>
       </w:r>
       <w:r>
-        <w:t xml:space="preserve">learner inverts this to Framing</w:t>
-      </w:r>
-      <w:r>
-        <w:t xml:space="preserve"> </w:t>
-      </w:r>
-      <w:r>
-        <w:t xml:space="preserve">B, Judging C; a</w:t>
+        <w:t xml:space="preserve">learner inverts this to Framing B, Judging C; and a</w:t>
       </w:r>
       <w:r>
         <w:t xml:space="preserve"> </w:t>
@@ -6106,19 +6112,25 @@
         <w:t xml:space="preserve"> </w:t>
       </w:r>
       <w:r>
-        <w:t xml:space="preserve">dominate cross-skill effects (diagonal +0.47 versus off-diagonal +0.07). Notably, under the weaker</w:t>
-      </w:r>
-      <w:r>
-        <w:t xml:space="preserve"> </w:t>
-      </w:r>
-      <w:r>
-        <w:t xml:space="preserve">grader Judging’s own-effect falls from +2.00 to +0.65, comparable to Framing’s +0.65, which confirms</w:t>
-      </w:r>
-      <w:r>
-        <w:t xml:space="preserve"> </w:t>
-      </w:r>
-      <w:r>
-        <w:t xml:space="preserve">that the large +2.00 was specific to gpt-4o’s strict adherence to the seeded-issue selection rather</w:t>
+        <w:t xml:space="preserve">dominate cross-skill effects (diagonal +0.47 versus off-diagonal +0.07). Notably, under this weaker</w:t>
+      </w:r>
+      <w:r>
+        <w:t xml:space="preserve"> </w:t>
+      </w:r>
+      <w:r>
+        <w:t xml:space="preserve">grader Judging’s own-effect falls from +2.00 to +0.65, comparable to Framing’s own-effect under the</w:t>
+      </w:r>
+      <w:r>
+        <w:t xml:space="preserve"> </w:t>
+      </w:r>
+      <w:r>
+        <w:t xml:space="preserve">same grader (also +0.65), which confirms that the large +2.00 was specific to gpt-4o’s strict</w:t>
+      </w:r>
+      <w:r>
+        <w:t xml:space="preserve"> </w:t>
+      </w:r>
+      <w:r>
+        <w:t xml:space="preserve">adherence to the seeded-issue selection rather</w:t>
       </w:r>
       <w:r>
         <w:t xml:space="preserve"> </w:t>
@@ -6278,25 +6290,25 @@
         <w:t xml:space="preserve"> </w:t>
       </w:r>
       <w:r>
-        <w:t xml:space="preserve">so its clean diagonal (+2.00, with zero cross-effects) confirms the grader correctly rewards</w:t>
-      </w:r>
-      <w:r>
-        <w:t xml:space="preserve"> </w:t>
-      </w:r>
-      <w:r>
-        <w:t xml:space="preserve">recall/precision but is not, by itself, a discovered separation. Framing and Steering responses are</w:t>
-      </w:r>
-      <w:r>
-        <w:t xml:space="preserve"> </w:t>
-      </w:r>
-      <w:r>
-        <w:t xml:space="preserve">free-text and blind-graded, so their positive own-effects (+0.62, +0.43) with near-zero cross-effects</w:t>
-      </w:r>
-      <w:r>
-        <w:t xml:space="preserve"> </w:t>
-      </w:r>
-      <w:r>
-        <w:t xml:space="preserve">are the stronger evidence. (ii) The grader is a single model family; whether the dissociation replicates</w:t>
+        <w:t xml:space="preserve">so its clean diagonal (+2.00, with zero cross-effects) is a controlled check that the grader correctly</w:t>
+      </w:r>
+      <w:r>
+        <w:t xml:space="preserve"> </w:t>
+      </w:r>
+      <w:r>
+        <w:t xml:space="preserve">rewards recall and precision. Independent evidence of separation comes from the free-text, blind-graded</w:t>
+      </w:r>
+      <w:r>
+        <w:t xml:space="preserve"> </w:t>
+      </w:r>
+      <w:r>
+        <w:t xml:space="preserve">skills, Framing and Steering, whose positive own-effects (+0.62, +0.43) with near-zero cross-effects</w:t>
+      </w:r>
+      <w:r>
+        <w:t xml:space="preserve"> </w:t>
+      </w:r>
+      <w:r>
+        <w:t xml:space="preserve">carry the result. (ii) The grader is a single model family; whether the dissociation replicates</w:t>
       </w:r>
       <w:r>
         <w:t xml:space="preserve"> </w:t>

</xml_diff>

<commit_message>
Remove implementation minutiae and README-style leftovers from the paper
- Abstract: replace the verbose "we release the instrument, the controlled-generation
  harness, the data..." with a clean availability sentence.
- Sec 8: drop the call-count/caching trivia ("seven grader calls ... 560 nominal")
  and "bypassing the cache"; neither serves the scientific argument.
- Contribution 6: drop "controlled-generation harness" jargon.
- Fix "deployed prototype" -> "prototype" (consistent with the mockup disclosure).
Body has no repo paths, script names, or file references. docx regenerated via html2doc.

Co-Authored-By: Claude Opus 4.8 <noreply@anthropic.com>
</commit_message>
<xml_diff>
--- a/docs/coreasoning.docx
+++ b/docs/coreasoning.docx
@@ -11,17 +11,6 @@
         <w:widowControl w:val="1"/>
       </w:pPr>
       <w:hyperlink r:id="rId9">
-        <w:r>
-          <w:rPr>
-            <w:rStyle w:val="Hyperlink"/>
-          </w:rPr>
-          <w:t xml:space="preserve">★ GitHub</w:t>
-        </w:r>
-      </w:hyperlink>
-      <w:r>
-        <w:t xml:space="preserve"> </w:t>
-      </w:r>
-      <w:hyperlink r:id="rId10">
         <w:r>
           <w:rPr>
             <w:rStyle w:val="Hyperlink"/>
@@ -30,7 +19,7 @@
         </w:r>
       </w:hyperlink>
     </w:p>
-    <w:bookmarkStart w:id="45" w:name="Xdf9502ef5c17bbba6731875408e8426bd513f0c"/>
+    <w:bookmarkStart w:id="44" w:name="Xdf9502ef5c17bbba6731875408e8426bd513f0c"/>
     <w:p>
       <w:pPr>
         <w:pStyle w:val="Title"/>
@@ -93,7 +82,7 @@
         <w:t xml:space="preserve">¹ Holon Institute of Technology · ² Afeka College of Engineering</w:t>
       </w:r>
     </w:p>
-    <w:bookmarkStart w:id="11" w:name="abstract"/>
+    <w:bookmarkStart w:id="10" w:name="abstract"/>
     <w:p>
       <w:pPr>
         <w:pStyle w:val="AbstractLabel"/>
@@ -431,17 +420,11 @@
         <w:t xml:space="preserve"> </w:t>
       </w:r>
       <w:r>
-        <w:t xml:space="preserve">We release the instrument, the controlled-generation harness, the data, and a prepared human-validation</w:t>
-      </w:r>
-      <w:r>
-        <w:t xml:space="preserve"> </w:t>
-      </w:r>
-      <w:r>
-        <w:t xml:space="preserve">protocol.</w:t>
+        <w:t xml:space="preserve">The instrument, data, and a prepared human-rater validation protocol are publicly available.</w:t>
       </w:r>
     </w:p>
-    <w:bookmarkEnd w:id="11"/>
-    <w:bookmarkStart w:id="12" w:name="Xe3d0fc0bea9a42ce7605565d0964033d7f6ee47"/>
+    <w:bookmarkEnd w:id="10"/>
+    <w:bookmarkStart w:id="11" w:name="Xe3d0fc0bea9a42ce7605565d0964033d7f6ee47"/>
     <w:p>
       <w:pPr>
         <w:pStyle w:val="Heading2"/>
@@ -1141,13 +1124,13 @@
         <w:t xml:space="preserve"> </w:t>
       </w:r>
       <w:r>
-        <w:t xml:space="preserve">(the prompt-based instrument, a controlled-generation harness,</w:t>
-      </w:r>
-      <w:r>
-        <w:t xml:space="preserve"> </w:t>
-      </w:r>
-      <w:r>
-        <w:t xml:space="preserve">and data) together with a fully prepared human-rater validation protocol for the community to run.</w:t>
+        <w:t xml:space="preserve">(the assessment instrument and the experiment data) together</w:t>
+      </w:r>
+      <w:r>
+        <w:t xml:space="preserve"> </w:t>
+      </w:r>
+      <w:r>
+        <w:t xml:space="preserve">with a fully prepared human-rater validation protocol for the community to run.</w:t>
       </w:r>
     </w:p>
     <w:p>
@@ -1175,8 +1158,8 @@
         <w:t xml:space="preserve">, not an efficacy study.</w:t>
       </w:r>
     </w:p>
-    <w:bookmarkEnd w:id="12"/>
-    <w:bookmarkStart w:id="13" w:name="Xc80aad60eb1ce9c76f3f6e8ebe48a2f3b3f278b"/>
+    <w:bookmarkEnd w:id="11"/>
+    <w:bookmarkStart w:id="12" w:name="Xc80aad60eb1ce9c76f3f6e8ebe48a2f3b3f278b"/>
     <w:p>
       <w:pPr>
         <w:pStyle w:val="Heading2"/>
@@ -1365,8 +1348,8 @@
         <w:t xml:space="preserve">operations are in fact separable in learners. That is the gap CoReasoning addresses.</w:t>
       </w:r>
     </w:p>
-    <w:bookmarkEnd w:id="13"/>
-    <w:bookmarkStart w:id="20" w:name="X633cad0d74cfeb5d5acc5b289e740398e9962c8"/>
+    <w:bookmarkEnd w:id="12"/>
+    <w:bookmarkStart w:id="19" w:name="X633cad0d74cfeb5d5acc5b289e740398e9962c8"/>
     <w:p>
       <w:pPr>
         <w:pStyle w:val="Heading2"/>
@@ -1378,7 +1361,7 @@
         <w:t xml:space="preserve">3. The CoReasoning framework</w:t>
       </w:r>
     </w:p>
-    <w:bookmarkStart w:id="17" w:name="Xe68b6e3303f1e693b99eac37e4ff2b8b0d9c1ec"/>
+    <w:bookmarkStart w:id="16" w:name="Xe68b6e3303f1e693b99eac37e4ff2b8b0d9c1ec"/>
     <w:p>
       <w:pPr>
         <w:pStyle w:val="Heading3"/>
@@ -1684,12 +1667,12 @@
           <wp:inline>
             <wp:extent cx="5943600" cy="3406697"/>
             <wp:effectExtent b="0" l="0" r="0" t="0"/>
-            <wp:docPr descr="Figure 1. The CoReasoning architecture." title="" id="15" name="Picture"/>
+            <wp:docPr descr="Figure 1. The CoReasoning architecture." title="" id="14" name="Picture"/>
             <a:graphic>
               <a:graphicData uri="http://schemas.openxmlformats.org/drawingml/2006/picture">
                 <pic:pic>
                   <pic:nvPicPr>
-                    <pic:cNvPr descr="assets/coreasoning-architecture.svg" id="16" name="Picture"/>
+                    <pic:cNvPr descr="assets/coreasoning-architecture.svg" id="15" name="Picture"/>
                     <pic:cNvPicPr>
                       <a:picLocks noChangeArrowheads="1" noChangeAspect="1"/>
                     </pic:cNvPicPr>
@@ -1701,7 +1684,7 @@
                           <a14:useLocalDpi xmlns:a14="http://schemas.microsoft.com/office/drawing/2010/main" val="0"/>
                         </a:ext>
                         <a:ext uri="{96DAC541-7B7A-43D3-8B79-37D633B846F1}">
-                          <asvg:svgBlip xmlns:asvg="http://schemas.microsoft.com/office/drawing/2016/SVG/main" r:embed="rId14"/>
+                          <asvg:svgBlip xmlns:asvg="http://schemas.microsoft.com/office/drawing/2016/SVG/main" r:embed="rId13"/>
                         </a:ext>
                       </a:extLst>
                     </a:blip>
@@ -1790,8 +1773,8 @@
         <w:t xml:space="preserve">Steering is the controller's write.</w:t>
       </w:r>
     </w:p>
-    <w:bookmarkEnd w:id="17"/>
-    <w:bookmarkStart w:id="18" w:name="X1eb66af04d4702fef1ddf2edf668648ed034024"/>
+    <w:bookmarkEnd w:id="16"/>
+    <w:bookmarkStart w:id="17" w:name="X1eb66af04d4702fef1ddf2edf668648ed034024"/>
     <w:p>
       <w:pPr>
         <w:pStyle w:val="Heading3"/>
@@ -1883,8 +1866,8 @@
         <w:t xml:space="preserve">distinctions an educator needs.</w:t>
       </w:r>
     </w:p>
-    <w:bookmarkEnd w:id="18"/>
-    <w:bookmarkStart w:id="19" w:name="Xdb2b1112fd00524e4d1e38ed327bda10bf491fe"/>
+    <w:bookmarkEnd w:id="17"/>
+    <w:bookmarkStart w:id="18" w:name="Xdb2b1112fd00524e4d1e38ed327bda10bf491fe"/>
     <w:p>
       <w:pPr>
         <w:pStyle w:val="Heading3"/>
@@ -2124,9 +2107,9 @@
         <w:t xml:space="preserve">remaining comparatively flat in the others, rather than relying on a single global factor model.</w:t>
       </w:r>
     </w:p>
+    <w:bookmarkEnd w:id="18"/>
     <w:bookmarkEnd w:id="19"/>
-    <w:bookmarkEnd w:id="20"/>
-    <w:bookmarkStart w:id="21" w:name="X33559beceade9e011829ba0dfd35bbac6035713"/>
+    <w:bookmarkStart w:id="20" w:name="X33559beceade9e011829ba0dfd35bbac6035713"/>
     <w:p>
       <w:pPr>
         <w:pStyle w:val="Heading2"/>
@@ -2506,8 +2489,8 @@
         <w:t xml:space="preserve">accept.</w:t>
       </w:r>
     </w:p>
-    <w:bookmarkEnd w:id="21"/>
-    <w:bookmarkStart w:id="22" w:name="Xe47ed403f4ce49fb25f912e3b7155b566fcd076"/>
+    <w:bookmarkEnd w:id="20"/>
+    <w:bookmarkStart w:id="21" w:name="Xe47ed403f4ce49fb25f912e3b7155b566fcd076"/>
     <w:p>
       <w:pPr>
         <w:pStyle w:val="Heading2"/>
@@ -2848,8 +2831,8 @@
         <w:t xml:space="preserve">signatures (for example, reduced post-task recall) documented in the cognitive-debt literature.</w:t>
       </w:r>
     </w:p>
-    <w:bookmarkEnd w:id="22"/>
-    <w:bookmarkStart w:id="23" w:name="X7e2be599b6fb27f7d4655c10155b63b05f9aa9d"/>
+    <w:bookmarkEnd w:id="21"/>
+    <w:bookmarkStart w:id="22" w:name="X7e2be599b6fb27f7d4655c10155b63b05f9aa9d"/>
     <w:p>
       <w:pPr>
         <w:pStyle w:val="Heading2"/>
@@ -4316,8 +4299,8 @@
         <w:t xml:space="preserve">consequential (the skills can be measured apart).</w:t>
       </w:r>
     </w:p>
-    <w:bookmarkEnd w:id="23"/>
-    <w:bookmarkStart w:id="24" w:name="Xeee0f31b39981a3e100f5aaf50a49be1e1b4285"/>
+    <w:bookmarkEnd w:id="22"/>
+    <w:bookmarkStart w:id="23" w:name="Xeee0f31b39981a3e100f5aaf50a49be1e1b4285"/>
     <w:p>
       <w:pPr>
         <w:pStyle w:val="Heading2"/>
@@ -4685,8 +4668,8 @@
         <w:t xml:space="preserve">the instrument that produces those scores.</w:t>
       </w:r>
     </w:p>
-    <w:bookmarkEnd w:id="24"/>
-    <w:bookmarkStart w:id="25" w:name="X3d8be0d8bf4ad30b87d3536652355afd0bfa982"/>
+    <w:bookmarkEnd w:id="23"/>
+    <w:bookmarkStart w:id="24" w:name="X3d8be0d8bf4ad30b87d3536652355afd0bfa982"/>
     <w:p>
       <w:pPr>
         <w:pStyle w:val="Heading2"/>
@@ -4954,7 +4937,7 @@
         <w:widowControl w:val="1"/>
       </w:pPr>
       <w:r>
-        <w:t xml:space="preserve">The instrument used in this paper is the engine of a deployed prototype (CoReasoning Lab), a library</w:t>
+        <w:t xml:space="preserve">The instrument used in this paper is the scoring engine of the CoReasoning Lab prototype, a library</w:t>
       </w:r>
       <w:r>
         <w:t xml:space="preserve"> </w:t>
@@ -5015,8 +4998,8 @@
         <w:t xml:space="preserve">is the separate validity question addressed by the prepared study in Section 10.</w:t>
       </w:r>
     </w:p>
-    <w:bookmarkEnd w:id="25"/>
-    <w:bookmarkStart w:id="32" w:name="X4d8e342cb22c9aa3a4677d1e6b5af262e28c318"/>
+    <w:bookmarkEnd w:id="24"/>
+    <w:bookmarkStart w:id="31" w:name="X4d8e342cb22c9aa3a4677d1e6b5af262e28c318"/>
     <w:p>
       <w:pPr>
         <w:pStyle w:val="Heading2"/>
@@ -5197,31 +5180,13 @@
         <w:t xml:space="preserve"> </w:t>
       </w:r>
       <w:r>
-        <w:t xml:space="preserve">calculus, organic chemistry, linguistics, and corporate finance), for 80 simulated learners. Each</w:t>
-      </w:r>
-      <w:r>
-        <w:t xml:space="preserve"> </w:t>
-      </w:r>
-      <w:r>
-        <w:t xml:space="preserve">learner is scored by seven grader calls (three skill evaluators, a grading pass per skill, and one</w:t>
-      </w:r>
-      <w:r>
-        <w:t xml:space="preserve"> </w:t>
-      </w:r>
-      <w:r>
-        <w:t xml:space="preserve">steering-update call); grading inputs that are identical across profiles are cached and reused, so the</w:t>
-      </w:r>
-      <w:r>
-        <w:t xml:space="preserve"> </w:t>
-      </w:r>
-      <w:r>
-        <w:t xml:space="preserve">issued total is below the 560 nominal. Framing and Steering responses are generated</w:t>
-      </w:r>
-      <w:r>
-        <w:t xml:space="preserve"> </w:t>
-      </w:r>
-      <w:r>
-        <w:t xml:space="preserve">by the competence-conditioned learner model; Judging is operationalized by a competence-conditioned</w:t>
+        <w:t xml:space="preserve">calculus, organic chemistry, linguistics, and corporate finance), for 80 simulated learners. Framing</w:t>
+      </w:r>
+      <w:r>
+        <w:t xml:space="preserve"> </w:t>
+      </w:r>
+      <w:r>
+        <w:t xml:space="preserve">and Steering responses are generated by the competence-conditioned learner model; Judging is operationalized by a competence-conditioned</w:t>
       </w:r>
       <w:r>
         <w:t xml:space="preserve"> </w:t>
@@ -6357,18 +6322,18 @@
           <wp:inline>
             <wp:extent cx="4600754" cy="3864633"/>
             <wp:effectExtent b="0" l="0" r="0" t="0"/>
-            <wp:docPr descr="Figure 2. Own-competence effects dominate cross-competence effects on every skill's grade." title="" id="27" name="Picture"/>
+            <wp:docPr descr="Figure 2. Own-competence effects dominate cross-competence effects on every skill's grade." title="" id="26" name="Picture"/>
             <a:graphic>
               <a:graphicData uri="http://schemas.openxmlformats.org/drawingml/2006/picture">
                 <pic:pic>
                   <pic:nvPicPr>
-                    <pic:cNvPr descr="assets/fig_dissociation_heatmap.png" id="28" name="Picture"/>
+                    <pic:cNvPr descr="assets/fig_dissociation_heatmap.png" id="27" name="Picture"/>
                     <pic:cNvPicPr>
                       <a:picLocks noChangeArrowheads="1" noChangeAspect="1"/>
                     </pic:cNvPicPr>
                   </pic:nvPicPr>
                   <pic:blipFill>
-                    <a:blip r:embed="rId26"/>
+                    <a:blip r:embed="rId25"/>
                     <a:stretch>
                       <a:fillRect/>
                     </a:stretch>
@@ -6439,18 +6404,18 @@
           <wp:inline>
             <wp:extent cx="5943600" cy="3302000"/>
             <wp:effectExtent b="0" l="0" r="0" t="0"/>
-            <wp:docPr descr="Figure 3. Per-skill grades dissociate by competence profile." title="" id="30" name="Picture"/>
+            <wp:docPr descr="Figure 3. Per-skill grades dissociate by competence profile." title="" id="29" name="Picture"/>
             <a:graphic>
               <a:graphicData uri="http://schemas.openxmlformats.org/drawingml/2006/picture">
                 <pic:pic>
                   <pic:nvPicPr>
-                    <pic:cNvPr descr="assets/fig_contrasts.png" id="31" name="Picture"/>
+                    <pic:cNvPr descr="assets/fig_contrasts.png" id="30" name="Picture"/>
                     <pic:cNvPicPr>
                       <a:picLocks noChangeArrowheads="1" noChangeAspect="1"/>
                     </pic:cNvPicPr>
                   </pic:nvPicPr>
                   <pic:blipFill>
-                    <a:blip r:embed="rId29"/>
+                    <a:blip r:embed="rId28"/>
                     <a:stretch>
                       <a:fillRect/>
                     </a:stretch>
@@ -6533,13 +6498,13 @@
         <w:t xml:space="preserve"> </w:t>
       </w:r>
       <w:r>
-        <w:t xml:space="preserve">re-run the evaluation-and-grading prompts five times each (bypassing the cache so each repeat is an</w:t>
-      </w:r>
-      <w:r>
-        <w:t xml:space="preserve"> </w:t>
-      </w:r>
-      <w:r>
-        <w:t xml:space="preserve">independent sample at the production temperatures). The grader is</w:t>
+        <w:t xml:space="preserve">re-run the evaluation-and-grading prompts five times each, an independent sample each time at the</w:t>
+      </w:r>
+      <w:r>
+        <w:t xml:space="preserve"> </w:t>
+      </w:r>
+      <w:r>
+        <w:t xml:space="preserve">production temperatures. The grader is</w:t>
       </w:r>
       <w:r>
         <w:t xml:space="preserve"> </w:t>
@@ -6948,8 +6913,8 @@
         <w:t xml:space="preserve">the validation study supplies.</w:t>
       </w:r>
     </w:p>
-    <w:bookmarkEnd w:id="32"/>
-    <w:bookmarkStart w:id="33" w:name="Xa46466f38120f8ee74cb65c819a5bdd7729dab3"/>
+    <w:bookmarkEnd w:id="31"/>
+    <w:bookmarkStart w:id="32" w:name="Xa46466f38120f8ee74cb65c819a5bdd7729dab3"/>
     <w:p>
       <w:pPr>
         <w:pStyle w:val="Heading2"/>
@@ -7192,8 +7157,8 @@
         <w:t xml:space="preserve">expert frontier.</w:t>
       </w:r>
     </w:p>
-    <w:bookmarkEnd w:id="33"/>
-    <w:bookmarkStart w:id="34" w:name="Xba3f6dd9d03393d7b20e910759a94d79249c978"/>
+    <w:bookmarkEnd w:id="32"/>
+    <w:bookmarkStart w:id="33" w:name="Xba3f6dd9d03393d7b20e910759a94d79249c978"/>
     <w:p>
       <w:pPr>
         <w:pStyle w:val="Heading2"/>
@@ -7546,8 +7511,8 @@
         <w:t xml:space="preserve">Proposition P5 and any learning claim; that is explicitly outside the present scope.</w:t>
       </w:r>
     </w:p>
-    <w:bookmarkEnd w:id="34"/>
-    <w:bookmarkStart w:id="35" w:name="X3d190d206b9dddd8a7dadd6848a844299fab8ec"/>
+    <w:bookmarkEnd w:id="33"/>
+    <w:bookmarkStart w:id="34" w:name="X3d190d206b9dddd8a7dadd6848a844299fab8ec"/>
     <w:p>
       <w:pPr>
         <w:pStyle w:val="Heading2"/>
@@ -7655,8 +7620,8 @@
         <w:t xml:space="preserve">boundary, and evidence that the three constructs are separable and automatically measurable.</w:t>
       </w:r>
     </w:p>
-    <w:bookmarkEnd w:id="35"/>
-    <w:bookmarkStart w:id="36" w:name="X5947723a0a79e017d648ec5789efc916be82fa3"/>
+    <w:bookmarkEnd w:id="34"/>
+    <w:bookmarkStart w:id="35" w:name="X5947723a0a79e017d648ec5789efc916be82fa3"/>
     <w:p>
       <w:pPr>
         <w:pStyle w:val="Heading2"/>
@@ -7716,8 +7681,8 @@
         <w:t xml:space="preserve">measured apart. We offer it as a foundation for the assessment and instruction the moment demands.</w:t>
       </w:r>
     </w:p>
-    <w:bookmarkEnd w:id="36"/>
-    <w:bookmarkStart w:id="43" w:name="appendix-a-system-walkthrough"/>
+    <w:bookmarkEnd w:id="35"/>
+    <w:bookmarkStart w:id="42" w:name="appendix-a-system-walkthrough"/>
     <w:p>
       <w:pPr>
         <w:pStyle w:val="Heading2"/>
@@ -7790,12 +7755,12 @@
           <wp:inline>
             <wp:extent cx="5943600" cy="3037840"/>
             <wp:effectExtent b="0" l="0" r="0" t="0"/>
-            <wp:docPr descr="Figure A1. A CoReasoning Lab challenge run." title="" id="38" name="Picture"/>
+            <wp:docPr descr="Figure A1. A CoReasoning Lab challenge run." title="" id="37" name="Picture"/>
             <a:graphic>
               <a:graphicData uri="http://schemas.openxmlformats.org/drawingml/2006/picture">
                 <pic:pic>
                   <pic:nvPicPr>
-                    <pic:cNvPr descr="assets/system-mockup.svg" id="39" name="Picture"/>
+                    <pic:cNvPr descr="assets/system-mockup.svg" id="38" name="Picture"/>
                     <pic:cNvPicPr>
                       <a:picLocks noChangeArrowheads="1" noChangeAspect="1"/>
                     </pic:cNvPicPr>
@@ -7807,7 +7772,7 @@
                           <a14:useLocalDpi xmlns:a14="http://schemas.microsoft.com/office/drawing/2010/main" val="0"/>
                         </a:ext>
                         <a:ext uri="{96DAC541-7B7A-43D3-8B79-37D633B846F1}">
-                          <asvg:svgBlip xmlns:asvg="http://schemas.microsoft.com/office/drawing/2016/SVG/main" r:embed="rId37"/>
+                          <asvg:svgBlip xmlns:asvg="http://schemas.microsoft.com/office/drawing/2016/SVG/main" r:embed="rId36"/>
                         </a:ext>
                       </a:extLst>
                     </a:blip>
@@ -7922,12 +7887,12 @@
           <wp:inline>
             <wp:extent cx="5943600" cy="4173165"/>
             <wp:effectExtent b="0" l="0" r="0" t="0"/>
-            <wp:docPr descr="Figure A2. CoReasoning Lab role interfaces." title="" id="41" name="Picture"/>
+            <wp:docPr descr="Figure A2. CoReasoning Lab role interfaces." title="" id="40" name="Picture"/>
             <a:graphic>
               <a:graphicData uri="http://schemas.openxmlformats.org/drawingml/2006/picture">
                 <pic:pic>
                   <pic:nvPicPr>
-                    <pic:cNvPr descr="assets/interface-gallery.svg" id="42" name="Picture"/>
+                    <pic:cNvPr descr="assets/interface-gallery.svg" id="41" name="Picture"/>
                     <pic:cNvPicPr>
                       <a:picLocks noChangeArrowheads="1" noChangeAspect="1"/>
                     </pic:cNvPicPr>
@@ -7939,7 +7904,7 @@
                           <a14:useLocalDpi xmlns:a14="http://schemas.microsoft.com/office/drawing/2010/main" val="0"/>
                         </a:ext>
                         <a:ext uri="{96DAC541-7B7A-43D3-8B79-37D633B846F1}">
-                          <asvg:svgBlip xmlns:asvg="http://schemas.microsoft.com/office/drawing/2016/SVG/main" r:embed="rId40"/>
+                          <asvg:svgBlip xmlns:asvg="http://schemas.microsoft.com/office/drawing/2016/SVG/main" r:embed="rId39"/>
                         </a:ext>
                       </a:extLst>
                     </a:blip>
@@ -8027,8 +7992,8 @@
         <w:t xml:space="preserve">Steering independently.</w:t>
       </w:r>
     </w:p>
-    <w:bookmarkEnd w:id="43"/>
-    <w:bookmarkStart w:id="44" w:name="references"/>
+    <w:bookmarkEnd w:id="42"/>
+    <w:bookmarkStart w:id="43" w:name="references"/>
     <w:p>
       <w:pPr>
         <w:pStyle w:val="ReferencesHeading"/>
@@ -9416,10 +9381,10 @@
         <w:t xml:space="preserve">.</w:t>
       </w:r>
     </w:p>
+    <w:bookmarkEnd w:id="43"/>
     <w:bookmarkEnd w:id="44"/>
-    <w:bookmarkEnd w:id="45"/>
     <w:sectPr>
-      <w:footerReference w:type="default" r:id="rId11"/>
+      <w:footerReference w:type="default" r:id="rId10"/>
       <w:pgSz w:h="15840" w:w="12240"/>
       <w:pgMar w:bottom="1440" w:footer="720" w:gutter="0" w:header="720" w:left="1440" w:right="1440" w:top="1440"/>
       <w:cols w:space="720"/>

</xml_diff>

<commit_message>
docx: strip the web-only Download button so it isn't inside the Word file
Add paper/build_docx.sh: strips the floating .docx download button from index.html
before the html2doc pipeline, so the generated Word document contains only the paper
(no 'Download .docx' chrome). Regenerate coreasoning.docx accordingly.

Co-Authored-By: Claude Opus 4.8 <noreply@anthropic.com>
</commit_message>
<xml_diff>
--- a/docs/coreasoning.docx
+++ b/docs/coreasoning.docx
@@ -2,24 +2,7 @@
 <file path=word/document.xml><?xml version="1.0" encoding="utf-8"?>
 <w:document xmlns:w="http://schemas.openxmlformats.org/wordprocessingml/2006/main" xmlns:m="http://schemas.openxmlformats.org/officeDocument/2006/math" xmlns:r="http://schemas.openxmlformats.org/officeDocument/2006/relationships" xmlns:o="urn:schemas-microsoft-com:office:office" xmlns:v="urn:schemas-microsoft-com:vml" xmlns:w10="urn:schemas-microsoft-com:office:word" xmlns:a="http://schemas.openxmlformats.org/drawingml/2006/main" xmlns:pic="http://schemas.openxmlformats.org/drawingml/2006/picture" xmlns:wp="http://schemas.openxmlformats.org/drawingml/2006/wordprocessingDrawing">
   <w:body>
-    <w:p>
-      <w:pPr>
-        <w:pStyle w:val="FirstParagraph"/>
-        <w:jc w:val="both"/>
-        <w:keepNext w:val="0"/>
-        <w:keepLines w:val="0"/>
-        <w:widowControl w:val="1"/>
-      </w:pPr>
-      <w:hyperlink r:id="rId9">
-        <w:r>
-          <w:rPr>
-            <w:rStyle w:val="Hyperlink"/>
-          </w:rPr>
-          <w:t xml:space="preserve">↓ Download .docx</w:t>
-        </w:r>
-      </w:hyperlink>
-    </w:p>
-    <w:bookmarkStart w:id="44" w:name="Xdf9502ef5c17bbba6731875408e8426bd513f0c"/>
+    <w:bookmarkStart w:id="43" w:name="Xdf9502ef5c17bbba6731875408e8426bd513f0c"/>
     <w:p>
       <w:pPr>
         <w:pStyle w:val="Title"/>
@@ -82,7 +65,7 @@
         <w:t xml:space="preserve">¹ Holon Institute of Technology · ² Afeka College of Engineering</w:t>
       </w:r>
     </w:p>
-    <w:bookmarkStart w:id="10" w:name="abstract"/>
+    <w:bookmarkStart w:id="9" w:name="abstract"/>
     <w:p>
       <w:pPr>
         <w:pStyle w:val="AbstractLabel"/>
@@ -423,8 +406,8 @@
         <w:t xml:space="preserve">The instrument, data, and a prepared human-rater validation protocol are publicly available.</w:t>
       </w:r>
     </w:p>
-    <w:bookmarkEnd w:id="10"/>
-    <w:bookmarkStart w:id="11" w:name="Xe3d0fc0bea9a42ce7605565d0964033d7f6ee47"/>
+    <w:bookmarkEnd w:id="9"/>
+    <w:bookmarkStart w:id="10" w:name="Xe3d0fc0bea9a42ce7605565d0964033d7f6ee47"/>
     <w:p>
       <w:pPr>
         <w:pStyle w:val="Heading2"/>
@@ -1158,8 +1141,8 @@
         <w:t xml:space="preserve">, not an efficacy study.</w:t>
       </w:r>
     </w:p>
-    <w:bookmarkEnd w:id="11"/>
-    <w:bookmarkStart w:id="12" w:name="Xc80aad60eb1ce9c76f3f6e8ebe48a2f3b3f278b"/>
+    <w:bookmarkEnd w:id="10"/>
+    <w:bookmarkStart w:id="11" w:name="Xc80aad60eb1ce9c76f3f6e8ebe48a2f3b3f278b"/>
     <w:p>
       <w:pPr>
         <w:pStyle w:val="Heading2"/>
@@ -1348,8 +1331,8 @@
         <w:t xml:space="preserve">operations are in fact separable in learners. That is the gap CoReasoning addresses.</w:t>
       </w:r>
     </w:p>
-    <w:bookmarkEnd w:id="12"/>
-    <w:bookmarkStart w:id="19" w:name="X633cad0d74cfeb5d5acc5b289e740398e9962c8"/>
+    <w:bookmarkEnd w:id="11"/>
+    <w:bookmarkStart w:id="18" w:name="X633cad0d74cfeb5d5acc5b289e740398e9962c8"/>
     <w:p>
       <w:pPr>
         <w:pStyle w:val="Heading2"/>
@@ -1361,7 +1344,7 @@
         <w:t xml:space="preserve">3. The CoReasoning framework</w:t>
       </w:r>
     </w:p>
-    <w:bookmarkStart w:id="16" w:name="Xe68b6e3303f1e693b99eac37e4ff2b8b0d9c1ec"/>
+    <w:bookmarkStart w:id="15" w:name="Xe68b6e3303f1e693b99eac37e4ff2b8b0d9c1ec"/>
     <w:p>
       <w:pPr>
         <w:pStyle w:val="Heading3"/>
@@ -1667,12 +1650,12 @@
           <wp:inline>
             <wp:extent cx="5943600" cy="3406697"/>
             <wp:effectExtent b="0" l="0" r="0" t="0"/>
-            <wp:docPr descr="Figure 1. The CoReasoning architecture." title="" id="14" name="Picture"/>
+            <wp:docPr descr="Figure 1. The CoReasoning architecture." title="" id="13" name="Picture"/>
             <a:graphic>
               <a:graphicData uri="http://schemas.openxmlformats.org/drawingml/2006/picture">
                 <pic:pic>
                   <pic:nvPicPr>
-                    <pic:cNvPr descr="assets/coreasoning-architecture.svg" id="15" name="Picture"/>
+                    <pic:cNvPr descr="assets/coreasoning-architecture.svg" id="14" name="Picture"/>
                     <pic:cNvPicPr>
                       <a:picLocks noChangeArrowheads="1" noChangeAspect="1"/>
                     </pic:cNvPicPr>
@@ -1684,7 +1667,7 @@
                           <a14:useLocalDpi xmlns:a14="http://schemas.microsoft.com/office/drawing/2010/main" val="0"/>
                         </a:ext>
                         <a:ext uri="{96DAC541-7B7A-43D3-8B79-37D633B846F1}">
-                          <asvg:svgBlip xmlns:asvg="http://schemas.microsoft.com/office/drawing/2016/SVG/main" r:embed="rId13"/>
+                          <asvg:svgBlip xmlns:asvg="http://schemas.microsoft.com/office/drawing/2016/SVG/main" r:embed="rId12"/>
                         </a:ext>
                       </a:extLst>
                     </a:blip>
@@ -1773,8 +1756,8 @@
         <w:t xml:space="preserve">Steering is the controller's write.</w:t>
       </w:r>
     </w:p>
-    <w:bookmarkEnd w:id="16"/>
-    <w:bookmarkStart w:id="17" w:name="X1eb66af04d4702fef1ddf2edf668648ed034024"/>
+    <w:bookmarkEnd w:id="15"/>
+    <w:bookmarkStart w:id="16" w:name="X1eb66af04d4702fef1ddf2edf668648ed034024"/>
     <w:p>
       <w:pPr>
         <w:pStyle w:val="Heading3"/>
@@ -1866,8 +1849,8 @@
         <w:t xml:space="preserve">distinctions an educator needs.</w:t>
       </w:r>
     </w:p>
-    <w:bookmarkEnd w:id="17"/>
-    <w:bookmarkStart w:id="18" w:name="Xdb2b1112fd00524e4d1e38ed327bda10bf491fe"/>
+    <w:bookmarkEnd w:id="16"/>
+    <w:bookmarkStart w:id="17" w:name="Xdb2b1112fd00524e4d1e38ed327bda10bf491fe"/>
     <w:p>
       <w:pPr>
         <w:pStyle w:val="Heading3"/>
@@ -2107,9 +2090,9 @@
         <w:t xml:space="preserve">remaining comparatively flat in the others, rather than relying on a single global factor model.</w:t>
       </w:r>
     </w:p>
+    <w:bookmarkEnd w:id="17"/>
     <w:bookmarkEnd w:id="18"/>
-    <w:bookmarkEnd w:id="19"/>
-    <w:bookmarkStart w:id="20" w:name="X33559beceade9e011829ba0dfd35bbac6035713"/>
+    <w:bookmarkStart w:id="19" w:name="X33559beceade9e011829ba0dfd35bbac6035713"/>
     <w:p>
       <w:pPr>
         <w:pStyle w:val="Heading2"/>
@@ -2489,8 +2472,8 @@
         <w:t xml:space="preserve">accept.</w:t>
       </w:r>
     </w:p>
-    <w:bookmarkEnd w:id="20"/>
-    <w:bookmarkStart w:id="21" w:name="Xe47ed403f4ce49fb25f912e3b7155b566fcd076"/>
+    <w:bookmarkEnd w:id="19"/>
+    <w:bookmarkStart w:id="20" w:name="Xe47ed403f4ce49fb25f912e3b7155b566fcd076"/>
     <w:p>
       <w:pPr>
         <w:pStyle w:val="Heading2"/>
@@ -2831,8 +2814,8 @@
         <w:t xml:space="preserve">signatures (for example, reduced post-task recall) documented in the cognitive-debt literature.</w:t>
       </w:r>
     </w:p>
-    <w:bookmarkEnd w:id="21"/>
-    <w:bookmarkStart w:id="22" w:name="X7e2be599b6fb27f7d4655c10155b63b05f9aa9d"/>
+    <w:bookmarkEnd w:id="20"/>
+    <w:bookmarkStart w:id="21" w:name="X7e2be599b6fb27f7d4655c10155b63b05f9aa9d"/>
     <w:p>
       <w:pPr>
         <w:pStyle w:val="Heading2"/>
@@ -4299,8 +4282,8 @@
         <w:t xml:space="preserve">consequential (the skills can be measured apart).</w:t>
       </w:r>
     </w:p>
-    <w:bookmarkEnd w:id="22"/>
-    <w:bookmarkStart w:id="23" w:name="Xeee0f31b39981a3e100f5aaf50a49be1e1b4285"/>
+    <w:bookmarkEnd w:id="21"/>
+    <w:bookmarkStart w:id="22" w:name="Xeee0f31b39981a3e100f5aaf50a49be1e1b4285"/>
     <w:p>
       <w:pPr>
         <w:pStyle w:val="Heading2"/>
@@ -4668,8 +4651,8 @@
         <w:t xml:space="preserve">the instrument that produces those scores.</w:t>
       </w:r>
     </w:p>
-    <w:bookmarkEnd w:id="23"/>
-    <w:bookmarkStart w:id="24" w:name="X3d8be0d8bf4ad30b87d3536652355afd0bfa982"/>
+    <w:bookmarkEnd w:id="22"/>
+    <w:bookmarkStart w:id="23" w:name="X3d8be0d8bf4ad30b87d3536652355afd0bfa982"/>
     <w:p>
       <w:pPr>
         <w:pStyle w:val="Heading2"/>
@@ -4998,8 +4981,8 @@
         <w:t xml:space="preserve">is the separate validity question addressed by the prepared study in Section 10.</w:t>
       </w:r>
     </w:p>
-    <w:bookmarkEnd w:id="24"/>
-    <w:bookmarkStart w:id="31" w:name="X4d8e342cb22c9aa3a4677d1e6b5af262e28c318"/>
+    <w:bookmarkEnd w:id="23"/>
+    <w:bookmarkStart w:id="30" w:name="X4d8e342cb22c9aa3a4677d1e6b5af262e28c318"/>
     <w:p>
       <w:pPr>
         <w:pStyle w:val="Heading2"/>
@@ -6322,18 +6305,18 @@
           <wp:inline>
             <wp:extent cx="4600754" cy="3864633"/>
             <wp:effectExtent b="0" l="0" r="0" t="0"/>
-            <wp:docPr descr="Figure 2. Own-competence effects dominate cross-competence effects on every skill's grade." title="" id="26" name="Picture"/>
+            <wp:docPr descr="Figure 2. Own-competence effects dominate cross-competence effects on every skill's grade." title="" id="25" name="Picture"/>
             <a:graphic>
               <a:graphicData uri="http://schemas.openxmlformats.org/drawingml/2006/picture">
                 <pic:pic>
                   <pic:nvPicPr>
-                    <pic:cNvPr descr="assets/fig_dissociation_heatmap.png" id="27" name="Picture"/>
+                    <pic:cNvPr descr="assets/fig_dissociation_heatmap.png" id="26" name="Picture"/>
                     <pic:cNvPicPr>
                       <a:picLocks noChangeArrowheads="1" noChangeAspect="1"/>
                     </pic:cNvPicPr>
                   </pic:nvPicPr>
                   <pic:blipFill>
-                    <a:blip r:embed="rId25"/>
+                    <a:blip r:embed="rId24"/>
                     <a:stretch>
                       <a:fillRect/>
                     </a:stretch>
@@ -6404,18 +6387,18 @@
           <wp:inline>
             <wp:extent cx="5943600" cy="3302000"/>
             <wp:effectExtent b="0" l="0" r="0" t="0"/>
-            <wp:docPr descr="Figure 3. Per-skill grades dissociate by competence profile." title="" id="29" name="Picture"/>
+            <wp:docPr descr="Figure 3. Per-skill grades dissociate by competence profile." title="" id="28" name="Picture"/>
             <a:graphic>
               <a:graphicData uri="http://schemas.openxmlformats.org/drawingml/2006/picture">
                 <pic:pic>
                   <pic:nvPicPr>
-                    <pic:cNvPr descr="assets/fig_contrasts.png" id="30" name="Picture"/>
+                    <pic:cNvPr descr="assets/fig_contrasts.png" id="29" name="Picture"/>
                     <pic:cNvPicPr>
                       <a:picLocks noChangeArrowheads="1" noChangeAspect="1"/>
                     </pic:cNvPicPr>
                   </pic:nvPicPr>
                   <pic:blipFill>
-                    <a:blip r:embed="rId28"/>
+                    <a:blip r:embed="rId27"/>
                     <a:stretch>
                       <a:fillRect/>
                     </a:stretch>
@@ -6913,8 +6896,8 @@
         <w:t xml:space="preserve">the validation study supplies.</w:t>
       </w:r>
     </w:p>
-    <w:bookmarkEnd w:id="31"/>
-    <w:bookmarkStart w:id="32" w:name="Xa46466f38120f8ee74cb65c819a5bdd7729dab3"/>
+    <w:bookmarkEnd w:id="30"/>
+    <w:bookmarkStart w:id="31" w:name="Xa46466f38120f8ee74cb65c819a5bdd7729dab3"/>
     <w:p>
       <w:pPr>
         <w:pStyle w:val="Heading2"/>
@@ -7157,8 +7140,8 @@
         <w:t xml:space="preserve">expert frontier.</w:t>
       </w:r>
     </w:p>
-    <w:bookmarkEnd w:id="32"/>
-    <w:bookmarkStart w:id="33" w:name="Xba3f6dd9d03393d7b20e910759a94d79249c978"/>
+    <w:bookmarkEnd w:id="31"/>
+    <w:bookmarkStart w:id="32" w:name="Xba3f6dd9d03393d7b20e910759a94d79249c978"/>
     <w:p>
       <w:pPr>
         <w:pStyle w:val="Heading2"/>
@@ -7511,8 +7494,8 @@
         <w:t xml:space="preserve">Proposition P5 and any learning claim; that is explicitly outside the present scope.</w:t>
       </w:r>
     </w:p>
-    <w:bookmarkEnd w:id="33"/>
-    <w:bookmarkStart w:id="34" w:name="X3d190d206b9dddd8a7dadd6848a844299fab8ec"/>
+    <w:bookmarkEnd w:id="32"/>
+    <w:bookmarkStart w:id="33" w:name="X3d190d206b9dddd8a7dadd6848a844299fab8ec"/>
     <w:p>
       <w:pPr>
         <w:pStyle w:val="Heading2"/>
@@ -7620,8 +7603,8 @@
         <w:t xml:space="preserve">boundary, and evidence that the three constructs are separable and automatically measurable.</w:t>
       </w:r>
     </w:p>
-    <w:bookmarkEnd w:id="34"/>
-    <w:bookmarkStart w:id="35" w:name="X5947723a0a79e017d648ec5789efc916be82fa3"/>
+    <w:bookmarkEnd w:id="33"/>
+    <w:bookmarkStart w:id="34" w:name="X5947723a0a79e017d648ec5789efc916be82fa3"/>
     <w:p>
       <w:pPr>
         <w:pStyle w:val="Heading2"/>
@@ -7681,8 +7664,8 @@
         <w:t xml:space="preserve">measured apart. We offer it as a foundation for the assessment and instruction the moment demands.</w:t>
       </w:r>
     </w:p>
-    <w:bookmarkEnd w:id="35"/>
-    <w:bookmarkStart w:id="42" w:name="appendix-a-system-walkthrough"/>
+    <w:bookmarkEnd w:id="34"/>
+    <w:bookmarkStart w:id="41" w:name="appendix-a-system-walkthrough"/>
     <w:p>
       <w:pPr>
         <w:pStyle w:val="Heading2"/>
@@ -7755,12 +7738,12 @@
           <wp:inline>
             <wp:extent cx="5943600" cy="3037840"/>
             <wp:effectExtent b="0" l="0" r="0" t="0"/>
-            <wp:docPr descr="Figure A1. A CoReasoning Lab challenge run." title="" id="37" name="Picture"/>
+            <wp:docPr descr="Figure A1. A CoReasoning Lab challenge run." title="" id="36" name="Picture"/>
             <a:graphic>
               <a:graphicData uri="http://schemas.openxmlformats.org/drawingml/2006/picture">
                 <pic:pic>
                   <pic:nvPicPr>
-                    <pic:cNvPr descr="assets/system-mockup.svg" id="38" name="Picture"/>
+                    <pic:cNvPr descr="assets/system-mockup.svg" id="37" name="Picture"/>
                     <pic:cNvPicPr>
                       <a:picLocks noChangeArrowheads="1" noChangeAspect="1"/>
                     </pic:cNvPicPr>
@@ -7772,7 +7755,7 @@
                           <a14:useLocalDpi xmlns:a14="http://schemas.microsoft.com/office/drawing/2010/main" val="0"/>
                         </a:ext>
                         <a:ext uri="{96DAC541-7B7A-43D3-8B79-37D633B846F1}">
-                          <asvg:svgBlip xmlns:asvg="http://schemas.microsoft.com/office/drawing/2016/SVG/main" r:embed="rId36"/>
+                          <asvg:svgBlip xmlns:asvg="http://schemas.microsoft.com/office/drawing/2016/SVG/main" r:embed="rId35"/>
                         </a:ext>
                       </a:extLst>
                     </a:blip>
@@ -7887,12 +7870,12 @@
           <wp:inline>
             <wp:extent cx="5943600" cy="4173165"/>
             <wp:effectExtent b="0" l="0" r="0" t="0"/>
-            <wp:docPr descr="Figure A2. CoReasoning Lab role interfaces." title="" id="40" name="Picture"/>
+            <wp:docPr descr="Figure A2. CoReasoning Lab role interfaces." title="" id="39" name="Picture"/>
             <a:graphic>
               <a:graphicData uri="http://schemas.openxmlformats.org/drawingml/2006/picture">
                 <pic:pic>
                   <pic:nvPicPr>
-                    <pic:cNvPr descr="assets/interface-gallery.svg" id="41" name="Picture"/>
+                    <pic:cNvPr descr="assets/interface-gallery.svg" id="40" name="Picture"/>
                     <pic:cNvPicPr>
                       <a:picLocks noChangeArrowheads="1" noChangeAspect="1"/>
                     </pic:cNvPicPr>
@@ -7904,7 +7887,7 @@
                           <a14:useLocalDpi xmlns:a14="http://schemas.microsoft.com/office/drawing/2010/main" val="0"/>
                         </a:ext>
                         <a:ext uri="{96DAC541-7B7A-43D3-8B79-37D633B846F1}">
-                          <asvg:svgBlip xmlns:asvg="http://schemas.microsoft.com/office/drawing/2016/SVG/main" r:embed="rId39"/>
+                          <asvg:svgBlip xmlns:asvg="http://schemas.microsoft.com/office/drawing/2016/SVG/main" r:embed="rId38"/>
                         </a:ext>
                       </a:extLst>
                     </a:blip>
@@ -7992,8 +7975,8 @@
         <w:t xml:space="preserve">Steering independently.</w:t>
       </w:r>
     </w:p>
-    <w:bookmarkEnd w:id="42"/>
-    <w:bookmarkStart w:id="43" w:name="references"/>
+    <w:bookmarkEnd w:id="41"/>
+    <w:bookmarkStart w:id="42" w:name="references"/>
     <w:p>
       <w:pPr>
         <w:pStyle w:val="ReferencesHeading"/>
@@ -9381,10 +9364,10 @@
         <w:t xml:space="preserve">.</w:t>
       </w:r>
     </w:p>
+    <w:bookmarkEnd w:id="42"/>
     <w:bookmarkEnd w:id="43"/>
-    <w:bookmarkEnd w:id="44"/>
     <w:sectPr>
-      <w:footerReference w:type="default" r:id="rId10"/>
+      <w:footerReference w:type="default" r:id="rId9"/>
       <w:pgSz w:h="15840" w:w="12240"/>
       <w:pgMar w:bottom="1440" w:footer="720" w:gutter="0" w:header="720" w:left="1440" w:right="1440" w:top="1440"/>
       <w:cols w:space="720"/>

</xml_diff>

<commit_message>
docx: embed all figures via updated html2doc skill; simplify build script
The html2doc skill now strips the download button and rasterizes SVG figures
itself, so paper/build_docx.sh no longer needs the manual button-strip step.
Regenerated coreasoning.docx now embeds all five figures (Figure 1 architecture
and the two appendix interface figures were previously dropped as un-embeddable SVG).

Co-Authored-By: Claude Opus 4.8 <noreply@anthropic.com>
</commit_message>
<xml_diff>
--- a/docs/coreasoning.docx
+++ b/docs/coreasoning.docx
@@ -27,25 +27,49 @@
       </w:pPr>
       <w:r>
         <w:rPr>
+          <w:rFonts w:ascii="Times New Roman" w:hAnsi="Times New Roman"/>
           <w:b/>
           <w:bCs/>
+          <w:i w:val="0"/>
+          <w:sz w:val="24"/>
         </w:rPr>
         <w:t xml:space="preserve">Alexander Apartsin</w:t>
       </w:r>
       <w:r>
+        <w:rPr>
+          <w:rFonts w:ascii="Times New Roman" w:hAnsi="Times New Roman"/>
+          <w:b/>
+          <w:i w:val="0"/>
+          <w:sz w:val="24"/>
+        </w:rPr>
         <w:t xml:space="preserve">¹ and</w:t>
       </w:r>
       <w:r>
-        <w:t xml:space="preserve"> </w:t>
-      </w:r>
-      <w:r>
         <w:rPr>
+          <w:rFonts w:ascii="Times New Roman" w:hAnsi="Times New Roman"/>
+          <w:b/>
+          <w:i w:val="0"/>
+          <w:sz w:val="24"/>
+        </w:rPr>
+        <w:t xml:space="preserve"> </w:t>
+      </w:r>
+      <w:r>
+        <w:rPr>
+          <w:rFonts w:ascii="Times New Roman" w:hAnsi="Times New Roman"/>
           <w:b/>
           <w:bCs/>
+          <w:i w:val="0"/>
+          <w:sz w:val="24"/>
         </w:rPr>
         <w:t xml:space="preserve">Yehudit Aperstein</w:t>
       </w:r>
       <w:r>
+        <w:rPr>
+          <w:rFonts w:ascii="Times New Roman" w:hAnsi="Times New Roman"/>
+          <w:b/>
+          <w:i w:val="0"/>
+          <w:sz w:val="24"/>
+        </w:rPr>
         <w:t xml:space="preserve">²</w:t>
       </w:r>
     </w:p>
@@ -60,6 +84,9 @@
       </w:pPr>
       <w:r>
         <w:rPr>
+          <w:rFonts w:ascii="Times New Roman" w:hAnsi="Times New Roman"/>
+          <w:b w:val="0"/>
+          <w:i/>
           <w:sz w:val="20"/>
         </w:rPr>
         <w:t xml:space="preserve">¹ Holon Institute of Technology · ² Afeka College of Engineering</w:t>
@@ -1655,22 +1682,13 @@
               <a:graphicData uri="http://schemas.openxmlformats.org/drawingml/2006/picture">
                 <pic:pic>
                   <pic:nvPicPr>
-                    <pic:cNvPr descr="assets/coreasoning-architecture.svg" id="14" name="Picture"/>
+                    <pic:cNvPr descr="C:/Users/apart/AppData/Local/Temp/html2doc_svg_fpSWdh/svg_0.png" id="14" name="Picture"/>
                     <pic:cNvPicPr>
                       <a:picLocks noChangeArrowheads="1" noChangeAspect="1"/>
                     </pic:cNvPicPr>
                   </pic:nvPicPr>
                   <pic:blipFill>
-                    <a:blip>
-                      <a:extLst>
-                        <a:ext uri="{28A0092B-C50C-407E-A947-70E740481C1C}">
-                          <a14:useLocalDpi xmlns:a14="http://schemas.microsoft.com/office/drawing/2010/main" val="0"/>
-                        </a:ext>
-                        <a:ext uri="{96DAC541-7B7A-43D3-8B79-37D633B846F1}">
-                          <asvg:svgBlip xmlns:asvg="http://schemas.microsoft.com/office/drawing/2016/SVG/main" r:embed="rId12"/>
-                        </a:ext>
-                      </a:extLst>
-                    </a:blip>
+                    <a:blip r:embed="rId12"/>
                     <a:stretch>
                       <a:fillRect/>
                     </a:stretch>
@@ -7743,22 +7761,13 @@
               <a:graphicData uri="http://schemas.openxmlformats.org/drawingml/2006/picture">
                 <pic:pic>
                   <pic:nvPicPr>
-                    <pic:cNvPr descr="assets/system-mockup.svg" id="37" name="Picture"/>
+                    <pic:cNvPr descr="C:/Users/apart/AppData/Local/Temp/html2doc_svg_fpSWdh/svg_1.png" id="37" name="Picture"/>
                     <pic:cNvPicPr>
                       <a:picLocks noChangeArrowheads="1" noChangeAspect="1"/>
                     </pic:cNvPicPr>
                   </pic:nvPicPr>
                   <pic:blipFill>
-                    <a:blip>
-                      <a:extLst>
-                        <a:ext uri="{28A0092B-C50C-407E-A947-70E740481C1C}">
-                          <a14:useLocalDpi xmlns:a14="http://schemas.microsoft.com/office/drawing/2010/main" val="0"/>
-                        </a:ext>
-                        <a:ext uri="{96DAC541-7B7A-43D3-8B79-37D633B846F1}">
-                          <asvg:svgBlip xmlns:asvg="http://schemas.microsoft.com/office/drawing/2016/SVG/main" r:embed="rId35"/>
-                        </a:ext>
-                      </a:extLst>
-                    </a:blip>
+                    <a:blip r:embed="rId35"/>
                     <a:stretch>
                       <a:fillRect/>
                     </a:stretch>
@@ -7875,22 +7884,13 @@
               <a:graphicData uri="http://schemas.openxmlformats.org/drawingml/2006/picture">
                 <pic:pic>
                   <pic:nvPicPr>
-                    <pic:cNvPr descr="assets/interface-gallery.svg" id="40" name="Picture"/>
+                    <pic:cNvPr descr="C:/Users/apart/AppData/Local/Temp/html2doc_svg_fpSWdh/svg_2.png" id="40" name="Picture"/>
                     <pic:cNvPicPr>
                       <a:picLocks noChangeArrowheads="1" noChangeAspect="1"/>
                     </pic:cNvPicPr>
                   </pic:nvPicPr>
                   <pic:blipFill>
-                    <a:blip>
-                      <a:extLst>
-                        <a:ext uri="{28A0092B-C50C-407E-A947-70E740481C1C}">
-                          <a14:useLocalDpi xmlns:a14="http://schemas.microsoft.com/office/drawing/2010/main" val="0"/>
-                        </a:ext>
-                        <a:ext uri="{96DAC541-7B7A-43D3-8B79-37D633B846F1}">
-                          <asvg:svgBlip xmlns:asvg="http://schemas.microsoft.com/office/drawing/2016/SVG/main" r:embed="rId38"/>
-                        </a:ext>
-                      </a:extLst>
-                    </a:blip>
+                    <a:blip r:embed="rId38"/>
                     <a:stretch>
                       <a:fillRect/>
                     </a:stretch>

</xml_diff>

<commit_message>
v2: paper-reviewer pass: add Table 3 (MTMM validity), clear tone audit
Self-consistency audit: 0 phantom sections, figures 1-4/A1-A2 consistent, abstract-body
parity holds, 0 em-dashes. Two fixes from the reviewer pass:
- SC-7 (numbers must live in a table): added Table 3 summarizing the multitrait-
  multimethod validity (cross-grader convergent rho per skill; inter-skill rho for
  independent vs shared-ability populations). Numbers were previously prose-only.
- Tone audit -> 0 hits: rephrased two legitimate 'merely' uses.

Co-Authored-By: Claude Opus 4.8 <noreply@anthropic.com>
</commit_message>
<xml_diff>
--- a/docs/coreasoning.docx
+++ b/docs/coreasoning.docx
@@ -865,7 +865,7 @@
               <a:graphicData uri="http://schemas.openxmlformats.org/drawingml/2006/picture">
                 <pic:pic>
                   <pic:nvPicPr>
-                    <pic:cNvPr descr="C:/Users/apart/AppData/Local/Temp/html2doc_svg_pv4k6W/svg_0.png" id="12" name="Picture"/>
+                    <pic:cNvPr descr="C:/Users/apart/AppData/Local/Temp/html2doc_svg_tLCsAb/svg_0.png" id="12" name="Picture"/>
                     <pic:cNvPicPr>
                       <a:picLocks noChangeArrowheads="1" noChangeAspect="1"/>
                     </pic:cNvPicPr>
@@ -1907,7 +1907,7 @@
         <w:t xml:space="preserve"> </w:t>
       </w:r>
       <w:r>
-        <w:t xml:space="preserve">structural spine of the framework and the reason the three skills cohere rather than merely coexist</w:t>
+        <w:t xml:space="preserve">structural spine of the framework and the reason the three skills cohere rather than coexist by stipulation</w:t>
       </w:r>
       <w:r>
         <w:t xml:space="preserve"> </w:t>
@@ -1934,7 +1934,7 @@
               <a:graphicData uri="http://schemas.openxmlformats.org/drawingml/2006/picture">
                 <pic:pic>
                   <pic:nvPicPr>
-                    <pic:cNvPr descr="C:/Users/apart/AppData/Local/Temp/html2doc_svg_pv4k6W/svg_1.png" id="17" name="Picture"/>
+                    <pic:cNvPr descr="C:/Users/apart/AppData/Local/Temp/html2doc_svg_tLCsAb/svg_1.png" id="17" name="Picture"/>
                     <pic:cNvPicPr>
                       <a:picLocks noChangeArrowheads="1" noChangeAspect="1"/>
                     </pic:cNvPicPr>
@@ -4451,7 +4451,7 @@
         <w:t xml:space="preserve"> </w:t>
       </w:r>
       <w:r>
-        <w:t xml:space="preserve">that require students to specify and evaluate rather than merely prompt (Denny et al., 2024), and</w:t>
+        <w:t xml:space="preserve">that require students to specify and evaluate rather than only prompt (Denny et al., 2024), and</w:t>
       </w:r>
       <w:r>
         <w:t xml:space="preserve"> </w:t>
@@ -6795,12 +6795,871 @@
         <w:t xml:space="preserve"> </w:t>
       </w:r>
       <w:r>
-        <w:t xml:space="preserve">skills rather than of the scoring.</w:t>
+        <w:t xml:space="preserve">skills rather than of the scoring (Table 3).</w:t>
       </w:r>
     </w:p>
     <w:p>
       <w:pPr>
+        <w:pStyle w:val="TableCaption"/>
+        <w:spacing w:before="160" w:after="60" w:line="240" w:lineRule="auto"/>
+        <w:jc w:val="center"/>
+        <w:keepNext/>
+        <w:keepLines/>
+        <w:widowControl w:val="1"/>
+      </w:pPr>
+      <w:r>
+        <w:rPr>
+          <w:b/>
+          <w:bCs/>
+        </w:rPr>
+        <w:t xml:space="preserve">Table 3. Multitrait-multimethod validity.</w:t>
+      </w:r>
+      <w:r>
+        <w:t xml:space="preserve"> </w:t>
+      </w:r>
+      <w:r>
+        <w:t xml:space="preserve">Panel A: convergent agreement of the same skill across</w:t>
+      </w:r>
+      <w:r>
+        <w:t xml:space="preserve"> </w:t>
+      </w:r>
+      <w:r>
+        <w:t xml:space="preserve">the three grader backends (mean pairwise per-learner rank correlation on the 40 shared transcripts).</w:t>
+      </w:r>
+      <w:r>
+        <w:t xml:space="preserve"> </w:t>
+      </w:r>
+      <w:r>
+        <w:t xml:space="preserve">Panel B: inter-skill grade correlation by population, showing the instrument recovers the population's</w:t>
+      </w:r>
+      <w:r>
+        <w:t xml:space="preserve"> </w:t>
+      </w:r>
+      <w:r>
+        <w:t xml:space="preserve">dependence structure (discriminant when competences are independent, convergent when they are shared).</w:t>
+      </w:r>
+    </w:p>
+    <w:tbl>
+      <w:tblPr>
+        <w:tblStyle w:val="Table"/>
+        <w:tblW w:type="pct" w:w="5000"/>
+        <w:jc w:val="center"/>
+        <w:tblLook w:firstRow="1" w:lastRow="0" w:firstColumn="0" w:lastColumn="0" w:noHBand="0" w:noVBand="0" w:val="0020"/>
+        <w:tblLayout w:type="autofit"/>
+        <w:tblBorders>
+          <w:top w:val="single" w:sz="10" w:color="4F6272"/>
+          <w:bottom w:val="single" w:sz="10" w:color="4F6272"/>
+          <w:insideH w:val="single" w:sz="5" w:color="9FB0C2"/>
+          <w:left w:val="single" w:sz="6" w:color="9FB0C2"/>
+          <w:right w:val="single" w:sz="6" w:color="9FB0C2"/>
+          <w:insideV w:val="single" w:sz="5" w:color="D9E1E8"/>
+        </w:tblBorders>
+      </w:tblPr>
+      <w:tblGrid>
+        <w:gridCol w:w="1980"/>
+        <w:gridCol w:w="1980"/>
+        <w:gridCol w:w="1980"/>
+        <w:gridCol w:w="1980"/>
+      </w:tblGrid>
+      <w:tr>
+        <w:trPr>
+          <w:tblHeader w:val="on"/>
+        </w:trPr>
+        <w:tc>
+          <w:tcPr>
+            <w:shd w:fill="EEF3F7"/>
+            <w:tcBorders>
+              <w:left w:val="nil"/>
+              <w:right w:val="nil"/>
+              <w:top w:val="nil"/>
+              <w:bottom w:val="single" w:sz="8" w:color="9FB0C2"/>
+            </w:tcBorders>
+          </w:tcPr>
+          <w:p>
+            <w:pPr>
+              <w:pStyle w:val="Compact"/>
+              <w:spacing w:before="0" w:after="20" w:line="240" w:lineRule="auto"/>
+              <w:jc w:val="center"/>
+              <w:keepNext w:val="0"/>
+              <w:keepLines/>
+              <w:widowControl w:val="1"/>
+            </w:pPr>
+            <w:r>
+              <w:rPr>
+                <w:rFonts w:ascii="Times New Roman" w:hAnsi="Times New Roman"/>
+                <w:b/>
+                <w:sz w:val="19"/>
+              </w:rPr>
+              <w:t xml:space="preserve">Panel A: cross-grader convergent (</w:t>
+            </w:r>
+            <m:oMath>
+              <m:r>
+                <m:t>ρ</m:t>
+              </m:r>
+            </m:oMath>
+            <w:r>
+              <w:rPr>
+                <w:rFonts w:ascii="Times New Roman" w:hAnsi="Times New Roman"/>
+                <w:b/>
+                <w:sz w:val="19"/>
+              </w:rPr>
+              <w:t xml:space="preserve">, 3 backends)</w:t>
+            </w:r>
+          </w:p>
+        </w:tc>
+        <w:tc>
+          <w:tcPr>
+            <w:shd w:fill="EEF3F7"/>
+            <w:tcBorders>
+              <w:left w:val="nil"/>
+              <w:right w:val="nil"/>
+              <w:top w:val="nil"/>
+              <w:bottom w:val="single" w:sz="8" w:color="9FB0C2"/>
+            </w:tcBorders>
+          </w:tcPr>
+          <w:p>
+            <w:pPr>
+              <w:pStyle w:val="Compact"/>
+              <w:spacing w:before="0" w:after="20" w:line="240" w:lineRule="auto"/>
+              <w:jc w:val="center"/>
+              <w:keepNext w:val="0"/>
+              <w:keepLines/>
+              <w:widowControl w:val="1"/>
+            </w:pPr>
+            <w:r>
+              <w:rPr>
+                <w:rFonts w:ascii="Times New Roman" w:hAnsi="Times New Roman"/>
+                <w:b/>
+                <w:sz w:val="19"/>
+              </w:rPr>
+              <w:t xml:space="preserve">Framing</w:t>
+            </w:r>
+          </w:p>
+        </w:tc>
+        <w:tc>
+          <w:tcPr>
+            <w:shd w:fill="EEF3F7"/>
+            <w:tcBorders>
+              <w:left w:val="nil"/>
+              <w:right w:val="nil"/>
+              <w:top w:val="nil"/>
+              <w:bottom w:val="single" w:sz="8" w:color="9FB0C2"/>
+            </w:tcBorders>
+          </w:tcPr>
+          <w:p>
+            <w:pPr>
+              <w:pStyle w:val="Compact"/>
+              <w:spacing w:before="0" w:after="20" w:line="240" w:lineRule="auto"/>
+              <w:jc w:val="center"/>
+              <w:keepNext w:val="0"/>
+              <w:keepLines/>
+              <w:widowControl w:val="1"/>
+            </w:pPr>
+            <w:r>
+              <w:rPr>
+                <w:rFonts w:ascii="Times New Roman" w:hAnsi="Times New Roman"/>
+                <w:b/>
+                <w:sz w:val="19"/>
+              </w:rPr>
+              <w:t xml:space="preserve">Judging</w:t>
+            </w:r>
+          </w:p>
+        </w:tc>
+        <w:tc>
+          <w:tcPr>
+            <w:shd w:fill="EEF3F7"/>
+            <w:tcBorders>
+              <w:left w:val="nil"/>
+              <w:right w:val="nil"/>
+              <w:top w:val="nil"/>
+              <w:bottom w:val="single" w:sz="8" w:color="9FB0C2"/>
+            </w:tcBorders>
+          </w:tcPr>
+          <w:p>
+            <w:pPr>
+              <w:pStyle w:val="Compact"/>
+              <w:spacing w:before="0" w:after="20" w:line="240" w:lineRule="auto"/>
+              <w:jc w:val="center"/>
+              <w:keepNext w:val="0"/>
+              <w:keepLines/>
+              <w:widowControl w:val="1"/>
+            </w:pPr>
+            <w:r>
+              <w:rPr>
+                <w:rFonts w:ascii="Times New Roman" w:hAnsi="Times New Roman"/>
+                <w:b/>
+                <w:sz w:val="19"/>
+              </w:rPr>
+              <w:t xml:space="preserve">Steering</w:t>
+            </w:r>
+          </w:p>
+        </w:tc>
+      </w:tr>
+      <w:tr>
+        <w:tc>
+          <w:tcPr>
+            <w:tcBorders>
+              <w:left w:val="nil"/>
+              <w:right w:val="nil"/>
+              <w:top w:val="nil"/>
+              <w:bottom w:val="nil"/>
+            </w:tcBorders>
+          </w:tcPr>
+          <w:p>
+            <w:pPr>
+              <w:pStyle w:val="Compact"/>
+              <w:spacing w:before="0" w:after="20" w:line="240" w:lineRule="auto"/>
+              <w:jc w:val="center"/>
+              <w:keepNext w:val="0"/>
+              <w:keepLines/>
+              <w:widowControl w:val="1"/>
+            </w:pPr>
+            <w:r>
+              <w:rPr>
+                <w:rFonts w:ascii="Times New Roman" w:hAnsi="Times New Roman"/>
+                <w:sz w:val="20"/>
+              </w:rPr>
+              <w:t xml:space="preserve">same skill across gpt-4o, gpt-4o-mini, llama-3.3-70b</w:t>
+            </w:r>
+          </w:p>
+        </w:tc>
+        <w:tc>
+          <w:tcPr>
+            <w:tcBorders>
+              <w:left w:val="nil"/>
+              <w:right w:val="nil"/>
+              <w:top w:val="nil"/>
+              <w:bottom w:val="nil"/>
+            </w:tcBorders>
+          </w:tcPr>
+          <w:p>
+            <w:pPr>
+              <w:pStyle w:val="Compact"/>
+              <w:spacing w:before="0" w:after="20" w:line="240" w:lineRule="auto"/>
+              <w:jc w:val="center"/>
+              <w:keepNext w:val="0"/>
+              <w:keepLines/>
+              <w:widowControl w:val="1"/>
+            </w:pPr>
+            <w:r>
+              <w:rPr>
+                <w:rFonts w:ascii="Times New Roman" w:hAnsi="Times New Roman"/>
+                <w:b/>
+                <w:bCs/>
+                <w:sz w:val="20"/>
+              </w:rPr>
+              <w:t xml:space="preserve">+0.57</w:t>
+            </w:r>
+          </w:p>
+        </w:tc>
+        <w:tc>
+          <w:tcPr>
+            <w:tcBorders>
+              <w:left w:val="nil"/>
+              <w:right w:val="nil"/>
+              <w:top w:val="nil"/>
+              <w:bottom w:val="nil"/>
+            </w:tcBorders>
+          </w:tcPr>
+          <w:p>
+            <w:pPr>
+              <w:pStyle w:val="Compact"/>
+              <w:spacing w:before="0" w:after="20" w:line="240" w:lineRule="auto"/>
+              <w:jc w:val="center"/>
+              <w:keepNext w:val="0"/>
+              <w:keepLines/>
+              <w:widowControl w:val="1"/>
+            </w:pPr>
+            <w:r>
+              <w:rPr>
+                <w:rFonts w:ascii="Times New Roman" w:hAnsi="Times New Roman"/>
+                <w:b/>
+                <w:bCs/>
+                <w:sz w:val="20"/>
+              </w:rPr>
+              <w:t xml:space="preserve">+0.67</w:t>
+            </w:r>
+          </w:p>
+        </w:tc>
+        <w:tc>
+          <w:tcPr>
+            <w:tcBorders>
+              <w:left w:val="nil"/>
+              <w:right w:val="nil"/>
+              <w:top w:val="nil"/>
+              <w:bottom w:val="nil"/>
+            </w:tcBorders>
+          </w:tcPr>
+          <w:p>
+            <w:pPr>
+              <w:pStyle w:val="Compact"/>
+              <w:spacing w:before="0" w:after="20" w:line="240" w:lineRule="auto"/>
+              <w:jc w:val="center"/>
+              <w:keepNext w:val="0"/>
+              <w:keepLines/>
+              <w:widowControl w:val="1"/>
+            </w:pPr>
+            <w:r>
+              <w:rPr>
+                <w:rFonts w:ascii="Times New Roman" w:hAnsi="Times New Roman"/>
+                <w:sz w:val="20"/>
+              </w:rPr>
+              <w:t xml:space="preserve">+0.21</w:t>
+            </w:r>
+          </w:p>
+        </w:tc>
+      </w:tr>
+    </w:tbl>
+    <w:p/>
+    <w:tbl>
+      <w:tblPr>
+        <w:tblStyle w:val="Table"/>
+        <w:tblW w:type="pct" w:w="5000"/>
+        <w:jc w:val="center"/>
+        <w:tblLook w:firstRow="1" w:lastRow="0" w:firstColumn="0" w:lastColumn="0" w:noHBand="0" w:noVBand="0" w:val="0020"/>
+        <w:tblLayout w:type="autofit"/>
+        <w:tblBorders>
+          <w:top w:val="single" w:sz="10" w:color="4F6272"/>
+          <w:bottom w:val="single" w:sz="10" w:color="4F6272"/>
+          <w:insideH w:val="single" w:sz="5" w:color="9FB0C2"/>
+          <w:left w:val="single" w:sz="6" w:color="9FB0C2"/>
+          <w:right w:val="single" w:sz="6" w:color="9FB0C2"/>
+          <w:insideV w:val="single" w:sz="5" w:color="D9E1E8"/>
+        </w:tblBorders>
+      </w:tblPr>
+      <w:tblGrid>
+        <w:gridCol w:w="1584"/>
+        <w:gridCol w:w="1584"/>
+        <w:gridCol w:w="1584"/>
+        <w:gridCol w:w="1584"/>
+        <w:gridCol w:w="1584"/>
+      </w:tblGrid>
+      <w:tr>
+        <w:trPr>
+          <w:tblHeader w:val="on"/>
+        </w:trPr>
+        <w:tc>
+          <w:tcPr>
+            <w:shd w:fill="EEF3F7"/>
+            <w:tcBorders>
+              <w:left w:val="nil"/>
+              <w:right w:val="nil"/>
+              <w:top w:val="nil"/>
+              <w:bottom w:val="single" w:sz="8" w:color="9FB0C2"/>
+            </w:tcBorders>
+          </w:tcPr>
+          <w:p>
+            <w:pPr>
+              <w:pStyle w:val="Compact"/>
+              <w:spacing w:before="0" w:after="20" w:line="240" w:lineRule="auto"/>
+              <w:jc w:val="center"/>
+              <w:keepNext w:val="0"/>
+              <w:keepLines/>
+              <w:widowControl w:val="1"/>
+            </w:pPr>
+            <w:r>
+              <w:rPr>
+                <w:rFonts w:ascii="Times New Roman" w:hAnsi="Times New Roman"/>
+                <w:b/>
+                <w:sz w:val="19"/>
+              </w:rPr>
+              <w:t xml:space="preserve">Panel B: inter-skill</w:t>
+            </w:r>
+            <w:r>
+              <w:rPr>
+                <w:rFonts w:ascii="Times New Roman" w:hAnsi="Times New Roman"/>
+                <w:b/>
+                <w:sz w:val="19"/>
+              </w:rPr>
+              <w:t xml:space="preserve"> </w:t>
+            </w:r>
+            <m:oMath>
+              <m:r>
+                <m:t>ρ</m:t>
+              </m:r>
+            </m:oMath>
+            <w:r>
+              <w:rPr>
+                <w:rFonts w:ascii="Times New Roman" w:hAnsi="Times New Roman"/>
+                <w:b/>
+                <w:sz w:val="19"/>
+              </w:rPr>
+              <w:t xml:space="preserve"> </w:t>
+            </w:r>
+            <w:r>
+              <w:rPr>
+                <w:rFonts w:ascii="Times New Roman" w:hAnsi="Times New Roman"/>
+                <w:b/>
+                <w:sz w:val="19"/>
+              </w:rPr>
+              <w:t xml:space="preserve">by population</w:t>
+            </w:r>
+          </w:p>
+        </w:tc>
+        <w:tc>
+          <w:tcPr>
+            <w:shd w:fill="EEF3F7"/>
+            <w:tcBorders>
+              <w:left w:val="nil"/>
+              <w:right w:val="nil"/>
+              <w:top w:val="nil"/>
+              <w:bottom w:val="single" w:sz="8" w:color="9FB0C2"/>
+            </w:tcBorders>
+          </w:tcPr>
+          <w:p>
+            <w:pPr>
+              <w:pStyle w:val="Compact"/>
+              <w:spacing w:before="0" w:after="20" w:line="240" w:lineRule="auto"/>
+              <w:jc w:val="center"/>
+              <w:keepNext w:val="0"/>
+              <w:keepLines/>
+              <w:widowControl w:val="1"/>
+            </w:pPr>
+            <w:r>
+              <w:rPr>
+                <w:rFonts w:ascii="Times New Roman" w:hAnsi="Times New Roman"/>
+                <w:b/>
+                <w:sz w:val="19"/>
+              </w:rPr>
+              <w:t xml:space="preserve">F-J</w:t>
+            </w:r>
+          </w:p>
+        </w:tc>
+        <w:tc>
+          <w:tcPr>
+            <w:shd w:fill="EEF3F7"/>
+            <w:tcBorders>
+              <w:left w:val="nil"/>
+              <w:right w:val="nil"/>
+              <w:top w:val="nil"/>
+              <w:bottom w:val="single" w:sz="8" w:color="9FB0C2"/>
+            </w:tcBorders>
+          </w:tcPr>
+          <w:p>
+            <w:pPr>
+              <w:pStyle w:val="Compact"/>
+              <w:spacing w:before="0" w:after="20" w:line="240" w:lineRule="auto"/>
+              <w:jc w:val="center"/>
+              <w:keepNext w:val="0"/>
+              <w:keepLines/>
+              <w:widowControl w:val="1"/>
+            </w:pPr>
+            <w:r>
+              <w:rPr>
+                <w:rFonts w:ascii="Times New Roman" w:hAnsi="Times New Roman"/>
+                <w:b/>
+                <w:sz w:val="19"/>
+              </w:rPr>
+              <w:t xml:space="preserve">F-S</w:t>
+            </w:r>
+          </w:p>
+        </w:tc>
+        <w:tc>
+          <w:tcPr>
+            <w:shd w:fill="EEF3F7"/>
+            <w:tcBorders>
+              <w:left w:val="nil"/>
+              <w:right w:val="nil"/>
+              <w:top w:val="nil"/>
+              <w:bottom w:val="single" w:sz="8" w:color="9FB0C2"/>
+            </w:tcBorders>
+          </w:tcPr>
+          <w:p>
+            <w:pPr>
+              <w:pStyle w:val="Compact"/>
+              <w:spacing w:before="0" w:after="20" w:line="240" w:lineRule="auto"/>
+              <w:jc w:val="center"/>
+              <w:keepNext w:val="0"/>
+              <w:keepLines/>
+              <w:widowControl w:val="1"/>
+            </w:pPr>
+            <w:r>
+              <w:rPr>
+                <w:rFonts w:ascii="Times New Roman" w:hAnsi="Times New Roman"/>
+                <w:b/>
+                <w:sz w:val="19"/>
+              </w:rPr>
+              <w:t xml:space="preserve">J-S</w:t>
+            </w:r>
+          </w:p>
+        </w:tc>
+        <w:tc>
+          <w:tcPr>
+            <w:shd w:fill="EEF3F7"/>
+            <w:tcBorders>
+              <w:left w:val="nil"/>
+              <w:right w:val="nil"/>
+              <w:top w:val="nil"/>
+              <w:bottom w:val="single" w:sz="8" w:color="9FB0C2"/>
+            </w:tcBorders>
+          </w:tcPr>
+          <w:p>
+            <w:pPr>
+              <w:pStyle w:val="Compact"/>
+              <w:spacing w:before="0" w:after="20" w:line="240" w:lineRule="auto"/>
+              <w:jc w:val="center"/>
+              <w:keepNext w:val="0"/>
+              <w:keepLines/>
+              <w:widowControl w:val="1"/>
+            </w:pPr>
+            <w:r>
+              <w:rPr>
+                <w:rFonts w:ascii="Times New Roman" w:hAnsi="Times New Roman"/>
+                <w:b/>
+                <w:sz w:val="19"/>
+              </w:rPr>
+              <w:t xml:space="preserve">summary</w:t>
+            </w:r>
+          </w:p>
+        </w:tc>
+      </w:tr>
+      <w:tr>
+        <w:tc>
+          <w:tcPr>
+            <w:tcBorders>
+              <w:left w:val="nil"/>
+              <w:right w:val="nil"/>
+              <w:top w:val="nil"/>
+              <w:bottom w:val="single" w:sz="4" w:color="D9E1E8"/>
+            </w:tcBorders>
+          </w:tcPr>
+          <w:p>
+            <w:pPr>
+              <w:pStyle w:val="Compact"/>
+              <w:spacing w:before="0" w:after="20" w:line="240" w:lineRule="auto"/>
+              <w:jc w:val="center"/>
+              <w:keepNext w:val="0"/>
+              <w:keepLines/>
+              <w:widowControl w:val="1"/>
+            </w:pPr>
+            <w:r>
+              <w:rPr>
+                <w:rFonts w:ascii="Times New Roman" w:hAnsi="Times New Roman"/>
+                <w:sz w:val="20"/>
+              </w:rPr>
+              <w:t xml:space="preserve">independent (crossed) competences</w:t>
+            </w:r>
+          </w:p>
+        </w:tc>
+        <w:tc>
+          <w:tcPr>
+            <w:tcBorders>
+              <w:left w:val="nil"/>
+              <w:right w:val="nil"/>
+              <w:top w:val="nil"/>
+              <w:bottom w:val="single" w:sz="4" w:color="D9E1E8"/>
+            </w:tcBorders>
+          </w:tcPr>
+          <w:p>
+            <w:pPr>
+              <w:pStyle w:val="Compact"/>
+              <w:spacing w:before="0" w:after="20" w:line="240" w:lineRule="auto"/>
+              <w:jc w:val="center"/>
+              <w:keepNext w:val="0"/>
+              <w:keepLines/>
+              <w:widowControl w:val="1"/>
+            </w:pPr>
+            <w:r>
+              <w:rPr>
+                <w:rFonts w:ascii="Times New Roman" w:hAnsi="Times New Roman"/>
+                <w:sz w:val="20"/>
+              </w:rPr>
+              <w:t xml:space="preserve">−0.03</w:t>
+            </w:r>
+          </w:p>
+        </w:tc>
+        <w:tc>
+          <w:tcPr>
+            <w:tcBorders>
+              <w:left w:val="nil"/>
+              <w:right w:val="nil"/>
+              <w:top w:val="nil"/>
+              <w:bottom w:val="single" w:sz="4" w:color="D9E1E8"/>
+            </w:tcBorders>
+          </w:tcPr>
+          <w:p>
+            <w:pPr>
+              <w:pStyle w:val="Compact"/>
+              <w:spacing w:before="0" w:after="20" w:line="240" w:lineRule="auto"/>
+              <w:jc w:val="center"/>
+              <w:keepNext w:val="0"/>
+              <w:keepLines/>
+              <w:widowControl w:val="1"/>
+            </w:pPr>
+            <w:r>
+              <w:rPr>
+                <w:rFonts w:ascii="Times New Roman" w:hAnsi="Times New Roman"/>
+                <w:sz w:val="20"/>
+              </w:rPr>
+              <w:t xml:space="preserve">−0.12</w:t>
+            </w:r>
+          </w:p>
+        </w:tc>
+        <w:tc>
+          <w:tcPr>
+            <w:tcBorders>
+              <w:left w:val="nil"/>
+              <w:right w:val="nil"/>
+              <w:top w:val="nil"/>
+              <w:bottom w:val="single" w:sz="4" w:color="D9E1E8"/>
+            </w:tcBorders>
+          </w:tcPr>
+          <w:p>
+            <w:pPr>
+              <w:pStyle w:val="Compact"/>
+              <w:spacing w:before="0" w:after="20" w:line="240" w:lineRule="auto"/>
+              <w:jc w:val="center"/>
+              <w:keepNext w:val="0"/>
+              <w:keepLines/>
+              <w:widowControl w:val="1"/>
+            </w:pPr>
+            <w:r>
+              <w:rPr>
+                <w:rFonts w:ascii="Times New Roman" w:hAnsi="Times New Roman"/>
+                <w:sz w:val="20"/>
+              </w:rPr>
+              <w:t xml:space="preserve">+0.25</w:t>
+            </w:r>
+          </w:p>
+        </w:tc>
+        <w:tc>
+          <w:tcPr>
+            <w:tcBorders>
+              <w:left w:val="nil"/>
+              <w:right w:val="nil"/>
+              <w:top w:val="nil"/>
+              <w:bottom w:val="single" w:sz="4" w:color="D9E1E8"/>
+            </w:tcBorders>
+          </w:tcPr>
+          <w:p>
+            <w:pPr>
+              <w:pStyle w:val="Compact"/>
+              <w:spacing w:before="0" w:after="20" w:line="240" w:lineRule="auto"/>
+              <w:jc w:val="center"/>
+              <w:keepNext w:val="0"/>
+              <w:keepLines/>
+              <w:widowControl w:val="1"/>
+            </w:pPr>
+            <w:r>
+              <w:rPr>
+                <w:rFonts w:ascii="Times New Roman" w:hAnsi="Times New Roman"/>
+                <w:sz w:val="20"/>
+              </w:rPr>
+              <w:t xml:space="preserve">mean</w:t>
+            </w:r>
+            <w:r>
+              <w:rPr>
+                <w:rFonts w:ascii="Times New Roman" w:hAnsi="Times New Roman"/>
+                <w:sz w:val="20"/>
+              </w:rPr>
+              <w:t xml:space="preserve"> </w:t>
+            </w:r>
+            <m:oMath>
+              <m:r>
+                <m:rPr>
+                  <m:sty m:val="p"/>
+                </m:rPr>
+                <m:t>|</m:t>
+              </m:r>
+              <m:r>
+                <m:t>ρ</m:t>
+              </m:r>
+              <m:r>
+                <m:rPr>
+                  <m:sty m:val="p"/>
+                </m:rPr>
+                <m:t>|</m:t>
+              </m:r>
+            </m:oMath>
+            <w:r>
+              <w:rPr>
+                <w:rFonts w:ascii="Times New Roman" w:hAnsi="Times New Roman"/>
+                <w:sz w:val="20"/>
+              </w:rPr>
+              <w:t xml:space="preserve"> </w:t>
+            </w:r>
+            <w:r>
+              <w:rPr>
+                <w:rFonts w:ascii="Times New Roman" w:hAnsi="Times New Roman"/>
+                <w:sz w:val="20"/>
+              </w:rPr>
+              <w:t xml:space="preserve">= 0.13</w:t>
+            </w:r>
+          </w:p>
+        </w:tc>
+      </w:tr>
+      <w:tr>
+        <w:tc>
+          <w:tcPr>
+            <w:tcBorders>
+              <w:left w:val="nil"/>
+              <w:right w:val="nil"/>
+              <w:top w:val="nil"/>
+              <w:bottom w:val="nil"/>
+            </w:tcBorders>
+          </w:tcPr>
+          <w:p>
+            <w:pPr>
+              <w:pStyle w:val="Compact"/>
+              <w:spacing w:before="0" w:after="20" w:line="240" w:lineRule="auto"/>
+              <w:jc w:val="center"/>
+              <w:keepNext w:val="0"/>
+              <w:keepLines/>
+              <w:widowControl w:val="1"/>
+            </w:pPr>
+            <w:r>
+              <w:rPr>
+                <w:rFonts w:ascii="Times New Roman" w:hAnsi="Times New Roman"/>
+                <w:sz w:val="20"/>
+              </w:rPr>
+              <w:t xml:space="preserve">shared single-ability level</w:t>
+            </w:r>
+          </w:p>
+        </w:tc>
+        <w:tc>
+          <w:tcPr>
+            <w:tcBorders>
+              <w:left w:val="nil"/>
+              <w:right w:val="nil"/>
+              <w:top w:val="nil"/>
+              <w:bottom w:val="nil"/>
+            </w:tcBorders>
+          </w:tcPr>
+          <w:p>
+            <w:pPr>
+              <w:pStyle w:val="Compact"/>
+              <w:spacing w:before="0" w:after="20" w:line="240" w:lineRule="auto"/>
+              <w:jc w:val="center"/>
+              <w:keepNext w:val="0"/>
+              <w:keepLines/>
+              <w:widowControl w:val="1"/>
+            </w:pPr>
+            <w:r>
+              <w:rPr>
+                <w:rFonts w:ascii="Times New Roman" w:hAnsi="Times New Roman"/>
+                <w:b/>
+                <w:bCs/>
+                <w:sz w:val="20"/>
+              </w:rPr>
+              <w:t xml:space="preserve">+0.52</w:t>
+            </w:r>
+          </w:p>
+        </w:tc>
+        <w:tc>
+          <w:tcPr>
+            <w:tcBorders>
+              <w:left w:val="nil"/>
+              <w:right w:val="nil"/>
+              <w:top w:val="nil"/>
+              <w:bottom w:val="nil"/>
+            </w:tcBorders>
+          </w:tcPr>
+          <w:p>
+            <w:pPr>
+              <w:pStyle w:val="Compact"/>
+              <w:spacing w:before="0" w:after="20" w:line="240" w:lineRule="auto"/>
+              <w:jc w:val="center"/>
+              <w:keepNext w:val="0"/>
+              <w:keepLines/>
+              <w:widowControl w:val="1"/>
+            </w:pPr>
+            <w:r>
+              <w:rPr>
+                <w:rFonts w:ascii="Times New Roman" w:hAnsi="Times New Roman"/>
+                <w:sz w:val="20"/>
+              </w:rPr>
+              <w:t xml:space="preserve">+0.14</w:t>
+            </w:r>
+          </w:p>
+        </w:tc>
+        <w:tc>
+          <w:tcPr>
+            <w:tcBorders>
+              <w:left w:val="nil"/>
+              <w:right w:val="nil"/>
+              <w:top w:val="nil"/>
+              <w:bottom w:val="nil"/>
+            </w:tcBorders>
+          </w:tcPr>
+          <w:p>
+            <w:pPr>
+              <w:pStyle w:val="Compact"/>
+              <w:spacing w:before="0" w:after="20" w:line="240" w:lineRule="auto"/>
+              <w:jc w:val="center"/>
+              <w:keepNext w:val="0"/>
+              <w:keepLines/>
+              <w:widowControl w:val="1"/>
+            </w:pPr>
+            <w:r>
+              <w:rPr>
+                <w:rFonts w:ascii="Times New Roman" w:hAnsi="Times New Roman"/>
+                <w:b/>
+                <w:bCs/>
+                <w:sz w:val="20"/>
+              </w:rPr>
+              <w:t xml:space="preserve">+0.56</w:t>
+            </w:r>
+          </w:p>
+        </w:tc>
+        <w:tc>
+          <w:tcPr>
+            <w:tcBorders>
+              <w:left w:val="nil"/>
+              <w:right w:val="nil"/>
+              <w:top w:val="nil"/>
+              <w:bottom w:val="nil"/>
+            </w:tcBorders>
+          </w:tcPr>
+          <w:p>
+            <w:pPr>
+              <w:pStyle w:val="Compact"/>
+              <w:spacing w:before="0" w:after="20" w:line="240" w:lineRule="auto"/>
+              <w:jc w:val="center"/>
+              <w:keepNext w:val="0"/>
+              <w:keepLines/>
+              <w:widowControl w:val="1"/>
+            </w:pPr>
+            <w:r>
+              <w:rPr>
+                <w:rFonts w:ascii="Times New Roman" w:hAnsi="Times New Roman"/>
+                <w:sz w:val="20"/>
+              </w:rPr>
+              <w:t xml:space="preserve">mean</w:t>
+            </w:r>
+            <w:r>
+              <w:rPr>
+                <w:rFonts w:ascii="Times New Roman" w:hAnsi="Times New Roman"/>
+                <w:sz w:val="20"/>
+              </w:rPr>
+              <w:t xml:space="preserve"> </w:t>
+            </w:r>
+            <m:oMath>
+              <m:r>
+                <m:t>ρ</m:t>
+              </m:r>
+            </m:oMath>
+            <w:r>
+              <w:rPr>
+                <w:rFonts w:ascii="Times New Roman" w:hAnsi="Times New Roman"/>
+                <w:sz w:val="20"/>
+              </w:rPr>
+              <w:t xml:space="preserve"> </w:t>
+            </w:r>
+            <w:r>
+              <w:rPr>
+                <w:rFonts w:ascii="Times New Roman" w:hAnsi="Times New Roman"/>
+                <w:sz w:val="20"/>
+              </w:rPr>
+              <w:t xml:space="preserve">= +0.41</w:t>
+            </w:r>
+          </w:p>
+        </w:tc>
+      </w:tr>
+    </w:tbl>
+    <w:p>
+      <w:pPr>
         <w:pStyle w:val="BodyText"/>
+        <w:spacing w:before="160"/>
         <w:jc w:val="both"/>
         <w:keepNext w:val="0"/>
         <w:keepLines w:val="0"/>
@@ -8542,7 +9401,7 @@
               <a:graphicData uri="http://schemas.openxmlformats.org/drawingml/2006/picture">
                 <pic:pic>
                   <pic:nvPicPr>
-                    <pic:cNvPr descr="C:/Users/apart/AppData/Local/Temp/html2doc_svg_pv4k6W/svg_2.png" id="40" name="Picture"/>
+                    <pic:cNvPr descr="C:/Users/apart/AppData/Local/Temp/html2doc_svg_tLCsAb/svg_2.png" id="40" name="Picture"/>
                     <pic:cNvPicPr>
                       <a:picLocks noChangeArrowheads="1" noChangeAspect="1"/>
                     </pic:cNvPicPr>
@@ -8665,7 +9524,7 @@
               <a:graphicData uri="http://schemas.openxmlformats.org/drawingml/2006/picture">
                 <pic:pic>
                   <pic:nvPicPr>
-                    <pic:cNvPr descr="C:/Users/apart/AppData/Local/Temp/html2doc_svg_pv4k6W/svg_3.png" id="43" name="Picture"/>
+                    <pic:cNvPr descr="C:/Users/apart/AppData/Local/Temp/html2doc_svg_tLCsAb/svg_3.png" id="43" name="Picture"/>
                     <pic:cNvPicPr>
                       <a:picLocks noChangeArrowheads="1" noChangeAspect="1"/>
                     </pic:cNvPicPr>

</xml_diff>

<commit_message>
v2: clarify the evaluated engine is the verbatim prototype prompts (harness is research orchestration)
Reviewer/reproducibility point: state explicitly in Section 7.1 that the 16 scoring-
engine prompts are run verbatim and the surrounding harness (simulated-learner
generation, crossed factorial, analysis) is research orchestration around that fixed
engine, not a reimplementation, so the measurements characterize the instrument itself.

Citation gate (bibtest): 55/56 valid; the single not_found is the real-but-unindexed
Acar (2023) HBR article (paired with peer-reviewed Denny et al. 2024). No hallucinated,
placeholder, or misattributed entries.

Co-Authored-By: Claude Opus 4.8 <noreply@anthropic.com>
</commit_message>
<xml_diff>
--- a/docs/coreasoning.docx
+++ b/docs/coreasoning.docx
@@ -865,7 +865,7 @@
               <a:graphicData uri="http://schemas.openxmlformats.org/drawingml/2006/picture">
                 <pic:pic>
                   <pic:nvPicPr>
-                    <pic:cNvPr descr="C:/Users/apart/AppData/Local/Temp/html2doc_svg_tLCsAb/svg_0.png" id="12" name="Picture"/>
+                    <pic:cNvPr descr="C:/Users/apart/AppData/Local/Temp/html2doc_svg_ScLfJu/svg_0.png" id="12" name="Picture"/>
                     <pic:cNvPicPr>
                       <a:picLocks noChangeArrowheads="1" noChangeAspect="1"/>
                     </pic:cNvPicPr>
@@ -1934,7 +1934,7 @@
               <a:graphicData uri="http://schemas.openxmlformats.org/drawingml/2006/picture">
                 <pic:pic>
                   <pic:nvPicPr>
-                    <pic:cNvPr descr="C:/Users/apart/AppData/Local/Temp/html2doc_svg_tLCsAb/svg_1.png" id="17" name="Picture"/>
+                    <pic:cNvPr descr="C:/Users/apart/AppData/Local/Temp/html2doc_svg_ScLfJu/svg_1.png" id="17" name="Picture"/>
                     <pic:cNvPicPr>
                       <a:picLocks noChangeArrowheads="1" noChangeAspect="1"/>
                     </pic:cNvPicPr>
@@ -5256,7 +5256,25 @@
         <w:t xml:space="preserve"> </w:t>
       </w:r>
       <w:r>
-        <w:t xml:space="preserve">of sixteen prompts spanning challenge construction, AI generation, and evaluation. Scoring a single</w:t>
+        <w:t xml:space="preserve">of sixteen prompts spanning challenge construction, AI generation, and evaluation. These prompts are</w:t>
+      </w:r>
+      <w:r>
+        <w:t xml:space="preserve"> </w:t>
+      </w:r>
+      <w:r>
+        <w:t xml:space="preserve">run verbatim: the surrounding experiment harness (simulated-learner generation, the crossed factorial,</w:t>
+      </w:r>
+      <w:r>
+        <w:t xml:space="preserve"> </w:t>
+      </w:r>
+      <w:r>
+        <w:t xml:space="preserve">and the analysis) is research orchestration around that fixed engine, not a reimplementation of it, so</w:t>
+      </w:r>
+      <w:r>
+        <w:t xml:space="preserve"> </w:t>
+      </w:r>
+      <w:r>
+        <w:t xml:space="preserve">the measurements characterize the instrument itself. Scoring a single</w:t>
       </w:r>
       <w:r>
         <w:t xml:space="preserve"> </w:t>
@@ -9401,7 +9419,7 @@
               <a:graphicData uri="http://schemas.openxmlformats.org/drawingml/2006/picture">
                 <pic:pic>
                   <pic:nvPicPr>
-                    <pic:cNvPr descr="C:/Users/apart/AppData/Local/Temp/html2doc_svg_tLCsAb/svg_2.png" id="40" name="Picture"/>
+                    <pic:cNvPr descr="C:/Users/apart/AppData/Local/Temp/html2doc_svg_ScLfJu/svg_2.png" id="40" name="Picture"/>
                     <pic:cNvPicPr>
                       <a:picLocks noChangeArrowheads="1" noChangeAspect="1"/>
                     </pic:cNvPicPr>
@@ -9524,7 +9542,7 @@
               <a:graphicData uri="http://schemas.openxmlformats.org/drawingml/2006/picture">
                 <pic:pic>
                   <pic:nvPicPr>
-                    <pic:cNvPr descr="C:/Users/apart/AppData/Local/Temp/html2doc_svg_tLCsAb/svg_3.png" id="43" name="Picture"/>
+                    <pic:cNvPr descr="C:/Users/apart/AppData/Local/Temp/html2doc_svg_ScLfJu/svg_3.png" id="43" name="Picture"/>
                     <pic:cNvPicPr>
                       <a:picLocks noChangeArrowheads="1" noChangeAspect="1"/>
                     </pic:cNvPicPr>

</xml_diff>

<commit_message>
v2: add the Campbell-Fiske halo result to Section 8 (no grader halo)
Tier-1 validity strengthening, fully landed (run + verified + written): the full MTMM
matrix shows convergent (same skill across graders, +0.49) exceeds heterotrait-monomethod
(+0.08) and heterotrait-heteromethod (+0.06); per-grader cross-skill |rho| 0.13/0.18/0.13,
so no grader exhibits halo and all three Campbell-Fiske criteria hold. Computed by
research/scripts/e7_mtmm.py.

Co-Authored-By: Claude Opus 4.8 <noreply@anthropic.com>
</commit_message>
<xml_diff>
--- a/docs/coreasoning.docx
+++ b/docs/coreasoning.docx
@@ -865,7 +865,7 @@
               <a:graphicData uri="http://schemas.openxmlformats.org/drawingml/2006/picture">
                 <pic:pic>
                   <pic:nvPicPr>
-                    <pic:cNvPr descr="C:/Users/apart/AppData/Local/Temp/html2doc_svg_nZBYlI/svg_0.png" id="12" name="Picture"/>
+                    <pic:cNvPr descr="C:/Users/apart/AppData/Local/Temp/html2doc_svg_5gQ2iV/svg_0.png" id="12" name="Picture"/>
                     <pic:cNvPicPr>
                       <a:picLocks noChangeArrowheads="1" noChangeAspect="1"/>
                     </pic:cNvPicPr>
@@ -1934,7 +1934,7 @@
               <a:graphicData uri="http://schemas.openxmlformats.org/drawingml/2006/picture">
                 <pic:pic>
                   <pic:nvPicPr>
-                    <pic:cNvPr descr="C:/Users/apart/AppData/Local/Temp/html2doc_svg_nZBYlI/svg_1.png" id="17" name="Picture"/>
+                    <pic:cNvPr descr="C:/Users/apart/AppData/Local/Temp/html2doc_svg_5gQ2iV/svg_1.png" id="17" name="Picture"/>
                     <pic:cNvPicPr>
                       <a:picLocks noChangeArrowheads="1" noChangeAspect="1"/>
                     </pic:cNvPicPr>
@@ -6650,7 +6650,57 @@
         <w:t xml:space="preserve"> </w:t>
       </w:r>
       <w:r>
-        <w:t xml:space="preserve">rather than a separate construct. Second, the instrument is faithful to the population's dependence</w:t>
+        <w:t xml:space="preserve">rather than a separate construct. Laid out as the full multitrait-multimethod matrix, the convergent</w:t>
+      </w:r>
+      <w:r>
+        <w:t xml:space="preserve"> </w:t>
+      </w:r>
+      <w:r>
+        <w:t xml:space="preserve">correlations (same skill across graders, mean +0.49) exceed both the heterotrait-monomethod correlations</w:t>
+      </w:r>
+      <w:r>
+        <w:t xml:space="preserve"> </w:t>
+      </w:r>
+      <w:r>
+        <w:t xml:space="preserve">(different skills within one grader, mean +0.08) and the heterotrait-heteromethod correlations (mean</w:t>
+      </w:r>
+      <w:r>
+        <w:t xml:space="preserve"> </w:t>
+      </w:r>
+      <w:r>
+        <w:t xml:space="preserve">+0.06); no grader shows halo (within-grader cross-skill mean</w:t>
+      </w:r>
+      <w:r>
+        <w:t xml:space="preserve"> </w:t>
+      </w:r>
+      <m:oMath>
+        <m:r>
+          <m:rPr>
+            <m:sty m:val="p"/>
+          </m:rPr>
+          <m:t>|</m:t>
+        </m:r>
+        <m:r>
+          <m:t>ρ</m:t>
+        </m:r>
+        <m:r>
+          <m:rPr>
+            <m:sty m:val="p"/>
+          </m:rPr>
+          <m:t>|</m:t>
+        </m:r>
+      </m:oMath>
+      <w:r>
+        <w:t xml:space="preserve"> </w:t>
+      </w:r>
+      <w:r>
+        <w:t xml:space="preserve">of 0.13, 0.18, 0.13 for the three</w:t>
+      </w:r>
+      <w:r>
+        <w:t xml:space="preserve"> </w:t>
+      </w:r>
+      <w:r>
+        <w:t xml:space="preserve">backends), so all three Campbell-Fiske criteria hold. Second, the instrument is faithful to the population's dependence</w:t>
       </w:r>
       <w:r>
         <w:t xml:space="preserve"> </w:t>
@@ -9452,7 +9502,7 @@
               <a:graphicData uri="http://schemas.openxmlformats.org/drawingml/2006/picture">
                 <pic:pic>
                   <pic:nvPicPr>
-                    <pic:cNvPr descr="C:/Users/apart/AppData/Local/Temp/html2doc_svg_nZBYlI/svg_2.png" id="40" name="Picture"/>
+                    <pic:cNvPr descr="C:/Users/apart/AppData/Local/Temp/html2doc_svg_5gQ2iV/svg_2.png" id="40" name="Picture"/>
                     <pic:cNvPicPr>
                       <a:picLocks noChangeArrowheads="1" noChangeAspect="1"/>
                     </pic:cNvPicPr>
@@ -9575,7 +9625,7 @@
               <a:graphicData uri="http://schemas.openxmlformats.org/drawingml/2006/picture">
                 <pic:pic>
                   <pic:nvPicPr>
-                    <pic:cNvPr descr="C:/Users/apart/AppData/Local/Temp/html2doc_svg_nZBYlI/svg_3.png" id="43" name="Picture"/>
+                    <pic:cNvPr descr="C:/Users/apart/AppData/Local/Temp/html2doc_svg_5gQ2iV/svg_3.png" id="43" name="Picture"/>
                     <pic:cNvPicPr>
                       <a:picLocks noChangeArrowheads="1" noChangeAspect="1"/>
                     </pic:cNvPicPr>

</xml_diff>

<commit_message>
v2: strengthen Section 10 with the forward research program (Tier-3)
Add a forward-directions paragraph: external validity can begin before the human studies
by scoring released real student-AI dialogue corpora with the per-skill instrument; plus
four propositions-driven directions (longitudinal skill development/persistence;
instructional-intervention study building on Clerc et al. 2026; cross-domain transfer
testing P4; metacognition-mediation testing whether monitoring accuracy predicts Judging).
Anchored on existing citations; verified direction citations to follow via the running scout.

Self-consistency + tone audit clean: 0 phantom sections, no orphan citations, 0 em-dashes,
0 tone hits; bibtest 62/63 valid.

Co-Authored-By: Claude Opus 4.8 <noreply@anthropic.com>
</commit_message>
<xml_diff>
--- a/docs/coreasoning.docx
+++ b/docs/coreasoning.docx
@@ -865,7 +865,7 @@
               <a:graphicData uri="http://schemas.openxmlformats.org/drawingml/2006/picture">
                 <pic:pic>
                   <pic:nvPicPr>
-                    <pic:cNvPr descr="C:/Users/apart/AppData/Local/Temp/html2doc_svg_4uN5wz/svg_0.png" id="12" name="Picture"/>
+                    <pic:cNvPr descr="C:/Users/apart/AppData/Local/Temp/html2doc_svg_cpH8Uu/svg_0.png" id="12" name="Picture"/>
                     <pic:cNvPicPr>
                       <a:picLocks noChangeArrowheads="1" noChangeAspect="1"/>
                     </pic:cNvPicPr>
@@ -1934,7 +1934,7 @@
               <a:graphicData uri="http://schemas.openxmlformats.org/drawingml/2006/picture">
                 <pic:pic>
                   <pic:nvPicPr>
-                    <pic:cNvPr descr="C:/Users/apart/AppData/Local/Temp/html2doc_svg_4uN5wz/svg_1.png" id="17" name="Picture"/>
+                    <pic:cNvPr descr="C:/Users/apart/AppData/Local/Temp/html2doc_svg_cpH8Uu/svg_1.png" id="17" name="Picture"/>
                     <pic:cNvPicPr>
                       <a:picLocks noChangeArrowheads="1" noChangeAspect="1"/>
                     </pic:cNvPicPr>
@@ -9374,6 +9374,78 @@
         <w:t xml:space="preserve">Proposition P5 and any learning claim; that is explicitly outside the present scope.</w:t>
       </w:r>
     </w:p>
+    <w:p>
+      <w:pPr>
+        <w:pStyle w:val="BodyText"/>
+        <w:jc w:val="both"/>
+        <w:keepNext w:val="0"/>
+        <w:keepLines w:val="0"/>
+        <w:widowControl w:val="1"/>
+      </w:pPr>
+      <w:r>
+        <w:t xml:space="preserve">Beyond validity, the framework opens a research program, and one strand can begin before the human</w:t>
+      </w:r>
+      <w:r>
+        <w:t xml:space="preserve"> </w:t>
+      </w:r>
+      <w:r>
+        <w:t xml:space="preserve">studies: external validity can be probed by scoring released corpora of real student-AI dialogue with</w:t>
+      </w:r>
+      <w:r>
+        <w:t xml:space="preserve"> </w:t>
+      </w:r>
+      <w:r>
+        <w:t xml:space="preserve">the per-skill instrument, testing whether Framing, Judging, and Steering are detectable and separable</w:t>
+      </w:r>
+      <w:r>
+        <w:t xml:space="preserve"> </w:t>
+      </w:r>
+      <w:r>
+        <w:t xml:space="preserve">outside the controlled challenge format. Four further directions follow from the propositions: a</w:t>
+      </w:r>
+      <w:r>
+        <w:t xml:space="preserve"> </w:t>
+      </w:r>
+      <w:r>
+        <w:t xml:space="preserve">longitudinal study of whether the three skills develop and persist with practice; an</w:t>
+      </w:r>
+      <w:r>
+        <w:t xml:space="preserve"> </w:t>
+      </w:r>
+      <w:r>
+        <w:t xml:space="preserve">instructional-intervention study testing whether targeted teaching of each skill improves it, building</w:t>
+      </w:r>
+      <w:r>
+        <w:t xml:space="preserve"> </w:t>
+      </w:r>
+      <w:r>
+        <w:t xml:space="preserve">on evidence that students' behavioral regulation of LLM use is trainable (Clerc et al., 2026); a</w:t>
+      </w:r>
+      <w:r>
+        <w:t xml:space="preserve"> </w:t>
+      </w:r>
+      <w:r>
+        <w:t xml:space="preserve">transfer study testing P4's prediction that Framing, the more structural skill, transfers across domains</w:t>
+      </w:r>
+      <w:r>
+        <w:t xml:space="preserve"> </w:t>
+      </w:r>
+      <w:r>
+        <w:t xml:space="preserve">more readily than the domain-bound Judging; and a mediation study testing whether metacognitive</w:t>
+      </w:r>
+      <w:r>
+        <w:t xml:space="preserve"> </w:t>
+      </w:r>
+      <w:r>
+        <w:t xml:space="preserve">monitoring accuracy predicts Judging, which would tie the construct directly to its monitor-control</w:t>
+      </w:r>
+      <w:r>
+        <w:t xml:space="preserve"> </w:t>
+      </w:r>
+      <w:r>
+        <w:t xml:space="preserve">grounding.</w:t>
+      </w:r>
+    </w:p>
     <w:bookmarkEnd w:id="35"/>
     <w:bookmarkStart w:id="36" w:name="Xd9958a5808c799d638099c5f014583a644a871b"/>
     <w:p>
@@ -9647,7 +9719,7 @@
               <a:graphicData uri="http://schemas.openxmlformats.org/drawingml/2006/picture">
                 <pic:pic>
                   <pic:nvPicPr>
-                    <pic:cNvPr descr="C:/Users/apart/AppData/Local/Temp/html2doc_svg_4uN5wz/svg_2.png" id="40" name="Picture"/>
+                    <pic:cNvPr descr="C:/Users/apart/AppData/Local/Temp/html2doc_svg_cpH8Uu/svg_2.png" id="40" name="Picture"/>
                     <pic:cNvPicPr>
                       <a:picLocks noChangeArrowheads="1" noChangeAspect="1"/>
                     </pic:cNvPicPr>
@@ -9770,7 +9842,7 @@
               <a:graphicData uri="http://schemas.openxmlformats.org/drawingml/2006/picture">
                 <pic:pic>
                   <pic:nvPicPr>
-                    <pic:cNvPr descr="C:/Users/apart/AppData/Local/Temp/html2doc_svg_4uN5wz/svg_3.png" id="43" name="Picture"/>
+                    <pic:cNvPr descr="C:/Users/apart/AppData/Local/Temp/html2doc_svg_cpH8Uu/svg_3.png" id="43" name="Picture"/>
                     <pic:cNvPicPr>
                       <a:picLocks noChangeArrowheads="1" noChangeAspect="1"/>
                     </pic:cNvPicPr>

</xml_diff>

<commit_message>
v2: name StudyChat as the external-validity corpus + add verified direction citations + ready-to-run harness
Section 10: the external-validity strand now names the StudyChat corpus (16,851 real
student-ChatGPT turns; McNichols et al. 2025), whose dialogue-act labels (questioning/
verification/editing) anchor Framing/Judging/Steering; transfer direction cites far-transfer
of metacognitive regulation (Wirth et al. 2025); mediation direction cites calibration->
strategy-use (Lee & Bosch 2025). All three bibtest-valid; Clerc 2026 (intervention) already cited.

research/scripts/e8_studychat.py: prepared, ready-to-run external-validity study. StudyChat is
gated (CC BY 4.0), so this is staged like the human-study package: maps StudyChat's dialogue-act
labels to F/J/S and reports per-student behavior rates + inter-behavior correlation (dissociation
in the wild), runnable once HF terms are accepted. No simulated learners.

Co-Authored-By: Claude Opus 4.8 <noreply@anthropic.com>
</commit_message>
<xml_diff>
--- a/docs/coreasoning.docx
+++ b/docs/coreasoning.docx
@@ -865,7 +865,7 @@
               <a:graphicData uri="http://schemas.openxmlformats.org/drawingml/2006/picture">
                 <pic:pic>
                   <pic:nvPicPr>
-                    <pic:cNvPr descr="C:/Users/apart/AppData/Local/Temp/html2doc_svg_cpH8Uu/svg_0.png" id="12" name="Picture"/>
+                    <pic:cNvPr descr="C:/Users/apart/AppData/Local/Temp/html2doc_svg_17nCzd/svg_0.png" id="12" name="Picture"/>
                     <pic:cNvPicPr>
                       <a:picLocks noChangeArrowheads="1" noChangeAspect="1"/>
                     </pic:cNvPicPr>
@@ -1934,7 +1934,7 @@
               <a:graphicData uri="http://schemas.openxmlformats.org/drawingml/2006/picture">
                 <pic:pic>
                   <pic:nvPicPr>
-                    <pic:cNvPr descr="C:/Users/apart/AppData/Local/Temp/html2doc_svg_cpH8Uu/svg_1.png" id="17" name="Picture"/>
+                    <pic:cNvPr descr="C:/Users/apart/AppData/Local/Temp/html2doc_svg_17nCzd/svg_1.png" id="17" name="Picture"/>
                     <pic:cNvPicPr>
                       <a:picLocks noChangeArrowheads="1" noChangeAspect="1"/>
                     </pic:cNvPicPr>
@@ -9389,61 +9389,85 @@
         <w:t xml:space="preserve"> </w:t>
       </w:r>
       <w:r>
-        <w:t xml:space="preserve">studies: external validity can be probed by scoring released corpora of real student-AI dialogue with</w:t>
-      </w:r>
-      <w:r>
-        <w:t xml:space="preserve"> </w:t>
-      </w:r>
-      <w:r>
-        <w:t xml:space="preserve">the per-skill instrument, testing whether Framing, Judging, and Steering are detectable and separable</w:t>
-      </w:r>
-      <w:r>
-        <w:t xml:space="preserve"> </w:t>
-      </w:r>
-      <w:r>
-        <w:t xml:space="preserve">outside the controlled challenge format. Four further directions follow from the propositions: a</w:t>
-      </w:r>
-      <w:r>
-        <w:t xml:space="preserve"> </w:t>
-      </w:r>
-      <w:r>
-        <w:t xml:space="preserve">longitudinal study of whether the three skills develop and persist with practice; an</w:t>
-      </w:r>
-      <w:r>
-        <w:t xml:space="preserve"> </w:t>
-      </w:r>
-      <w:r>
-        <w:t xml:space="preserve">instructional-intervention study testing whether targeted teaching of each skill improves it, building</w:t>
-      </w:r>
-      <w:r>
-        <w:t xml:space="preserve"> </w:t>
-      </w:r>
-      <w:r>
-        <w:t xml:space="preserve">on evidence that students' behavioral regulation of LLM use is trainable (Clerc et al., 2026); a</w:t>
-      </w:r>
-      <w:r>
-        <w:t xml:space="preserve"> </w:t>
-      </w:r>
-      <w:r>
-        <w:t xml:space="preserve">transfer study testing P4's prediction that Framing, the more structural skill, transfers across domains</w:t>
-      </w:r>
-      <w:r>
-        <w:t xml:space="preserve"> </w:t>
-      </w:r>
-      <w:r>
-        <w:t xml:space="preserve">more readily than the domain-bound Judging; and a mediation study testing whether metacognitive</w:t>
-      </w:r>
-      <w:r>
-        <w:t xml:space="preserve"> </w:t>
-      </w:r>
-      <w:r>
-        <w:t xml:space="preserve">monitoring accuracy predicts Judging, which would tie the construct directly to its monitor-control</w:t>
-      </w:r>
-      <w:r>
-        <w:t xml:space="preserve"> </w:t>
-      </w:r>
-      <w:r>
-        <w:t xml:space="preserve">grounding.</w:t>
+        <w:t xml:space="preserve">studies: external validity can be probed by scoring a released corpus of real student-LLM dialogue, the</w:t>
+      </w:r>
+      <w:r>
+        <w:t xml:space="preserve"> </w:t>
+      </w:r>
+      <w:r>
+        <w:t xml:space="preserve">StudyChat dataset of 16,851 student-ChatGPT interactions from a university course (McNichols et al.,</w:t>
+      </w:r>
+      <w:r>
+        <w:t xml:space="preserve"> </w:t>
+      </w:r>
+      <w:r>
+        <w:t xml:space="preserve">2025), with the per-skill instrument, testing whether Framing, Judging, and Steering are detectable and</w:t>
+      </w:r>
+      <w:r>
+        <w:t xml:space="preserve"> </w:t>
+      </w:r>
+      <w:r>
+        <w:t xml:space="preserve">separable outside the controlled challenge format; StudyChat's own dialogue-act labels (questioning,</w:t>
+      </w:r>
+      <w:r>
+        <w:t xml:space="preserve"> </w:t>
+      </w:r>
+      <w:r>
+        <w:t xml:space="preserve">verification, and editing) align with the three skills and supply an external anchor. Four further</w:t>
+      </w:r>
+      <w:r>
+        <w:t xml:space="preserve"> </w:t>
+      </w:r>
+      <w:r>
+        <w:t xml:space="preserve">directions follow from the propositions: a longitudinal study of whether the three skills develop and</w:t>
+      </w:r>
+      <w:r>
+        <w:t xml:space="preserve"> </w:t>
+      </w:r>
+      <w:r>
+        <w:t xml:space="preserve">persist with practice; an instructional-intervention study testing whether targeted teaching of each</w:t>
+      </w:r>
+      <w:r>
+        <w:t xml:space="preserve"> </w:t>
+      </w:r>
+      <w:r>
+        <w:t xml:space="preserve">skill improves it, building on evidence that students' behavioral regulation of LLM use is trainable</w:t>
+      </w:r>
+      <w:r>
+        <w:t xml:space="preserve"> </w:t>
+      </w:r>
+      <w:r>
+        <w:t xml:space="preserve">(Clerc et al., 2026); a transfer study testing P4's prediction that Framing, the more structural skill,</w:t>
+      </w:r>
+      <w:r>
+        <w:t xml:space="preserve"> </w:t>
+      </w:r>
+      <w:r>
+        <w:t xml:space="preserve">transfers across domains more readily than the domain-bound Judging, a question made tractable by</w:t>
+      </w:r>
+      <w:r>
+        <w:t xml:space="preserve"> </w:t>
+      </w:r>
+      <w:r>
+        <w:t xml:space="preserve">evidence that metacognitive regulation can show far transfer (Wirth et al., 2025); and a mediation study</w:t>
+      </w:r>
+      <w:r>
+        <w:t xml:space="preserve"> </w:t>
+      </w:r>
+      <w:r>
+        <w:t xml:space="preserve">testing whether metacognitive monitoring accuracy predicts Judging, extending findings that calibration</w:t>
+      </w:r>
+      <w:r>
+        <w:t xml:space="preserve"> </w:t>
+      </w:r>
+      <w:r>
+        <w:t xml:space="preserve">predicts subsequent strategy use in computer-based learning (Lee &amp; Bosch, 2025) and tying the construct</w:t>
+      </w:r>
+      <w:r>
+        <w:t xml:space="preserve"> </w:t>
+      </w:r>
+      <w:r>
+        <w:t xml:space="preserve">to its monitor-control grounding.</w:t>
       </w:r>
     </w:p>
     <w:bookmarkEnd w:id="35"/>
@@ -9719,7 +9743,7 @@
               <a:graphicData uri="http://schemas.openxmlformats.org/drawingml/2006/picture">
                 <pic:pic>
                   <pic:nvPicPr>
-                    <pic:cNvPr descr="C:/Users/apart/AppData/Local/Temp/html2doc_svg_cpH8Uu/svg_2.png" id="40" name="Picture"/>
+                    <pic:cNvPr descr="C:/Users/apart/AppData/Local/Temp/html2doc_svg_17nCzd/svg_2.png" id="40" name="Picture"/>
                     <pic:cNvPicPr>
                       <a:picLocks noChangeArrowheads="1" noChangeAspect="1"/>
                     </pic:cNvPicPr>
@@ -9842,7 +9866,7 @@
               <a:graphicData uri="http://schemas.openxmlformats.org/drawingml/2006/picture">
                 <pic:pic>
                   <pic:nvPicPr>
-                    <pic:cNvPr descr="C:/Users/apart/AppData/Local/Temp/html2doc_svg_cpH8Uu/svg_3.png" id="43" name="Picture"/>
+                    <pic:cNvPr descr="C:/Users/apart/AppData/Local/Temp/html2doc_svg_17nCzd/svg_3.png" id="43" name="Picture"/>
                     <pic:cNvPicPr>
                       <a:picLocks noChangeArrowheads="1" noChangeAspect="1"/>
                     </pic:cNvPicPr>
@@ -10831,7 +10855,7 @@
         <w:widowControl w:val="1"/>
       </w:pPr>
       <w:r>
-        <w:t xml:space="preserve">Lee, J. D., &amp; See, K. A. (2004). Trust in Automation: Designing for Appropriate Reliance.</w:t>
+        <w:t xml:space="preserve">Lee, H., &amp; Bosch, N. (2025). Calibration Discrepancy Predicts Students' Subsequent Metacognitive Strategy Use in Computer-Based Learning Environments.</w:t>
       </w:r>
       <w:r>
         <w:t xml:space="preserve"> </w:t>
@@ -10841,10 +10865,10 @@
           <w:i/>
           <w:iCs/>
         </w:rPr>
-        <w:t xml:space="preserve">Human Factors</w:t>
-      </w:r>
-      <w:r>
-        <w:t xml:space="preserve">, 46(1), 50–80.</w:t>
+        <w:t xml:space="preserve">International Journal of Artificial Intelligence in Education</w:t>
+      </w:r>
+      <w:r>
+        <w:t xml:space="preserve">, 35(6), 3746–3779. https://doi.org/10.1007/s40593-025-00514-5</w:t>
       </w:r>
     </w:p>
     <w:p>
@@ -10856,7 +10880,7 @@
         <w:widowControl w:val="1"/>
       </w:pPr>
       <w:r>
-        <w:t xml:space="preserve">Lee, S. C., Baby, T., Vongvit, R., Lee, J., Kim, Y., Min, C., &amp; Yoon, S. H. (2025). Development and Validation of a Generative AI Competence Scale.</w:t>
+        <w:t xml:space="preserve">Lee, J. D., &amp; See, K. A. (2004). Trust in Automation: Designing for Appropriate Reliance.</w:t>
       </w:r>
       <w:r>
         <w:t xml:space="preserve"> </w:t>
@@ -10866,10 +10890,10 @@
           <w:i/>
           <w:iCs/>
         </w:rPr>
-        <w:t xml:space="preserve">Technology in Society</w:t>
-      </w:r>
-      <w:r>
-        <w:t xml:space="preserve">. https://doi.org/10.1016/j.techsoc.2025.103059</w:t>
+        <w:t xml:space="preserve">Human Factors</w:t>
+      </w:r>
+      <w:r>
+        <w:t xml:space="preserve">, 46(1), 50–80.</w:t>
       </w:r>
     </w:p>
     <w:p>
@@ -10881,7 +10905,7 @@
         <w:widowControl w:val="1"/>
       </w:pPr>
       <w:r>
-        <w:t xml:space="preserve">Li, C., Cui, H., &amp; Hagedorn, L. S. (2026). The Cognitive Impact of ChatGPT in Higher Education: A Systematic Review of Critical and Creative Thinking Outcomes.</w:t>
+        <w:t xml:space="preserve">Lee, S. C., Baby, T., Vongvit, R., Lee, J., Kim, Y., Min, C., &amp; Yoon, S. H. (2025). Development and Validation of a Generative AI Competence Scale.</w:t>
       </w:r>
       <w:r>
         <w:t xml:space="preserve"> </w:t>
@@ -10891,10 +10915,10 @@
           <w:i/>
           <w:iCs/>
         </w:rPr>
-        <w:t xml:space="preserve">Computers and Education: Artificial Intelligence</w:t>
-      </w:r>
-      <w:r>
-        <w:t xml:space="preserve">, 10, 100571. https://doi.org/10.1016/j.caeai.2026.100571</w:t>
+        <w:t xml:space="preserve">Technology in Society</w:t>
+      </w:r>
+      <w:r>
+        <w:t xml:space="preserve">. https://doi.org/10.1016/j.techsoc.2025.103059</w:t>
       </w:r>
     </w:p>
     <w:p>
@@ -10906,7 +10930,7 @@
         <w:widowControl w:val="1"/>
       </w:pPr>
       <w:r>
-        <w:t xml:space="preserve">Lo, L. S. (2023). The CLEAR Path: A Framework for Enhancing Information Literacy through Prompt Engineering.</w:t>
+        <w:t xml:space="preserve">Li, C., Cui, H., &amp; Hagedorn, L. S. (2026). The Cognitive Impact of ChatGPT in Higher Education: A Systematic Review of Critical and Creative Thinking Outcomes.</w:t>
       </w:r>
       <w:r>
         <w:t xml:space="preserve"> </w:t>
@@ -10916,10 +10940,10 @@
           <w:i/>
           <w:iCs/>
         </w:rPr>
-        <w:t xml:space="preserve">The Journal of Academic Librarianship</w:t>
-      </w:r>
-      <w:r>
-        <w:t xml:space="preserve">, 49(4).</w:t>
+        <w:t xml:space="preserve">Computers and Education: Artificial Intelligence</w:t>
+      </w:r>
+      <w:r>
+        <w:t xml:space="preserve">, 10, 100571. https://doi.org/10.1016/j.caeai.2026.100571</w:t>
       </w:r>
     </w:p>
     <w:p>
@@ -10931,7 +10955,7 @@
         <w:widowControl w:val="1"/>
       </w:pPr>
       <w:r>
-        <w:t xml:space="preserve">Long, D., &amp; Magerko, B. (2020). What Is AI Literacy? Competencies and Design Considerations.</w:t>
+        <w:t xml:space="preserve">Lo, L. S. (2023). The CLEAR Path: A Framework for Enhancing Information Literacy through Prompt Engineering.</w:t>
       </w:r>
       <w:r>
         <w:t xml:space="preserve"> </w:t>
@@ -10941,10 +10965,10 @@
           <w:i/>
           <w:iCs/>
         </w:rPr>
-        <w:t xml:space="preserve">Proceedings of the 2020 CHI Conference on Human Factors in Computing Systems</w:t>
-      </w:r>
-      <w:r>
-        <w:t xml:space="preserve">, 1–16.</w:t>
+        <w:t xml:space="preserve">The Journal of Academic Librarianship</w:t>
+      </w:r>
+      <w:r>
+        <w:t xml:space="preserve">, 49(4).</w:t>
       </w:r>
     </w:p>
     <w:p>
@@ -10956,7 +10980,7 @@
         <w:widowControl w:val="1"/>
       </w:pPr>
       <w:r>
-        <w:t xml:space="preserve">Messick, S. (1995). Validity of Psychological Assessment: Validation of Inferences from Persons' Responses and Performances as Scientific Inquiry into Score Meaning.</w:t>
+        <w:t xml:space="preserve">Long, D., &amp; Magerko, B. (2020). What Is AI Literacy? Competencies and Design Considerations.</w:t>
       </w:r>
       <w:r>
         <w:t xml:space="preserve"> </w:t>
@@ -10966,10 +10990,10 @@
           <w:i/>
           <w:iCs/>
         </w:rPr>
-        <w:t xml:space="preserve">American Psychologist</w:t>
-      </w:r>
-      <w:r>
-        <w:t xml:space="preserve">, 50(9), 741–749. https://doi.org/10.1037/0003-066X.50.9.741</w:t>
+        <w:t xml:space="preserve">Proceedings of the 2020 CHI Conference on Human Factors in Computing Systems</w:t>
+      </w:r>
+      <w:r>
+        <w:t xml:space="preserve">, 1–16.</w:t>
       </w:r>
     </w:p>
     <w:p>
@@ -10981,7 +11005,7 @@
         <w:widowControl w:val="1"/>
       </w:pPr>
       <w:r>
-        <w:t xml:space="preserve">Nazaretsky, T., Gabbay, H., &amp; Käser, T. (2025). Can Students Judge Like Experts? A Large-Scale Study on AI and Human Personalized Formative Feedback.</w:t>
+        <w:t xml:space="preserve">McNichols, H., Ikram, F., &amp; Lan, A. (2025). The StudyChat Dataset: Student Dialogues With ChatGPT in an Artificial Intelligence Course.</w:t>
       </w:r>
       <w:r>
         <w:t xml:space="preserve"> </w:t>
@@ -10991,10 +11015,10 @@
           <w:i/>
           <w:iCs/>
         </w:rPr>
-        <w:t xml:space="preserve">Computers and Education: Artificial Intelligence</w:t>
-      </w:r>
-      <w:r>
-        <w:t xml:space="preserve">. https://doi.org/10.1016/j.caeai.2025.100533</w:t>
+        <w:t xml:space="preserve">arXiv preprint arXiv:2503.07928</w:t>
+      </w:r>
+      <w:r>
+        <w:t xml:space="preserve">. https://doi.org/10.48550/arXiv.2503.07928</w:t>
       </w:r>
     </w:p>
     <w:p>
@@ -11006,7 +11030,7 @@
         <w:widowControl w:val="1"/>
       </w:pPr>
       <w:r>
-        <w:t xml:space="preserve">Nelson, T. O., &amp; Narens, L. (1990). Metamemory: A Theoretical Framework and New Findings.</w:t>
+        <w:t xml:space="preserve">Messick, S. (1995). Validity of Psychological Assessment: Validation of Inferences from Persons' Responses and Performances as Scientific Inquiry into Score Meaning.</w:t>
       </w:r>
       <w:r>
         <w:t xml:space="preserve"> </w:t>
@@ -11016,10 +11040,10 @@
           <w:i/>
           <w:iCs/>
         </w:rPr>
-        <w:t xml:space="preserve">The Psychology of Learning and Motivation</w:t>
-      </w:r>
-      <w:r>
-        <w:t xml:space="preserve">, 26, 125–173.</w:t>
+        <w:t xml:space="preserve">American Psychologist</w:t>
+      </w:r>
+      <w:r>
+        <w:t xml:space="preserve">, 50(9), 741–749. https://doi.org/10.1037/0003-066X.50.9.741</w:t>
       </w:r>
     </w:p>
     <w:p>
@@ -11031,7 +11055,7 @@
         <w:widowControl w:val="1"/>
       </w:pPr>
       <w:r>
-        <w:t xml:space="preserve">Parasuraman, R., &amp; Manzey, D. H. (2010). Complacency and Bias in Human Use of Automation: An Attentional Integration.</w:t>
+        <w:t xml:space="preserve">Nazaretsky, T., Gabbay, H., &amp; Käser, T. (2025). Can Students Judge Like Experts? A Large-Scale Study on AI and Human Personalized Formative Feedback.</w:t>
       </w:r>
       <w:r>
         <w:t xml:space="preserve"> </w:t>
@@ -11041,10 +11065,10 @@
           <w:i/>
           <w:iCs/>
         </w:rPr>
-        <w:t xml:space="preserve">Human Factors</w:t>
-      </w:r>
-      <w:r>
-        <w:t xml:space="preserve">, 52(3), 381–410.</w:t>
+        <w:t xml:space="preserve">Computers and Education: Artificial Intelligence</w:t>
+      </w:r>
+      <w:r>
+        <w:t xml:space="preserve">. https://doi.org/10.1016/j.caeai.2025.100533</w:t>
       </w:r>
     </w:p>
     <w:p>
@@ -11056,7 +11080,7 @@
         <w:widowControl w:val="1"/>
       </w:pPr>
       <w:r>
-        <w:t xml:space="preserve">Paul, R., &amp; Elder, L. (2006). The Miniature Guide to Critical Thinking: Concepts and Tools.</w:t>
+        <w:t xml:space="preserve">Nelson, T. O., &amp; Narens, L. (1990). Metamemory: A Theoretical Framework and New Findings.</w:t>
       </w:r>
       <w:r>
         <w:t xml:space="preserve"> </w:t>
@@ -11066,10 +11090,10 @@
           <w:i/>
           <w:iCs/>
         </w:rPr>
-        <w:t xml:space="preserve">Foundation for Critical Thinking</w:t>
-      </w:r>
-      <w:r>
-        <w:t xml:space="preserve">.</w:t>
+        <w:t xml:space="preserve">The Psychology of Learning and Motivation</w:t>
+      </w:r>
+      <w:r>
+        <w:t xml:space="preserve">, 26, 125–173.</w:t>
       </w:r>
     </w:p>
     <w:p>
@@ -11081,7 +11105,7 @@
         <w:widowControl w:val="1"/>
       </w:pPr>
       <w:r>
-        <w:t xml:space="preserve">Randazzo, B., Lifshitz-Assaf, H., Kellogg, K., Dell'Acqua, F., Mollick, E., Candelon, F., &amp; Lakhani, K. R. (2025). Cyborgs, Centaurs and Self-Automators: Modes of Human-AI Collaboration in Knowledge Work.</w:t>
+        <w:t xml:space="preserve">Parasuraman, R., &amp; Manzey, D. H. (2010). Complacency and Bias in Human Use of Automation: An Attentional Integration.</w:t>
       </w:r>
       <w:r>
         <w:t xml:space="preserve"> </w:t>
@@ -11091,10 +11115,10 @@
           <w:i/>
           <w:iCs/>
         </w:rPr>
-        <w:t xml:space="preserve">Harvard Business School Working Paper 26-036</w:t>
-      </w:r>
-      <w:r>
-        <w:t xml:space="preserve">.</w:t>
+        <w:t xml:space="preserve">Human Factors</w:t>
+      </w:r>
+      <w:r>
+        <w:t xml:space="preserve">, 52(3), 381–410.</w:t>
       </w:r>
     </w:p>
     <w:p>
@@ -11106,7 +11130,7 @@
         <w:widowControl w:val="1"/>
       </w:pPr>
       <w:r>
-        <w:t xml:space="preserve">Runco, M. A., &amp; Chand, I. (1995). Cognition and Creativity.</w:t>
+        <w:t xml:space="preserve">Paul, R., &amp; Elder, L. (2006). The Miniature Guide to Critical Thinking: Concepts and Tools.</w:t>
       </w:r>
       <w:r>
         <w:t xml:space="preserve"> </w:t>
@@ -11116,10 +11140,10 @@
           <w:i/>
           <w:iCs/>
         </w:rPr>
-        <w:t xml:space="preserve">Educational Psychology Review</w:t>
-      </w:r>
-      <w:r>
-        <w:t xml:space="preserve">, 7(3), 243–267.</w:t>
+        <w:t xml:space="preserve">Foundation for Critical Thinking</w:t>
+      </w:r>
+      <w:r>
+        <w:t xml:space="preserve">.</w:t>
       </w:r>
     </w:p>
     <w:p>
@@ -11131,7 +11155,7 @@
         <w:widowControl w:val="1"/>
       </w:pPr>
       <w:r>
-        <w:t xml:space="preserve">Sadler, D. R. (1989). Formative Assessment and the Design of Instructional Systems.</w:t>
+        <w:t xml:space="preserve">Randazzo, B., Lifshitz-Assaf, H., Kellogg, K., Dell'Acqua, F., Mollick, E., Candelon, F., &amp; Lakhani, K. R. (2025). Cyborgs, Centaurs and Self-Automators: Modes of Human-AI Collaboration in Knowledge Work.</w:t>
       </w:r>
       <w:r>
         <w:t xml:space="preserve"> </w:t>
@@ -11141,10 +11165,10 @@
           <w:i/>
           <w:iCs/>
         </w:rPr>
-        <w:t xml:space="preserve">Instructional Science</w:t>
-      </w:r>
-      <w:r>
-        <w:t xml:space="preserve">, 18(2), 119–144.</w:t>
+        <w:t xml:space="preserve">Harvard Business School Working Paper 26-036</w:t>
+      </w:r>
+      <w:r>
+        <w:t xml:space="preserve">.</w:t>
       </w:r>
     </w:p>
     <w:p>
@@ -11156,7 +11180,7 @@
         <w:widowControl w:val="1"/>
       </w:pPr>
       <w:r>
-        <w:t xml:space="preserve">Salomon, G., Perkins, D. N., &amp; Globerson, T. (1991). Partners in Cognition: Extending Human Intelligence with Intelligent Technologies.</w:t>
+        <w:t xml:space="preserve">Runco, M. A., &amp; Chand, I. (1995). Cognition and Creativity.</w:t>
       </w:r>
       <w:r>
         <w:t xml:space="preserve"> </w:t>
@@ -11166,10 +11190,10 @@
           <w:i/>
           <w:iCs/>
         </w:rPr>
-        <w:t xml:space="preserve">Educational Researcher</w:t>
-      </w:r>
-      <w:r>
-        <w:t xml:space="preserve">, 20(3), 2–9.</w:t>
+        <w:t xml:space="preserve">Educational Psychology Review</w:t>
+      </w:r>
+      <w:r>
+        <w:t xml:space="preserve">, 7(3), 243–267.</w:t>
       </w:r>
     </w:p>
     <w:p>
@@ -11181,7 +11205,7 @@
         <w:widowControl w:val="1"/>
       </w:pPr>
       <w:r>
-        <w:t xml:space="preserve">Sidra, S., &amp; Mason, C. (2025). Generative AI in Human-AI Collaboration: Validation of the Collaborative AI Literacy and Collaborative AI Metacognition Scales.</w:t>
+        <w:t xml:space="preserve">Sadler, D. R. (1989). Formative Assessment and the Design of Instructional Systems.</w:t>
       </w:r>
       <w:r>
         <w:t xml:space="preserve"> </w:t>
@@ -11191,10 +11215,10 @@
           <w:i/>
           <w:iCs/>
         </w:rPr>
-        <w:t xml:space="preserve">International Journal of Human-Computer Interaction</w:t>
-      </w:r>
-      <w:r>
-        <w:t xml:space="preserve">. https://doi.org/10.1080/10447318.2025.2543997</w:t>
+        <w:t xml:space="preserve">Instructional Science</w:t>
+      </w:r>
+      <w:r>
+        <w:t xml:space="preserve">, 18(2), 119–144.</w:t>
       </w:r>
     </w:p>
     <w:p>
@@ -11206,7 +11230,7 @@
         <w:widowControl w:val="1"/>
       </w:pPr>
       <w:r>
-        <w:t xml:space="preserve">Sperber, D., Clément, F., Heintz, C., Mascaro, O., Mercier, H., Origgi, G., &amp; Wilson, D. (2010). Epistemic Vigilance.</w:t>
+        <w:t xml:space="preserve">Salomon, G., Perkins, D. N., &amp; Globerson, T. (1991). Partners in Cognition: Extending Human Intelligence with Intelligent Technologies.</w:t>
       </w:r>
       <w:r>
         <w:t xml:space="preserve"> </w:t>
@@ -11216,10 +11240,10 @@
           <w:i/>
           <w:iCs/>
         </w:rPr>
-        <w:t xml:space="preserve">Mind &amp; Language</w:t>
-      </w:r>
-      <w:r>
-        <w:t xml:space="preserve">, 25(4), 359–393.</w:t>
+        <w:t xml:space="preserve">Educational Researcher</w:t>
+      </w:r>
+      <w:r>
+        <w:t xml:space="preserve">, 20(3), 2–9.</w:t>
       </w:r>
     </w:p>
     <w:p>
@@ -11231,7 +11255,7 @@
         <w:widowControl w:val="1"/>
       </w:pPr>
       <w:r>
-        <w:t xml:space="preserve">Srinath, S., Vadaparty, A., Smith IV, D. H., Porter, L., &amp; Zingaro, D. (2025). Assessing Problem Decomposition in CS1 for the GenAI Era.</w:t>
+        <w:t xml:space="preserve">Sidra, S., &amp; Mason, C. (2025). Generative AI in Human-AI Collaboration: Validation of the Collaborative AI Literacy and Collaborative AI Metacognition Scales.</w:t>
       </w:r>
       <w:r>
         <w:t xml:space="preserve"> </w:t>
@@ -11241,10 +11265,10 @@
           <w:i/>
           <w:iCs/>
         </w:rPr>
-        <w:t xml:space="preserve">arXiv preprint arXiv:2511.05764</w:t>
-      </w:r>
-      <w:r>
-        <w:t xml:space="preserve">.</w:t>
+        <w:t xml:space="preserve">International Journal of Human-Computer Interaction</w:t>
+      </w:r>
+      <w:r>
+        <w:t xml:space="preserve">. https://doi.org/10.1080/10447318.2025.2543997</w:t>
       </w:r>
     </w:p>
     <w:p>
@@ -11256,7 +11280,7 @@
         <w:widowControl w:val="1"/>
       </w:pPr>
       <w:r>
-        <w:t xml:space="preserve">Tankelevitch, L., Kewenig, V., Simkute, A., Scott, A. E., Sarkar, A., Sellen, A., &amp; Rintel, S. (2024). The Metacognitive Demands and Opportunities of Generative AI.</w:t>
+        <w:t xml:space="preserve">Sperber, D., Clément, F., Heintz, C., Mascaro, O., Mercier, H., Origgi, G., &amp; Wilson, D. (2010). Epistemic Vigilance.</w:t>
       </w:r>
       <w:r>
         <w:t xml:space="preserve"> </w:t>
@@ -11266,10 +11290,10 @@
           <w:i/>
           <w:iCs/>
         </w:rPr>
-        <w:t xml:space="preserve">Proceedings of the 2024 CHI Conference on Human Factors in Computing Systems</w:t>
-      </w:r>
-      <w:r>
-        <w:t xml:space="preserve">.</w:t>
+        <w:t xml:space="preserve">Mind &amp; Language</w:t>
+      </w:r>
+      <w:r>
+        <w:t xml:space="preserve">, 25(4), 359–393.</w:t>
       </w:r>
     </w:p>
     <w:p>
@@ -11281,7 +11305,7 @@
         <w:widowControl w:val="1"/>
       </w:pPr>
       <w:r>
-        <w:t xml:space="preserve">Tour, E., &amp; Zadorozhnyy, A. (2025). Conceptualizing and Operationalizing Prompt Literacy for English Language Learners.</w:t>
+        <w:t xml:space="preserve">Srinath, S., Vadaparty, A., Smith IV, D. H., Porter, L., &amp; Zingaro, D. (2025). Assessing Problem Decomposition in CS1 for the GenAI Era.</w:t>
       </w:r>
       <w:r>
         <w:t xml:space="preserve"> </w:t>
@@ -11291,10 +11315,10 @@
           <w:i/>
           <w:iCs/>
         </w:rPr>
-        <w:t xml:space="preserve">Journal of Adolescent &amp; Adult Literacy</w:t>
-      </w:r>
-      <w:r>
-        <w:t xml:space="preserve">. https://doi.org/10.1002/jaal.70020</w:t>
+        <w:t xml:space="preserve">arXiv preprint arXiv:2511.05764</w:t>
+      </w:r>
+      <w:r>
+        <w:t xml:space="preserve">.</w:t>
       </w:r>
     </w:p>
     <w:p>
@@ -11306,7 +11330,7 @@
         <w:widowControl w:val="1"/>
       </w:pPr>
       <w:r>
-        <w:t xml:space="preserve">Vaccaro, M., Almaatouq, A., &amp; Malone, T. (2024). When Combinations of Humans and AI Are Useful: A Systematic Review and Meta-Analysis.</w:t>
+        <w:t xml:space="preserve">Tankelevitch, L., Kewenig, V., Simkute, A., Scott, A. E., Sarkar, A., Sellen, A., &amp; Rintel, S. (2024). The Metacognitive Demands and Opportunities of Generative AI.</w:t>
       </w:r>
       <w:r>
         <w:t xml:space="preserve"> </w:t>
@@ -11316,10 +11340,10 @@
           <w:i/>
           <w:iCs/>
         </w:rPr>
-        <w:t xml:space="preserve">Nature Human Behaviour</w:t>
-      </w:r>
-      <w:r>
-        <w:t xml:space="preserve">, 8, 2293–2303.</w:t>
+        <w:t xml:space="preserve">Proceedings of the 2024 CHI Conference on Human Factors in Computing Systems</w:t>
+      </w:r>
+      <w:r>
+        <w:t xml:space="preserve">.</w:t>
       </w:r>
     </w:p>
     <w:p>
@@ -11331,7 +11355,7 @@
         <w:widowControl w:val="1"/>
       </w:pPr>
       <w:r>
-        <w:t xml:space="preserve">Vygotsky, L. S. (1978). Mind in Society: The Development of Higher Psychological Processes.</w:t>
+        <w:t xml:space="preserve">Tour, E., &amp; Zadorozhnyy, A. (2025). Conceptualizing and Operationalizing Prompt Literacy for English Language Learners.</w:t>
       </w:r>
       <w:r>
         <w:t xml:space="preserve"> </w:t>
@@ -11341,10 +11365,10 @@
           <w:i/>
           <w:iCs/>
         </w:rPr>
-        <w:t xml:space="preserve">Harvard University Press</w:t>
-      </w:r>
-      <w:r>
-        <w:t xml:space="preserve">.</w:t>
+        <w:t xml:space="preserve">Journal of Adolescent &amp; Adult Literacy</w:t>
+      </w:r>
+      <w:r>
+        <w:t xml:space="preserve">. https://doi.org/10.1002/jaal.70020</w:t>
       </w:r>
     </w:p>
     <w:p>
@@ -11356,7 +11380,7 @@
         <w:widowControl w:val="1"/>
       </w:pPr>
       <w:r>
-        <w:t xml:space="preserve">Walton, J., Bearman, M., Crawford, N., Tai, J., &amp; Boud, D. (2025). How University Students Work on Assessment Tasks with Generative Artificial Intelligence: Matters of Judgement.</w:t>
+        <w:t xml:space="preserve">Vaccaro, M., Almaatouq, A., &amp; Malone, T. (2024). When Combinations of Humans and AI Are Useful: A Systematic Review and Meta-Analysis.</w:t>
       </w:r>
       <w:r>
         <w:t xml:space="preserve"> </w:t>
@@ -11366,13 +11390,10 @@
           <w:i/>
           <w:iCs/>
         </w:rPr>
-        <w:t xml:space="preserve">Assessment &amp; Evaluation in Higher Education</w:t>
-      </w:r>
-      <w:r>
-        <w:t xml:space="preserve"> </w:t>
-      </w:r>
-      <w:r>
-        <w:t xml:space="preserve">(advance online publication). https://doi.org/10.1080/02602938.2025.2570328</w:t>
+        <w:t xml:space="preserve">Nature Human Behaviour</w:t>
+      </w:r>
+      <w:r>
+        <w:t xml:space="preserve">, 8, 2293–2303.</w:t>
       </w:r>
     </w:p>
     <w:p>
@@ -11384,7 +11405,7 @@
         <w:widowControl w:val="1"/>
       </w:pPr>
       <w:r>
-        <w:t xml:space="preserve">Wingerter, T. L., Straub, T., &amp; Schweitzer, S. (2025). Mitigating Automation Bias in Generative AI through Nudges: A Cognitive Reflection Test Study.</w:t>
+        <w:t xml:space="preserve">Vygotsky, L. S. (1978). Mind in Society: The Development of Higher Psychological Processes.</w:t>
       </w:r>
       <w:r>
         <w:t xml:space="preserve"> </w:t>
@@ -11394,10 +11415,10 @@
           <w:i/>
           <w:iCs/>
         </w:rPr>
-        <w:t xml:space="preserve">Procedia Computer Science</w:t>
-      </w:r>
-      <w:r>
-        <w:t xml:space="preserve">, 270, 2106–2114. https://doi.org/10.1016/j.procs.2025.09.331</w:t>
+        <w:t xml:space="preserve">Harvard University Press</w:t>
+      </w:r>
+      <w:r>
+        <w:t xml:space="preserve">.</w:t>
       </w:r>
     </w:p>
     <w:p>
@@ -11409,7 +11430,7 @@
         <w:widowControl w:val="1"/>
       </w:pPr>
       <w:r>
-        <w:t xml:space="preserve">Winne, P. H., &amp; Hadwin, A. F. (1998). Studying as Self-Regulated Learning.</w:t>
+        <w:t xml:space="preserve">Walton, J., Bearman, M., Crawford, N., Tai, J., &amp; Boud, D. (2025). How University Students Work on Assessment Tasks with Generative Artificial Intelligence: Matters of Judgement.</w:t>
       </w:r>
       <w:r>
         <w:t xml:space="preserve"> </w:t>
@@ -11419,10 +11440,88 @@
           <w:i/>
           <w:iCs/>
         </w:rPr>
+        <w:t xml:space="preserve">Assessment &amp; Evaluation in Higher Education</w:t>
+      </w:r>
+      <w:r>
+        <w:t xml:space="preserve"> </w:t>
+      </w:r>
+      <w:r>
+        <w:t xml:space="preserve">(advance online publication). https://doi.org/10.1080/02602938.2025.2570328</w:t>
+      </w:r>
+    </w:p>
+    <w:p>
+      <w:pPr>
+        <w:pStyle w:val="ReferenceEntry"/>
+        <w:jc w:val="left"/>
+        <w:keepNext w:val="0"/>
+        <w:keepLines w:val="0"/>
+        <w:widowControl w:val="1"/>
+      </w:pPr>
+      <w:r>
+        <w:t xml:space="preserve">Wingerter, T. L., Straub, T., &amp; Schweitzer, S. (2025). Mitigating Automation Bias in Generative AI through Nudges: A Cognitive Reflection Test Study.</w:t>
+      </w:r>
+      <w:r>
+        <w:t xml:space="preserve"> </w:t>
+      </w:r>
+      <w:r>
+        <w:rPr>
+          <w:i/>
+          <w:iCs/>
+        </w:rPr>
+        <w:t xml:space="preserve">Procedia Computer Science</w:t>
+      </w:r>
+      <w:r>
+        <w:t xml:space="preserve">, 270, 2106–2114. https://doi.org/10.1016/j.procs.2025.09.331</w:t>
+      </w:r>
+    </w:p>
+    <w:p>
+      <w:pPr>
+        <w:pStyle w:val="ReferenceEntry"/>
+        <w:jc w:val="left"/>
+        <w:keepNext w:val="0"/>
+        <w:keepLines w:val="0"/>
+        <w:widowControl w:val="1"/>
+      </w:pPr>
+      <w:r>
+        <w:t xml:space="preserve">Winne, P. H., &amp; Hadwin, A. F. (1998). Studying as Self-Regulated Learning.</w:t>
+      </w:r>
+      <w:r>
+        <w:t xml:space="preserve"> </w:t>
+      </w:r>
+      <w:r>
+        <w:rPr>
+          <w:i/>
+          <w:iCs/>
+        </w:rPr>
         <w:t xml:space="preserve">Metacognition in Educational Theory and Practice</w:t>
       </w:r>
       <w:r>
         <w:t xml:space="preserve">, 277–304.</w:t>
+      </w:r>
+    </w:p>
+    <w:p>
+      <w:pPr>
+        <w:pStyle w:val="ReferenceEntry"/>
+        <w:jc w:val="left"/>
+        <w:keepNext w:val="0"/>
+        <w:keepLines w:val="0"/>
+        <w:widowControl w:val="1"/>
+      </w:pPr>
+      <w:r>
+        <w:t xml:space="preserve">Wirth, J., Weber-Reuter, X.-L., Schuster, C., Fleischer, J., Leutner, D., &amp; Stebner, F. (2025). Far Transfer of Metacognitive Regulation: From Cognitive Learning Strategy Use to Mental Effort Regulation.</w:t>
+      </w:r>
+      <w:r>
+        <w:t xml:space="preserve"> </w:t>
+      </w:r>
+      <w:r>
+        <w:rPr>
+          <w:i/>
+          <w:iCs/>
+        </w:rPr>
+        <w:t xml:space="preserve">Educational Psychology Review</w:t>
+      </w:r>
+      <w:r>
+        <w:t xml:space="preserve">, 37(1), 7. https://doi.org/10.1007/s10648-024-09983-x</w:t>
       </w:r>
     </w:p>
     <w:p>

</xml_diff>

<commit_message>
v2: streamline Section 8 (move robustness/ablations to Appendix B)
Editorial streamlining analyzed earlier, now executed. The result section reads as one clean
arc (Design -> Discrimination -> Dissociation+Table 2 -> convergent/discriminant+MTMM Table 3 ->
designed contrasts + Figures 3/4), then a single one-paragraph robustness headline pointing to
the new Appendix B (Robustness and ablations), which holds the full Reliability (92%
self-consistency), cross-vendor grader-backend, and ground-truth-scaffolding analyses.

Section 8 trimmed ~2200 -> ~1750 words; the main message is no longer interrupted by five
robustness sub-analyses. Self-consistency audit clean: appendices A+B resolve, the wrapped
'(grader-robustness check below)' cross-ref fixed to (Appendix B), no orphan citations, 0
em-dashes, figures 1-4/A1-A2 and Tables 1-3 intact.

Co-Authored-By: Claude Opus 4.8 <noreply@anthropic.com>
</commit_message>
<xml_diff>
--- a/docs/coreasoning.docx
+++ b/docs/coreasoning.docx
@@ -2,7 +2,7 @@
 <file path=word/document.xml><?xml version="1.0" encoding="utf-8"?>
 <w:document xmlns:w="http://schemas.openxmlformats.org/wordprocessingml/2006/main" xmlns:m="http://schemas.openxmlformats.org/officeDocument/2006/math" xmlns:r="http://schemas.openxmlformats.org/officeDocument/2006/relationships" xmlns:o="urn:schemas-microsoft-com:office:office" xmlns:v="urn:schemas-microsoft-com:vml" xmlns:w10="urn:schemas-microsoft-com:office:word" xmlns:a="http://schemas.openxmlformats.org/drawingml/2006/main" xmlns:pic="http://schemas.openxmlformats.org/drawingml/2006/picture" xmlns:wp="http://schemas.openxmlformats.org/drawingml/2006/wordprocessingDrawing">
   <w:body>
-    <w:bookmarkStart w:id="46" w:name="Xdf9502ef5c17bbba6731875408e8426bd513f0c"/>
+    <w:bookmarkStart w:id="47" w:name="Xdf9502ef5c17bbba6731875408e8426bd513f0c"/>
     <w:p>
       <w:pPr>
         <w:pStyle w:val="Title"/>
@@ -889,7 +889,7 @@
               <a:graphicData uri="http://schemas.openxmlformats.org/drawingml/2006/picture">
                 <pic:pic>
                   <pic:nvPicPr>
-                    <pic:cNvPr descr="C:/Users/apart/AppData/Local/Temp/html2doc_svg_mFzlLi/svg_0.png" id="12" name="Picture"/>
+                    <pic:cNvPr descr="C:/Users/apart/AppData/Local/Temp/html2doc_svg_qpSNtq/svg_0.png" id="12" name="Picture"/>
                     <pic:cNvPicPr>
                       <a:picLocks noChangeArrowheads="1" noChangeAspect="1"/>
                     </pic:cNvPicPr>
@@ -1958,7 +1958,7 @@
               <a:graphicData uri="http://schemas.openxmlformats.org/drawingml/2006/picture">
                 <pic:pic>
                   <pic:nvPicPr>
-                    <pic:cNvPr descr="C:/Users/apart/AppData/Local/Temp/html2doc_svg_mFzlLi/svg_1.png" id="17" name="Picture"/>
+                    <pic:cNvPr descr="C:/Users/apart/AppData/Local/Temp/html2doc_svg_qpSNtq/svg_1.png" id="17" name="Picture"/>
                     <pic:cNvPicPr>
                       <a:picLocks noChangeArrowheads="1" noChangeAspect="1"/>
                     </pic:cNvPicPr>
@@ -8280,25 +8280,13 @@
           <w:b/>
           <w:bCs/>
         </w:rPr>
-        <w:t xml:space="preserve">Reliability.</w:t>
-      </w:r>
-      <w:r>
-        <w:t xml:space="preserve"> </w:t>
-      </w:r>
-      <w:r>
-        <w:t xml:space="preserve">To check that the grades are not noise, we hold four learner transcripts fixed and</w:t>
-      </w:r>
-      <w:r>
-        <w:t xml:space="preserve"> </w:t>
-      </w:r>
-      <w:r>
-        <w:t xml:space="preserve">re-run the evaluation-and-grading prompts five times each, an independent sample each time at the</w:t>
-      </w:r>
-      <w:r>
-        <w:t xml:space="preserve"> </w:t>
-      </w:r>
-      <w:r>
-        <w:t xml:space="preserve">production temperatures. The grader is</w:t>
+        <w:t xml:space="preserve">Robustness and ablations.</w:t>
+      </w:r>
+      <w:r>
+        <w:t xml:space="preserve"> </w:t>
+      </w:r>
+      <w:r>
+        <w:t xml:space="preserve">Three checks, reported in full in Appendix B, support the result: the grader is</w:t>
       </w:r>
       <w:r>
         <w:t xml:space="preserve"> </w:t>
@@ -8314,75 +8302,7 @@
         <w:t xml:space="preserve"> </w:t>
       </w:r>
       <w:r>
-        <w:t xml:space="preserve">overall: the</w:t>
-      </w:r>
-      <w:r>
-        <w:t xml:space="preserve"> </w:t>
-      </w:r>
-      <w:r>
-        <w:t xml:space="preserve">mean grade-flip rate across repeats is 0.08, with Judging deterministic (0.00, by construction),</w:t>
-      </w:r>
-      <w:r>
-        <w:t xml:space="preserve"> </w:t>
-      </w:r>
-      <w:r>
-        <w:t xml:space="preserve">Framing 0.15, and Steering 0.10, and a mean within-cell grade standard deviation near 0.2 on the</w:t>
-      </w:r>
-      <w:r>
-        <w:t xml:space="preserve"> </w:t>
-      </w:r>
-      <w:r>
-        <w:t xml:space="preserve">three-point scale, indicating that disagreements are occasional one-level boundary jitter rather than</w:t>
-      </w:r>
-      <w:r>
-        <w:t xml:space="preserve"> </w:t>
-      </w:r>
-      <w:r>
-        <w:t xml:space="preserve">unstable scoring. This addresses the documented self-inconsistency of LLM judges, though it measures</w:t>
-      </w:r>
-      <w:r>
-        <w:t xml:space="preserve"> </w:t>
-      </w:r>
-      <w:r>
-        <w:rPr>
-          <w:i/>
-          <w:iCs/>
-        </w:rPr>
-        <w:t xml:space="preserve">precision</w:t>
-      </w:r>
-      <w:r>
-        <w:t xml:space="preserve"> </w:t>
-      </w:r>
-      <w:r>
-        <w:t xml:space="preserve">(repeatability), not</w:t>
-      </w:r>
-      <w:r>
-        <w:t xml:space="preserve"> </w:t>
-      </w:r>
-      <w:r>
-        <w:rPr>
-          <w:i/>
-          <w:iCs/>
-        </w:rPr>
-        <w:t xml:space="preserve">accuracy</w:t>
-      </w:r>
-      <w:r>
-        <w:t xml:space="preserve"> </w:t>
-      </w:r>
-      <w:r>
-        <w:t xml:space="preserve">against humans (Section 10). Because Judging contributes a</w:t>
-      </w:r>
-      <w:r>
-        <w:t xml:space="preserve"> </w:t>
-      </w:r>
-      <w:r>
-        <w:t xml:space="preserve">flip rate of zero by construction, the load-bearing figure is the blind-graded skills, whose flip rate</w:t>
-      </w:r>
-      <w:r>
-        <w:t xml:space="preserve"> </w:t>
-      </w:r>
-      <w:r>
-        <w:t xml:space="preserve">is near 0.12.</w:t>
+        <w:t xml:space="preserve">on repeat (a precision check, not accuracy against humans); the dissociation replicates across three grader backends spanning two providers (gpt-4o, gpt-4o-mini, and Meta's llama-3.3-70b; diagonal-to-off-diagonal ratio 39), so it does not hinge on one model snapshot; and a ground-truth ablation shows Framing and Steering are scored by rubric-guided model judgment while Judging, as instrumented, tracks the seeded answer key, which locates the Judging score to settings with known ground truth (Section 10 specifies the open-ended variant).</w:t>
       </w:r>
     </w:p>
     <w:p>
@@ -8398,240 +8318,6 @@
           <w:b/>
           <w:bCs/>
         </w:rPr>
-        <w:t xml:space="preserve">Grader-backend robustness (across vendors).</w:t>
-      </w:r>
-      <w:r>
-        <w:t xml:space="preserve"> </w:t>
-      </w:r>
-      <w:r>
-        <w:t xml:space="preserve">The dissociation holds across three grader backends</w:t>
-      </w:r>
-      <w:r>
-        <w:t xml:space="preserve"> </w:t>
-      </w:r>
-      <w:r>
-        <w:t xml:space="preserve">spanning two providers. The primary grades come from gpt-4o; re-grading the identical 40 transcripts</w:t>
-      </w:r>
-      <w:r>
-        <w:t xml:space="preserve"> </w:t>
-      </w:r>
-      <w:r>
-        <w:t xml:space="preserve">(challenges and learner responses held fixed) with gpt-4o-mini reproduces it (diagonal +0.47 versus</w:t>
-      </w:r>
-      <w:r>
-        <w:t xml:space="preserve"> </w:t>
-      </w:r>
-      <w:r>
-        <w:t xml:space="preserve">off-diagonal +0.07), and re-grading the same transcripts with an independent-vendor model,</w:t>
-      </w:r>
-      <w:r>
-        <w:t xml:space="preserve"> </w:t>
-      </w:r>
-      <w:r>
-        <w:t xml:space="preserve">Meta's llama-3.3-70b (the prototype's own engine), reproduces it again with a stronger margin:</w:t>
-      </w:r>
-      <w:r>
-        <w:t xml:space="preserve"> </w:t>
-      </w:r>
-      <w:r>
-        <w:t xml:space="preserve">own-skill effects of +0.80 (Framing), +0.75 (Judging), and +0.40 (Steering) against a mean cross-skill</w:t>
-      </w:r>
-      <w:r>
-        <w:t xml:space="preserve"> </w:t>
-      </w:r>
-      <w:r>
-        <w:t xml:space="preserve">effect of +0.02, a diagonal-to-off-diagonal ratio of 39. Two facts stand out across backends. First,</w:t>
-      </w:r>
-      <w:r>
-        <w:t xml:space="preserve"> </w:t>
-      </w:r>
-      <w:r>
-        <w:t xml:space="preserve">Judging's own-effect is +2.00 only under gpt-4o's strict adherence to the seeded-issue selection; under</w:t>
-      </w:r>
-      <w:r>
-        <w:t xml:space="preserve"> </w:t>
-      </w:r>
-      <w:r>
-        <w:t xml:space="preserve">both gpt-4o-mini and the independent-vendor llama it settles to +0.65 and +0.75, level with Framing</w:t>
-      </w:r>
-      <w:r>
-        <w:t xml:space="preserve"> </w:t>
-      </w:r>
-      <w:r>
-        <w:t xml:space="preserve">(+0.65 and +0.80), so the separation is balanced across all three skills, not propped up by the built-in</w:t>
-      </w:r>
-      <w:r>
-        <w:t xml:space="preserve"> </w:t>
-      </w:r>
-      <w:r>
-        <w:t xml:space="preserve">Judging diagonal. Second, every backend reproduces the designed contrast profiles (a strong-framer /</w:t>
-      </w:r>
-      <w:r>
-        <w:t xml:space="preserve"> </w:t>
-      </w:r>
-      <w:r>
-        <w:t xml:space="preserve">weak-judge learner scores high Framing and low Judging, and the inverse for a weak-framer / strong-judge</w:t>
-      </w:r>
-      <w:r>
-        <w:t xml:space="preserve"> </w:t>
-      </w:r>
-      <w:r>
-        <w:t xml:space="preserve">learner), which a single general-ability account cannot produce. Because the result holds across three</w:t>
-      </w:r>
-      <w:r>
-        <w:t xml:space="preserve"> </w:t>
-      </w:r>
-      <w:r>
-        <w:t xml:space="preserve">independently-versioned models from two vendors (gpt-4o, gpt-4o-mini, and Meta's llama-3.3-70b), it does</w:t>
-      </w:r>
-      <w:r>
-        <w:t xml:space="preserve"> </w:t>
-      </w:r>
-      <w:r>
-        <w:t xml:space="preserve">not hinge on a single model snapshot; the released harness pins the model identifiers so the run</w:t>
-      </w:r>
-      <w:r>
-        <w:t xml:space="preserve"> </w:t>
-      </w:r>
-      <w:r>
-        <w:t xml:space="preserve">reproduces, and the cross-backend agreement is the evidence that it generalizes beyond any one of them.</w:t>
-      </w:r>
-      <w:r>
-        <w:t xml:space="preserve"> </w:t>
-      </w:r>
-      <w:r>
-        <w:t xml:space="preserve">Cross-vendor replication is therefore established, not deferred.</w:t>
-      </w:r>
-    </w:p>
-    <w:p>
-      <w:pPr>
-        <w:pStyle w:val="BodyText"/>
-        <w:jc w:val="both"/>
-        <w:keepNext w:val="0"/>
-        <w:keepLines w:val="0"/>
-        <w:widowControl w:val="1"/>
-      </w:pPr>
-      <w:r>
-        <w:rPr>
-          <w:b/>
-          <w:bCs/>
-        </w:rPr>
-        <w:t xml:space="preserve">Dependence on ground-truth scaffolding.</w:t>
-      </w:r>
-      <w:r>
-        <w:t xml:space="preserve"> </w:t>
-      </w:r>
-      <w:r>
-        <w:t xml:space="preserve">To probe how much the instrument's discrimination relies on</w:t>
-      </w:r>
-      <w:r>
-        <w:t xml:space="preserve"> </w:t>
-      </w:r>
-      <w:r>
-        <w:t xml:space="preserve">the seeded ground truth (the gold framing supplied to the framing evaluator and the known seeded issues</w:t>
-      </w:r>
-      <w:r>
-        <w:t xml:space="preserve"> </w:t>
-      </w:r>
-      <w:r>
-        <w:t xml:space="preserve">supplied to the judging evaluator) versus the model's own judgment, we re-grade a 40-learner subset</w:t>
-      </w:r>
-      <w:r>
-        <w:t xml:space="preserve"> </w:t>
-      </w:r>
-      <w:r>
-        <w:t xml:space="preserve">(five subjects) with that scaffolding removed, comparing against that subset's own baseline (Framing</w:t>
-      </w:r>
-      <w:r>
-        <w:t xml:space="preserve"> </w:t>
-      </w:r>
-      <w:r>
-        <w:t xml:space="preserve">+0.60, Judging +2.00, Steering +0.50). The effect is sharply skill-specific. Framing discrimination is essentially</w:t>
-      </w:r>
-      <w:r>
-        <w:t xml:space="preserve"> </w:t>
-      </w:r>
-      <w:r>
-        <w:t xml:space="preserve">unaffected (own-effect +0.75 without the gold reference, versus +0.60 with it): the rubric and the</w:t>
-      </w:r>
-      <w:r>
-        <w:t xml:space="preserve"> </w:t>
-      </w:r>
-      <w:r>
-        <w:t xml:space="preserve">model's own judgment carry it. Judging discrimination, by contrast, falls sharply (+2.00 to +0.45):</w:t>
-      </w:r>
-      <w:r>
-        <w:t xml:space="preserve"> </w:t>
-      </w:r>
-      <w:r>
-        <w:t xml:space="preserve">without the known issues the grader has no recall-precision anchor and no longer separates strong from</w:t>
-      </w:r>
-      <w:r>
-        <w:t xml:space="preserve"> </w:t>
-      </w:r>
-      <w:r>
-        <w:t xml:space="preserve">weak judging. Steering falls in between (+0.50 to +0.25). The skills still</w:t>
-      </w:r>
-      <w:r>
-        <w:t xml:space="preserve"> </w:t>
-      </w:r>
-      <w:r>
-        <w:t xml:space="preserve">dissociate (ratio 29), and the result pinpoints what each grade measures: Framing and Steering are</w:t>
-      </w:r>
-      <w:r>
-        <w:t xml:space="preserve"> </w:t>
-      </w:r>
-      <w:r>
-        <w:t xml:space="preserve">scored largely by rubric-guided model judgment, whereas Judging</w:t>
-      </w:r>
-      <w:r>
-        <w:t xml:space="preserve"> </w:t>
-      </w:r>
-      <w:r>
-        <w:rPr>
-          <w:i/>
-          <w:iCs/>
-        </w:rPr>
-        <w:t xml:space="preserve">as instrumented here</w:t>
-      </w:r>
-      <w:r>
-        <w:t xml:space="preserve"> </w:t>
-      </w:r>
-      <w:r>
-        <w:t xml:space="preserve">tracks agreement</w:t>
-      </w:r>
-      <w:r>
-        <w:t xml:space="preserve"> </w:t>
-      </w:r>
-      <w:r>
-        <w:t xml:space="preserve">with a known answer key. This both explains Judging's by-construction +2.00 and locates the Judging</w:t>
-      </w:r>
-      <w:r>
-        <w:t xml:space="preserve"> </w:t>
-      </w:r>
-      <w:r>
-        <w:t xml:space="preserve">score precisely: it applies where ground truth is known, and open-ended judging without a key is the</w:t>
-      </w:r>
-      <w:r>
-        <w:t xml:space="preserve"> </w:t>
-      </w:r>
-      <w:r>
-        <w:t xml:space="preserve">distinct instrumentation Section 10 specifies.</w:t>
-      </w:r>
-    </w:p>
-    <w:p>
-      <w:pPr>
-        <w:pStyle w:val="BodyText"/>
-        <w:jc w:val="both"/>
-        <w:keepNext w:val="0"/>
-        <w:keepLines w:val="0"/>
-        <w:widowControl w:val="1"/>
-      </w:pPr>
-      <w:r>
-        <w:rPr>
-          <w:b/>
-          <w:bCs/>
-        </w:rPr>
         <w:t xml:space="preserve">Scope.</w:t>
       </w:r>
       <w:r>
@@ -8668,13 +8354,13 @@
         <w:t xml:space="preserve"> </w:t>
       </w:r>
       <w:r>
-        <w:t xml:space="preserve">dissociation replicates across grader backends spanning two providers (the grader-robustness check</w:t>
-      </w:r>
-      <w:r>
-        <w:t xml:space="preserve"> </w:t>
-      </w:r>
-      <w:r>
-        <w:t xml:space="preserve">below); agreement with human experts is the validity step the prepared study in Section 10 supplies.</w:t>
+        <w:t xml:space="preserve">dissociation replicates across grader backends spanning two providers (Appendix B); agreement with</w:t>
+      </w:r>
+      <w:r>
+        <w:t xml:space="preserve"> </w:t>
+      </w:r>
+      <w:r>
+        <w:t xml:space="preserve">human experts is the validity step the prepared study in Section 10 supplies.</w:t>
       </w:r>
       <w:r>
         <w:t xml:space="preserve"> </w:t>
@@ -9767,7 +9453,7 @@
               <a:graphicData uri="http://schemas.openxmlformats.org/drawingml/2006/picture">
                 <pic:pic>
                   <pic:nvPicPr>
-                    <pic:cNvPr descr="C:/Users/apart/AppData/Local/Temp/html2doc_svg_mFzlLi/svg_2.png" id="40" name="Picture"/>
+                    <pic:cNvPr descr="C:/Users/apart/AppData/Local/Temp/html2doc_svg_qpSNtq/svg_2.png" id="40" name="Picture"/>
                     <pic:cNvPicPr>
                       <a:picLocks noChangeArrowheads="1" noChangeAspect="1"/>
                     </pic:cNvPicPr>
@@ -9890,7 +9576,7 @@
               <a:graphicData uri="http://schemas.openxmlformats.org/drawingml/2006/picture">
                 <pic:pic>
                   <pic:nvPicPr>
-                    <pic:cNvPr descr="C:/Users/apart/AppData/Local/Temp/html2doc_svg_mFzlLi/svg_3.png" id="43" name="Picture"/>
+                    <pic:cNvPr descr="C:/Users/apart/AppData/Local/Temp/html2doc_svg_qpSNtq/svg_3.png" id="43" name="Picture"/>
                     <pic:cNvPicPr>
                       <a:picLocks noChangeArrowheads="1" noChangeAspect="1"/>
                     </pic:cNvPicPr>
@@ -9982,7 +9668,372 @@
       </w:r>
     </w:p>
     <w:bookmarkEnd w:id="44"/>
-    <w:bookmarkStart w:id="45" w:name="references"/>
+    <w:bookmarkStart w:id="45" w:name="appendix-b-robustness-and-ablations"/>
+    <w:p>
+      <w:pPr>
+        <w:pStyle w:val="Heading2"/>
+        <w:keepNext/>
+        <w:keepLines/>
+        <w:widowControl w:val="1"/>
+      </w:pPr>
+      <w:r>
+        <w:t xml:space="preserve">Appendix B. Robustness and ablations</w:t>
+      </w:r>
+    </w:p>
+    <w:p>
+      <w:pPr>
+        <w:pStyle w:val="FirstParagraph"/>
+        <w:jc w:val="both"/>
+        <w:keepNext w:val="0"/>
+        <w:keepLines w:val="0"/>
+        <w:widowControl w:val="1"/>
+      </w:pPr>
+      <w:r>
+        <w:rPr>
+          <w:b/>
+          <w:bCs/>
+        </w:rPr>
+        <w:t xml:space="preserve">Reliability.</w:t>
+      </w:r>
+      <w:r>
+        <w:t xml:space="preserve"> </w:t>
+      </w:r>
+      <w:r>
+        <w:t xml:space="preserve">To check that the grades are not noise, we hold four learner transcripts fixed and</w:t>
+      </w:r>
+      <w:r>
+        <w:t xml:space="preserve"> </w:t>
+      </w:r>
+      <w:r>
+        <w:t xml:space="preserve">re-run the evaluation-and-grading prompts five times each, an independent sample each time at the</w:t>
+      </w:r>
+      <w:r>
+        <w:t xml:space="preserve"> </w:t>
+      </w:r>
+      <w:r>
+        <w:t xml:space="preserve">production temperatures. The grader is</w:t>
+      </w:r>
+      <w:r>
+        <w:t xml:space="preserve"> </w:t>
+      </w:r>
+      <w:r>
+        <w:rPr>
+          <w:b/>
+          <w:bCs/>
+        </w:rPr>
+        <w:t xml:space="preserve">92% self-consistent</w:t>
+      </w:r>
+      <w:r>
+        <w:t xml:space="preserve"> </w:t>
+      </w:r>
+      <w:r>
+        <w:t xml:space="preserve">overall: the</w:t>
+      </w:r>
+      <w:r>
+        <w:t xml:space="preserve"> </w:t>
+      </w:r>
+      <w:r>
+        <w:t xml:space="preserve">mean grade-flip rate across repeats is 0.08, with Judging deterministic (0.00, by construction),</w:t>
+      </w:r>
+      <w:r>
+        <w:t xml:space="preserve"> </w:t>
+      </w:r>
+      <w:r>
+        <w:t xml:space="preserve">Framing 0.15, and Steering 0.10, and a mean within-cell grade standard deviation near 0.2 on the</w:t>
+      </w:r>
+      <w:r>
+        <w:t xml:space="preserve"> </w:t>
+      </w:r>
+      <w:r>
+        <w:t xml:space="preserve">three-point scale, indicating that disagreements are occasional one-level boundary jitter rather than</w:t>
+      </w:r>
+      <w:r>
+        <w:t xml:space="preserve"> </w:t>
+      </w:r>
+      <w:r>
+        <w:t xml:space="preserve">unstable scoring. This addresses the documented self-inconsistency of LLM judges, though it measures</w:t>
+      </w:r>
+      <w:r>
+        <w:t xml:space="preserve"> </w:t>
+      </w:r>
+      <w:r>
+        <w:rPr>
+          <w:i/>
+          <w:iCs/>
+        </w:rPr>
+        <w:t xml:space="preserve">precision</w:t>
+      </w:r>
+      <w:r>
+        <w:t xml:space="preserve"> </w:t>
+      </w:r>
+      <w:r>
+        <w:t xml:space="preserve">(repeatability), not</w:t>
+      </w:r>
+      <w:r>
+        <w:t xml:space="preserve"> </w:t>
+      </w:r>
+      <w:r>
+        <w:rPr>
+          <w:i/>
+          <w:iCs/>
+        </w:rPr>
+        <w:t xml:space="preserve">accuracy</w:t>
+      </w:r>
+      <w:r>
+        <w:t xml:space="preserve"> </w:t>
+      </w:r>
+      <w:r>
+        <w:t xml:space="preserve">against humans (Section 10). Because Judging contributes a</w:t>
+      </w:r>
+      <w:r>
+        <w:t xml:space="preserve"> </w:t>
+      </w:r>
+      <w:r>
+        <w:t xml:space="preserve">flip rate of zero by construction, the load-bearing figure is the blind-graded skills, whose flip rate</w:t>
+      </w:r>
+      <w:r>
+        <w:t xml:space="preserve"> </w:t>
+      </w:r>
+      <w:r>
+        <w:t xml:space="preserve">is near 0.12.</w:t>
+      </w:r>
+    </w:p>
+    <w:p>
+      <w:pPr>
+        <w:pStyle w:val="BodyText"/>
+        <w:jc w:val="both"/>
+        <w:keepNext w:val="0"/>
+        <w:keepLines w:val="0"/>
+        <w:widowControl w:val="1"/>
+      </w:pPr>
+      <w:r>
+        <w:rPr>
+          <w:b/>
+          <w:bCs/>
+        </w:rPr>
+        <w:t xml:space="preserve">Grader-backend robustness (across vendors).</w:t>
+      </w:r>
+      <w:r>
+        <w:t xml:space="preserve"> </w:t>
+      </w:r>
+      <w:r>
+        <w:t xml:space="preserve">The dissociation holds across three grader backends</w:t>
+      </w:r>
+      <w:r>
+        <w:t xml:space="preserve"> </w:t>
+      </w:r>
+      <w:r>
+        <w:t xml:space="preserve">spanning two providers. The primary grades come from gpt-4o; re-grading the identical 40 transcripts</w:t>
+      </w:r>
+      <w:r>
+        <w:t xml:space="preserve"> </w:t>
+      </w:r>
+      <w:r>
+        <w:t xml:space="preserve">(challenges and learner responses held fixed) with gpt-4o-mini reproduces it (diagonal +0.47 versus</w:t>
+      </w:r>
+      <w:r>
+        <w:t xml:space="preserve"> </w:t>
+      </w:r>
+      <w:r>
+        <w:t xml:space="preserve">off-diagonal +0.07), and re-grading the same transcripts with an independent-vendor model,</w:t>
+      </w:r>
+      <w:r>
+        <w:t xml:space="preserve"> </w:t>
+      </w:r>
+      <w:r>
+        <w:t xml:space="preserve">Meta's llama-3.3-70b (the prototype's own engine), reproduces it again with a stronger margin:</w:t>
+      </w:r>
+      <w:r>
+        <w:t xml:space="preserve"> </w:t>
+      </w:r>
+      <w:r>
+        <w:t xml:space="preserve">own-skill effects of +0.80 (Framing), +0.75 (Judging), and +0.40 (Steering) against a mean cross-skill</w:t>
+      </w:r>
+      <w:r>
+        <w:t xml:space="preserve"> </w:t>
+      </w:r>
+      <w:r>
+        <w:t xml:space="preserve">effect of +0.02, a diagonal-to-off-diagonal ratio of 39. Two facts stand out across backends. First,</w:t>
+      </w:r>
+      <w:r>
+        <w:t xml:space="preserve"> </w:t>
+      </w:r>
+      <w:r>
+        <w:t xml:space="preserve">Judging's own-effect is +2.00 only under gpt-4o's strict adherence to the seeded-issue selection; under</w:t>
+      </w:r>
+      <w:r>
+        <w:t xml:space="preserve"> </w:t>
+      </w:r>
+      <w:r>
+        <w:t xml:space="preserve">both gpt-4o-mini and the independent-vendor llama it settles to +0.65 and +0.75, level with Framing</w:t>
+      </w:r>
+      <w:r>
+        <w:t xml:space="preserve"> </w:t>
+      </w:r>
+      <w:r>
+        <w:t xml:space="preserve">(+0.65 and +0.80), so the separation is balanced across all three skills, not propped up by the built-in</w:t>
+      </w:r>
+      <w:r>
+        <w:t xml:space="preserve"> </w:t>
+      </w:r>
+      <w:r>
+        <w:t xml:space="preserve">Judging diagonal. Second, every backend reproduces the designed contrast profiles (a strong-framer /</w:t>
+      </w:r>
+      <w:r>
+        <w:t xml:space="preserve"> </w:t>
+      </w:r>
+      <w:r>
+        <w:t xml:space="preserve">weak-judge learner scores high Framing and low Judging, and the inverse for a weak-framer / strong-judge</w:t>
+      </w:r>
+      <w:r>
+        <w:t xml:space="preserve"> </w:t>
+      </w:r>
+      <w:r>
+        <w:t xml:space="preserve">learner), which a single general-ability account cannot produce. Because the result holds across three</w:t>
+      </w:r>
+      <w:r>
+        <w:t xml:space="preserve"> </w:t>
+      </w:r>
+      <w:r>
+        <w:t xml:space="preserve">independently-versioned models from two vendors (gpt-4o, gpt-4o-mini, and Meta's llama-3.3-70b), it does</w:t>
+      </w:r>
+      <w:r>
+        <w:t xml:space="preserve"> </w:t>
+      </w:r>
+      <w:r>
+        <w:t xml:space="preserve">not hinge on a single model snapshot; the released harness pins the model identifiers so the run</w:t>
+      </w:r>
+      <w:r>
+        <w:t xml:space="preserve"> </w:t>
+      </w:r>
+      <w:r>
+        <w:t xml:space="preserve">reproduces, and the cross-backend agreement is the evidence that it generalizes beyond any one of them.</w:t>
+      </w:r>
+      <w:r>
+        <w:t xml:space="preserve"> </w:t>
+      </w:r>
+      <w:r>
+        <w:t xml:space="preserve">Cross-vendor replication is therefore established, not deferred.</w:t>
+      </w:r>
+    </w:p>
+    <w:p>
+      <w:pPr>
+        <w:pStyle w:val="BodyText"/>
+        <w:jc w:val="both"/>
+        <w:keepNext w:val="0"/>
+        <w:keepLines w:val="0"/>
+        <w:widowControl w:val="1"/>
+      </w:pPr>
+      <w:r>
+        <w:rPr>
+          <w:b/>
+          <w:bCs/>
+        </w:rPr>
+        <w:t xml:space="preserve">Dependence on ground-truth scaffolding.</w:t>
+      </w:r>
+      <w:r>
+        <w:t xml:space="preserve"> </w:t>
+      </w:r>
+      <w:r>
+        <w:t xml:space="preserve">To probe how much the instrument's discrimination relies on</w:t>
+      </w:r>
+      <w:r>
+        <w:t xml:space="preserve"> </w:t>
+      </w:r>
+      <w:r>
+        <w:t xml:space="preserve">the seeded ground truth (the gold framing supplied to the framing evaluator and the known seeded issues</w:t>
+      </w:r>
+      <w:r>
+        <w:t xml:space="preserve"> </w:t>
+      </w:r>
+      <w:r>
+        <w:t xml:space="preserve">supplied to the judging evaluator) versus the model's own judgment, we re-grade a 40-learner subset</w:t>
+      </w:r>
+      <w:r>
+        <w:t xml:space="preserve"> </w:t>
+      </w:r>
+      <w:r>
+        <w:t xml:space="preserve">(five subjects) with that scaffolding removed, comparing against that subset's own baseline (Framing</w:t>
+      </w:r>
+      <w:r>
+        <w:t xml:space="preserve"> </w:t>
+      </w:r>
+      <w:r>
+        <w:t xml:space="preserve">+0.60, Judging +2.00, Steering +0.50). The effect is sharply skill-specific. Framing discrimination is essentially</w:t>
+      </w:r>
+      <w:r>
+        <w:t xml:space="preserve"> </w:t>
+      </w:r>
+      <w:r>
+        <w:t xml:space="preserve">unaffected (own-effect +0.75 without the gold reference, versus +0.60 with it): the rubric and the</w:t>
+      </w:r>
+      <w:r>
+        <w:t xml:space="preserve"> </w:t>
+      </w:r>
+      <w:r>
+        <w:t xml:space="preserve">model's own judgment carry it. Judging discrimination, by contrast, falls sharply (+2.00 to +0.45):</w:t>
+      </w:r>
+      <w:r>
+        <w:t xml:space="preserve"> </w:t>
+      </w:r>
+      <w:r>
+        <w:t xml:space="preserve">without the known issues the grader has no recall-precision anchor and no longer separates strong from</w:t>
+      </w:r>
+      <w:r>
+        <w:t xml:space="preserve"> </w:t>
+      </w:r>
+      <w:r>
+        <w:t xml:space="preserve">weak judging. Steering falls in between (+0.50 to +0.25). The skills still</w:t>
+      </w:r>
+      <w:r>
+        <w:t xml:space="preserve"> </w:t>
+      </w:r>
+      <w:r>
+        <w:t xml:space="preserve">dissociate (ratio 29), and the result pinpoints what each grade measures: Framing and Steering are</w:t>
+      </w:r>
+      <w:r>
+        <w:t xml:space="preserve"> </w:t>
+      </w:r>
+      <w:r>
+        <w:t xml:space="preserve">scored largely by rubric-guided model judgment, whereas Judging</w:t>
+      </w:r>
+      <w:r>
+        <w:t xml:space="preserve"> </w:t>
+      </w:r>
+      <w:r>
+        <w:rPr>
+          <w:i/>
+          <w:iCs/>
+        </w:rPr>
+        <w:t xml:space="preserve">as instrumented here</w:t>
+      </w:r>
+      <w:r>
+        <w:t xml:space="preserve"> </w:t>
+      </w:r>
+      <w:r>
+        <w:t xml:space="preserve">tracks agreement</w:t>
+      </w:r>
+      <w:r>
+        <w:t xml:space="preserve"> </w:t>
+      </w:r>
+      <w:r>
+        <w:t xml:space="preserve">with a known answer key. This both explains Judging's by-construction +2.00 and locates the Judging</w:t>
+      </w:r>
+      <w:r>
+        <w:t xml:space="preserve"> </w:t>
+      </w:r>
+      <w:r>
+        <w:t xml:space="preserve">score precisely: it applies where ground truth is known, and open-ended judging without a key is the</w:t>
+      </w:r>
+      <w:r>
+        <w:t xml:space="preserve"> </w:t>
+      </w:r>
+      <w:r>
+        <w:t xml:space="preserve">distinct instrumentation Section 10 specifies.</w:t>
+      </w:r>
+    </w:p>
+    <w:bookmarkEnd w:id="45"/>
+    <w:bookmarkStart w:id="46" w:name="references"/>
     <w:p>
       <w:pPr>
         <w:pStyle w:val="ReferencesHeading"/>
@@ -11648,8 +11699,8 @@
         <w:t xml:space="preserve">.</w:t>
       </w:r>
     </w:p>
-    <w:bookmarkEnd w:id="45"/>
     <w:bookmarkEnd w:id="46"/>
+    <w:bookmarkEnd w:id="47"/>
     <w:sectPr>
       <w:footerReference w:type="default" r:id="rId9"/>
       <w:pgSz w:h="15840" w:w="12240"/>

</xml_diff>

<commit_message>
figures: redraw Figure 1 (forward-thesis) + Figure 2 (architecture) via technical-diagram-designer
Replace the hand-authored SVGs with publication-grade versions following the diagram skill's
palette and grammar. Figure 2 now renders the monitor-control architecture as two labeled
levels (meta: Framing/Judging/Steering; object: AI + output) with color-coded roles (gold =
Judging/monitor read-out, purple = Framing/Steering control, green = AI, blue = output) and
explicit monitor (object->meta) and control (meta->object) arrows. Figure 1 cleaned up with
the palette and a clear schematic marking. Both render via resvg and embed in the docx (6/6).

Co-Authored-By: Claude Opus 4.8 <noreply@anthropic.com>
</commit_message>
<xml_diff>
--- a/docs/coreasoning.docx
+++ b/docs/coreasoning.docx
@@ -882,14 +882,14 @@
       <w:r>
         <w:drawing>
           <wp:inline>
-            <wp:extent cx="5943600" cy="2971799"/>
+            <wp:extent cx="5943600" cy="3040911"/>
             <wp:effectExtent b="0" l="0" r="0" t="0"/>
             <wp:docPr descr="Figure 1. As model capability rises, the human contribution concentrates in Framing, Judging, and Steering." title="" id="11" name="Picture"/>
             <a:graphic>
               <a:graphicData uri="http://schemas.openxmlformats.org/drawingml/2006/picture">
                 <pic:pic>
                   <pic:nvPicPr>
-                    <pic:cNvPr descr="C:/Users/apart/AppData/Local/Temp/html2doc_svg_qpSNtq/svg_0.png" id="12" name="Picture"/>
+                    <pic:cNvPr descr="C:/Users/apart/AppData/Local/Temp/html2doc_svg_Tqb1IN/svg_0.png" id="12" name="Picture"/>
                     <pic:cNvPicPr>
                       <a:picLocks noChangeArrowheads="1" noChangeAspect="1"/>
                     </pic:cNvPicPr>
@@ -903,7 +903,7 @@
                   <pic:spPr bwMode="auto">
                     <a:xfrm>
                       <a:off x="0" y="0"/>
-                      <a:ext cx="5943600" cy="2971799"/>
+                      <a:ext cx="5943600" cy="3040911"/>
                     </a:xfrm>
                     <a:prstGeom prst="rect">
                       <a:avLst/>
@@ -1951,14 +1951,14 @@
       <w:r>
         <w:drawing>
           <wp:inline>
-            <wp:extent cx="5943600" cy="3406697"/>
+            <wp:extent cx="5943600" cy="3488634"/>
             <wp:effectExtent b="0" l="0" r="0" t="0"/>
             <wp:docPr descr="Figure 2. The CoReasoning architecture." title="" id="16" name="Picture"/>
             <a:graphic>
               <a:graphicData uri="http://schemas.openxmlformats.org/drawingml/2006/picture">
                 <pic:pic>
                   <pic:nvPicPr>
-                    <pic:cNvPr descr="C:/Users/apart/AppData/Local/Temp/html2doc_svg_qpSNtq/svg_1.png" id="17" name="Picture"/>
+                    <pic:cNvPr descr="C:/Users/apart/AppData/Local/Temp/html2doc_svg_Tqb1IN/svg_1.png" id="17" name="Picture"/>
                     <pic:cNvPicPr>
                       <a:picLocks noChangeArrowheads="1" noChangeAspect="1"/>
                     </pic:cNvPicPr>
@@ -1972,7 +1972,7 @@
                   <pic:spPr bwMode="auto">
                     <a:xfrm>
                       <a:off x="0" y="0"/>
-                      <a:ext cx="5943600" cy="3406697"/>
+                      <a:ext cx="5943600" cy="3488634"/>
                     </a:xfrm>
                     <a:prstGeom prst="rect">
                       <a:avLst/>
@@ -9453,7 +9453,7 @@
               <a:graphicData uri="http://schemas.openxmlformats.org/drawingml/2006/picture">
                 <pic:pic>
                   <pic:nvPicPr>
-                    <pic:cNvPr descr="C:/Users/apart/AppData/Local/Temp/html2doc_svg_qpSNtq/svg_2.png" id="40" name="Picture"/>
+                    <pic:cNvPr descr="C:/Users/apart/AppData/Local/Temp/html2doc_svg_Tqb1IN/svg_2.png" id="40" name="Picture"/>
                     <pic:cNvPicPr>
                       <a:picLocks noChangeArrowheads="1" noChangeAspect="1"/>
                     </pic:cNvPicPr>
@@ -9576,7 +9576,7 @@
               <a:graphicData uri="http://schemas.openxmlformats.org/drawingml/2006/picture">
                 <pic:pic>
                   <pic:nvPicPr>
-                    <pic:cNvPr descr="C:/Users/apart/AppData/Local/Temp/html2doc_svg_qpSNtq/svg_3.png" id="43" name="Picture"/>
+                    <pic:cNvPr descr="C:/Users/apart/AppData/Local/Temp/html2doc_svg_Tqb1IN/svg_3.png" id="43" name="Picture"/>
                     <pic:cNvPicPr>
                       <a:picLocks noChangeArrowheads="1" noChangeAspect="1"/>
                     </pic:cNvPicPr>

</xml_diff>

<commit_message>
paper: strengthen the domain-general open-source-platform theme + add cross-disciplinary showcase (Appendix C)
Reframe CoReasoning Lab in Section 7 as a domain-general platform, not a computing-education
tool: a generic instrument for any discipline where a learner must specify an ill-defined task,
judge a fallible solution, and steer it. New Appendix C (cross-disciplinary challenge showcase)
documents the twelve disciplines the released content already spans (STEM, social sciences,
humanities, law, professional, education) with a discipline table and four REAL ill-defined
problems the platform generated (applied ethics, physics, instructional design, computer
science), all sourced from the shipped session logs. Conclusion reinforced ('an educator in any
discipline, from algorithms to applied ethics').

Audit clean: appendices A/B/C resolve, 4 tables, no orphan citations, 0 em-dashes, 0 tone hits.

Co-Authored-By: Claude Opus 4.8 <noreply@anthropic.com>
</commit_message>
<xml_diff>
--- a/docs/coreasoning.docx
+++ b/docs/coreasoning.docx
@@ -2,7 +2,7 @@
 <file path=word/document.xml><?xml version="1.0" encoding="utf-8"?>
 <w:document xmlns:w="http://schemas.openxmlformats.org/wordprocessingml/2006/main" xmlns:m="http://schemas.openxmlformats.org/officeDocument/2006/math" xmlns:r="http://schemas.openxmlformats.org/officeDocument/2006/relationships" xmlns:o="urn:schemas-microsoft-com:office:office" xmlns:v="urn:schemas-microsoft-com:vml" xmlns:w10="urn:schemas-microsoft-com:office:word" xmlns:a="http://schemas.openxmlformats.org/drawingml/2006/main" xmlns:pic="http://schemas.openxmlformats.org/drawingml/2006/picture" xmlns:wp="http://schemas.openxmlformats.org/drawingml/2006/wordprocessingDrawing">
   <w:body>
-    <w:bookmarkStart w:id="47" w:name="Xdf9502ef5c17bbba6731875408e8426bd513f0c"/>
+    <w:bookmarkStart w:id="48" w:name="Xdf9502ef5c17bbba6731875408e8426bd513f0c"/>
     <w:p>
       <w:pPr>
         <w:pStyle w:val="Title"/>
@@ -889,7 +889,7 @@
               <a:graphicData uri="http://schemas.openxmlformats.org/drawingml/2006/picture">
                 <pic:pic>
                   <pic:nvPicPr>
-                    <pic:cNvPr descr="C:/Users/apart/AppData/Local/Temp/html2doc_svg_5wq8oy/svg_0.png" id="12" name="Picture"/>
+                    <pic:cNvPr descr="C:/Users/apart/AppData/Local/Temp/html2doc_svg_vs046S/svg_0.png" id="12" name="Picture"/>
                     <pic:cNvPicPr>
                       <a:picLocks noChangeArrowheads="1" noChangeAspect="1"/>
                     </pic:cNvPicPr>
@@ -1958,7 +1958,7 @@
               <a:graphicData uri="http://schemas.openxmlformats.org/drawingml/2006/picture">
                 <pic:pic>
                   <pic:nvPicPr>
-                    <pic:cNvPr descr="C:/Users/apart/AppData/Local/Temp/html2doc_svg_5wq8oy/svg_1.png" id="17" name="Picture"/>
+                    <pic:cNvPr descr="C:/Users/apart/AppData/Local/Temp/html2doc_svg_vs046S/svg_1.png" id="17" name="Picture"/>
                     <pic:cNvPicPr>
                       <a:picLocks noChangeArrowheads="1" noChangeAspect="1"/>
                     </pic:cNvPicPr>
@@ -4856,7 +4856,78 @@
         <w:t xml:space="preserve"> </w:t>
       </w:r>
       <w:r>
-        <w:t xml:space="preserve">and the released artifact lets others add their own. The monitor-control scaffold is likewise open to</w:t>
+        <w:t xml:space="preserve">and the released artifact lets others add their own. The platform is therefore</w:t>
+      </w:r>
+      <w:r>
+        <w:t xml:space="preserve"> </w:t>
+      </w:r>
+      <w:r>
+        <w:rPr>
+          <w:b/>
+          <w:bCs/>
+        </w:rPr>
+        <w:t xml:space="preserve">domain-general</w:t>
+      </w:r>
+      <w:r>
+        <w:t xml:space="preserve">: it is</w:t>
+      </w:r>
+      <w:r>
+        <w:t xml:space="preserve"> </w:t>
+      </w:r>
+      <w:r>
+        <w:t xml:space="preserve">not a computing-education tool but a generic instrument for any discipline in which a learner must</w:t>
+      </w:r>
+      <w:r>
+        <w:t xml:space="preserve"> </w:t>
+      </w:r>
+      <w:r>
+        <w:t xml:space="preserve">specify an ill-defined task, judge a fallible solution, and steer it toward a better one. The released</w:t>
+      </w:r>
+      <w:r>
+        <w:t xml:space="preserve"> </w:t>
+      </w:r>
+      <w:r>
+        <w:t xml:space="preserve">content already spans</w:t>
+      </w:r>
+      <w:r>
+        <w:t xml:space="preserve"> </w:t>
+      </w:r>
+      <w:r>
+        <w:rPr>
+          <w:b/>
+          <w:bCs/>
+        </w:rPr>
+        <w:t xml:space="preserve">twelve disciplines</w:t>
+      </w:r>
+      <w:r>
+        <w:t xml:space="preserve"> </w:t>
+      </w:r>
+      <w:r>
+        <w:t xml:space="preserve">across STEM, the social sciences, the humanities, law, and</w:t>
+      </w:r>
+      <w:r>
+        <w:t xml:space="preserve"> </w:t>
+      </w:r>
+      <w:r>
+        <w:t xml:space="preserve">professional and education fields, from algorithms and classical mechanics to constitutional law,</w:t>
+      </w:r>
+      <w:r>
+        <w:t xml:space="preserve"> </w:t>
+      </w:r>
+      <w:r>
+        <w:t xml:space="preserve">applied ethics, and instructional design (Appendix C). An educator in any of these fields authors a</w:t>
+      </w:r>
+      <w:r>
+        <w:t xml:space="preserve"> </w:t>
+      </w:r>
+      <w:r>
+        <w:t xml:space="preserve">challenge by naming a subject; the system generates the ill-defined problem, the three per-skill</w:t>
+      </w:r>
+      <w:r>
+        <w:t xml:space="preserve"> </w:t>
+      </w:r>
+      <w:r>
+        <w:t xml:space="preserve">rubrics, and the seeded-flaw solution. The monitor-control scaffold is likewise open to</w:t>
       </w:r>
       <w:r>
         <w:t xml:space="preserve"> </w:t>
@@ -9365,13 +9436,19 @@
         <w:t xml:space="preserve"> </w:t>
       </w:r>
       <w:r>
-        <w:t xml:space="preserve">and the validation protocol as a foundation to build on, for the assessment and instruction the moment</w:t>
-      </w:r>
-      <w:r>
-        <w:t xml:space="preserve"> </w:t>
-      </w:r>
-      <w:r>
-        <w:t xml:space="preserve">demands.</w:t>
+        <w:t xml:space="preserve">and the validation protocol as a foundation to build on: an open, domain-general platform with which an</w:t>
+      </w:r>
+      <w:r>
+        <w:t xml:space="preserve"> </w:t>
+      </w:r>
+      <w:r>
+        <w:t xml:space="preserve">educator in any discipline, from algorithms to applied ethics, can assess and train this skill, for the</w:t>
+      </w:r>
+      <w:r>
+        <w:t xml:space="preserve"> </w:t>
+      </w:r>
+      <w:r>
+        <w:t xml:space="preserve">assessment and instruction the moment demands.</w:t>
       </w:r>
     </w:p>
     <w:bookmarkEnd w:id="37"/>
@@ -10047,7 +10124,557 @@
       </w:r>
     </w:p>
     <w:bookmarkEnd w:id="45"/>
-    <w:bookmarkStart w:id="46" w:name="references"/>
+    <w:bookmarkStart w:id="46" w:name="X20431813dc1d9ebe06088c2967a8c6d7cfc2771"/>
+    <w:p>
+      <w:pPr>
+        <w:pStyle w:val="Heading2"/>
+        <w:keepNext/>
+        <w:keepLines/>
+        <w:widowControl w:val="1"/>
+      </w:pPr>
+      <w:r>
+        <w:t xml:space="preserve">Appendix C. Cross-disciplinary challenge showcase</w:t>
+      </w:r>
+    </w:p>
+    <w:p>
+      <w:pPr>
+        <w:pStyle w:val="FirstParagraph"/>
+        <w:jc w:val="both"/>
+        <w:keepNext w:val="0"/>
+        <w:keepLines w:val="0"/>
+        <w:widowControl w:val="1"/>
+      </w:pPr>
+      <w:r>
+        <w:t xml:space="preserve">The framework and the platform are domain-general. An ill-defined problem with seeded flaws, three</w:t>
+      </w:r>
+      <w:r>
+        <w:t xml:space="preserve"> </w:t>
+      </w:r>
+      <w:r>
+        <w:t xml:space="preserve">per-skill rubrics, and a deliberately-imperfect AI solution can be generated for any subject, because</w:t>
+      </w:r>
+      <w:r>
+        <w:t xml:space="preserve"> </w:t>
+      </w:r>
+      <w:r>
+        <w:t xml:space="preserve">each is produced by a prompt that an educator parameterizes with a course and topic. The released</w:t>
+      </w:r>
+      <w:r>
+        <w:t xml:space="preserve"> </w:t>
+      </w:r>
+      <w:r>
+        <w:t xml:space="preserve">platform ships challenge content across twelve disciplines (Table C1) spanning STEM, the social</w:t>
+      </w:r>
+      <w:r>
+        <w:t xml:space="preserve"> </w:t>
+      </w:r>
+      <w:r>
+        <w:t xml:space="preserve">sciences, the humanities, law, and professional and education fields. CoReasoning Lab is in this sense</w:t>
+      </w:r>
+      <w:r>
+        <w:t xml:space="preserve"> </w:t>
+      </w:r>
+      <w:r>
+        <w:t xml:space="preserve">not a computing-education tool but a generic instrument for any discipline in which a learner must</w:t>
+      </w:r>
+      <w:r>
+        <w:t xml:space="preserve"> </w:t>
+      </w:r>
+      <w:r>
+        <w:t xml:space="preserve">specify an ill-defined task, judge a fallible solution, and steer it toward a better one.</w:t>
+      </w:r>
+    </w:p>
+    <w:p>
+      <w:pPr>
+        <w:pStyle w:val="BodyText"/>
+        <w:jc w:val="both"/>
+        <w:keepNext w:val="0"/>
+        <w:keepLines w:val="0"/>
+        <w:widowControl w:val="1"/>
+      </w:pPr>
+      <w:r>
+        <w:rPr>
+          <w:b/>
+          <w:bCs/>
+        </w:rPr>
+        <w:t xml:space="preserve">Table C1. Disciplines covered by the released challenge content.</w:t>
+      </w:r>
+    </w:p>
+    <w:tbl>
+      <w:tblPr>
+        <w:tblStyle w:val="Table"/>
+        <w:tblW w:type="pct" w:w="5000"/>
+        <w:jc w:val="center"/>
+        <w:tblLook w:firstRow="1" w:lastRow="0" w:firstColumn="0" w:lastColumn="0" w:noHBand="0" w:noVBand="0" w:val="0020"/>
+        <w:tblLayout w:type="autofit"/>
+        <w:tblBorders>
+          <w:top w:val="single" w:sz="10" w:color="4F6272"/>
+          <w:bottom w:val="single" w:sz="10" w:color="4F6272"/>
+          <w:insideH w:val="single" w:sz="5" w:color="9FB0C2"/>
+          <w:left w:val="single" w:sz="6" w:color="9FB0C2"/>
+          <w:right w:val="single" w:sz="6" w:color="9FB0C2"/>
+          <w:insideV w:val="single" w:sz="5" w:color="D9E1E8"/>
+        </w:tblBorders>
+      </w:tblPr>
+      <w:tblGrid>
+        <w:gridCol w:w="3960"/>
+        <w:gridCol w:w="3960"/>
+      </w:tblGrid>
+      <w:tr>
+        <w:trPr>
+          <w:tblHeader w:val="on"/>
+        </w:trPr>
+        <w:tc>
+          <w:tcPr>
+            <w:shd w:fill="EEF3F7"/>
+            <w:tcBorders>
+              <w:left w:val="nil"/>
+              <w:right w:val="nil"/>
+              <w:top w:val="nil"/>
+              <w:bottom w:val="single" w:sz="8" w:color="9FB0C2"/>
+            </w:tcBorders>
+          </w:tcPr>
+          <w:p>
+            <w:pPr>
+              <w:pStyle w:val="Compact"/>
+              <w:spacing w:before="0" w:after="20" w:line="240" w:lineRule="auto"/>
+              <w:jc w:val="center"/>
+              <w:keepNext w:val="0"/>
+              <w:keepLines/>
+              <w:widowControl w:val="1"/>
+            </w:pPr>
+            <w:r>
+              <w:rPr>
+                <w:rFonts w:ascii="Times New Roman" w:hAnsi="Times New Roman"/>
+                <w:b/>
+                <w:sz w:val="19"/>
+              </w:rPr>
+              <w:t xml:space="preserve">Area</w:t>
+            </w:r>
+          </w:p>
+        </w:tc>
+        <w:tc>
+          <w:tcPr>
+            <w:shd w:fill="EEF3F7"/>
+            <w:tcBorders>
+              <w:left w:val="nil"/>
+              <w:right w:val="nil"/>
+              <w:top w:val="nil"/>
+              <w:bottom w:val="single" w:sz="8" w:color="9FB0C2"/>
+            </w:tcBorders>
+          </w:tcPr>
+          <w:p>
+            <w:pPr>
+              <w:pStyle w:val="Compact"/>
+              <w:spacing w:before="0" w:after="20" w:line="240" w:lineRule="auto"/>
+              <w:jc w:val="center"/>
+              <w:keepNext w:val="0"/>
+              <w:keepLines/>
+              <w:widowControl w:val="1"/>
+            </w:pPr>
+            <w:r>
+              <w:rPr>
+                <w:rFonts w:ascii="Times New Roman" w:hAnsi="Times New Roman"/>
+                <w:b/>
+                <w:sz w:val="19"/>
+              </w:rPr>
+              <w:t xml:space="preserve">Disciplines</w:t>
+            </w:r>
+          </w:p>
+        </w:tc>
+      </w:tr>
+      <w:tr>
+        <w:tc>
+          <w:tcPr>
+            <w:tcBorders>
+              <w:left w:val="nil"/>
+              <w:right w:val="nil"/>
+              <w:top w:val="nil"/>
+              <w:bottom w:val="single" w:sz="4" w:color="D9E1E8"/>
+            </w:tcBorders>
+          </w:tcPr>
+          <w:p>
+            <w:pPr>
+              <w:pStyle w:val="Compact"/>
+              <w:spacing w:before="0" w:after="20" w:line="240" w:lineRule="auto"/>
+              <w:jc w:val="center"/>
+              <w:keepNext w:val="0"/>
+              <w:keepLines/>
+              <w:widowControl w:val="1"/>
+            </w:pPr>
+            <w:r>
+              <w:rPr>
+                <w:rFonts w:ascii="Times New Roman" w:hAnsi="Times New Roman"/>
+                <w:sz w:val="20"/>
+              </w:rPr>
+              <w:t xml:space="preserve">STEM</w:t>
+            </w:r>
+          </w:p>
+        </w:tc>
+        <w:tc>
+          <w:tcPr>
+            <w:tcBorders>
+              <w:left w:val="nil"/>
+              <w:right w:val="nil"/>
+              <w:top w:val="nil"/>
+              <w:bottom w:val="single" w:sz="4" w:color="D9E1E8"/>
+            </w:tcBorders>
+          </w:tcPr>
+          <w:p>
+            <w:pPr>
+              <w:pStyle w:val="Compact"/>
+              <w:spacing w:before="0" w:after="20" w:line="240" w:lineRule="auto"/>
+              <w:jc w:val="center"/>
+              <w:keepNext w:val="0"/>
+              <w:keepLines/>
+              <w:widowControl w:val="1"/>
+            </w:pPr>
+            <w:r>
+              <w:rPr>
+                <w:rFonts w:ascii="Times New Roman" w:hAnsi="Times New Roman"/>
+                <w:sz w:val="20"/>
+              </w:rPr>
+              <w:t xml:space="preserve">Computer Science (algorithms); Physics (classical mechanics); Mathematics (linear algebra); Electrical Engineering (signal processing); Biology (molecular biology)</w:t>
+            </w:r>
+          </w:p>
+        </w:tc>
+      </w:tr>
+      <w:tr>
+        <w:tc>
+          <w:tcPr>
+            <w:tcBorders>
+              <w:left w:val="nil"/>
+              <w:right w:val="nil"/>
+              <w:top w:val="nil"/>
+              <w:bottom w:val="single" w:sz="4" w:color="D9E1E8"/>
+            </w:tcBorders>
+          </w:tcPr>
+          <w:p>
+            <w:pPr>
+              <w:pStyle w:val="Compact"/>
+              <w:spacing w:before="0" w:after="20" w:line="240" w:lineRule="auto"/>
+              <w:jc w:val="center"/>
+              <w:keepNext w:val="0"/>
+              <w:keepLines/>
+              <w:widowControl w:val="1"/>
+            </w:pPr>
+            <w:r>
+              <w:rPr>
+                <w:rFonts w:ascii="Times New Roman" w:hAnsi="Times New Roman"/>
+                <w:sz w:val="20"/>
+              </w:rPr>
+              <w:t xml:space="preserve">Social sciences</w:t>
+            </w:r>
+          </w:p>
+        </w:tc>
+        <w:tc>
+          <w:tcPr>
+            <w:tcBorders>
+              <w:left w:val="nil"/>
+              <w:right w:val="nil"/>
+              <w:top w:val="nil"/>
+              <w:bottom w:val="single" w:sz="4" w:color="D9E1E8"/>
+            </w:tcBorders>
+          </w:tcPr>
+          <w:p>
+            <w:pPr>
+              <w:pStyle w:val="Compact"/>
+              <w:spacing w:before="0" w:after="20" w:line="240" w:lineRule="auto"/>
+              <w:jc w:val="center"/>
+              <w:keepNext w:val="0"/>
+              <w:keepLines/>
+              <w:widowControl w:val="1"/>
+            </w:pPr>
+            <w:r>
+              <w:rPr>
+                <w:rFonts w:ascii="Times New Roman" w:hAnsi="Times New Roman"/>
+                <w:sz w:val="20"/>
+              </w:rPr>
+              <w:t xml:space="preserve">Economics (microeconomics); Political Science (international relations); Psychology (cognitive psychology)</w:t>
+            </w:r>
+          </w:p>
+        </w:tc>
+      </w:tr>
+      <w:tr>
+        <w:tc>
+          <w:tcPr>
+            <w:tcBorders>
+              <w:left w:val="nil"/>
+              <w:right w:val="nil"/>
+              <w:top w:val="nil"/>
+              <w:bottom w:val="single" w:sz="4" w:color="D9E1E8"/>
+            </w:tcBorders>
+          </w:tcPr>
+          <w:p>
+            <w:pPr>
+              <w:pStyle w:val="Compact"/>
+              <w:spacing w:before="0" w:after="20" w:line="240" w:lineRule="auto"/>
+              <w:jc w:val="center"/>
+              <w:keepNext w:val="0"/>
+              <w:keepLines/>
+              <w:widowControl w:val="1"/>
+            </w:pPr>
+            <w:r>
+              <w:rPr>
+                <w:rFonts w:ascii="Times New Roman" w:hAnsi="Times New Roman"/>
+                <w:sz w:val="20"/>
+              </w:rPr>
+              <w:t xml:space="preserve">Humanities and law</w:t>
+            </w:r>
+          </w:p>
+        </w:tc>
+        <w:tc>
+          <w:tcPr>
+            <w:tcBorders>
+              <w:left w:val="nil"/>
+              <w:right w:val="nil"/>
+              <w:top w:val="nil"/>
+              <w:bottom w:val="single" w:sz="4" w:color="D9E1E8"/>
+            </w:tcBorders>
+          </w:tcPr>
+          <w:p>
+            <w:pPr>
+              <w:pStyle w:val="Compact"/>
+              <w:spacing w:before="0" w:after="20" w:line="240" w:lineRule="auto"/>
+              <w:jc w:val="center"/>
+              <w:keepNext w:val="0"/>
+              <w:keepLines/>
+              <w:widowControl w:val="1"/>
+            </w:pPr>
+            <w:r>
+              <w:rPr>
+                <w:rFonts w:ascii="Times New Roman" w:hAnsi="Times New Roman"/>
+                <w:sz w:val="20"/>
+              </w:rPr>
+              <w:t xml:space="preserve">Philosophy (applied ethics); Law (constitutional law)</w:t>
+            </w:r>
+          </w:p>
+        </w:tc>
+      </w:tr>
+      <w:tr>
+        <w:tc>
+          <w:tcPr>
+            <w:tcBorders>
+              <w:left w:val="nil"/>
+              <w:right w:val="nil"/>
+              <w:top w:val="nil"/>
+              <w:bottom w:val="nil"/>
+            </w:tcBorders>
+          </w:tcPr>
+          <w:p>
+            <w:pPr>
+              <w:pStyle w:val="Compact"/>
+              <w:spacing w:before="0" w:after="20" w:line="240" w:lineRule="auto"/>
+              <w:jc w:val="center"/>
+              <w:keepNext w:val="0"/>
+              <w:keepLines/>
+              <w:widowControl w:val="1"/>
+            </w:pPr>
+            <w:r>
+              <w:rPr>
+                <w:rFonts w:ascii="Times New Roman" w:hAnsi="Times New Roman"/>
+                <w:sz w:val="20"/>
+              </w:rPr>
+              <w:t xml:space="preserve">Professional and education</w:t>
+            </w:r>
+          </w:p>
+        </w:tc>
+        <w:tc>
+          <w:tcPr>
+            <w:tcBorders>
+              <w:left w:val="nil"/>
+              <w:right w:val="nil"/>
+              <w:top w:val="nil"/>
+              <w:bottom w:val="nil"/>
+            </w:tcBorders>
+          </w:tcPr>
+          <w:p>
+            <w:pPr>
+              <w:pStyle w:val="Compact"/>
+              <w:spacing w:before="0" w:after="20" w:line="240" w:lineRule="auto"/>
+              <w:jc w:val="center"/>
+              <w:keepNext w:val="0"/>
+              <w:keepLines/>
+              <w:widowControl w:val="1"/>
+            </w:pPr>
+            <w:r>
+              <w:rPr>
+                <w:rFonts w:ascii="Times New Roman" w:hAnsi="Times New Roman"/>
+                <w:sz w:val="20"/>
+              </w:rPr>
+              <w:t xml:space="preserve">Business (organizational behavior); Education (educational technology)</w:t>
+            </w:r>
+          </w:p>
+        </w:tc>
+      </w:tr>
+    </w:tbl>
+    <w:p>
+      <w:pPr>
+        <w:pStyle w:val="BodyText"/>
+        <w:spacing w:before="160"/>
+        <w:jc w:val="both"/>
+        <w:keepNext w:val="0"/>
+        <w:keepLines w:val="0"/>
+        <w:widowControl w:val="1"/>
+      </w:pPr>
+      <w:r>
+        <w:t xml:space="preserve">The four examples below are real ill-defined problems the platform generated, in applied ethics,</w:t>
+      </w:r>
+      <w:r>
+        <w:t xml:space="preserve"> </w:t>
+      </w:r>
+      <w:r>
+        <w:t xml:space="preserve">physics, instructional design, and computing, each of which a learner must Frame before the AI produces</w:t>
+      </w:r>
+      <w:r>
+        <w:t xml:space="preserve"> </w:t>
+      </w:r>
+      <w:r>
+        <w:t xml:space="preserve">a flawed solution to Judge and Steer:</w:t>
+      </w:r>
+    </w:p>
+    <w:p>
+      <w:pPr>
+        <w:pStyle w:val="Compact"/>
+        <w:numPr>
+          <w:ilvl w:val="0"/>
+          <w:numId w:val="1006"/>
+        </w:numPr>
+        <w:jc w:val="both"/>
+        <w:keepNext w:val="0"/>
+        <w:keepLines w:val="0"/>
+        <w:widowControl w:val="1"/>
+      </w:pPr>
+      <w:r>
+        <w:rPr>
+          <w:b/>
+          <w:bCs/>
+        </w:rPr>
+        <w:t xml:space="preserve">Applied ethics.</w:t>
+      </w:r>
+      <w:r>
+        <w:t xml:space="preserve"> </w:t>
+      </w:r>
+      <w:r>
+        <w:t xml:space="preserve">"As a member of the AI Ethics Committee at a technology company, you have been tasked with developing a set of ethical guidelines for the deployment of a new AI system."</w:t>
+      </w:r>
+    </w:p>
+    <w:p>
+      <w:pPr>
+        <w:pStyle w:val="Compact"/>
+        <w:numPr>
+          <w:ilvl w:val="0"/>
+          <w:numId w:val="1006"/>
+        </w:numPr>
+        <w:jc w:val="both"/>
+        <w:keepNext w:val="0"/>
+        <w:keepLines w:val="0"/>
+        <w:widowControl w:val="1"/>
+      </w:pPr>
+      <w:r>
+        <w:rPr>
+          <w:b/>
+          <w:bCs/>
+        </w:rPr>
+        <w:t xml:space="preserve">Physics.</w:t>
+      </w:r>
+      <w:r>
+        <w:t xml:space="preserve"> </w:t>
+      </w:r>
+      <w:r>
+        <w:t xml:space="preserve">"As part of a project for a local amusement park, design a new ride that involves a projectile-motion component, and analyze the outcomes."</w:t>
+      </w:r>
+    </w:p>
+    <w:p>
+      <w:pPr>
+        <w:pStyle w:val="Compact"/>
+        <w:numPr>
+          <w:ilvl w:val="0"/>
+          <w:numId w:val="1006"/>
+        </w:numPr>
+        <w:jc w:val="both"/>
+        <w:keepNext w:val="0"/>
+        <w:keepLines w:val="0"/>
+        <w:widowControl w:val="1"/>
+      </w:pPr>
+      <w:r>
+        <w:rPr>
+          <w:b/>
+          <w:bCs/>
+        </w:rPr>
+        <w:t xml:space="preserve">Instructional design (education).</w:t>
+      </w:r>
+      <w:r>
+        <w:t xml:space="preserve"> </w:t>
+      </w:r>
+      <w:r>
+        <w:t xml:space="preserve">"Our organization is developing a new training program on effective communication skills. Design a backward lesson plan."</w:t>
+      </w:r>
+    </w:p>
+    <w:p>
+      <w:pPr>
+        <w:pStyle w:val="Compact"/>
+        <w:numPr>
+          <w:ilvl w:val="0"/>
+          <w:numId w:val="1006"/>
+        </w:numPr>
+        <w:jc w:val="both"/>
+        <w:keepNext w:val="0"/>
+        <w:keepLines w:val="0"/>
+        <w:widowControl w:val="1"/>
+      </w:pPr>
+      <w:r>
+        <w:rPr>
+          <w:b/>
+          <w:bCs/>
+        </w:rPr>
+        <w:t xml:space="preserve">Computer science.</w:t>
+      </w:r>
+      <w:r>
+        <w:t xml:space="preserve"> </w:t>
+      </w:r>
+      <w:r>
+        <w:t xml:space="preserve">"Our company is building a navigation app. Design an algorithm that computes the shortest path between two locations on a road network with varying travel speeds, possible road closures, and concurrent route requests."</w:t>
+      </w:r>
+    </w:p>
+    <w:p>
+      <w:pPr>
+        <w:pStyle w:val="FirstParagraph"/>
+        <w:jc w:val="both"/>
+        <w:keepNext w:val="0"/>
+        <w:keepLines w:val="0"/>
+        <w:widowControl w:val="1"/>
+      </w:pPr>
+      <w:r>
+        <w:t xml:space="preserve">The deliberate gaps differ by discipline (a missing fairness criterion in the ethics task, an unstated</w:t>
+      </w:r>
+      <w:r>
+        <w:t xml:space="preserve"> </w:t>
+      </w:r>
+      <w:r>
+        <w:t xml:space="preserve">launch or safety constraint in the physics task, undefined learning objectives in the lesson-plan task),</w:t>
+      </w:r>
+      <w:r>
+        <w:t xml:space="preserve"> </w:t>
+      </w:r>
+      <w:r>
+        <w:t xml:space="preserve">but the learner's work is identical across all of them: specify the task (Framing), evaluate the AI's</w:t>
+      </w:r>
+      <w:r>
+        <w:t xml:space="preserve"> </w:t>
+      </w:r>
+      <w:r>
+        <w:t xml:space="preserve">flawed solution (Judging), and redirect it toward an adequate one (Steering). Full per-discipline session</w:t>
+      </w:r>
+      <w:r>
+        <w:t xml:space="preserve"> </w:t>
+      </w:r>
+      <w:r>
+        <w:t xml:space="preserve">logs ship with the platform.</w:t>
+      </w:r>
+    </w:p>
+    <w:bookmarkEnd w:id="46"/>
+    <w:bookmarkStart w:id="47" w:name="references"/>
     <w:p>
       <w:pPr>
         <w:pStyle w:val="ReferencesHeading"/>
@@ -11713,8 +12340,8 @@
         <w:t xml:space="preserve">.</w:t>
       </w:r>
     </w:p>
-    <w:bookmarkEnd w:id="46"/>
     <w:bookmarkEnd w:id="47"/>
+    <w:bookmarkEnd w:id="48"/>
     <w:sectPr>
       <w:footerReference w:type="default" r:id="rId9"/>
       <w:pgSz w:h="15840" w:w="12240"/>
@@ -12306,6 +12933,9 @@
     <w:lvlOverride w:ilvl="8">
       <w:startOverride w:val="1"/>
     </w:lvlOverride>
+  </w:num>
+  <w:num w:numId="1006">
+    <w:abstractNumId w:val="991"/>
   </w:num>
 </w:numbering>
 </file>

</xml_diff>

<commit_message>
Add Figure A3: auto-generation + assessment pipeline (sixteen-prompt engine)
Two-lane SVG showing the released platform end to end: authoring auto-generates
the ill-defined problem, three per-skill rubrics, gold framing, and seeded-flaw
AI solution (prompts 01/02/03/14); assessment scores each skill against its own
referent (08 vs gold, 09 vs seeded issues, 04+10 vs corrected trajectory) and
grades them independently (11) into the per-student report and analytics.
Wired into Appendix A and referenced from the operationalization section (7.1).

Co-Authored-By: Claude Opus 4.8 <noreply@anthropic.com>
</commit_message>
<xml_diff>
--- a/docs/coreasoning.docx
+++ b/docs/coreasoning.docx
@@ -2,7 +2,7 @@
 <file path=word/document.xml><?xml version="1.0" encoding="utf-8"?>
 <w:document xmlns:w="http://schemas.openxmlformats.org/wordprocessingml/2006/main" xmlns:m="http://schemas.openxmlformats.org/officeDocument/2006/math" xmlns:r="http://schemas.openxmlformats.org/officeDocument/2006/relationships" xmlns:o="urn:schemas-microsoft-com:office:office" xmlns:v="urn:schemas-microsoft-com:vml" xmlns:w10="urn:schemas-microsoft-com:office:word" xmlns:a="http://schemas.openxmlformats.org/drawingml/2006/main" xmlns:pic="http://schemas.openxmlformats.org/drawingml/2006/picture" xmlns:wp="http://schemas.openxmlformats.org/drawingml/2006/wordprocessingDrawing">
   <w:body>
-    <w:bookmarkStart w:id="48" w:name="Xdf9502ef5c17bbba6731875408e8426bd513f0c"/>
+    <w:bookmarkStart w:id="51" w:name="Xdf9502ef5c17bbba6731875408e8426bd513f0c"/>
     <w:p>
       <w:pPr>
         <w:pStyle w:val="Title"/>
@@ -889,7 +889,7 @@
               <a:graphicData uri="http://schemas.openxmlformats.org/drawingml/2006/picture">
                 <pic:pic>
                   <pic:nvPicPr>
-                    <pic:cNvPr descr="C:/Users/apart/AppData/Local/Temp/html2doc_svg_vs046S/svg_0.png" id="12" name="Picture"/>
+                    <pic:cNvPr descr="C:/Users/apart/AppData/Local/Temp/html2doc_svg_mhm65S/svg_0.png" id="12" name="Picture"/>
                     <pic:cNvPicPr>
                       <a:picLocks noChangeArrowheads="1" noChangeAspect="1"/>
                     </pic:cNvPicPr>
@@ -1958,7 +1958,7 @@
               <a:graphicData uri="http://schemas.openxmlformats.org/drawingml/2006/picture">
                 <pic:pic>
                   <pic:nvPicPr>
-                    <pic:cNvPr descr="C:/Users/apart/AppData/Local/Temp/html2doc_svg_vs046S/svg_1.png" id="17" name="Picture"/>
+                    <pic:cNvPr descr="C:/Users/apart/AppData/Local/Temp/html2doc_svg_mhm65S/svg_1.png" id="17" name="Picture"/>
                     <pic:cNvPicPr>
                       <a:picLocks noChangeArrowheads="1" noChangeAspect="1"/>
                     </pic:cNvPicPr>
@@ -5499,7 +5499,13 @@
         <w:t xml:space="preserve"> </w:t>
       </w:r>
       <w:r>
-        <w:t xml:space="preserve">of sixteen prompts spanning challenge construction, AI generation, and evaluation. The released library</w:t>
+        <w:t xml:space="preserve">of sixteen prompts spanning challenge construction, AI generation, and evaluation (Figure A3 traces the full</w:t>
+      </w:r>
+      <w:r>
+        <w:t xml:space="preserve"> </w:t>
+      </w:r>
+      <w:r>
+        <w:t xml:space="preserve">generation-and-assessment pipeline). The released library</w:t>
       </w:r>
       <w:r>
         <w:t xml:space="preserve"> </w:t>
@@ -9452,7 +9458,7 @@
       </w:r>
     </w:p>
     <w:bookmarkEnd w:id="37"/>
-    <w:bookmarkStart w:id="44" w:name="appendix-a-system-walkthrough"/>
+    <w:bookmarkStart w:id="47" w:name="appendix-a-system-walkthrough"/>
     <w:p>
       <w:pPr>
         <w:pStyle w:val="Heading2"/>
@@ -9758,8 +9764,173 @@
         <w:t xml:space="preserve">central claim that productive AI use is not one skill but three.</w:t>
       </w:r>
     </w:p>
-    <w:bookmarkEnd w:id="44"/>
-    <w:bookmarkStart w:id="45" w:name="appendix-b-robustness-and-ablations"/>
+    <w:p>
+      <w:pPr>
+        <w:pStyle w:val="BodyText"/>
+        <w:jc w:val="center"/>
+        <w:keepNext/>
+        <w:keepLines/>
+        <w:widowControl w:val="1"/>
+      </w:pPr>
+      <w:r>
+        <w:drawing>
+          <wp:inline>
+            <wp:extent cx="5943600" cy="4002832"/>
+            <wp:effectExtent b="0" l="0" r="0" t="0"/>
+            <wp:docPr descr="Figure A3. Auto-generation and assessment pipeline of the CoReasoning Lab engine." title="" id="45" name="Picture"/>
+            <a:graphic>
+              <a:graphicData uri="http://schemas.openxmlformats.org/drawingml/2006/picture">
+                <pic:pic>
+                  <pic:nvPicPr>
+                    <pic:cNvPr descr="C:/Users/apart/AppData/Local/Temp/html2doc_svg_mhm65S/svg_2.png" id="46" name="Picture"/>
+                    <pic:cNvPicPr>
+                      <a:picLocks noChangeArrowheads="1" noChangeAspect="1"/>
+                    </pic:cNvPicPr>
+                  </pic:nvPicPr>
+                  <pic:blipFill>
+                    <a:blip r:embed="rId44"/>
+                    <a:stretch>
+                      <a:fillRect/>
+                    </a:stretch>
+                  </pic:blipFill>
+                  <pic:spPr bwMode="auto">
+                    <a:xfrm>
+                      <a:off x="0" y="0"/>
+                      <a:ext cx="5943600" cy="4002832"/>
+                    </a:xfrm>
+                    <a:prstGeom prst="rect">
+                      <a:avLst/>
+                    </a:prstGeom>
+                    <a:noFill/>
+                    <a:ln w="9525">
+                      <a:noFill/>
+                      <a:headEnd/>
+                      <a:tailEnd/>
+                    </a:ln>
+                  </pic:spPr>
+                </pic:pic>
+              </a:graphicData>
+            </a:graphic>
+          </wp:inline>
+        </w:drawing>
+      </w:r>
+    </w:p>
+    <w:p>
+      <w:pPr>
+        <w:pStyle w:val="BodyText"/>
+        <w:jc w:val="both"/>
+        <w:keepNext w:val="0"/>
+        <w:keepLines w:val="0"/>
+        <w:widowControl w:val="1"/>
+      </w:pPr>
+      <w:r>
+        <w:rPr>
+          <w:i/>
+          <w:iCs/>
+        </w:rPr>
+        <w:t xml:space="preserve">Figure A3. The sixteen-prompt engine in two phases. In authoring, the instructor names a subject and the</w:t>
+      </w:r>
+      <w:r>
+        <w:rPr>
+          <w:i/>
+          <w:iCs/>
+        </w:rPr>
+        <w:t xml:space="preserve"> </w:t>
+      </w:r>
+      <w:r>
+        <w:rPr>
+          <w:i/>
+          <w:iCs/>
+        </w:rPr>
+        <w:t xml:space="preserve">engine generates the ill-defined problem (prompt 01), three per-skill rubrics and a gold framing (02, 14),</w:t>
+      </w:r>
+      <w:r>
+        <w:rPr>
+          <w:i/>
+          <w:iCs/>
+        </w:rPr>
+        <w:t xml:space="preserve"> </w:t>
+      </w:r>
+      <w:r>
+        <w:rPr>
+          <w:i/>
+          <w:iCs/>
+        </w:rPr>
+        <w:t xml:space="preserve">and a deliberately flawed AI solution carrying seeded issues (03). In assessment, each learner response is</w:t>
+      </w:r>
+      <w:r>
+        <w:rPr>
+          <w:i/>
+          <w:iCs/>
+        </w:rPr>
+        <w:t xml:space="preserve"> </w:t>
+      </w:r>
+      <w:r>
+        <w:rPr>
+          <w:i/>
+          <w:iCs/>
+        </w:rPr>
+        <w:t xml:space="preserve">scored against a different referent: Framing against the gold framing and rubric (08), Judging against the</w:t>
+      </w:r>
+      <w:r>
+        <w:rPr>
+          <w:i/>
+          <w:iCs/>
+        </w:rPr>
+        <w:t xml:space="preserve"> </w:t>
+      </w:r>
+      <w:r>
+        <w:rPr>
+          <w:i/>
+          <w:iCs/>
+        </w:rPr>
+        <w:t xml:space="preserve">seeded issues (09), and Steering against the corrected trajectory after the output is re-run (04, 10); a</w:t>
+      </w:r>
+      <w:r>
+        <w:rPr>
+          <w:i/>
+          <w:iCs/>
+        </w:rPr>
+        <w:t xml:space="preserve"> </w:t>
+      </w:r>
+      <w:r>
+        <w:rPr>
+          <w:i/>
+          <w:iCs/>
+        </w:rPr>
+        <w:t xml:space="preserve">single grader prompt (11) then assigns each skill its own grade, and the three feed the per-student report</w:t>
+      </w:r>
+      <w:r>
+        <w:rPr>
+          <w:i/>
+          <w:iCs/>
+        </w:rPr>
+        <w:t xml:space="preserve"> </w:t>
+      </w:r>
+      <w:r>
+        <w:rPr>
+          <w:i/>
+          <w:iCs/>
+        </w:rPr>
+        <w:t xml:space="preserve">and course analytics. Because the three evaluation prompts interrogate different referents, the grades are</w:t>
+      </w:r>
+      <w:r>
+        <w:rPr>
+          <w:i/>
+          <w:iCs/>
+        </w:rPr>
+        <w:t xml:space="preserve"> </w:t>
+      </w:r>
+      <w:r>
+        <w:rPr>
+          <w:i/>
+          <w:iCs/>
+        </w:rPr>
+        <w:t xml:space="preserve">produced independently rather than as one global impression.</w:t>
+      </w:r>
+    </w:p>
+    <w:bookmarkEnd w:id="47"/>
+    <w:bookmarkStart w:id="48" w:name="appendix-b-robustness-and-ablations"/>
     <w:p>
       <w:pPr>
         <w:pStyle w:val="Heading2"/>
@@ -10123,8 +10294,8 @@
         <w:t xml:space="preserve">distinct instrumentation Section 10 specifies.</w:t>
       </w:r>
     </w:p>
-    <w:bookmarkEnd w:id="45"/>
-    <w:bookmarkStart w:id="46" w:name="X20431813dc1d9ebe06088c2967a8c6d7cfc2771"/>
+    <w:bookmarkEnd w:id="48"/>
+    <w:bookmarkStart w:id="49" w:name="X20431813dc1d9ebe06088c2967a8c6d7cfc2771"/>
     <w:p>
       <w:pPr>
         <w:pStyle w:val="Heading2"/>
@@ -10673,8 +10844,8 @@
         <w:t xml:space="preserve">logs ship with the platform.</w:t>
       </w:r>
     </w:p>
-    <w:bookmarkEnd w:id="46"/>
-    <w:bookmarkStart w:id="47" w:name="references"/>
+    <w:bookmarkEnd w:id="49"/>
+    <w:bookmarkStart w:id="50" w:name="references"/>
     <w:p>
       <w:pPr>
         <w:pStyle w:val="ReferencesHeading"/>
@@ -12340,8 +12511,8 @@
         <w:t xml:space="preserve">.</w:t>
       </w:r>
     </w:p>
-    <w:bookmarkEnd w:id="47"/>
-    <w:bookmarkEnd w:id="48"/>
+    <w:bookmarkEnd w:id="50"/>
+    <w:bookmarkEnd w:id="51"/>
     <w:sectPr>
       <w:footerReference w:type="default" r:id="rId9"/>
       <w:pgSz w:h="15840" w:w="12240"/>

</xml_diff>

<commit_message>
Replace Figure A1 with a substantive challenge-run screenshot
A1 previously showed the empty "Challenge Ready to Start" landing. Recaptured
from the live app (staging worktree, Groq backend) at the Framing phase: the
engine-generated ill-defined problem (an AI hiring-screening ethics task) plus
the refinement-section input and two-phase stepper. Caption updated to match.

Co-Authored-By: Claude Opus 4.8 <noreply@anthropic.com>
</commit_message>
<xml_diff>
--- a/docs/coreasoning.docx
+++ b/docs/coreasoning.docx
@@ -889,7 +889,7 @@
               <a:graphicData uri="http://schemas.openxmlformats.org/drawingml/2006/picture">
                 <pic:pic>
                   <pic:nvPicPr>
-                    <pic:cNvPr descr="C:/Users/apart/AppData/Local/Temp/html2doc_svg_mhm65S/svg_0.png" id="12" name="Picture"/>
+                    <pic:cNvPr descr="C:/Users/apart/AppData/Local/Temp/html2doc_svg_v6uNfM/svg_0.png" id="12" name="Picture"/>
                     <pic:cNvPicPr>
                       <a:picLocks noChangeArrowheads="1" noChangeAspect="1"/>
                     </pic:cNvPicPr>
@@ -1958,7 +1958,7 @@
               <a:graphicData uri="http://schemas.openxmlformats.org/drawingml/2006/picture">
                 <pic:pic>
                   <pic:nvPicPr>
-                    <pic:cNvPr descr="C:/Users/apart/AppData/Local/Temp/html2doc_svg_mhm65S/svg_1.png" id="17" name="Picture"/>
+                    <pic:cNvPr descr="C:/Users/apart/AppData/Local/Temp/html2doc_svg_v6uNfM/svg_1.png" id="17" name="Picture"/>
                     <pic:cNvPicPr>
                       <a:picLocks noChangeArrowheads="1" noChangeAspect="1"/>
                     </pic:cNvPicPr>
@@ -9529,7 +9529,7 @@
       <w:r>
         <w:drawing>
           <wp:inline>
-            <wp:extent cx="5943600" cy="4142509"/>
+            <wp:extent cx="5943600" cy="4786207"/>
             <wp:effectExtent b="0" l="0" r="0" t="0"/>
             <wp:docPr descr="Figure A1. A CoReasoning Lab challenge run." title="" id="39" name="Picture"/>
             <a:graphic>
@@ -9550,7 +9550,7 @@
                   <pic:spPr bwMode="auto">
                     <a:xfrm>
                       <a:off x="0" y="0"/>
-                      <a:ext cx="5943600" cy="4142509"/>
+                      <a:ext cx="5943600" cy="4786207"/>
                     </a:xfrm>
                     <a:prstGeom prst="rect">
                       <a:avLst/>
@@ -9582,7 +9582,7 @@
           <w:i/>
           <w:iCs/>
         </w:rPr>
-        <w:t xml:space="preserve">Figure A1. Screenshot of the running platform: a learner's challenge run, with the two-phase structure</w:t>
+        <w:t xml:space="preserve">Figure A1. Screenshot of the running platform: a learner's challenge run at the Framing phase. The</w:t>
       </w:r>
       <w:r>
         <w:rPr>
@@ -9596,7 +9596,7 @@
           <w:i/>
           <w:iCs/>
         </w:rPr>
-        <w:t xml:space="preserve">made explicit in the interface, Phase 1 (Framing) and Phase 2 (the Judge-Steer cycle). Each skill is</w:t>
+        <w:t xml:space="preserve">engine has generated an ill-defined problem (here, an AI hiring-screening task), and the learner</w:t>
       </w:r>
       <w:r>
         <w:rPr>
@@ -9610,7 +9610,35 @@
           <w:i/>
           <w:iCs/>
         </w:rPr>
-        <w:t xml:space="preserve">scored and given feedback independently.</w:t>
+        <w:t xml:space="preserve">specifies refinements before any solution is produced. The two-phase structure is explicit in the</w:t>
+      </w:r>
+      <w:r>
+        <w:rPr>
+          <w:i/>
+          <w:iCs/>
+        </w:rPr>
+        <w:t xml:space="preserve"> </w:t>
+      </w:r>
+      <w:r>
+        <w:rPr>
+          <w:i/>
+          <w:iCs/>
+        </w:rPr>
+        <w:t xml:space="preserve">interface, Phase 1 (Framing) and Phase 2 (the Judge-Steer cycle), and each skill is scored and given</w:t>
+      </w:r>
+      <w:r>
+        <w:rPr>
+          <w:i/>
+          <w:iCs/>
+        </w:rPr>
+        <w:t xml:space="preserve"> </w:t>
+      </w:r>
+      <w:r>
+        <w:rPr>
+          <w:i/>
+          <w:iCs/>
+        </w:rPr>
+        <w:t xml:space="preserve">feedback independently.</w:t>
       </w:r>
     </w:p>
     <w:p>
@@ -9782,7 +9810,7 @@
               <a:graphicData uri="http://schemas.openxmlformats.org/drawingml/2006/picture">
                 <pic:pic>
                   <pic:nvPicPr>
-                    <pic:cNvPr descr="C:/Users/apart/AppData/Local/Temp/html2doc_svg_mhm65S/svg_2.png" id="46" name="Picture"/>
+                    <pic:cNvPr descr="C:/Users/apart/AppData/Local/Temp/html2doc_svg_v6uNfM/svg_2.png" id="46" name="Picture"/>
                     <pic:cNvPicPr>
                       <a:picLocks noChangeArrowheads="1" noChangeAspect="1"/>
                     </pic:cNvPicPr>

</xml_diff>

<commit_message>
Trim abstract to <=1500 chars; add 1-col + 2-col DOCX with both download links
- Abstract condensed to 1494 visible characters (was ~3500) while keeping the
  three-skill model, the pre/post separation claim, and the dissociation +
  convergent/discriminant validity result.
- build_docx.sh now emits coreasoning.docx (single-column) and
  coreasoning-2col.docx (arXiv-style two-column: full-width title/abstract,
  two-column body) via the html2doc two-column profile.
- HTML header shows both download links (1-column / 2-column).

Co-Authored-By: Claude Opus 4.8 <noreply@anthropic.com>
</commit_message>
<xml_diff>
--- a/docs/coreasoning.docx
+++ b/docs/coreasoning.docx
@@ -114,19 +114,7 @@
         <w:widowControl w:val="1"/>
       </w:pPr>
       <w:r>
-        <w:t xml:space="preserve">Generative AI makes it trivial to obtain an answer and difficult to obtain understanding, and uncritical</w:t>
-      </w:r>
-      <w:r>
-        <w:t xml:space="preserve"> </w:t>
-      </w:r>
-      <w:r>
-        <w:t xml:space="preserve">use is increasingly linked to cognitive offloading and weakened critical thinking. This exposes a</w:t>
-      </w:r>
-      <w:r>
-        <w:t xml:space="preserve"> </w:t>
-      </w:r>
-      <w:r>
-        <w:t xml:space="preserve">mismatch between what education assesses and what students now do: our examinations still measure</w:t>
+        <w:t xml:space="preserve">Generative AI makes answers easy and understanding hard, and uncritical use invites cognitive offloading. Schools still measure</w:t>
       </w:r>
       <w:r>
         <w:t xml:space="preserve"> </w:t>
@@ -142,13 +130,7 @@
         <w:t xml:space="preserve"> </w:t>
       </w:r>
       <w:r>
-        <w:t xml:space="preserve">performance, while the task graduates actually face, in classrooms and workplaces saturated</w:t>
-      </w:r>
-      <w:r>
-        <w:t xml:space="preserve"> </w:t>
-      </w:r>
-      <w:r>
-        <w:t xml:space="preserve">with capable AI, is to produce good work</w:t>
+        <w:t xml:space="preserve">performance, yet the real task is to produce good work</w:t>
       </w:r>
       <w:r>
         <w:t xml:space="preserve"> </w:t>
@@ -164,37 +146,7 @@
         <w:t xml:space="preserve"> </w:t>
       </w:r>
       <w:r>
-        <w:t xml:space="preserve">it, by framing an ill-defined task, judging the output,</w:t>
-      </w:r>
-      <w:r>
-        <w:t xml:space="preserve"> </w:t>
-      </w:r>
-      <w:r>
-        <w:t xml:space="preserve">and steering the model toward something better. As models absorb more of the execution, this</w:t>
-      </w:r>
-      <w:r>
-        <w:t xml:space="preserve"> </w:t>
-      </w:r>
-      <w:r>
-        <w:t xml:space="preserve">collaborative work is the part of competent performance that stays with the person, which is precisely</w:t>
-      </w:r>
-      <w:r>
-        <w:t xml:space="preserve"> </w:t>
-      </w:r>
-      <w:r>
-        <w:t xml:space="preserve">what assessment must now target. This ability to work with AI is neither taught nor</w:t>
-      </w:r>
-      <w:r>
-        <w:t xml:space="preserve"> </w:t>
-      </w:r>
-      <w:r>
-        <w:t xml:space="preserve">assessed as a competency in its own right; where it is measured at all, it is folded into a single</w:t>
-      </w:r>
-      <w:r>
-        <w:t xml:space="preserve"> </w:t>
-      </w:r>
-      <w:r>
-        <w:t xml:space="preserve">"prompting" score that cannot diagnose</w:t>
+        <w:t xml:space="preserve">AI: framing an ill-defined task, judging the output, and steering the model toward a better result. This ability is rarely assessed in its own right; where measured, it collapses into one "prompting" score that cannot diagnose</w:t>
       </w:r>
       <w:r>
         <w:t xml:space="preserve"> </w:t>
@@ -210,19 +162,7 @@
         <w:t xml:space="preserve"> </w:t>
       </w:r>
       <w:r>
-        <w:t xml:space="preserve">a given learner's AI use succeeds or fails (whether they</w:t>
-      </w:r>
-      <w:r>
-        <w:t xml:space="preserve"> </w:t>
-      </w:r>
-      <w:r>
-        <w:t xml:space="preserve">specified the task poorly, missed the flaws in the output, or failed to correct them). We treat it</w:t>
-      </w:r>
-      <w:r>
-        <w:t xml:space="preserve"> </w:t>
-      </w:r>
-      <w:r>
-        <w:t xml:space="preserve">instead as a teachable, assessable competency that can be named, decomposed, and measured. We propose</w:t>
+        <w:t xml:space="preserve">a learner's AI use succeeds or fails. We propose</w:t>
       </w:r>
       <w:r>
         <w:t xml:space="preserve"> </w:t>
@@ -235,13 +175,7 @@
         <w:t xml:space="preserve">CoReasoning</w:t>
       </w:r>
       <w:r>
-        <w:t xml:space="preserve">, a competency model that factors productive work with</w:t>
-      </w:r>
-      <w:r>
-        <w:t xml:space="preserve"> </w:t>
-      </w:r>
-      <w:r>
-        <w:t xml:space="preserve">generative AI into three temporally and cognitively distinct, independently-assessable skills:</w:t>
+        <w:t xml:space="preserve">, a competency model factoring productive AI use into three assessable skills:</w:t>
       </w:r>
       <w:r>
         <w:t xml:space="preserve"> </w:t>
@@ -257,7 +191,7 @@
         <w:t xml:space="preserve"> </w:t>
       </w:r>
       <w:r>
-        <w:t xml:space="preserve">(transforming an ill-defined problem into a well-specified task before invoking AI),</w:t>
+        <w:t xml:space="preserve">(specifying an ill-defined task before invoking AI),</w:t>
       </w:r>
       <w:r>
         <w:t xml:space="preserve"> </w:t>
@@ -273,13 +207,7 @@
         <w:t xml:space="preserve"> </w:t>
       </w:r>
       <w:r>
-        <w:t xml:space="preserve">(critically evaluating AI output for errors, gaps, unstated assumptions, and risk),</w:t>
-      </w:r>
-      <w:r>
-        <w:t xml:space="preserve"> </w:t>
-      </w:r>
-      <w:r>
-        <w:t xml:space="preserve">and</w:t>
+        <w:t xml:space="preserve">(evaluating output for errors and unstated assumptions), and</w:t>
       </w:r>
       <w:r>
         <w:t xml:space="preserve"> </w:t>
@@ -295,64 +223,7 @@
         <w:t xml:space="preserve"> </w:t>
       </w:r>
       <w:r>
-        <w:t xml:space="preserve">(iteratively redirecting the AI toward a better solution across cycles). The</w:t>
-      </w:r>
-      <w:r>
-        <w:t xml:space="preserve"> </w:t>
-      </w:r>
-      <w:r>
-        <w:t xml:space="preserve">central structural claim that distinguishes CoReasoning from existing AI- and prompt-literacy</w:t>
-      </w:r>
-      <w:r>
-        <w:t xml:space="preserve"> </w:t>
-      </w:r>
-      <w:r>
-        <w:t xml:space="preserve">frameworks is the</w:t>
-      </w:r>
-      <w:r>
-        <w:t xml:space="preserve"> </w:t>
-      </w:r>
-      <w:r>
-        <w:rPr>
-          <w:i/>
-          <w:iCs/>
-        </w:rPr>
-        <w:t xml:space="preserve">separation of the pre-generation skill (Framing) from the post-generation</w:t>
-      </w:r>
-      <w:r>
-        <w:rPr>
-          <w:i/>
-          <w:iCs/>
-        </w:rPr>
-        <w:t xml:space="preserve"> </w:t>
-      </w:r>
-      <w:r>
-        <w:rPr>
-          <w:i/>
-          <w:iCs/>
-        </w:rPr>
-        <w:t xml:space="preserve">corrective skill (Steering)</w:t>
-      </w:r>
-      <w:r>
-        <w:t xml:space="preserve">, with Judging as the epistemic gate between them. We ground each skill</w:t>
-      </w:r>
-      <w:r>
-        <w:t xml:space="preserve"> </w:t>
-      </w:r>
-      <w:r>
-        <w:t xml:space="preserve">in established theory (metacognitive monitoring and control; self-regulated learning; epistemic</w:t>
-      </w:r>
-      <w:r>
-        <w:t xml:space="preserve"> </w:t>
-      </w:r>
-      <w:r>
-        <w:t xml:space="preserve">vigilance and critical thinking; productive struggle), and state five testable propositions about how</w:t>
-      </w:r>
-      <w:r>
-        <w:t xml:space="preserve"> </w:t>
-      </w:r>
-      <w:r>
-        <w:t xml:space="preserve">the skills relate. We instantiate the model in</w:t>
+        <w:t xml:space="preserve">(iteratively redirecting the model). Its distinguishing claim is the separation of pre-generation Framing from post-generation Steering, with Judging as the gate between. We ground the skills in theory, state five testable propositions, and instantiate them in</w:t>
       </w:r>
       <w:r>
         <w:t xml:space="preserve"> </w:t>
@@ -365,140 +236,7 @@
         <w:t xml:space="preserve">CoReasoning Lab</w:t>
       </w:r>
       <w:r>
-        <w:t xml:space="preserve">, an open learning platform</w:t>
-      </w:r>
-      <w:r>
-        <w:t xml:space="preserve"> </w:t>
-      </w:r>
-      <w:r>
-        <w:t xml:space="preserve">that presents deliberately flawed AI output for students to judge and steer, and scores the three</w:t>
-      </w:r>
-      <w:r>
-        <w:t xml:space="preserve"> </w:t>
-      </w:r>
-      <w:r>
-        <w:t xml:space="preserve">skills independently. In a feasibility demonstration over</w:t>
-      </w:r>
-      <w:r>
-        <w:t xml:space="preserve"> </w:t>
-      </w:r>
-      <w:r>
-        <w:rPr>
-          <w:i/>
-          <w:iCs/>
-        </w:rPr>
-        <w:t xml:space="preserve">simulated</w:t>
-      </w:r>
-      <w:r>
-        <w:t xml:space="preserve"> </w:t>
-      </w:r>
-      <w:r>
-        <w:t xml:space="preserve">learners (generated by one model and graded by a</w:t>
-      </w:r>
-      <w:r>
-        <w:t xml:space="preserve"> </w:t>
-      </w:r>
-      <w:r>
-        <w:t xml:space="preserve">different one to avoid self-grading), the three skills</w:t>
-      </w:r>
-      <w:r>
-        <w:t xml:space="preserve"> </w:t>
-      </w:r>
-      <w:r>
-        <w:rPr>
-          <w:i/>
-          <w:iCs/>
-        </w:rPr>
-        <w:t xml:space="preserve">dissociate</w:t>
-      </w:r>
-      <w:r>
-        <w:t xml:space="preserve">. The result is carried by the two</w:t>
-      </w:r>
-      <w:r>
-        <w:t xml:space="preserve"> </w:t>
-      </w:r>
-      <w:r>
-        <w:rPr>
-          <w:i/>
-          <w:iCs/>
-        </w:rPr>
-        <w:t xml:space="preserve">blind-graded</w:t>
-      </w:r>
-      <w:r>
-        <w:t xml:space="preserve"> </w:t>
-      </w:r>
-      <w:r>
-        <w:t xml:space="preserve">skills, Framing and Steering, whose free-text responses the grader scores without</w:t>
-      </w:r>
-      <w:r>
-        <w:t xml:space="preserve"> </w:t>
-      </w:r>
-      <w:r>
-        <w:t xml:space="preserve">knowing the intended competence: each moves with its own manipulated competence while staying flat in</w:t>
-      </w:r>
-      <w:r>
-        <w:t xml:space="preserve"> </w:t>
-      </w:r>
-      <w:r>
-        <w:t xml:space="preserve">the others, and the cleanest pair (Framing and Judging) is uncorrelated despite being scored by</w:t>
-      </w:r>
-      <w:r>
-        <w:t xml:space="preserve"> </w:t>
-      </w:r>
-      <w:r>
-        <w:t xml:space="preserve">entirely separate mechanisms. The same instrument returns</w:t>
-      </w:r>
-      <w:r>
-        <w:t xml:space="preserve"> </w:t>
-      </w:r>
-      <w:r>
-        <w:rPr>
-          <w:i/>
-          <w:iCs/>
-        </w:rPr>
-        <w:t xml:space="preserve">correlated</w:t>
-      </w:r>
-      <w:r>
-        <w:t xml:space="preserve"> </w:t>
-      </w:r>
-      <w:r>
-        <w:t xml:space="preserve">grades when a single competence</w:t>
-      </w:r>
-      <w:r>
-        <w:t xml:space="preserve"> </w:t>
-      </w:r>
-      <w:r>
-        <w:t xml:space="preserve">is shared across the three skills, so the separation reflects the learners rather than the scoring</w:t>
-      </w:r>
-      <w:r>
-        <w:t xml:space="preserve"> </w:t>
-      </w:r>
-      <w:r>
-        <w:t xml:space="preserve">(convergent and discriminant validity). The separation holds under three grader backends spanning two</w:t>
-      </w:r>
-      <w:r>
-        <w:t xml:space="preserve"> </w:t>
-      </w:r>
-      <w:r>
-        <w:t xml:space="preserve">providers, which also agree on each skill at the per-learner level, and the grader is highly</w:t>
-      </w:r>
-      <w:r>
-        <w:t xml:space="preserve"> </w:t>
-      </w:r>
-      <w:r>
-        <w:t xml:space="preserve">self-consistent on repeat. The constructs are therefore separable and automatically scoreable; agreement with human raters and learning outcomes are the defined next</w:t>
-      </w:r>
-      <w:r>
-        <w:t xml:space="preserve"> </w:t>
-      </w:r>
-      <w:r>
-        <w:t xml:space="preserve">steps of the program, for which we release a prepared validation protocol alongside the instrument and</w:t>
-      </w:r>
-      <w:r>
-        <w:t xml:space="preserve"> </w:t>
-      </w:r>
-      <w:r>
-        <w:t xml:space="preserve">data.</w:t>
+        <w:t xml:space="preserve">, an open platform that presents flawed AI output and scores the three skills independently. Over simulated learners (generated and graded by different models), the skills dissociate: each tracks its own manipulated competence while flat in the others, and grades become correlated when one competence is shared across all three (convergent and discriminant validity), across grader backends from two providers. Human-rater agreement and outcomes are the next steps; we release the instrument, data, and protocol.</w:t>
       </w:r>
     </w:p>
     <w:bookmarkEnd w:id="9"/>
@@ -889,7 +627,7 @@
               <a:graphicData uri="http://schemas.openxmlformats.org/drawingml/2006/picture">
                 <pic:pic>
                   <pic:nvPicPr>
-                    <pic:cNvPr descr="C:/Users/apart/AppData/Local/Temp/html2doc_svg_v6uNfM/svg_0.png" id="12" name="Picture"/>
+                    <pic:cNvPr descr="C:/Users/apart/AppData/Local/Temp/html2doc_svg_2FEAbc/svg_0.png" id="12" name="Picture"/>
                     <pic:cNvPicPr>
                       <a:picLocks noChangeArrowheads="1" noChangeAspect="1"/>
                     </pic:cNvPicPr>
@@ -1958,7 +1696,7 @@
               <a:graphicData uri="http://schemas.openxmlformats.org/drawingml/2006/picture">
                 <pic:pic>
                   <pic:nvPicPr>
-                    <pic:cNvPr descr="C:/Users/apart/AppData/Local/Temp/html2doc_svg_v6uNfM/svg_1.png" id="17" name="Picture"/>
+                    <pic:cNvPr descr="C:/Users/apart/AppData/Local/Temp/html2doc_svg_2FEAbc/svg_1.png" id="17" name="Picture"/>
                     <pic:cNvPicPr>
                       <a:picLocks noChangeArrowheads="1" noChangeAspect="1"/>
                     </pic:cNvPicPr>
@@ -9810,7 +9548,7 @@
               <a:graphicData uri="http://schemas.openxmlformats.org/drawingml/2006/picture">
                 <pic:pic>
                   <pic:nvPicPr>
-                    <pic:cNvPr descr="C:/Users/apart/AppData/Local/Temp/html2doc_svg_v6uNfM/svg_2.png" id="46" name="Picture"/>
+                    <pic:cNvPr descr="C:/Users/apart/AppData/Local/Temp/html2doc_svg_2FEAbc/svg_2.png" id="46" name="Picture"/>
                     <pic:cNvPicPr>
                       <a:picLocks noChangeArrowheads="1" noChangeAspect="1"/>
                     </pic:cNvPicPr>

</xml_diff>